<commit_message>
docs: rebuild Word and PDF copies for 0cc33c2 (333 tests)
The test count was re-checked on 26 September 2026 against a clean clone of
0cc33c2, with no browser installed. The dates and line counts in the guides are
corrected to match, and the Word and PDF copies are rebuilt from them.
</commit_message>
<xml_diff>
--- a/docs/eosc-basic-compliance-guide.docx
+++ b/docs/eosc-basic-compliance-guide.docx
@@ -23,7 +23,7 @@
         <w:pStyle w:val="Author"/>
       </w:pPr>
       <w:r>
-        <w:t xml:space="preserve">Verified against a clean clone on 25 September 2026 — documentation commit fc841cc</w:t>
+        <w:t xml:space="preserve">Verified against a clean clone on 26 September 2026 — documentation commit 0cc33c2</w:t>
       </w:r>
     </w:p>
     <w:p>
@@ -165,7 +165,28 @@
         <w:t xml:space="preserve"> </w:t>
       </w:r>
       <w:r>
-        <w:t xml:space="preserve">on 25 September 2026. Every command</w:t>
+        <w:t xml:space="preserve">on 25 September 2026, and the test</w:t>
+      </w:r>
+      <w:r>
+        <w:t xml:space="preserve"> </w:t>
+      </w:r>
+      <w:r>
+        <w:t xml:space="preserve">count again at commit</w:t>
+      </w:r>
+      <w:r>
+        <w:t xml:space="preserve"> </w:t>
+      </w:r>
+      <w:r>
+        <w:rPr>
+          <w:rStyle w:val="VerbatimChar"/>
+        </w:rPr>
+        <w:t xml:space="preserve">0cc33c2</w:t>
+      </w:r>
+      <w:r>
+        <w:t xml:space="preserve"> </w:t>
+      </w:r>
+      <w:r>
+        <w:t xml:space="preserve">on 26 September 2026. Every command</w:t>
       </w:r>
       <w:r>
         <w:t xml:space="preserve"> </w:t>
@@ -1530,7 +1551,7 @@
         <w:t xml:space="preserve"> </w:t>
       </w:r>
       <w:r>
-        <w:t xml:space="preserve">329 tests still pass, while</w:t>
+        <w:t xml:space="preserve">333 tests still pass, while</w:t>
       </w:r>
       <w:r>
         <w:t xml:space="preserve"> </w:t>
@@ -1602,7 +1623,7 @@
         <w:rPr>
           <w:rStyle w:val="CommentTok"/>
         </w:rPr>
-        <w:t xml:space="preserve"># expect: 329 passed</w:t>
+        <w:t xml:space="preserve"># expect: 333 passed</w:t>
       </w:r>
       <w:r>
         <w:br/>
@@ -11680,7 +11701,7 @@
         <w:rPr>
           <w:rStyle w:val="CommentTok"/>
         </w:rPr>
-        <w:t xml:space="preserve"># 329 tests, offline, a few seconds</w:t>
+        <w:t xml:space="preserve"># 333 tests, offline, a few seconds</w:t>
       </w:r>
       <w:r>
         <w:br/>
@@ -11949,7 +11970,7 @@
               <w:pStyle w:val="Compact"/>
             </w:pPr>
             <w:r>
-              <w:t xml:space="preserve">44</w:t>
+              <w:t xml:space="preserve">48</w:t>
             </w:r>
           </w:p>
         </w:tc>
@@ -11990,7 +12011,7 @@
               <w:t xml:space="preserve"> </w:t>
             </w:r>
             <w:r>
-              <w:t xml:space="preserve">does not shrink the published report, and that</w:t>
+              <w:t xml:space="preserve">does not shrink the published report, that</w:t>
             </w:r>
             <w:r>
               <w:t xml:space="preserve"> </w:t>
@@ -12005,7 +12026,22 @@
               <w:t xml:space="preserve"> </w:t>
             </w:r>
             <w:r>
-              <w:t xml:space="preserve">leaves nodes out and says so.</w:t>
+              <w:t xml:space="preserve">leaves nodes out and says so, and that</w:t>
+            </w:r>
+            <w:r>
+              <w:t xml:space="preserve"> </w:t>
+            </w:r>
+            <w:r>
+              <w:rPr>
+                <w:rStyle w:val="VerbatimChar"/>
+              </w:rPr>
+              <w:t xml:space="preserve">--help</w:t>
+            </w:r>
+            <w:r>
+              <w:t xml:space="preserve"> </w:t>
+            </w:r>
+            <w:r>
+              <w:t xml:space="preserve">stays complete.</w:t>
             </w:r>
           </w:p>
         </w:tc>

</xml_diff>

<commit_message>
Rebuild Word/PDF copies of the docs for a0be8d9
</commit_message>
<xml_diff>
--- a/docs/eosc-basic-compliance-guide.docx
+++ b/docs/eosc-basic-compliance-guide.docx
@@ -23,7 +23,7 @@
         <w:pStyle w:val="Author"/>
       </w:pPr>
       <w:r>
-        <w:t xml:space="preserve">Verified against a clean clone on 26 September 2026 — documentation commit 2326950</w:t>
+        <w:t xml:space="preserve">Verified against a clean clone on 26 September 2026 — documentation commit a0be8d9</w:t>
       </w:r>
     </w:p>
     <w:p>
@@ -20442,13 +20442,48 @@
         <w:t xml:space="preserve"> </w:t>
       </w:r>
       <w:r>
-        <w:t xml:space="preserve">As in example 1, steps 5 and 6. Commit the</w:t>
-      </w:r>
-      <w:r>
-        <w:t xml:space="preserve"> </w:t>
-      </w:r>
-      <w:r>
-        <w:t xml:space="preserve">new document,</w:t>
+        <w:t xml:space="preserve">As in example 1, steps 5 and 6. If any</w:t>
+      </w:r>
+      <w:r>
+        <w:t xml:space="preserve"> </w:t>
+      </w:r>
+      <w:r>
+        <w:rPr>
+          <w:rStyle w:val="VerbatimChar"/>
+        </w:rPr>
+        <w:t xml:space="preserve">check_*</w:t>
+      </w:r>
+      <w:r>
+        <w:t xml:space="preserve"> </w:t>
+      </w:r>
+      <w:r>
+        <w:t xml:space="preserve">function changed in step 3, also update its decision procedure in</w:t>
+      </w:r>
+      <w:r>
+        <w:t xml:space="preserve"> </w:t>
+      </w:r>
+      <w:r>
+        <w:t xml:space="preserve">section 5 of</w:t>
+      </w:r>
+      <w:r>
+        <w:t xml:space="preserve"> </w:t>
+      </w:r>
+      <w:hyperlink r:id="rId9">
+        <w:r>
+          <w:rPr>
+            <w:rStyle w:val="VerbatimChar"/>
+          </w:rPr>
+          <w:t xml:space="preserve">ANALYSIS-WORKFLOW.md</w:t>
+        </w:r>
+      </w:hyperlink>
+      <w:r>
+        <w:t xml:space="preserve">, which describes</w:t>
+      </w:r>
+      <w:r>
+        <w:t xml:space="preserve"> </w:t>
+      </w:r>
+      <w:r>
+        <w:t xml:space="preserve">each point's rule branch by branch. Commit the new document,</w:t>
       </w:r>
       <w:r>
         <w:t xml:space="preserve"> </w:t>
@@ -20487,7 +20522,13 @@
         <w:t xml:space="preserve"> </w:t>
       </w:r>
       <w:r>
-        <w:t xml:space="preserve">and the documents together, so the commit shows the whole change.</w:t>
+        <w:t xml:space="preserve">and</w:t>
+      </w:r>
+      <w:r>
+        <w:t xml:space="preserve"> </w:t>
+      </w:r>
+      <w:r>
+        <w:t xml:space="preserve">the documents together, so the commit shows the whole change.</w:t>
       </w:r>
     </w:p>
     <w:p>

</xml_diff>

<commit_message>
Rebuild Word/PDF copies of the docs for b2fb946 (internal links fixed)
</commit_message>
<xml_diff>
--- a/docs/eosc-basic-compliance-guide.docx
+++ b/docs/eosc-basic-compliance-guide.docx
@@ -23,7 +23,7 @@
         <w:pStyle w:val="Author"/>
       </w:pPr>
       <w:r>
-        <w:t xml:space="preserve">Verified against a clean clone on 26 September 2026 — documentation commit a0be8d9</w:t>
+        <w:t xml:space="preserve">Verified against a clean clone on 26 September 2026 — documentation commit b2fb946</w:t>
       </w:r>
     </w:p>
     <w:p>
@@ -9314,7 +9314,7 @@
       </w:r>
     </w:p>
     <w:bookmarkEnd w:id="32"/>
-    <w:bookmarkStart w:id="33" w:name="checking-a-page-not-in-nodes.yaml"/>
+    <w:bookmarkStart w:id="33" w:name="checking-a-page-not-in-nodesyaml"/>
     <w:p>
       <w:pPr>
         <w:pStyle w:val="Heading3"/>
@@ -14084,7 +14084,58 @@
               <w:pStyle w:val="Compact"/>
             </w:pPr>
             <w:r>
-              <w:t xml:space="preserve">After changing a URL in</w:t>
+              <w:rPr>
+                <w:rStyle w:val="VerbatimChar"/>
+              </w:rPr>
+              <w:t xml:space="preserve">assess</w:t>
+            </w:r>
+            <w:r>
+              <w:t xml:space="preserve"> </w:t>
+            </w:r>
+            <w:r>
+              <w:t xml:space="preserve">warns that nodes were assessed from evidence collected at a different URL, and the report carries an</w:t>
+            </w:r>
+            <w:r>
+              <w:t xml:space="preserve"> </w:t>
+            </w:r>
+            <w:r>
+              <w:rPr>
+                <w:b/>
+                <w:bCs/>
+              </w:rPr>
+              <w:t xml:space="preserve">Evidence from a different URL</w:t>
+            </w:r>
+            <w:r>
+              <w:t xml:space="preserve"> </w:t>
+            </w:r>
+            <w:r>
+              <w:t xml:space="preserve">banner</w:t>
+            </w:r>
+          </w:p>
+        </w:tc>
+        <w:tc>
+          <w:tcPr/>
+          <w:p>
+            <w:pPr>
+              <w:pStyle w:val="Compact"/>
+            </w:pPr>
+            <w:r>
+              <w:t xml:space="preserve">A node's</w:t>
+            </w:r>
+            <w:r>
+              <w:t xml:space="preserve"> </w:t>
+            </w:r>
+            <w:r>
+              <w:rPr>
+                <w:rStyle w:val="VerbatimChar"/>
+              </w:rPr>
+              <w:t xml:space="preserve">url</w:t>
+            </w:r>
+            <w:r>
+              <w:t xml:space="preserve"> </w:t>
+            </w:r>
+            <w:r>
+              <w:t xml:space="preserve">in</w:t>
             </w:r>
             <w:r>
               <w:t xml:space="preserve"> </w:t>
@@ -14096,42 +14147,10 @@
               <w:t xml:space="preserve">nodes.yaml</w:t>
             </w:r>
             <w:r>
-              <w:t xml:space="preserve">, the rebuilt report shows the new address but the old page's verdicts</w:t>
-            </w:r>
-          </w:p>
-        </w:tc>
-        <w:tc>
-          <w:tcPr/>
-          <w:p>
-            <w:pPr>
-              <w:pStyle w:val="Compact"/>
-            </w:pPr>
-            <w:r>
-              <w:rPr>
-                <w:rStyle w:val="VerbatimChar"/>
-              </w:rPr>
-              <w:t xml:space="preserve">assess</w:t>
-            </w:r>
-            <w:r>
               <w:t xml:space="preserve"> </w:t>
             </w:r>
             <w:r>
-              <w:t xml:space="preserve">takes the URL from</w:t>
-            </w:r>
-            <w:r>
-              <w:t xml:space="preserve"> </w:t>
-            </w:r>
-            <w:r>
-              <w:rPr>
-                <w:rStyle w:val="VerbatimChar"/>
-              </w:rPr>
-              <w:t xml:space="preserve">nodes.yaml</w:t>
-            </w:r>
-            <w:r>
-              <w:t xml:space="preserve"> </w:t>
-            </w:r>
-            <w:r>
-              <w:t xml:space="preserve">and the verdicts from the evidence on disk. Collect the node again, or rebuild with the old node list via</w:t>
+              <w:t xml:space="preserve">changed after its evidence was collected, so the row shows the new address above the old page's verdicts. Collect that node again, or rebuild with the old node list via</w:t>
             </w:r>
             <w:r>
               <w:t xml:space="preserve"> </w:t>
@@ -14143,7 +14162,7 @@
               <w:t xml:space="preserve">--nodes</w:t>
             </w:r>
             <w:r>
-              <w:t xml:space="preserve">. Section 3, "Changing a node's URL".</w:t>
+              <w:t xml:space="preserve">. Section 3, "Changing a node's URL", and example 2 in section 11.</w:t>
             </w:r>
           </w:p>
         </w:tc>
@@ -15713,7 +15732,7 @@
         <w:t xml:space="preserve">own run.</w:t>
       </w:r>
     </w:p>
-    <w:bookmarkStart w:id="47" w:name="X6b9c9d2e59e13da41f347184ca67a475fa8b7ce"/>
+    <w:bookmarkStart w:id="47" w:name="X073cb44b8dc5d29e47f376bc008b8613dd82a6a"/>
     <w:p>
       <w:pPr>
         <w:pStyle w:val="Heading3"/>
@@ -17422,7 +17441,7 @@
       </w:r>
     </w:p>
     <w:bookmarkEnd w:id="47"/>
-    <w:bookmarkStart w:id="48" w:name="X5431a82e20a06edfb102374e037ce7ea9ce6896"/>
+    <w:bookmarkStart w:id="48" w:name="Xe23e918a40335caa5ab24e15a733d1ac9e4c070"/>
     <w:p>
       <w:pPr>
         <w:pStyle w:val="Heading3"/>
@@ -18536,7 +18555,7 @@
       </w:r>
     </w:p>
     <w:bookmarkEnd w:id="48"/>
-    <w:bookmarkStart w:id="49" w:name="Xbb3e2d317a0d811066009804bfa0a222a6197de"/>
+    <w:bookmarkStart w:id="49" w:name="Xa570dceeae7de3d84789b8e054a5bbb043a3946"/>
     <w:p>
       <w:pPr>
         <w:pStyle w:val="Heading3"/>

</xml_diff>

<commit_message>
Docs: Word/PDF copies rebuilt from 5701f9e (--node); verification commit references updated
</commit_message>
<xml_diff>
--- a/docs/eosc-basic-compliance-guide.docx
+++ b/docs/eosc-basic-compliance-guide.docx
@@ -23,7 +23,7 @@
         <w:pStyle w:val="Author"/>
       </w:pPr>
       <w:r>
-        <w:t xml:space="preserve">Verified against a clean clone on 26 September 2026 — documentation commit b2fb946</w:t>
+        <w:t xml:space="preserve">Verified against a clean clone on 26 September 2026 — documentation commit 5701f9e</w:t>
       </w:r>
     </w:p>
     <w:p>
@@ -180,7 +180,7 @@
         <w:rPr>
           <w:rStyle w:val="VerbatimChar"/>
         </w:rPr>
-        <w:t xml:space="preserve">0cc33c2</w:t>
+        <w:t xml:space="preserve">5701f9e</w:t>
       </w:r>
       <w:r>
         <w:t xml:space="preserve"> </w:t>
@@ -1551,7 +1551,7 @@
         <w:t xml:space="preserve"> </w:t>
       </w:r>
       <w:r>
-        <w:t xml:space="preserve">339 tests still pass, while</w:t>
+        <w:t xml:space="preserve">357 tests still pass, while</w:t>
       </w:r>
       <w:r>
         <w:t xml:space="preserve"> </w:t>
@@ -1623,7 +1623,7 @@
         <w:rPr>
           <w:rStyle w:val="CommentTok"/>
         </w:rPr>
-        <w:t xml:space="preserve"># expect: 339 passed</w:t>
+        <w:t xml:space="preserve"># expect: 357 passed</w:t>
       </w:r>
       <w:r>
         <w:br/>
@@ -6809,7 +6809,7 @@
     </w:p>
     <w:bookmarkEnd w:id="27"/>
     <w:bookmarkEnd w:id="28"/>
-    <w:bookmarkStart w:id="34" w:name="running-it"/>
+    <w:bookmarkStart w:id="35" w:name="running-it"/>
     <w:p>
       <w:pPr>
         <w:pStyle w:val="Heading2"/>
@@ -7518,7 +7518,19 @@
               <w:t xml:space="preserve">nodes.yaml</w:t>
             </w:r>
             <w:r>
-              <w:t xml:space="preserve">. Repeatable.</w:t>
+              <w:t xml:space="preserve">. Repeatable. With</w:t>
+            </w:r>
+            <w:r>
+              <w:t xml:space="preserve"> </w:t>
+            </w:r>
+            <w:r>
+              <w:rPr>
+                <w:rStyle w:val="VerbatimChar"/>
+              </w:rPr>
+              <w:t xml:space="preserve">--node</w:t>
+            </w:r>
+            <w:r>
+              <w:t xml:space="preserve">, the alternative page for that node.</w:t>
             </w:r>
           </w:p>
         </w:tc>
@@ -7537,6 +7549,60 @@
               <w:rPr>
                 <w:rStyle w:val="VerbatimChar"/>
               </w:rPr>
+              <w:t xml:space="preserve">--node id</w:t>
+            </w:r>
+          </w:p>
+        </w:tc>
+        <w:tc>
+          <w:tcPr/>
+          <w:p>
+            <w:pPr>
+              <w:pStyle w:val="Compact"/>
+            </w:pPr>
+            <w:r>
+              <w:t xml:space="preserve">Check one configured node at the alternative landing page given with</w:t>
+            </w:r>
+            <w:r>
+              <w:t xml:space="preserve"> </w:t>
+            </w:r>
+            <w:r>
+              <w:rPr>
+                <w:rStyle w:val="VerbatimChar"/>
+              </w:rPr>
+              <w:t xml:space="preserve">--url</w:t>
+            </w:r>
+            <w:r>
+              <w:t xml:space="preserve">, keeping its id, name and</w:t>
+            </w:r>
+            <w:r>
+              <w:t xml:space="preserve"> </w:t>
+            </w:r>
+            <w:r>
+              <w:rPr>
+                <w:rStyle w:val="VerbatimChar"/>
+              </w:rPr>
+              <w:t xml:space="preserve">eosc_page</w:t>
+            </w:r>
+            <w:r>
+              <w:t xml:space="preserve">. See below.</w:t>
+            </w:r>
+          </w:p>
+        </w:tc>
+      </w:tr>
+      <w:tr>
+        <w:trPr>
+          <w:cantSplit/>
+        </w:trPr>
+        <w:tc>
+          <w:tcPr/>
+          <w:p>
+            <w:pPr>
+              <w:pStyle w:val="Compact"/>
+            </w:pPr>
+            <w:r>
+              <w:rPr>
+                <w:rStyle w:val="VerbatimChar"/>
+              </w:rPr>
               <w:t xml:space="preserve">--eosc-page URL</w:t>
             </w:r>
           </w:p>
@@ -7575,7 +7641,19 @@
               <w:t xml:space="preserve"> </w:t>
             </w:r>
             <w:r>
-              <w:t xml:space="preserve">page, so a point 4 failure can name the exact URL that is missing.</w:t>
+              <w:t xml:space="preserve">page, so a point 4 failure can name the exact URL that is missing. With</w:t>
+            </w:r>
+            <w:r>
+              <w:t xml:space="preserve"> </w:t>
+            </w:r>
+            <w:r>
+              <w:rPr>
+                <w:rStyle w:val="VerbatimChar"/>
+              </w:rPr>
+              <w:t xml:space="preserve">--node</w:t>
+            </w:r>
+            <w:r>
+              <w:t xml:space="preserve">, replaces that node's configured one.</w:t>
             </w:r>
           </w:p>
         </w:tc>
@@ -9402,6 +9480,680 @@
         <w:t xml:space="preserve">stray single-page file that looks official is a genuine hazard.</w:t>
       </w:r>
     </w:p>
+    <w:bookmarkEnd w:id="33"/>
+    <w:bookmarkStart w:id="34" w:name="checking-a-node-at-an-alternative-url"/>
+    <w:p>
+      <w:pPr>
+        <w:pStyle w:val="Heading3"/>
+      </w:pPr>
+      <w:r>
+        <w:t xml:space="preserve">Checking a node at an alternative URL</w:t>
+      </w:r>
+    </w:p>
+    <w:p>
+      <w:pPr>
+        <w:pStyle w:val="FirstParagraph"/>
+      </w:pPr>
+      <w:r>
+        <w:t xml:space="preserve">To run every test against one configured node at a landing page other than the</w:t>
+      </w:r>
+      <w:r>
+        <w:t xml:space="preserve"> </w:t>
+      </w:r>
+      <w:r>
+        <w:t xml:space="preserve">one in</w:t>
+      </w:r>
+      <w:r>
+        <w:t xml:space="preserve"> </w:t>
+      </w:r>
+      <w:r>
+        <w:rPr>
+          <w:rStyle w:val="VerbatimChar"/>
+        </w:rPr>
+        <w:t xml:space="preserve">nodes.yaml</w:t>
+      </w:r>
+      <w:r>
+        <w:t xml:space="preserve">, give the node with</w:t>
+      </w:r>
+      <w:r>
+        <w:t xml:space="preserve"> </w:t>
+      </w:r>
+      <w:r>
+        <w:rPr>
+          <w:rStyle w:val="VerbatimChar"/>
+        </w:rPr>
+        <w:t xml:space="preserve">--node</w:t>
+      </w:r>
+      <w:r>
+        <w:t xml:space="preserve"> </w:t>
+      </w:r>
+      <w:r>
+        <w:t xml:space="preserve">and the page with</w:t>
+      </w:r>
+      <w:r>
+        <w:t xml:space="preserve"> </w:t>
+      </w:r>
+      <w:r>
+        <w:rPr>
+          <w:rStyle w:val="VerbatimChar"/>
+        </w:rPr>
+        <w:t xml:space="preserve">--url</w:t>
+      </w:r>
+      <w:r>
+        <w:t xml:space="preserve">:</w:t>
+      </w:r>
+    </w:p>
+    <w:p>
+      <w:pPr>
+        <w:pStyle w:val="SourceCode"/>
+      </w:pPr>
+      <w:r>
+        <w:rPr>
+          <w:rStyle w:val="ExtensionTok"/>
+        </w:rPr>
+        <w:t xml:space="preserve">uv</w:t>
+      </w:r>
+      <w:r>
+        <w:rPr>
+          <w:rStyle w:val="NormalTok"/>
+        </w:rPr>
+        <w:t xml:space="preserve"> run basic-check run </w:t>
+      </w:r>
+      <w:r>
+        <w:rPr>
+          <w:rStyle w:val="AttributeTok"/>
+        </w:rPr>
+        <w:t xml:space="preserve">--node</w:t>
+      </w:r>
+      <w:r>
+        <w:rPr>
+          <w:rStyle w:val="NormalTok"/>
+        </w:rPr>
+        <w:t xml:space="preserve"> bbmri-eric </w:t>
+      </w:r>
+      <w:r>
+        <w:rPr>
+          <w:rStyle w:val="AttributeTok"/>
+        </w:rPr>
+        <w:t xml:space="preserve">--url</w:t>
+      </w:r>
+      <w:r>
+        <w:rPr>
+          <w:rStyle w:val="NormalTok"/>
+        </w:rPr>
+        <w:t xml:space="preserve"> https://alt.example.org/eosc-node-bbmri-eric/</w:t>
+      </w:r>
+      <w:r>
+        <w:br/>
+      </w:r>
+      <w:r>
+        <w:rPr>
+          <w:rStyle w:val="ExtensionTok"/>
+        </w:rPr>
+        <w:t xml:space="preserve">uv</w:t>
+      </w:r>
+      <w:r>
+        <w:rPr>
+          <w:rStyle w:val="NormalTok"/>
+        </w:rPr>
+        <w:t xml:space="preserve"> run basic-check show bbmri-eric </w:t>
+      </w:r>
+      <w:r>
+        <w:rPr>
+          <w:rStyle w:val="AttributeTok"/>
+        </w:rPr>
+        <w:t xml:space="preserve">--one-off</w:t>
+      </w:r>
+    </w:p>
+    <w:p>
+      <w:pPr>
+        <w:pStyle w:val="FirstParagraph"/>
+      </w:pPr>
+      <w:r>
+        <w:t xml:space="preserve">The node keeps its id, name and</w:t>
+      </w:r>
+      <w:r>
+        <w:t xml:space="preserve"> </w:t>
+      </w:r>
+      <w:r>
+        <w:rPr>
+          <w:rStyle w:val="VerbatimChar"/>
+        </w:rPr>
+        <w:t xml:space="preserve">eosc_page</w:t>
+      </w:r>
+      <w:r>
+        <w:t xml:space="preserve">, so its scoped approved name</w:t>
+      </w:r>
+      <w:r>
+        <w:t xml:space="preserve"> </w:t>
+      </w:r>
+      <w:r>
+        <w:t xml:space="preserve">applies to point 3 and point 4 looks for its own</w:t>
+      </w:r>
+      <w:r>
+        <w:t xml:space="preserve"> </w:t>
+      </w:r>
+      <w:r>
+        <w:rPr>
+          <w:rStyle w:val="VerbatimChar"/>
+        </w:rPr>
+        <w:t xml:space="preserve">eosc.eu</w:t>
+      </w:r>
+      <w:r>
+        <w:t xml:space="preserve"> </w:t>
+      </w:r>
+      <w:r>
+        <w:t xml:space="preserve">page; only the page</w:t>
+      </w:r>
+      <w:r>
+        <w:t xml:space="preserve"> </w:t>
+      </w:r>
+      <w:r>
+        <w:t xml:space="preserve">fetched changes, and</w:t>
+      </w:r>
+      <w:r>
+        <w:t xml:space="preserve"> </w:t>
+      </w:r>
+      <w:r>
+        <w:rPr>
+          <w:rStyle w:val="VerbatimChar"/>
+        </w:rPr>
+        <w:t xml:space="preserve">nodes.yaml</w:t>
+      </w:r>
+      <w:r>
+        <w:t xml:space="preserve"> </w:t>
+      </w:r>
+      <w:r>
+        <w:t xml:space="preserve">is not edited.</w:t>
+      </w:r>
+      <w:r>
+        <w:t xml:space="preserve"> </w:t>
+      </w:r>
+      <w:r>
+        <w:rPr>
+          <w:rStyle w:val="VerbatimChar"/>
+        </w:rPr>
+        <w:t xml:space="preserve">--node</w:t>
+      </w:r>
+      <w:r>
+        <w:t xml:space="preserve"> </w:t>
+      </w:r>
+      <w:r>
+        <w:t xml:space="preserve">takes an id or a name</w:t>
+      </w:r>
+      <w:r>
+        <w:t xml:space="preserve"> </w:t>
+      </w:r>
+      <w:r>
+        <w:t xml:space="preserve">in any case, as</w:t>
+      </w:r>
+      <w:r>
+        <w:t xml:space="preserve"> </w:t>
+      </w:r>
+      <w:r>
+        <w:rPr>
+          <w:rStyle w:val="VerbatimChar"/>
+        </w:rPr>
+        <w:t xml:space="preserve">--skip</w:t>
+      </w:r>
+      <w:r>
+        <w:t xml:space="preserve"> </w:t>
+      </w:r>
+      <w:r>
+        <w:t xml:space="preserve">does.</w:t>
+      </w:r>
+    </w:p>
+    <w:tbl>
+      <w:tblPr>
+        <w:tblStyle w:val="Table"/>
+        <w:tblW w:type="pct" w:w="5000"/>
+        <w:tblLayout w:type="fixed"/>
+        <w:tblLook w:firstRow="1" w:lastRow="0" w:firstColumn="0" w:lastColumn="0" w:noHBand="0" w:noVBand="0" w:val="0020"/>
+      </w:tblPr>
+      <w:tblGrid>
+        <w:gridCol w:w="3960"/>
+        <w:gridCol w:w="3960"/>
+      </w:tblGrid>
+      <w:tr>
+        <w:trPr>
+          <w:cantSplit/>
+          <w:tblHeader w:val="on"/>
+        </w:trPr>
+        <w:tc>
+          <w:tcPr/>
+          <w:p>
+            <w:pPr>
+              <w:pStyle w:val="Compact"/>
+            </w:pPr>
+            <w:r>
+              <w:t xml:space="preserve">Rule</w:t>
+            </w:r>
+          </w:p>
+        </w:tc>
+        <w:tc>
+          <w:tcPr/>
+          <w:p>
+            <w:pPr>
+              <w:pStyle w:val="Compact"/>
+            </w:pPr>
+            <w:r>
+              <w:t xml:space="preserve">Why</w:t>
+            </w:r>
+          </w:p>
+        </w:tc>
+      </w:tr>
+      <w:tr>
+        <w:trPr>
+          <w:cantSplit/>
+        </w:trPr>
+        <w:tc>
+          <w:tcPr/>
+          <w:p>
+            <w:pPr>
+              <w:pStyle w:val="Compact"/>
+            </w:pPr>
+            <w:r>
+              <w:t xml:space="preserve">Exactly one</w:t>
+            </w:r>
+            <w:r>
+              <w:t xml:space="preserve"> </w:t>
+            </w:r>
+            <w:r>
+              <w:rPr>
+                <w:rStyle w:val="VerbatimChar"/>
+              </w:rPr>
+              <w:t xml:space="preserve">--url</w:t>
+            </w:r>
+          </w:p>
+        </w:tc>
+        <w:tc>
+          <w:tcPr/>
+          <w:p>
+            <w:pPr>
+              <w:pStyle w:val="Compact"/>
+            </w:pPr>
+            <w:r>
+              <w:t xml:space="preserve">It is the alternative page for that one node. Without</w:t>
+            </w:r>
+            <w:r>
+              <w:t xml:space="preserve"> </w:t>
+            </w:r>
+            <w:r>
+              <w:rPr>
+                <w:rStyle w:val="VerbatimChar"/>
+              </w:rPr>
+              <w:t xml:space="preserve">--url</w:t>
+            </w:r>
+            <w:r>
+              <w:t xml:space="preserve">, use</w:t>
+            </w:r>
+            <w:r>
+              <w:t xml:space="preserve"> </w:t>
+            </w:r>
+            <w:r>
+              <w:rPr>
+                <w:rStyle w:val="VerbatimChar"/>
+              </w:rPr>
+              <w:t xml:space="preserve">--only</w:t>
+            </w:r>
+            <w:r>
+              <w:t xml:space="preserve"> </w:t>
+            </w:r>
+            <w:r>
+              <w:t xml:space="preserve">to check the node at its configured page.</w:t>
+            </w:r>
+          </w:p>
+        </w:tc>
+      </w:tr>
+      <w:tr>
+        <w:trPr>
+          <w:cantSplit/>
+        </w:trPr>
+        <w:tc>
+          <w:tcPr/>
+          <w:p>
+            <w:pPr>
+              <w:pStyle w:val="Compact"/>
+            </w:pPr>
+            <w:r>
+              <w:t xml:space="preserve">Not with</w:t>
+            </w:r>
+            <w:r>
+              <w:t xml:space="preserve"> </w:t>
+            </w:r>
+            <w:r>
+              <w:rPr>
+                <w:rStyle w:val="VerbatimChar"/>
+              </w:rPr>
+              <w:t xml:space="preserve">--only</w:t>
+            </w:r>
+            <w:r>
+              <w:t xml:space="preserve"> </w:t>
+            </w:r>
+            <w:r>
+              <w:t xml:space="preserve">or</w:t>
+            </w:r>
+            <w:r>
+              <w:t xml:space="preserve"> </w:t>
+            </w:r>
+            <w:r>
+              <w:rPr>
+                <w:rStyle w:val="VerbatimChar"/>
+              </w:rPr>
+              <w:t xml:space="preserve">--skip</w:t>
+            </w:r>
+          </w:p>
+        </w:tc>
+        <w:tc>
+          <w:tcPr/>
+          <w:p>
+            <w:pPr>
+              <w:pStyle w:val="Compact"/>
+            </w:pPr>
+            <w:r>
+              <w:t xml:space="preserve">The run is already one node; either would be ignored or contradict it.</w:t>
+            </w:r>
+          </w:p>
+        </w:tc>
+      </w:tr>
+      <w:tr>
+        <w:trPr>
+          <w:cantSplit/>
+        </w:trPr>
+        <w:tc>
+          <w:tcPr/>
+          <w:p>
+            <w:pPr>
+              <w:pStyle w:val="Compact"/>
+            </w:pPr>
+            <w:r>
+              <w:t xml:space="preserve">Writes to</w:t>
+            </w:r>
+            <w:r>
+              <w:t xml:space="preserve"> </w:t>
+            </w:r>
+            <w:r>
+              <w:rPr>
+                <w:rStyle w:val="VerbatimChar"/>
+              </w:rPr>
+              <w:t xml:space="preserve">results/one-off/</w:t>
+            </w:r>
+            <w:r>
+              <w:t xml:space="preserve">, or another</w:t>
+            </w:r>
+            <w:r>
+              <w:t xml:space="preserve"> </w:t>
+            </w:r>
+            <w:r>
+              <w:rPr>
+                <w:rStyle w:val="VerbatimChar"/>
+              </w:rPr>
+              <w:t xml:space="preserve">--results</w:t>
+            </w:r>
+            <w:r>
+              <w:t xml:space="preserve"> </w:t>
+            </w:r>
+            <w:r>
+              <w:t xml:space="preserve">folder</w:t>
+            </w:r>
+          </w:p>
+        </w:tc>
+        <w:tc>
+          <w:tcPr/>
+          <w:p>
+            <w:pPr>
+              <w:pStyle w:val="Compact"/>
+            </w:pPr>
+            <w:r>
+              <w:rPr>
+                <w:rStyle w:val="VerbatimChar"/>
+              </w:rPr>
+              <w:t xml:space="preserve">--results results/</w:t>
+            </w:r>
+            <w:r>
+              <w:t xml:space="preserve"> </w:t>
+            </w:r>
+            <w:r>
+              <w:t xml:space="preserve">is refused: the evidence file is named after the node id and would replace the reviewed evidence.</w:t>
+            </w:r>
+          </w:p>
+        </w:tc>
+      </w:tr>
+      <w:tr>
+        <w:trPr>
+          <w:cantSplit/>
+        </w:trPr>
+        <w:tc>
+          <w:tcPr/>
+          <w:p>
+            <w:pPr>
+              <w:pStyle w:val="Compact"/>
+            </w:pPr>
+            <w:r>
+              <w:rPr>
+                <w:rStyle w:val="VerbatimChar"/>
+              </w:rPr>
+              <w:t xml:space="preserve">--eosc-page</w:t>
+            </w:r>
+            <w:r>
+              <w:t xml:space="preserve"> </w:t>
+            </w:r>
+            <w:r>
+              <w:t xml:space="preserve">replaces the node's</w:t>
+            </w:r>
+            <w:r>
+              <w:t xml:space="preserve"> </w:t>
+            </w:r>
+            <w:r>
+              <w:rPr>
+                <w:rStyle w:val="VerbatimChar"/>
+              </w:rPr>
+              <w:t xml:space="preserve">eosc.eu</w:t>
+            </w:r>
+            <w:r>
+              <w:t xml:space="preserve"> </w:t>
+            </w:r>
+            <w:r>
+              <w:t xml:space="preserve">page</w:t>
+            </w:r>
+          </w:p>
+        </w:tc>
+        <w:tc>
+          <w:tcPr/>
+          <w:p>
+            <w:pPr>
+              <w:pStyle w:val="Compact"/>
+            </w:pPr>
+            <w:r>
+              <w:t xml:space="preserve">For a trial of a changed registration as well as a changed page.</w:t>
+            </w:r>
+          </w:p>
+        </w:tc>
+      </w:tr>
+    </w:tbl>
+    <w:p>
+      <w:pPr>
+        <w:pStyle w:val="BodyText"/>
+      </w:pPr>
+      <w:r>
+        <w:t xml:space="preserve">The reports are titled</w:t>
+      </w:r>
+      <w:r>
+        <w:t xml:space="preserve"> </w:t>
+      </w:r>
+      <w:r>
+        <w:rPr>
+          <w:b/>
+          <w:bCs/>
+        </w:rPr>
+        <w:t xml:space="preserve">Alternative URL check (not a federation run)</w:t>
+      </w:r>
+      <w:r>
+        <w:t xml:space="preserve"> </w:t>
+      </w:r>
+      <w:r>
+        <w:t xml:space="preserve">and</w:t>
+      </w:r>
+      <w:r>
+        <w:t xml:space="preserve"> </w:t>
+      </w:r>
+      <w:r>
+        <w:t xml:space="preserve">carry an</w:t>
+      </w:r>
+      <w:r>
+        <w:t xml:space="preserve"> </w:t>
+      </w:r>
+      <w:r>
+        <w:rPr>
+          <w:b/>
+          <w:bCs/>
+        </w:rPr>
+        <w:t xml:space="preserve">Alternative URL, not a federation run</w:t>
+      </w:r>
+      <w:r>
+        <w:t xml:space="preserve"> </w:t>
+      </w:r>
+      <w:r>
+        <w:t xml:space="preserve">banner naming both</w:t>
+      </w:r>
+      <w:r>
+        <w:t xml:space="preserve"> </w:t>
+      </w:r>
+      <w:r>
+        <w:t xml:space="preserve">addresses;</w:t>
+      </w:r>
+      <w:r>
+        <w:t xml:space="preserve"> </w:t>
+      </w:r>
+      <w:r>
+        <w:rPr>
+          <w:rStyle w:val="VerbatimChar"/>
+        </w:rPr>
+        <w:t xml:space="preserve">results.json</w:t>
+      </w:r>
+      <w:r>
+        <w:t xml:space="preserve"> </w:t>
+      </w:r>
+      <w:r>
+        <w:t xml:space="preserve">records the pair under</w:t>
+      </w:r>
+      <w:r>
+        <w:t xml:space="preserve"> </w:t>
+      </w:r>
+      <w:r>
+        <w:rPr>
+          <w:rStyle w:val="VerbatimChar"/>
+        </w:rPr>
+        <w:t xml:space="preserve">alternative_url</w:t>
+      </w:r>
+      <w:r>
+        <w:t xml:space="preserve">, each node</w:t>
+      </w:r>
+      <w:r>
+        <w:t xml:space="preserve"> </w:t>
+      </w:r>
+      <w:r>
+        <w:t xml:space="preserve">record keeps</w:t>
+      </w:r>
+      <w:r>
+        <w:t xml:space="preserve"> </w:t>
+      </w:r>
+      <w:r>
+        <w:rPr>
+          <w:rStyle w:val="VerbatimChar"/>
+        </w:rPr>
+        <w:t xml:space="preserve">configured_url</w:t>
+      </w:r>
+      <w:r>
+        <w:t xml:space="preserve">, and</w:t>
+      </w:r>
+      <w:r>
+        <w:t xml:space="preserve"> </w:t>
+      </w:r>
+      <w:r>
+        <w:rPr>
+          <w:rStyle w:val="VerbatimChar"/>
+        </w:rPr>
+        <w:t xml:space="preserve">show</w:t>
+      </w:r>
+      <w:r>
+        <w:t xml:space="preserve"> </w:t>
+      </w:r>
+      <w:r>
+        <w:t xml:space="preserve">prints both. If the same evidence is</w:t>
+      </w:r>
+      <w:r>
+        <w:t xml:space="preserve"> </w:t>
+      </w:r>
+      <w:r>
+        <w:t xml:space="preserve">later assessed without</w:t>
+      </w:r>
+      <w:r>
+        <w:t xml:space="preserve"> </w:t>
+      </w:r>
+      <w:r>
+        <w:rPr>
+          <w:rStyle w:val="VerbatimChar"/>
+        </w:rPr>
+        <w:t xml:space="preserve">--node</w:t>
+      </w:r>
+      <w:r>
+        <w:t xml:space="preserve">, the usual</w:t>
+      </w:r>
+      <w:r>
+        <w:t xml:space="preserve"> </w:t>
+      </w:r>
+      <w:r>
+        <w:rPr>
+          <w:b/>
+          <w:bCs/>
+        </w:rPr>
+        <w:t xml:space="preserve">Evidence from a different URL</w:t>
+      </w:r>
+      <w:r>
+        <w:t xml:space="preserve"> </w:t>
+      </w:r>
+      <w:r>
+        <w:t xml:space="preserve">warning appears, so it cannot pass as the configured page.</w:t>
+      </w:r>
+    </w:p>
+    <w:p>
+      <w:pPr>
+        <w:pStyle w:val="BodyText"/>
+      </w:pPr>
+      <w:r>
+        <w:t xml:space="preserve">This is the way to try a node's new address before changing</w:t>
+      </w:r>
+      <w:r>
+        <w:t xml:space="preserve"> </w:t>
+      </w:r>
+      <w:r>
+        <w:rPr>
+          <w:rStyle w:val="VerbatimChar"/>
+        </w:rPr>
+        <w:t xml:space="preserve">nodes.yaml</w:t>
+      </w:r>
+      <w:r>
+        <w:t xml:space="preserve"> </w:t>
+      </w:r>
+      <w:r>
+        <w:t xml:space="preserve">(</w:t>
+      </w:r>
+      <w:hyperlink w:anchor="Xe23e918a40335caa5ab24e15a733d1ac9e4c070">
+        <w:r>
+          <w:rPr>
+            <w:rStyle w:val="Hyperlink"/>
+          </w:rPr>
+          <w:t xml:space="preserve">example 2</w:t>
+        </w:r>
+      </w:hyperlink>
+      <w:r>
+        <w:t xml:space="preserve"> </w:t>
+      </w:r>
+      <w:r>
+        <w:t xml:space="preserve">in section 11).</w:t>
+      </w:r>
+    </w:p>
     <w:p>
       <w:r>
         <w:pict>
@@ -9409,9 +10161,9 @@
         </w:pict>
       </w:r>
     </w:p>
-    <w:bookmarkEnd w:id="33"/>
     <w:bookmarkEnd w:id="34"/>
-    <w:bookmarkStart w:id="36" w:name="how-deep-to-go---depth"/>
+    <w:bookmarkEnd w:id="35"/>
+    <w:bookmarkStart w:id="37" w:name="how-deep-to-go---depth"/>
     <w:p>
       <w:pPr>
         <w:pStyle w:val="Heading2"/>
@@ -9980,7 +10732,7 @@
         <w:t xml:space="preserve">federation or a later date.</w:t>
       </w:r>
     </w:p>
-    <w:bookmarkStart w:id="35" w:name="X2a91d9b1ee4bf6327b51d59c91d7740875558d5"/>
+    <w:bookmarkStart w:id="36" w:name="X2a91d9b1ee4bf6327b51d59c91d7740875558d5"/>
     <w:p>
       <w:pPr>
         <w:pStyle w:val="Heading3"/>
@@ -10177,9 +10929,9 @@
         </w:pict>
       </w:r>
     </w:p>
-    <w:bookmarkEnd w:id="35"/>
     <w:bookmarkEnd w:id="36"/>
-    <w:bookmarkStart w:id="40" w:name="reading-the-output"/>
+    <w:bookmarkEnd w:id="37"/>
+    <w:bookmarkStart w:id="41" w:name="reading-the-output"/>
     <w:p>
       <w:pPr>
         <w:pStyle w:val="Heading2"/>
@@ -10508,7 +11260,7 @@
         </w:tc>
       </w:tr>
     </w:tbl>
-    <w:bookmarkStart w:id="37" w:name="the-four-verdicts"/>
+    <w:bookmarkStart w:id="38" w:name="the-four-verdicts"/>
     <w:p>
       <w:pPr>
         <w:pStyle w:val="Heading3"/>
@@ -10959,8 +11711,8 @@
         <w:t xml:space="preserve">instead of four honest abstentions.</w:t>
       </w:r>
     </w:p>
-    <w:bookmarkEnd w:id="37"/>
-    <w:bookmarkStart w:id="38" w:name="reproducing-a-verdict-by-hand"/>
+    <w:bookmarkEnd w:id="38"/>
+    <w:bookmarkStart w:id="39" w:name="reproducing-a-verdict-by-hand"/>
     <w:p>
       <w:pPr>
         <w:pStyle w:val="Heading3"/>
@@ -11144,8 +11896,8 @@
         <w:t xml:space="preserve">a verdict surprises you.</w:t>
       </w:r>
     </w:p>
-    <w:bookmarkEnd w:id="38"/>
-    <w:bookmarkStart w:id="39" w:name="personal-data-is-masked"/>
+    <w:bookmarkEnd w:id="39"/>
+    <w:bookmarkStart w:id="40" w:name="personal-data-is-masked"/>
     <w:p>
       <w:pPr>
         <w:pStyle w:val="Heading3"/>
@@ -12042,9 +12794,9 @@
         </w:pict>
       </w:r>
     </w:p>
-    <w:bookmarkEnd w:id="39"/>
     <w:bookmarkEnd w:id="40"/>
-    <w:bookmarkStart w:id="43" w:name="the-test-suite"/>
+    <w:bookmarkEnd w:id="41"/>
+    <w:bookmarkStart w:id="44" w:name="the-test-suite"/>
     <w:p>
       <w:pPr>
         <w:pStyle w:val="Heading2"/>
@@ -12085,7 +12837,7 @@
         <w:rPr>
           <w:rStyle w:val="CommentTok"/>
         </w:rPr>
-        <w:t xml:space="preserve"># 339 tests, offline, a few seconds</w:t>
+        <w:t xml:space="preserve"># 357 tests, offline, a few seconds</w:t>
       </w:r>
       <w:r>
         <w:br/>
@@ -12750,7 +13502,7 @@
       <w:r>
         <w:t xml:space="preserve"> </w:t>
       </w:r>
-      <w:hyperlink r:id="rId41">
+      <w:hyperlink r:id="rId42">
         <w:r>
           <w:rPr>
             <w:rStyle w:val="Hyperlink"/>
@@ -12814,7 +13566,7 @@
         <w:t xml:space="preserve">test_a_pipe_in_a_url_cannot_break_the_table</w:t>
       </w:r>
     </w:p>
-    <w:bookmarkStart w:id="42" w:name="a-note-on-what-a-passing-suite-means"/>
+    <w:bookmarkStart w:id="43" w:name="a-note-on-what-a-passing-suite-means"/>
     <w:p>
       <w:pPr>
         <w:pStyle w:val="Heading3"/>
@@ -12891,9 +13643,9 @@
         </w:pict>
       </w:r>
     </w:p>
-    <w:bookmarkEnd w:id="42"/>
     <w:bookmarkEnd w:id="43"/>
-    <w:bookmarkStart w:id="44" w:name="continuous-integration"/>
+    <w:bookmarkEnd w:id="44"/>
+    <w:bookmarkStart w:id="45" w:name="continuous-integration"/>
     <w:p>
       <w:pPr>
         <w:pStyle w:val="Heading2"/>
@@ -13593,8 +14345,8 @@
         </w:pict>
       </w:r>
     </w:p>
-    <w:bookmarkEnd w:id="44"/>
-    <w:bookmarkStart w:id="45" w:name="troubleshooting"/>
+    <w:bookmarkEnd w:id="45"/>
+    <w:bookmarkStart w:id="46" w:name="troubleshooting"/>
     <w:p>
       <w:pPr>
         <w:pStyle w:val="Heading2"/>
@@ -14799,8 +15551,8 @@
         </w:pict>
       </w:r>
     </w:p>
-    <w:bookmarkEnd w:id="45"/>
-    <w:bookmarkStart w:id="46" w:name="extending-it"/>
+    <w:bookmarkEnd w:id="46"/>
+    <w:bookmarkStart w:id="47" w:name="extending-it"/>
     <w:p>
       <w:pPr>
         <w:pStyle w:val="Heading2"/>
@@ -15434,8 +16186,8 @@
         <w:t xml:space="preserve">checklist transcription, so none of it is under this module's control.</w:t>
       </w:r>
     </w:p>
-    <w:bookmarkEnd w:id="46"/>
-    <w:bookmarkStart w:id="50" w:name="worked-examples"/>
+    <w:bookmarkEnd w:id="47"/>
+    <w:bookmarkStart w:id="51" w:name="worked-examples"/>
     <w:p>
       <w:pPr>
         <w:pStyle w:val="Heading2"/>
@@ -15732,7 +16484,7 @@
         <w:t xml:space="preserve">own run.</w:t>
       </w:r>
     </w:p>
-    <w:bookmarkStart w:id="47" w:name="X073cb44b8dc5d29e47f376bc008b8613dd82a6a"/>
+    <w:bookmarkStart w:id="48" w:name="X073cb44b8dc5d29e47f376bc008b8613dd82a6a"/>
     <w:p>
       <w:pPr>
         <w:pStyle w:val="Heading3"/>
@@ -17440,8 +18192,8 @@
         <w:t xml:space="preserve"> push</w:t>
       </w:r>
     </w:p>
-    <w:bookmarkEnd w:id="47"/>
-    <w:bookmarkStart w:id="48" w:name="Xe23e918a40335caa5ab24e15a733d1ac9e4c070"/>
+    <w:bookmarkEnd w:id="48"/>
+    <w:bookmarkStart w:id="49" w:name="Xe23e918a40335caa5ab24e15a733d1ac9e4c070"/>
     <w:p>
       <w:pPr>
         <w:pStyle w:val="Heading3"/>
@@ -18554,8 +19306,8 @@
         <w:t xml:space="preserve">the documents together.</w:t>
       </w:r>
     </w:p>
-    <w:bookmarkEnd w:id="48"/>
-    <w:bookmarkStart w:id="49" w:name="Xa570dceeae7de3d84789b8e054a5bbb043a3946"/>
+    <w:bookmarkEnd w:id="49"/>
+    <w:bookmarkStart w:id="50" w:name="Xa570dceeae7de3d84789b8e054a5bbb043a3946"/>
     <w:p>
       <w:pPr>
         <w:pStyle w:val="Heading3"/>
@@ -20557,9 +21309,9 @@
         </w:pict>
       </w:r>
     </w:p>
-    <w:bookmarkEnd w:id="49"/>
     <w:bookmarkEnd w:id="50"/>
-    <w:bookmarkStart w:id="51" w:name="sources"/>
+    <w:bookmarkEnd w:id="51"/>
+    <w:bookmarkStart w:id="52" w:name="sources"/>
     <w:p>
       <w:pPr>
         <w:pStyle w:val="Heading2"/>
@@ -20664,7 +21416,7 @@
         <w:t xml:space="preserve">Playwright for Python: https://playwright.dev/python/</w:t>
       </w:r>
     </w:p>
-    <w:bookmarkEnd w:id="51"/>
+    <w:bookmarkEnd w:id="52"/>
     <w:sectPr>
       <w:footnotePr>
         <w:numRestart w:val="eachSect"/>

</xml_diff>

<commit_message>
Docs: Word/PDF copies rebuilt from 44261dd (--list-nodes-ids, --show-node); verification commit references updated
</commit_message>
<xml_diff>
--- a/docs/eosc-basic-compliance-guide.docx
+++ b/docs/eosc-basic-compliance-guide.docx
@@ -23,7 +23,7 @@
         <w:pStyle w:val="Author"/>
       </w:pPr>
       <w:r>
-        <w:t xml:space="preserve">Verified against a clean clone on 26 September 2026 — documentation commit 51a5332</w:t>
+        <w:t xml:space="preserve">Verified against a clean clone on 26 September 2026 — documentation commit 44261dd</w:t>
       </w:r>
     </w:p>
     <w:p>
@@ -180,7 +180,7 @@
         <w:rPr>
           <w:rStyle w:val="VerbatimChar"/>
         </w:rPr>
-        <w:t xml:space="preserve">51a5332</w:t>
+        <w:t xml:space="preserve">44261dd</w:t>
       </w:r>
       <w:r>
         <w:t xml:space="preserve"> </w:t>
@@ -1551,7 +1551,7 @@
         <w:t xml:space="preserve"> </w:t>
       </w:r>
       <w:r>
-        <w:t xml:space="preserve">369 tests still pass, while</w:t>
+        <w:t xml:space="preserve">379 tests still pass, while</w:t>
       </w:r>
       <w:r>
         <w:t xml:space="preserve"> </w:t>
@@ -1623,7 +1623,7 @@
         <w:rPr>
           <w:rStyle w:val="CommentTok"/>
         </w:rPr>
-        <w:t xml:space="preserve"># expect: 369 passed</w:t>
+        <w:t xml:space="preserve"># expect: 379 passed</w:t>
       </w:r>
       <w:r>
         <w:br/>
@@ -6986,7 +6986,7 @@
         <w:pStyle w:val="FirstParagraph"/>
       </w:pPr>
       <w:r>
-        <w:t xml:space="preserve">Four flags on</w:t>
+        <w:t xml:space="preserve">Six flags on</w:t>
       </w:r>
       <w:r>
         <w:t xml:space="preserve"> </w:t>
@@ -7063,6 +7063,39 @@
         <w:rPr>
           <w:rStyle w:val="AttributeTok"/>
         </w:rPr>
+        <w:t xml:space="preserve">--list-nodes-ids</w:t>
+      </w:r>
+      <w:r>
+        <w:rPr>
+          <w:rStyle w:val="NormalTok"/>
+        </w:rPr>
+        <w:t xml:space="preserve">         </w:t>
+      </w:r>
+      <w:r>
+        <w:rPr>
+          <w:rStyle w:val="CommentTok"/>
+        </w:rPr>
+        <w:t xml:space="preserve"># the same, under a second name</w:t>
+      </w:r>
+      <w:r>
+        <w:br/>
+      </w:r>
+      <w:r>
+        <w:rPr>
+          <w:rStyle w:val="ExtensionTok"/>
+        </w:rPr>
+        <w:t xml:space="preserve">uv</w:t>
+      </w:r>
+      <w:r>
+        <w:rPr>
+          <w:rStyle w:val="NormalTok"/>
+        </w:rPr>
+        <w:t xml:space="preserve"> run basic-check </w:t>
+      </w:r>
+      <w:r>
+        <w:rPr>
+          <w:rStyle w:val="AttributeTok"/>
+        </w:rPr>
         <w:t xml:space="preserve">--list-nlps</w:t>
       </w:r>
       <w:r>
@@ -7142,6 +7175,39 @@
           <w:rStyle w:val="CommentTok"/>
         </w:rPr>
         <w:t xml:space="preserve"># all three in one table</w:t>
+      </w:r>
+      <w:r>
+        <w:br/>
+      </w:r>
+      <w:r>
+        <w:rPr>
+          <w:rStyle w:val="ExtensionTok"/>
+        </w:rPr>
+        <w:t xml:space="preserve">uv</w:t>
+      </w:r>
+      <w:r>
+        <w:rPr>
+          <w:rStyle w:val="NormalTok"/>
+        </w:rPr>
+        <w:t xml:space="preserve"> run basic-check </w:t>
+      </w:r>
+      <w:r>
+        <w:rPr>
+          <w:rStyle w:val="AttributeTok"/>
+        </w:rPr>
+        <w:t xml:space="preserve">--show-node</w:t>
+      </w:r>
+      <w:r>
+        <w:rPr>
+          <w:rStyle w:val="NormalTok"/>
+        </w:rPr>
+        <w:t xml:space="preserve"> bbmri-eric   </w:t>
+      </w:r>
+      <w:r>
+        <w:rPr>
+          <w:rStyle w:val="CommentTok"/>
+        </w:rPr>
+        <w:t xml:space="preserve"># one node's row of that table</w:t>
       </w:r>
     </w:p>
     <w:p>
@@ -7428,6 +7494,214 @@
       </w:r>
       <w:r>
         <w:t xml:space="preserve">unscoped, so each counts for every node."</w:t>
+      </w:r>
+    </w:p>
+    <w:p>
+      <w:pPr>
+        <w:pStyle w:val="BodyText"/>
+      </w:pPr>
+      <w:r>
+        <w:rPr>
+          <w:rStyle w:val="VerbatimChar"/>
+        </w:rPr>
+        <w:t xml:space="preserve">--show-node</w:t>
+      </w:r>
+      <w:r>
+        <w:t xml:space="preserve"> </w:t>
+      </w:r>
+      <w:r>
+        <w:t xml:space="preserve">takes one node, by id or by name in any case as</w:t>
+      </w:r>
+      <w:r>
+        <w:t xml:space="preserve"> </w:t>
+      </w:r>
+      <w:r>
+        <w:rPr>
+          <w:rStyle w:val="VerbatimChar"/>
+        </w:rPr>
+        <w:t xml:space="preserve">--skip</w:t>
+      </w:r>
+      <w:r>
+        <w:t xml:space="preserve"> </w:t>
+      </w:r>
+      <w:r>
+        <w:t xml:space="preserve">does</w:t>
+      </w:r>
+      <w:r>
+        <w:t xml:space="preserve"> </w:t>
+      </w:r>
+      <w:r>
+        <w:t xml:space="preserve">(</w:t>
+      </w:r>
+      <w:r>
+        <w:rPr>
+          <w:rStyle w:val="VerbatimChar"/>
+        </w:rPr>
+        <w:t xml:space="preserve">eosc-it</w:t>
+      </w:r>
+      <w:r>
+        <w:t xml:space="preserve">,</w:t>
+      </w:r>
+      <w:r>
+        <w:t xml:space="preserve"> </w:t>
+      </w:r>
+      <w:r>
+        <w:rPr>
+          <w:rStyle w:val="VerbatimChar"/>
+        </w:rPr>
+        <w:t xml:space="preserve">Italy</w:t>
+      </w:r>
+      <w:r>
+        <w:t xml:space="preserve">,</w:t>
+      </w:r>
+      <w:r>
+        <w:t xml:space="preserve"> </w:t>
+      </w:r>
+      <w:r>
+        <w:rPr>
+          <w:rStyle w:val="VerbatimChar"/>
+        </w:rPr>
+        <w:t xml:space="preserve">EOSC Node Italy</w:t>
+      </w:r>
+      <w:r>
+        <w:t xml:space="preserve">), and prints that node's row of the</w:t>
+      </w:r>
+      <w:r>
+        <w:t xml:space="preserve"> </w:t>
+      </w:r>
+      <w:r>
+        <w:t xml:space="preserve">table under the same header:</w:t>
+      </w:r>
+    </w:p>
+    <w:tbl>
+      <w:tblPr>
+        <w:tblStyle w:val="Table"/>
+        <w:tblW w:type="pct" w:w="5000"/>
+        <w:tblLayout w:type="fixed"/>
+        <w:tblLook w:firstRow="1" w:lastRow="0" w:firstColumn="0" w:lastColumn="0" w:noHBand="0" w:noVBand="0" w:val="0020"/>
+      </w:tblPr>
+      <w:tblGrid>
+        <w:gridCol w:w="2640"/>
+        <w:gridCol w:w="2640"/>
+        <w:gridCol w:w="2640"/>
+      </w:tblGrid>
+      <w:tr>
+        <w:trPr>
+          <w:cantSplit/>
+          <w:tblHeader w:val="on"/>
+        </w:trPr>
+        <w:tc>
+          <w:tcPr/>
+          <w:p>
+            <w:pPr>
+              <w:pStyle w:val="Compact"/>
+            </w:pPr>
+            <w:r>
+              <w:t xml:space="preserve">Node id</w:t>
+            </w:r>
+          </w:p>
+        </w:tc>
+        <w:tc>
+          <w:tcPr/>
+          <w:p>
+            <w:pPr>
+              <w:pStyle w:val="Compact"/>
+            </w:pPr>
+            <w:r>
+              <w:t xml:space="preserve">Node Landing Page URL</w:t>
+            </w:r>
+          </w:p>
+        </w:tc>
+        <w:tc>
+          <w:tcPr/>
+          <w:p>
+            <w:pPr>
+              <w:pStyle w:val="Compact"/>
+            </w:pPr>
+            <w:r>
+              <w:t xml:space="preserve">Approved name</w:t>
+            </w:r>
+          </w:p>
+        </w:tc>
+      </w:tr>
+      <w:tr>
+        <w:trPr>
+          <w:cantSplit/>
+        </w:trPr>
+        <w:tc>
+          <w:tcPr/>
+          <w:p>
+            <w:pPr>
+              <w:pStyle w:val="Compact"/>
+            </w:pPr>
+            <w:r>
+              <w:rPr>
+                <w:rStyle w:val="VerbatimChar"/>
+              </w:rPr>
+              <w:t xml:space="preserve">bbmri-eric</w:t>
+            </w:r>
+          </w:p>
+        </w:tc>
+        <w:tc>
+          <w:tcPr/>
+          <w:p>
+            <w:pPr>
+              <w:pStyle w:val="Compact"/>
+            </w:pPr>
+            <w:r>
+              <w:rPr>
+                <w:rStyle w:val="VerbatimChar"/>
+              </w:rPr>
+              <w:t xml:space="preserve">https://dev3.bbmri-eric.eu/eosc-node-bbmri-eric/</w:t>
+            </w:r>
+          </w:p>
+        </w:tc>
+        <w:tc>
+          <w:tcPr/>
+          <w:p>
+            <w:pPr>
+              <w:pStyle w:val="Compact"/>
+            </w:pPr>
+            <w:r>
+              <w:t xml:space="preserve">EOSC Node | BBMRI-ERIC</w:t>
+            </w:r>
+          </w:p>
+        </w:tc>
+      </w:tr>
+    </w:tbl>
+    <w:p>
+      <w:pPr>
+        <w:pStyle w:val="BodyText"/>
+      </w:pPr>
+      <w:r>
+        <w:t xml:space="preserve">A value that matches no node, or more than one, is an error that lists the ids.</w:t>
+      </w:r>
+      <w:r>
+        <w:t xml:space="preserve"> </w:t>
+      </w:r>
+      <w:r>
+        <w:rPr>
+          <w:rStyle w:val="VerbatimChar"/>
+        </w:rPr>
+        <w:t xml:space="preserve">--list-nodes-ids</w:t>
+      </w:r>
+      <w:r>
+        <w:t xml:space="preserve"> </w:t>
+      </w:r>
+      <w:r>
+        <w:t xml:space="preserve">is another name for</w:t>
+      </w:r>
+      <w:r>
+        <w:t xml:space="preserve"> </w:t>
+      </w:r>
+      <w:r>
+        <w:rPr>
+          <w:rStyle w:val="VerbatimChar"/>
+        </w:rPr>
+        <w:t xml:space="preserve">--list-nodes</w:t>
+      </w:r>
+      <w:r>
+        <w:t xml:space="preserve">, with the same output.</w:t>
       </w:r>
     </w:p>
     <w:p>
@@ -13468,7 +13742,7 @@
         <w:rPr>
           <w:rStyle w:val="CommentTok"/>
         </w:rPr>
-        <w:t xml:space="preserve"># 369 tests, offline, a few seconds</w:t>
+        <w:t xml:space="preserve"># 379 tests, offline, a few seconds</w:t>
       </w:r>
       <w:r>
         <w:br/>

</xml_diff>

<commit_message>
Checklist v3.2 (28 Sep 2026): item 5 now requires AUP/UAP linked from the NLP and in the Catalogue; web-11 evidence re-scored offline (49/14/67); docs and Word/PDF guides updated
</commit_message>
<xml_diff>
--- a/docs/eosc-basic-compliance-guide.docx
+++ b/docs/eosc-basic-compliance-guide.docx
@@ -23,7 +23,7 @@
         <w:pStyle w:val="Author"/>
       </w:pPr>
       <w:r>
-        <w:t xml:space="preserve">Verified against a clean clone on 26 September 2026 — rebuilt 28 September 2026</w:t>
+        <w:t xml:space="preserve">Verified against a clean clone on 26 September 2026 — rebuilt 29 September 2026 for checklist v3.2</w:t>
       </w:r>
     </w:p>
     <w:p>
@@ -112,13 +112,13 @@
           <w:b/>
           <w:bCs/>
         </w:rPr>
-        <w:t xml:space="preserve">Node Landing Page Verification Checklist v3.1</w:t>
-      </w:r>
-      <w:r>
-        <w:t xml:space="preserve"> </w:t>
-      </w:r>
-      <w:r>
-        <w:t xml:space="preserve">(24 September 2026) and writes</w:t>
+        <w:t xml:space="preserve">Node Landing Page Verification Checklist v3.2</w:t>
+      </w:r>
+      <w:r>
+        <w:t xml:space="preserve"> </w:t>
+      </w:r>
+      <w:r>
+        <w:t xml:space="preserve">(28 September 2026) and writes</w:t>
       </w:r>
       <w:r>
         <w:t xml:space="preserve"> </w:t>
@@ -256,6 +256,26 @@
       </w:r>
       <w:r>
         <w:t xml:space="preserve">noted rather than smoothed over.</w:t>
+      </w:r>
+    </w:p>
+    <w:p>
+      <w:pPr>
+        <w:pStyle w:val="BodyText"/>
+      </w:pPr>
+      <w:r>
+        <w:t xml:space="preserve">This edition was revised on 29 September 2026 for checklist v3.2: the test</w:t>
+      </w:r>
+      <w:r>
+        <w:t xml:space="preserve"> </w:t>
+      </w:r>
+      <w:r>
+        <w:t xml:space="preserve">count (438), the tallies and the rebuild of the published report were re-measured</w:t>
+      </w:r>
+      <w:r>
+        <w:t xml:space="preserve"> </w:t>
+      </w:r>
+      <w:r>
+        <w:t xml:space="preserve">offline that day, again without contacting any node.</w:t>
       </w:r>
     </w:p>
     <w:p>
@@ -267,121 +287,40 @@
           <w:b/>
           <w:bCs/>
         </w:rPr>
-        <w:t xml:space="preserve">The published run changed on 28 September 2026.</w:t>
-      </w:r>
-      <w:r>
-        <w:t xml:space="preserve"> </w:t>
-      </w:r>
-      <w:r>
-        <w:rPr>
-          <w:rStyle w:val="VerbatimChar"/>
-        </w:rPr>
-        <w:t xml:space="preserve">results/</w:t>
-      </w:r>
-      <w:r>
-        <w:t xml:space="preserve"> </w:t>
-      </w:r>
-      <w:r>
-        <w:t xml:space="preserve">now holds run</w:t>
-      </w:r>
-      <w:r>
-        <w:t xml:space="preserve"> </w:t>
-      </w:r>
-      <w:r>
-        <w:rPr>
-          <w:rStyle w:val="VerbatimChar"/>
-        </w:rPr>
-        <w:t xml:space="preserve">web-11</w:t>
-      </w:r>
-      <w:r>
-        <w:t xml:space="preserve">, collected by the GitHub workflow on 28 September from all thirteen</w:t>
-      </w:r>
-      <w:r>
-        <w:t xml:space="preserve"> </w:t>
-      </w:r>
-      <w:r>
-        <w:t xml:space="preserve">nodes under checklist v3.1 (49 PASS, 8 FAIL, 73 MANUAL_REVIEW). It is the first</w:t>
-      </w:r>
-      <w:r>
-        <w:t xml:space="preserve"> </w:t>
-      </w:r>
-      <w:r>
-        <w:t xml:space="preserve">run with CERN's new landing page,</w:t>
-      </w:r>
-      <w:r>
-        <w:t xml:space="preserve"> </w:t>
-      </w:r>
-      <w:r>
-        <w:rPr>
-          <w:rStyle w:val="VerbatimChar"/>
-        </w:rPr>
-        <w:t xml:space="preserve">https://eosc.cern/</w:t>
-      </w:r>
-      <w:r>
-        <w:t xml:space="preserve">, and follows</w:t>
-      </w:r>
-      <w:r>
-        <w:t xml:space="preserve"> </w:t>
-      </w:r>
-      <w:r>
-        <w:rPr>
-          <w:rStyle w:val="VerbatimChar"/>
-        </w:rPr>
-        <w:t xml:space="preserve">web-10</w:t>
-      </w:r>
-      <w:r>
-        <w:t xml:space="preserve"> </w:t>
-      </w:r>
-      <w:r>
-        <w:t xml:space="preserve">of</w:t>
-      </w:r>
-      <w:r>
-        <w:t xml:space="preserve"> </w:t>
-      </w:r>
-      <w:r>
-        <w:t xml:space="preserve">the same day, the first with EOSC Node Poland, which replaced a node listed by</w:t>
-      </w:r>
-      <w:r>
-        <w:t xml:space="preserve"> </w:t>
-      </w:r>
-      <w:r>
-        <w:t xml:space="preserve">mistake. The other rows repeat runs</w:t>
-      </w:r>
-      <w:r>
-        <w:t xml:space="preserve"> </w:t>
-      </w:r>
-      <w:r>
-        <w:rPr>
-          <w:rStyle w:val="VerbatimChar"/>
-        </w:rPr>
-        <w:t xml:space="preserve">web-4</w:t>
-      </w:r>
-      <w:r>
-        <w:t xml:space="preserve"> </w:t>
-      </w:r>
-      <w:r>
-        <w:t xml:space="preserve">to</w:t>
-      </w:r>
-      <w:r>
-        <w:t xml:space="preserve"> </w:t>
-      </w:r>
-      <w:r>
-        <w:rPr>
-          <w:rStyle w:val="VerbatimChar"/>
-        </w:rPr>
-        <w:t xml:space="preserve">web-9</w:t>
-      </w:r>
-      <w:r>
-        <w:t xml:space="preserve"> </w:t>
-      </w:r>
-      <w:r>
-        <w:t xml:space="preserve">of 26 September cell for</w:t>
-      </w:r>
-      <w:r>
-        <w:t xml:space="preserve"> </w:t>
-      </w:r>
-      <w:r>
-        <w:t xml:space="preserve">cell. It has</w:t>
+        <w:t xml:space="preserve">Checklist v3.2 since 29 September 2026.</w:t>
+      </w:r>
+      <w:r>
+        <w:t xml:space="preserve"> </w:t>
+      </w:r>
+      <w:r>
+        <w:t xml:space="preserve">The default reference checklist</w:t>
+      </w:r>
+      <w:r>
+        <w:t xml:space="preserve"> </w:t>
+      </w:r>
+      <w:r>
+        <w:t xml:space="preserve">is now v3.2 of 28 September 2026 (</w:t>
+      </w:r>
+      <w:r>
+        <w:rPr>
+          <w:rStyle w:val="VerbatimChar"/>
+        </w:rPr>
+        <w:t xml:space="preserve">checklist/v3.2.yaml</w:t>
+      </w:r>
+      <w:r>
+        <w:t xml:space="preserve">). Only item 5 changed,</w:t>
+      </w:r>
+      <w:r>
+        <w:t xml:space="preserve"> </w:t>
+      </w:r>
+      <w:r>
+        <w:t xml:space="preserve">and it became stricter: the purpose description, the Acceptable Use Policy and</w:t>
+      </w:r>
+      <w:r>
+        <w:t xml:space="preserve"> </w:t>
+      </w:r>
+      <w:r>
+        <w:t xml:space="preserve">the User Access Policy of every Node Exchange resource must now be available</w:t>
       </w:r>
       <w:r>
         <w:t xml:space="preserve"> </w:t>
@@ -391,121 +330,173 @@
           <w:b/>
           <w:bCs/>
         </w:rPr>
-        <w:t xml:space="preserve">not</w:t>
-      </w:r>
-      <w:r>
-        <w:t xml:space="preserve"> </w:t>
-      </w:r>
-      <w:r>
-        <w:t xml:space="preserve">been reviewed by</w:t>
-      </w:r>
-      <w:r>
-        <w:t xml:space="preserve"> </w:t>
-      </w:r>
-      <w:r>
-        <w:t xml:space="preserve">hand; the review of the run it replaced stays in</w:t>
-      </w:r>
-      <w:r>
-        <w:t xml:space="preserve"> </w:t>
-      </w:r>
-      <w:r>
-        <w:rPr>
-          <w:rStyle w:val="VerbatimChar"/>
-        </w:rPr>
-        <w:t xml:space="preserve">results/REVIEW-2026-09-24.md</w:t>
-      </w:r>
-      <w:r>
-        <w:t xml:space="preserve"> </w:t>
-      </w:r>
-      <w:r>
-        <w:t xml:space="preserve">as history. Passages below that describe "the</w:t>
-      </w:r>
-      <w:r>
-        <w:t xml:space="preserve"> </w:t>
-      </w:r>
-      <w:r>
-        <w:t xml:space="preserve">published run of 24 September" are about that earlier, reviewed run, whose</w:t>
-      </w:r>
-      <w:r>
-        <w:t xml:space="preserve"> </w:t>
-      </w:r>
-      <w:r>
-        <w:t xml:space="preserve">files are in the git history at commit</w:t>
-      </w:r>
-      <w:r>
-        <w:t xml:space="preserve"> </w:t>
-      </w:r>
-      <w:r>
-        <w:rPr>
-          <w:rStyle w:val="VerbatimChar"/>
-        </w:rPr>
-        <w:t xml:space="preserve">800d632</w:t>
-      </w:r>
-      <w:r>
-        <w:t xml:space="preserve">.</w:t>
-      </w:r>
-    </w:p>
-    <w:p>
-      <w:pPr>
-        <w:pStyle w:val="BlockText"/>
-      </w:pPr>
+        <w:t xml:space="preserve">both</w:t>
+      </w:r>
+      <w:r>
+        <w:t xml:space="preserve"> </w:t>
+      </w:r>
+      <w:r>
+        <w:t xml:space="preserve">directly on the NLP</w:t>
+      </w:r>
+      <w:r>
+        <w:t xml:space="preserve"> </w:t>
+      </w:r>
       <w:r>
         <w:rPr>
           <w:b/>
           <w:bCs/>
         </w:rPr>
-        <w:t xml:space="preserve">Checklist v3.1 since 26 September 2026.</w:t>
-      </w:r>
-      <w:r>
-        <w:t xml:space="preserve"> </w:t>
-      </w:r>
-      <w:r>
-        <w:t xml:space="preserve">The default reference checklist</w:t>
-      </w:r>
-      <w:r>
-        <w:t xml:space="preserve"> </w:t>
-      </w:r>
-      <w:r>
-        <w:t xml:space="preserve">is now v3.1 of 24 September 2026 (</w:t>
-      </w:r>
-      <w:r>
-        <w:rPr>
-          <w:rStyle w:val="VerbatimChar"/>
-        </w:rPr>
-        <w:t xml:space="preserve">checklist/v3.1.yaml</w:t>
-      </w:r>
-      <w:r>
-        <w:t xml:space="preserve">). The evidence of</w:t>
-      </w:r>
-      <w:r>
-        <w:t xml:space="preserve"> </w:t>
-      </w:r>
-      <w:r>
-        <w:rPr>
-          <w:rStyle w:val="VerbatimChar"/>
-        </w:rPr>
-        <w:t xml:space="preserve">web-4</w:t>
-      </w:r>
-      <w:r>
-        <w:t xml:space="preserve"> </w:t>
-      </w:r>
-      <w:r>
-        <w:t xml:space="preserve">was first re-scored against it offline, then</w:t>
-      </w:r>
-      <w:r>
-        <w:t xml:space="preserve"> </w:t>
-      </w:r>
-      <w:r>
-        <w:rPr>
-          <w:rStyle w:val="VerbatimChar"/>
-        </w:rPr>
-        <w:t xml:space="preserve">web-5</w:t>
-      </w:r>
-      <w:r>
-        <w:t xml:space="preserve"> </w:t>
-      </w:r>
-      <w:r>
-        <w:t xml:space="preserve">to</w:t>
+        <w:t xml:space="preserve">and</w:t>
+      </w:r>
+      <w:r>
+        <w:t xml:space="preserve"> </w:t>
+      </w:r>
+      <w:r>
+        <w:t xml:space="preserve">in the resource's EOSC Catalogue metadata,</w:t>
+      </w:r>
+      <w:r>
+        <w:t xml:space="preserve"> </w:t>
+      </w:r>
+      <w:r>
+        <w:t xml:space="preserve">where v3.1 asked for either. So a landing page that links to no AUP or UAP now</w:t>
+      </w:r>
+      <w:r>
+        <w:t xml:space="preserve"> </w:t>
+      </w:r>
+      <w:r>
+        <w:rPr>
+          <w:b/>
+          <w:bCs/>
+        </w:rPr>
+        <w:t xml:space="preserve">fails</w:t>
+      </w:r>
+      <w:r>
+        <w:t xml:space="preserve"> </w:t>
+      </w:r>
+      <w:r>
+        <w:t xml:space="preserve">5b or 5c instead of going to review. Two notes in the new item 5</w:t>
+      </w:r>
+      <w:r>
+        <w:t xml:space="preserve"> </w:t>
+      </w:r>
+      <w:r>
+        <w:t xml:space="preserve">keep review rather than FAIL where they apply: one document may serve as both</w:t>
+      </w:r>
+      <w:r>
+        <w:t xml:space="preserve"> </w:t>
+      </w:r>
+      <w:r>
+        <w:t xml:space="preserve">AUP and UAP, and datasets, archives and software may provide them through a</w:t>
+      </w:r>
+      <w:r>
+        <w:t xml:space="preserve"> </w:t>
+      </w:r>
+      <w:r>
+        <w:t xml:space="preserve">product licence. The rule is selected by the checklist file (</w:t>
+      </w:r>
+      <w:r>
+        <w:rPr>
+          <w:rStyle w:val="VerbatimChar"/>
+        </w:rPr>
+        <w:t xml:space="preserve">item5_on_nlp</w:t>
+      </w:r>
+      <w:r>
+        <w:t xml:space="preserve">),</w:t>
+      </w:r>
+      <w:r>
+        <w:t xml:space="preserve"> </w:t>
+      </w:r>
+      <w:r>
+        <w:t xml:space="preserve">so runs made under v3.0 and v3.1 still rebuild exactly with</w:t>
+      </w:r>
+      <w:r>
+        <w:t xml:space="preserve"> </w:t>
+      </w:r>
+      <w:r>
+        <w:rPr>
+          <w:rStyle w:val="VerbatimChar"/>
+        </w:rPr>
+        <w:t xml:space="preserve">-c</w:t>
+      </w:r>
+      <w:r>
+        <w:t xml:space="preserve">. The header of</w:t>
+      </w:r>
+      <w:r>
+        <w:t xml:space="preserve"> </w:t>
+      </w:r>
+      <w:r>
+        <w:rPr>
+          <w:rStyle w:val="VerbatimChar"/>
+        </w:rPr>
+        <w:t xml:space="preserve">checklist/v3.2.yaml</w:t>
+      </w:r>
+      <w:r>
+        <w:t xml:space="preserve"> </w:t>
+      </w:r>
+      <w:r>
+        <w:t xml:space="preserve">lists the differences point by point, and section 5 of</w:t>
+      </w:r>
+      <w:r>
+        <w:t xml:space="preserve"> </w:t>
+      </w:r>
+      <w:r>
+        <w:t xml:space="preserve">the</w:t>
+      </w:r>
+      <w:r>
+        <w:t xml:space="preserve"> </w:t>
+      </w:r>
+      <w:hyperlink r:id="rId9">
+        <w:r>
+          <w:rPr>
+            <w:rStyle w:val="Hyperlink"/>
+          </w:rPr>
+          <w:t xml:space="preserve">analysis workflow</w:t>
+        </w:r>
+      </w:hyperlink>
+      <w:r>
+        <w:t xml:space="preserve"> </w:t>
+      </w:r>
+      <w:r>
+        <w:t xml:space="preserve">has the decision procedure.</w:t>
+      </w:r>
+    </w:p>
+    <w:p>
+      <w:pPr>
+        <w:pStyle w:val="BlockText"/>
+      </w:pPr>
+      <w:r>
+        <w:rPr>
+          <w:b/>
+          <w:bCs/>
+        </w:rPr>
+        <w:t xml:space="preserve">The published run changed on 29 September 2026.</w:t>
+      </w:r>
+      <w:r>
+        <w:t xml:space="preserve"> </w:t>
+      </w:r>
+      <w:r>
+        <w:rPr>
+          <w:rStyle w:val="VerbatimChar"/>
+        </w:rPr>
+        <w:t xml:space="preserve">results/</w:t>
+      </w:r>
+      <w:r>
+        <w:t xml:space="preserve"> </w:t>
+      </w:r>
+      <w:r>
+        <w:t xml:space="preserve">now holds run</w:t>
+      </w:r>
+      <w:r>
+        <w:t xml:space="preserve"> </w:t>
+      </w:r>
+      <w:r>
+        <w:rPr>
+          <w:rStyle w:val="VerbatimChar"/>
+        </w:rPr>
+        <w:t xml:space="preserve">web-11-v3.2</w:t>
+      </w:r>
+      <w:r>
+        <w:t xml:space="preserve">: the evidence of run</w:t>
       </w:r>
       <w:r>
         <w:t xml:space="preserve"> </w:t>
@@ -517,31 +508,157 @@
         <w:t xml:space="preserve">web-11</w:t>
       </w:r>
       <w:r>
-        <w:t xml:space="preserve"> </w:t>
-      </w:r>
-      <w:r>
-        <w:t xml:space="preserve">were collected under it; every verdict is unchanged. The header of</w:t>
-      </w:r>
-      <w:r>
-        <w:t xml:space="preserve"> </w:t>
-      </w:r>
-      <w:r>
-        <w:rPr>
-          <w:rStyle w:val="VerbatimChar"/>
-        </w:rPr>
-        <w:t xml:space="preserve">checklist/v3.1.yaml</w:t>
-      </w:r>
-      <w:r>
-        <w:t xml:space="preserve"> </w:t>
-      </w:r>
-      <w:r>
-        <w:t xml:space="preserve">lists the differences point by</w:t>
-      </w:r>
-      <w:r>
-        <w:t xml:space="preserve"> </w:t>
-      </w:r>
-      <w:r>
-        <w:t xml:space="preserve">point.</w:t>
+        <w:t xml:space="preserve">, collected by the GitHub workflow on</w:t>
+      </w:r>
+      <w:r>
+        <w:t xml:space="preserve"> </w:t>
+      </w:r>
+      <w:r>
+        <w:t xml:space="preserve">28 September 2026 from all thirteen nodes (</w:t>
+      </w:r>
+      <w:hyperlink r:id="rId10">
+        <w:r>
+          <w:rPr>
+            <w:rStyle w:val="Hyperlink"/>
+          </w:rPr>
+          <w:t xml:space="preserve">run 36431202625</w:t>
+        </w:r>
+      </w:hyperlink>
+      <w:r>
+        <w:t xml:space="preserve">),</w:t>
+      </w:r>
+      <w:r>
+        <w:t xml:space="preserve"> </w:t>
+      </w:r>
+      <w:r>
+        <w:t xml:space="preserve">scored again against v3.2 without contacting any node: 49 PASS, 14 FAIL, 67</w:t>
+      </w:r>
+      <w:r>
+        <w:t xml:space="preserve"> </w:t>
+      </w:r>
+      <w:r>
+        <w:t xml:space="preserve">MANUAL_REVIEW. Under v3.1 the same evidence gave 49 PASS, 8 FAIL and 73</w:t>
+      </w:r>
+      <w:r>
+        <w:t xml:space="preserve"> </w:t>
+      </w:r>
+      <w:r>
+        <w:t xml:space="preserve">MANUAL_REVIEW; the six new FAILs are 5b and 5c for CERN, Data Terra and PaNOSC.</w:t>
+      </w:r>
+      <w:r>
+        <w:t xml:space="preserve"> </w:t>
+      </w:r>
+      <w:r>
+        <w:rPr>
+          <w:rStyle w:val="VerbatimChar"/>
+        </w:rPr>
+        <w:t xml:space="preserve">web-11</w:t>
+      </w:r>
+      <w:r>
+        <w:t xml:space="preserve"> </w:t>
+      </w:r>
+      <w:r>
+        <w:t xml:space="preserve">was the first run with CERN's new landing page,</w:t>
+      </w:r>
+      <w:r>
+        <w:t xml:space="preserve"> </w:t>
+      </w:r>
+      <w:r>
+        <w:rPr>
+          <w:rStyle w:val="VerbatimChar"/>
+        </w:rPr>
+        <w:t xml:space="preserve">https://eosc.cern/</w:t>
+      </w:r>
+      <w:r>
+        <w:t xml:space="preserve">,</w:t>
+      </w:r>
+      <w:r>
+        <w:t xml:space="preserve"> </w:t>
+      </w:r>
+      <w:r>
+        <w:t xml:space="preserve">and followed</w:t>
+      </w:r>
+      <w:r>
+        <w:t xml:space="preserve"> </w:t>
+      </w:r>
+      <w:r>
+        <w:rPr>
+          <w:rStyle w:val="VerbatimChar"/>
+        </w:rPr>
+        <w:t xml:space="preserve">web-10</w:t>
+      </w:r>
+      <w:r>
+        <w:t xml:space="preserve"> </w:t>
+      </w:r>
+      <w:r>
+        <w:t xml:space="preserve">of the same day, the first with EOSC Node Poland, which</w:t>
+      </w:r>
+      <w:r>
+        <w:t xml:space="preserve"> </w:t>
+      </w:r>
+      <w:r>
+        <w:t xml:space="preserve">replaced a node listed by mistake. It has</w:t>
+      </w:r>
+      <w:r>
+        <w:t xml:space="preserve"> </w:t>
+      </w:r>
+      <w:r>
+        <w:rPr>
+          <w:b/>
+          <w:bCs/>
+        </w:rPr>
+        <w:t xml:space="preserve">not</w:t>
+      </w:r>
+      <w:r>
+        <w:t xml:space="preserve"> </w:t>
+      </w:r>
+      <w:r>
+        <w:t xml:space="preserve">been reviewed by hand; the</w:t>
+      </w:r>
+      <w:r>
+        <w:t xml:space="preserve"> </w:t>
+      </w:r>
+      <w:r>
+        <w:t xml:space="preserve">review of the run of 24 September stays in</w:t>
+      </w:r>
+      <w:r>
+        <w:t xml:space="preserve"> </w:t>
+      </w:r>
+      <w:r>
+        <w:rPr>
+          <w:rStyle w:val="VerbatimChar"/>
+        </w:rPr>
+        <w:t xml:space="preserve">results/REVIEW-2026-09-24.md</w:t>
+      </w:r>
+      <w:r>
+        <w:t xml:space="preserve"> </w:t>
+      </w:r>
+      <w:r>
+        <w:t xml:space="preserve">as</w:t>
+      </w:r>
+      <w:r>
+        <w:t xml:space="preserve"> </w:t>
+      </w:r>
+      <w:r>
+        <w:t xml:space="preserve">history. Passages below that describe "the published run of 24 September" are</w:t>
+      </w:r>
+      <w:r>
+        <w:t xml:space="preserve"> </w:t>
+      </w:r>
+      <w:r>
+        <w:t xml:space="preserve">about that earlier, reviewed run, whose files are in the git history at commit</w:t>
+      </w:r>
+      <w:r>
+        <w:t xml:space="preserve"> </w:t>
+      </w:r>
+      <w:r>
+        <w:rPr>
+          <w:rStyle w:val="VerbatimChar"/>
+        </w:rPr>
+        <w:t xml:space="preserve">800d632</w:t>
+      </w:r>
+      <w:r>
+        <w:t xml:space="preserve">.</w:t>
       </w:r>
     </w:p>
     <w:p>
@@ -653,7 +770,7 @@
         </w:pict>
       </w:r>
     </w:p>
-    <w:bookmarkStart w:id="11" w:name="requirements"/>
+    <w:bookmarkStart w:id="12" w:name="requirements"/>
     <w:p>
       <w:pPr>
         <w:pStyle w:val="Heading2"/>
@@ -721,7 +838,7 @@
             <w:pPr>
               <w:pStyle w:val="Compact"/>
             </w:pPr>
-            <w:hyperlink r:id="rId10">
+            <w:hyperlink r:id="rId11">
               <w:r>
                 <w:rPr>
                   <w:rStyle w:val="VerbatimChar"/>
@@ -1087,8 +1204,8 @@
         </w:pict>
       </w:r>
     </w:p>
-    <w:bookmarkEnd w:id="11"/>
-    <w:bookmarkStart w:id="14" w:name="installation"/>
+    <w:bookmarkEnd w:id="12"/>
+    <w:bookmarkStart w:id="15" w:name="installation"/>
     <w:p>
       <w:pPr>
         <w:pStyle w:val="Heading2"/>
@@ -1387,7 +1504,7 @@
         <w:t xml:space="preserve">this step.</w:t>
       </w:r>
     </w:p>
-    <w:bookmarkStart w:id="12" w:name="what-needs-a-browser-and-what-does-not"/>
+    <w:bookmarkStart w:id="13" w:name="what-needs-a-browser-and-what-does-not"/>
     <w:p>
       <w:pPr>
         <w:pStyle w:val="Heading3"/>
@@ -1837,7 +1954,7 @@
         <w:t xml:space="preserve"> </w:t>
       </w:r>
       <w:r>
-        <w:t xml:space="preserve">426 tests still pass, while</w:t>
+        <w:t xml:space="preserve">438 tests still pass, while</w:t>
       </w:r>
       <w:r>
         <w:t xml:space="preserve"> </w:t>
@@ -1867,8 +1984,8 @@
         <w:t xml:space="preserve">.</w:t>
       </w:r>
     </w:p>
-    <w:bookmarkEnd w:id="12"/>
-    <w:bookmarkStart w:id="13" w:name="verifying-the-installation"/>
+    <w:bookmarkEnd w:id="13"/>
+    <w:bookmarkStart w:id="14" w:name="verifying-the-installation"/>
     <w:p>
       <w:pPr>
         <w:pStyle w:val="Heading3"/>
@@ -1909,7 +2026,7 @@
         <w:rPr>
           <w:rStyle w:val="CommentTok"/>
         </w:rPr>
-        <w:t xml:space="preserve"># expect: 426 passed</w:t>
+        <w:t xml:space="preserve"># expect: 438 passed</w:t>
       </w:r>
       <w:r>
         <w:br/>
@@ -1990,9 +2107,9 @@
         </w:pict>
       </w:r>
     </w:p>
-    <w:bookmarkEnd w:id="13"/>
     <w:bookmarkEnd w:id="14"/>
-    <w:bookmarkStart w:id="28" w:name="configuration"/>
+    <w:bookmarkEnd w:id="15"/>
+    <w:bookmarkStart w:id="29" w:name="configuration"/>
     <w:p>
       <w:pPr>
         <w:pStyle w:val="Heading2"/>
@@ -2021,7 +2138,7 @@
         <w:t xml:space="preserve">edited; the third is a plain text list you write yourself.</w:t>
       </w:r>
     </w:p>
-    <w:bookmarkStart w:id="16" w:name="nodes.yaml-which-pages-to-check"/>
+    <w:bookmarkStart w:id="17" w:name="nodes.yaml-which-pages-to-check"/>
     <w:p>
       <w:pPr>
         <w:pStyle w:val="Heading3"/>
@@ -2416,7 +2533,7 @@
       <w:r>
         <w:t xml:space="preserve"> </w:t>
       </w:r>
-      <w:hyperlink r:id="rId15">
+      <w:hyperlink r:id="rId16">
         <w:r>
           <w:rPr>
             <w:rStyle w:val="Hyperlink"/>
@@ -2716,11 +2833,26 @@
         <w:t xml:space="preserve"> </w:t>
       </w:r>
       <w:r>
-        <w:t xml:space="preserve">(the published run).</w:t>
-      </w:r>
-    </w:p>
-    <w:bookmarkEnd w:id="16"/>
-    <w:bookmarkStart w:id="17" w:name="changing-a-nodes-url"/>
+        <w:t xml:space="preserve">(the published run is</w:t>
+      </w:r>
+      <w:r>
+        <w:t xml:space="preserve"> </w:t>
+      </w:r>
+      <w:r>
+        <w:rPr>
+          <w:rStyle w:val="VerbatimChar"/>
+        </w:rPr>
+        <w:t xml:space="preserve">web-11</w:t>
+      </w:r>
+      <w:r>
+        <w:t xml:space="preserve"> </w:t>
+      </w:r>
+      <w:r>
+        <w:t xml:space="preserve">re-scored under v3.2).</w:t>
+      </w:r>
+    </w:p>
+    <w:bookmarkEnd w:id="17"/>
+    <w:bookmarkStart w:id="18" w:name="changing-a-nodes-url"/>
     <w:p>
       <w:pPr>
         <w:pStyle w:val="Heading3"/>
@@ -3470,13 +3602,16 @@
         <w:t xml:space="preserve">nodes.yaml</w:t>
       </w:r>
       <w:r>
-        <w:t xml:space="preserve">, so no other option is needed and there is no</w:t>
-      </w:r>
-      <w:r>
-        <w:t xml:space="preserve"> </w:t>
-      </w:r>
-      <w:r>
-        <w:t xml:space="preserve">URL warning:</w:t>
+        <w:t xml:space="preserve"> </w:t>
+      </w:r>
+      <w:r>
+        <w:t xml:space="preserve">and scored under the default checklist, so no</w:t>
+      </w:r>
+      <w:r>
+        <w:t xml:space="preserve"> </w:t>
+      </w:r>
+      <w:r>
+        <w:t xml:space="preserve">other option is needed and there is no URL warning:</w:t>
       </w:r>
     </w:p>
     <w:p>
@@ -3505,7 +3640,7 @@
         <w:rPr>
           <w:rStyle w:val="NormalTok"/>
         </w:rPr>
-        <w:t xml:space="preserve"> web-11</w:t>
+        <w:t xml:space="preserve"> web-11-v3.2</w:t>
       </w:r>
     </w:p>
     <w:p>
@@ -3513,6 +3648,44 @@
         <w:pStyle w:val="FirstParagraph"/>
       </w:pPr>
       <w:r>
+        <w:t xml:space="preserve">To see the same evidence as it was published under v3.1 (run</w:t>
+      </w:r>
+      <w:r>
+        <w:t xml:space="preserve"> </w:t>
+      </w:r>
+      <w:r>
+        <w:rPr>
+          <w:rStyle w:val="VerbatimChar"/>
+        </w:rPr>
+        <w:t xml:space="preserve">web-11</w:t>
+      </w:r>
+      <w:r>
+        <w:t xml:space="preserve">, 49 PASS,</w:t>
+      </w:r>
+      <w:r>
+        <w:t xml:space="preserve"> </w:t>
+      </w:r>
+      <w:r>
+        <w:t xml:space="preserve">8 FAIL, 73 MANUAL_REVIEW), add</w:t>
+      </w:r>
+      <w:r>
+        <w:t xml:space="preserve"> </w:t>
+      </w:r>
+      <w:r>
+        <w:rPr>
+          <w:rStyle w:val="VerbatimChar"/>
+        </w:rPr>
+        <w:t xml:space="preserve">-c checklist/v3.1.yaml --run web-11</w:t>
+      </w:r>
+      <w:r>
+        <w:t xml:space="preserve">.</w:t>
+      </w:r>
+    </w:p>
+    <w:p>
+      <w:pPr>
+        <w:pStyle w:val="BodyText"/>
+      </w:pPr>
+      <w:r>
         <w:t xml:space="preserve">Run</w:t>
       </w:r>
       <w:r>
@@ -3560,7 +3733,7 @@
         <w:pStyle w:val="BodyText"/>
       </w:pPr>
       <w:r>
-        <w:t xml:space="preserve">Verified on 28 September 2026: this reproduces the committed</w:t>
+        <w:t xml:space="preserve">Verified on 29 September 2026: this reproduces the committed</w:t>
       </w:r>
       <w:r>
         <w:t xml:space="preserve"> </w:t>
@@ -3575,7 +3748,7 @@
         <w:t xml:space="preserve"> </w:t>
       </w:r>
       <w:r>
-        <w:t xml:space="preserve">exactly, apart from the generation time, with 49 PASS, 8 FAIL and 73</w:t>
+        <w:t xml:space="preserve">exactly, apart from the generation time, with 49 PASS, 14 FAIL and 67</w:t>
       </w:r>
       <w:r>
         <w:t xml:space="preserve"> </w:t>
@@ -3819,8 +3992,8 @@
         <w:t xml:space="preserve">the next published run.</w:t>
       </w:r>
     </w:p>
-    <w:bookmarkEnd w:id="17"/>
-    <w:bookmarkStart w:id="18" w:name="checklistv3.1.yaml-the-rules"/>
+    <w:bookmarkEnd w:id="18"/>
+    <w:bookmarkStart w:id="19" w:name="checklistv3.2.yaml-the-rules"/>
     <w:p>
       <w:pPr>
         <w:pStyle w:val="Heading3"/>
@@ -3829,7 +4002,7 @@
         <w:rPr>
           <w:rStyle w:val="VerbatimChar"/>
         </w:rPr>
-        <w:t xml:space="preserve">checklist/v3.1.yaml</w:t>
+        <w:t xml:space="preserve">checklist/v3.2.yaml</w:t>
       </w:r>
       <w:r>
         <w:t xml:space="preserve"> </w:t>
@@ -3998,7 +4171,61 @@
         <w:t xml:space="preserve">tests/test_checklist.py</w:t>
       </w:r>
       <w:r>
-        <w:t xml:space="preserve">. Be clear about what this proves — it pins the exact</w:t>
+        <w:t xml:space="preserve">. v3.2 also carries</w:t>
+      </w:r>
+      <w:r>
+        <w:t xml:space="preserve"> </w:t>
+      </w:r>
+      <w:r>
+        <w:rPr>
+          <w:rStyle w:val="VerbatimChar"/>
+        </w:rPr>
+        <w:t xml:space="preserve">item5_on_nlp: true</w:t>
+      </w:r>
+      <w:r>
+        <w:t xml:space="preserve">, the one</w:t>
+      </w:r>
+      <w:r>
+        <w:t xml:space="preserve"> </w:t>
+      </w:r>
+      <w:r>
+        <w:t xml:space="preserve">value the rules take from the file: it selects the stricter item 5 rule</w:t>
+      </w:r>
+      <w:r>
+        <w:t xml:space="preserve"> </w:t>
+      </w:r>
+      <w:r>
+        <w:t xml:space="preserve">(policies linked from the NLP, and in the Catalogue).</w:t>
+      </w:r>
+      <w:r>
+        <w:t xml:space="preserve"> </w:t>
+      </w:r>
+      <w:r>
+        <w:rPr>
+          <w:rStyle w:val="VerbatimChar"/>
+        </w:rPr>
+        <w:t xml:space="preserve">v3.0.yaml</w:t>
+      </w:r>
+      <w:r>
+        <w:t xml:space="preserve"> </w:t>
+      </w:r>
+      <w:r>
+        <w:t xml:space="preserve">and</w:t>
+      </w:r>
+      <w:r>
+        <w:t xml:space="preserve"> </w:t>
+      </w:r>
+      <w:r>
+        <w:rPr>
+          <w:rStyle w:val="VerbatimChar"/>
+        </w:rPr>
+        <w:t xml:space="preserve">v3.1.yaml</w:t>
+      </w:r>
+      <w:r>
+        <w:t xml:space="preserve"> </w:t>
+      </w:r>
+      <w:r>
+        <w:t xml:space="preserve">do not carry it, so they apply the older rule. Be clear about what this proves — it pins the exact</w:t>
       </w:r>
       <w:r>
         <w:t xml:space="preserve"> </w:t>
@@ -4159,7 +4386,7 @@
         <w:rPr>
           <w:rStyle w:val="StringTok"/>
         </w:rPr>
-        <w:t xml:space="preserve">"v3.1.yaml"</w:t>
+        <w:t xml:space="preserve">"v3.2.yaml"</w:t>
       </w:r>
     </w:p>
     <w:p>
@@ -4203,7 +4430,7 @@
         <w:rPr>
           <w:rStyle w:val="VerbatimChar"/>
         </w:rPr>
-        <w:t xml:space="preserve">checklist-v3.1.html</w:t>
+        <w:t xml:space="preserve">checklist-v3.2.html</w:t>
       </w:r>
       <w:r>
         <w:t xml:space="preserve">) and the tests all follow that line.</w:t>
@@ -4218,7 +4445,7 @@
           <w:b/>
           <w:bCs/>
         </w:rPr>
-        <w:t xml:space="preserve">If the checklist is revised to v3.2,</w:t>
+        <w:t xml:space="preserve">If the checklist is revised to v3.3,</w:t>
       </w:r>
       <w:r>
         <w:t xml:space="preserve"> </w:t>
@@ -4233,7 +4460,7 @@
         <w:rPr>
           <w:rStyle w:val="VerbatimChar"/>
         </w:rPr>
-        <w:t xml:space="preserve">checklist/v3.2.yaml</w:t>
+        <w:t xml:space="preserve">checklist/v3.3.yaml</w:t>
       </w:r>
       <w:r>
         <w:t xml:space="preserve"> </w:t>
@@ -4245,7 +4472,7 @@
         <w:t xml:space="preserve"> </w:t>
       </w:r>
       <w:r>
-        <w:t xml:space="preserve">own source file and hash rather than editing v3.1 in place, then change that</w:t>
+        <w:t xml:space="preserve">own source file and hash rather than editing v3.2 in place, then change that</w:t>
       </w:r>
       <w:r>
         <w:t xml:space="preserve"> </w:t>
@@ -4283,8 +4510,8 @@
         <w:t xml:space="preserve">section 11.</w:t>
       </w:r>
     </w:p>
-    <w:bookmarkEnd w:id="18"/>
-    <w:bookmarkStart w:id="25" w:name="the-approved-names-file---approved-names"/>
+    <w:bookmarkEnd w:id="19"/>
+    <w:bookmarkStart w:id="26" w:name="the-approved-names-file---approved-names"/>
     <w:p>
       <w:pPr>
         <w:pStyle w:val="Heading3"/>
@@ -4546,7 +4773,7 @@
         <w:t xml:space="preserve">the names they think it did.</w:t>
       </w:r>
     </w:p>
-    <w:bookmarkStart w:id="19" w:name="which-list-is-used"/>
+    <w:bookmarkStart w:id="20" w:name="which-list-is-used"/>
     <w:p>
       <w:pPr>
         <w:pStyle w:val="Heading4"/>
@@ -4786,8 +5013,8 @@
         <w:t xml:space="preserve">.</w:t>
       </w:r>
     </w:p>
-    <w:bookmarkEnd w:id="19"/>
-    <w:bookmarkStart w:id="20" w:name="supplying-your-own-list"/>
+    <w:bookmarkEnd w:id="20"/>
+    <w:bookmarkStart w:id="21" w:name="supplying-your-own-list"/>
     <w:p>
       <w:pPr>
         <w:pStyle w:val="Heading4"/>
@@ -5134,8 +5361,8 @@
         <w:t xml:space="preserve">is unaffected.</w:t>
       </w:r>
     </w:p>
-    <w:bookmarkEnd w:id="20"/>
-    <w:bookmarkStart w:id="21" w:name="how-a-name-is-matched"/>
+    <w:bookmarkEnd w:id="21"/>
+    <w:bookmarkStart w:id="22" w:name="how-a-name-is-matched"/>
     <w:p>
       <w:pPr>
         <w:pStyle w:val="Heading4"/>
@@ -5883,8 +6110,8 @@
         <w:t xml:space="preserve">matches none of the twelve.</w:t>
       </w:r>
     </w:p>
-    <w:bookmarkEnd w:id="21"/>
-    <w:bookmarkStart w:id="22" w:name="a-match-is-not-proof-of-the-right-name"/>
+    <w:bookmarkEnd w:id="22"/>
+    <w:bookmarkStart w:id="23" w:name="a-match-is-not-proof-of-the-right-name"/>
     <w:p>
       <w:pPr>
         <w:pStyle w:val="Heading4"/>
@@ -6157,8 +6384,8 @@
         <w:t xml:space="preserve">file's header comment says the same thing.</w:t>
       </w:r>
     </w:p>
-    <w:bookmarkEnd w:id="22"/>
-    <w:bookmarkStart w:id="23" w:name="which-list-was-used-is-recorded"/>
+    <w:bookmarkEnd w:id="23"/>
+    <w:bookmarkStart w:id="24" w:name="which-list-was-used-is-recorded"/>
     <w:p>
       <w:pPr>
         <w:pStyle w:val="Heading4"/>
@@ -6243,8 +6470,8 @@
         <w:t xml:space="preserve"> checklist/approved-names.txt</w:t>
       </w:r>
     </w:p>
-    <w:bookmarkEnd w:id="23"/>
-    <w:bookmarkStart w:id="24" w:name="what-the-official-list-actually-finds"/>
+    <w:bookmarkEnd w:id="24"/>
+    <w:bookmarkStart w:id="25" w:name="what-the-official-list-actually-finds"/>
     <w:p>
       <w:pPr>
         <w:pStyle w:val="Heading4"/>
@@ -6809,9 +7036,9 @@
         <w:t xml:space="preserve">file before assuming the page is at fault.</w:t>
       </w:r>
     </w:p>
-    <w:bookmarkEnd w:id="24"/>
     <w:bookmarkEnd w:id="25"/>
-    <w:bookmarkStart w:id="26" w:name="adding-a-node"/>
+    <w:bookmarkEnd w:id="26"/>
+    <w:bookmarkStart w:id="27" w:name="adding-a-node"/>
     <w:p>
       <w:pPr>
         <w:pStyle w:val="Heading3"/>
@@ -6956,7 +7183,7 @@
       <w:r>
         <w:t xml:space="preserve"> </w:t>
       </w:r>
-      <w:hyperlink r:id="rId15">
+      <w:hyperlink r:id="rId16">
         <w:r>
           <w:rPr>
             <w:rStyle w:val="Hyperlink"/>
@@ -7554,8 +7781,8 @@
         <w:t xml:space="preserve">unless you intend to publish a partial one and say so.</w:t>
       </w:r>
     </w:p>
-    <w:bookmarkEnd w:id="26"/>
-    <w:bookmarkStart w:id="27" w:name="X84bdf4d6d4e37947911920c44f1c0e29ac695a1"/>
+    <w:bookmarkEnd w:id="27"/>
+    <w:bookmarkStart w:id="28" w:name="X84bdf4d6d4e37947911920c44f1c0e29ac695a1"/>
     <w:p>
       <w:pPr>
         <w:pStyle w:val="Heading3"/>
@@ -7780,9 +8007,9 @@
         </w:pict>
       </w:r>
     </w:p>
-    <w:bookmarkEnd w:id="27"/>
     <w:bookmarkEnd w:id="28"/>
-    <w:bookmarkStart w:id="37" w:name="running-it"/>
+    <w:bookmarkEnd w:id="29"/>
+    <w:bookmarkStart w:id="38" w:name="running-it"/>
     <w:p>
       <w:pPr>
         <w:pStyle w:val="Heading2"/>
@@ -7828,7 +8055,7 @@
         <w:t xml:space="preserve">requests.</w:t>
       </w:r>
     </w:p>
-    <w:bookmarkStart w:id="29" w:name="the-commands"/>
+    <w:bookmarkStart w:id="30" w:name="the-commands"/>
     <w:p>
       <w:pPr>
         <w:pStyle w:val="Heading3"/>
@@ -7944,8 +8171,8 @@
         <w:t xml:space="preserve"># one node's results in the terminal</w:t>
       </w:r>
     </w:p>
-    <w:bookmarkEnd w:id="29"/>
-    <w:bookmarkStart w:id="30" w:name="listing-the-configuration"/>
+    <w:bookmarkEnd w:id="30"/>
+    <w:bookmarkStart w:id="31" w:name="listing-the-configuration"/>
     <w:p>
       <w:pPr>
         <w:pStyle w:val="Heading3"/>
@@ -8849,8 +9076,8 @@
         <w:t xml:space="preserve">the next run will check.</w:t>
       </w:r>
     </w:p>
-    <w:bookmarkEnd w:id="30"/>
-    <w:bookmarkStart w:id="31" w:name="useful-options"/>
+    <w:bookmarkEnd w:id="31"/>
+    <w:bookmarkStart w:id="32" w:name="useful-options"/>
     <w:p>
       <w:pPr>
         <w:pStyle w:val="Heading3"/>
@@ -10090,8 +10317,8 @@
         </w:tc>
       </w:tr>
     </w:tbl>
-    <w:bookmarkEnd w:id="31"/>
-    <w:bookmarkStart w:id="32" w:name="only-narrows-the-fetch-not-the-report"/>
+    <w:bookmarkEnd w:id="32"/>
+    <w:bookmarkStart w:id="33" w:name="only-narrows-the-fetch-not-the-report"/>
     <w:p>
       <w:pPr>
         <w:pStyle w:val="Heading3"/>
@@ -10704,8 +10931,8 @@
         <w:t xml:space="preserve"> run basic-check assess</w:t>
       </w:r>
     </w:p>
-    <w:bookmarkEnd w:id="32"/>
-    <w:bookmarkStart w:id="33" w:name="skip-leaves-nodes-out-and-says-so"/>
+    <w:bookmarkEnd w:id="33"/>
+    <w:bookmarkStart w:id="34" w:name="skip-leaves-nodes-out-and-says-so"/>
     <w:p>
       <w:pPr>
         <w:pStyle w:val="Heading3"/>
@@ -11275,8 +11502,8 @@
         <w:t xml:space="preserve">fetches EUDAT alone.</w:t>
       </w:r>
     </w:p>
-    <w:bookmarkEnd w:id="33"/>
-    <w:bookmarkStart w:id="34" w:name="checking-a-page-not-in-nodesyaml"/>
+    <w:bookmarkEnd w:id="34"/>
+    <w:bookmarkStart w:id="35" w:name="checking-a-page-not-in-nodesyaml"/>
     <w:p>
       <w:pPr>
         <w:pStyle w:val="Heading3"/>
@@ -11364,8 +11591,8 @@
         <w:t xml:space="preserve">stray single-page file that looks official is a genuine hazard.</w:t>
       </w:r>
     </w:p>
-    <w:bookmarkEnd w:id="34"/>
-    <w:bookmarkStart w:id="35" w:name="Xff864b2a738710e69d56a09dc1146f678e1e3b2"/>
+    <w:bookmarkEnd w:id="35"/>
+    <w:bookmarkStart w:id="36" w:name="Xff864b2a738710e69d56a09dc1146f678e1e3b2"/>
     <w:p>
       <w:pPr>
         <w:pStyle w:val="Heading3"/>
@@ -12070,8 +12297,8 @@
         <w:t xml:space="preserve"> /tmp/copy</w:t>
       </w:r>
     </w:p>
-    <w:bookmarkEnd w:id="35"/>
-    <w:bookmarkStart w:id="36" w:name="checking-a-node-at-an-alternative-url"/>
+    <w:bookmarkEnd w:id="36"/>
+    <w:bookmarkStart w:id="37" w:name="checking-a-node-at-an-alternative-url"/>
     <w:p>
       <w:pPr>
         <w:pStyle w:val="Heading3"/>
@@ -12751,9 +12978,9 @@
         </w:pict>
       </w:r>
     </w:p>
-    <w:bookmarkEnd w:id="36"/>
     <w:bookmarkEnd w:id="37"/>
-    <w:bookmarkStart w:id="39" w:name="how-deep-to-go---depth"/>
+    <w:bookmarkEnd w:id="38"/>
+    <w:bookmarkStart w:id="40" w:name="how-deep-to-go---depth"/>
     <w:p>
       <w:pPr>
         <w:pStyle w:val="Heading2"/>
@@ -13367,7 +13594,7 @@
         <w:t xml:space="preserve">federation or a later date.</w:t>
       </w:r>
     </w:p>
-    <w:bookmarkStart w:id="38" w:name="X2a91d9b1ee4bf6327b51d59c91d7740875558d5"/>
+    <w:bookmarkStart w:id="39" w:name="X2a91d9b1ee4bf6327b51d59c91d7740875558d5"/>
     <w:p>
       <w:pPr>
         <w:pStyle w:val="Heading3"/>
@@ -13564,9 +13791,9 @@
         </w:pict>
       </w:r>
     </w:p>
-    <w:bookmarkEnd w:id="38"/>
     <w:bookmarkEnd w:id="39"/>
-    <w:bookmarkStart w:id="43" w:name="reading-the-output"/>
+    <w:bookmarkEnd w:id="40"/>
+    <w:bookmarkStart w:id="44" w:name="reading-the-output"/>
     <w:p>
       <w:pPr>
         <w:pStyle w:val="Heading2"/>
@@ -13775,7 +14002,7 @@
               <w:rPr>
                 <w:rStyle w:val="VerbatimChar"/>
               </w:rPr>
-              <w:t xml:space="preserve">checklist-v3.1.html</w:t>
+              <w:t xml:space="preserve">checklist-v3.2.html</w:t>
             </w:r>
           </w:p>
         </w:tc>
@@ -13895,7 +14122,7 @@
         </w:tc>
       </w:tr>
     </w:tbl>
-    <w:bookmarkStart w:id="40" w:name="the-four-verdicts"/>
+    <w:bookmarkStart w:id="41" w:name="the-four-verdicts"/>
     <w:p>
       <w:pPr>
         <w:pStyle w:val="Heading3"/>
@@ -14364,8 +14591,8 @@
         <w:t xml:space="preserve">26 September, and the same four cells are review there.</w:t>
       </w:r>
     </w:p>
-    <w:bookmarkEnd w:id="40"/>
-    <w:bookmarkStart w:id="41" w:name="reproducing-a-verdict-by-hand"/>
+    <w:bookmarkEnd w:id="41"/>
+    <w:bookmarkStart w:id="42" w:name="reproducing-a-verdict-by-hand"/>
     <w:p>
       <w:pPr>
         <w:pStyle w:val="Heading3"/>
@@ -14549,8 +14776,8 @@
         <w:t xml:space="preserve">a verdict surprises you.</w:t>
       </w:r>
     </w:p>
-    <w:bookmarkEnd w:id="41"/>
-    <w:bookmarkStart w:id="42" w:name="personal-data-is-masked"/>
+    <w:bookmarkEnd w:id="42"/>
+    <w:bookmarkStart w:id="43" w:name="personal-data-is-masked"/>
     <w:p>
       <w:pPr>
         <w:pStyle w:val="Heading3"/>
@@ -15193,7 +15420,19 @@
         <w:t xml:space="preserve"> </w:t>
       </w:r>
       <w:r>
-        <w:t xml:space="preserve">(28 September 2026) was collected</w:t>
+        <w:t xml:space="preserve">(28 September 2026), published re-scored under v3.2 as</w:t>
+      </w:r>
+      <w:r>
+        <w:t xml:space="preserve"> </w:t>
+      </w:r>
+      <w:r>
+        <w:rPr>
+          <w:rStyle w:val="VerbatimChar"/>
+        </w:rPr>
+        <w:t xml:space="preserve">web-11-v3.2</w:t>
+      </w:r>
+      <w:r>
+        <w:t xml:space="preserve">, was collected</w:t>
       </w:r>
       <w:r>
         <w:t xml:space="preserve"> </w:t>
@@ -15584,9 +15823,9 @@
         </w:pict>
       </w:r>
     </w:p>
-    <w:bookmarkEnd w:id="42"/>
     <w:bookmarkEnd w:id="43"/>
-    <w:bookmarkStart w:id="46" w:name="the-test-suite"/>
+    <w:bookmarkEnd w:id="44"/>
+    <w:bookmarkStart w:id="47" w:name="the-test-suite"/>
     <w:p>
       <w:pPr>
         <w:pStyle w:val="Heading2"/>
@@ -15627,7 +15866,7 @@
         <w:rPr>
           <w:rStyle w:val="CommentTok"/>
         </w:rPr>
-        <w:t xml:space="preserve"># 426 tests, offline, a few seconds</w:t>
+        <w:t xml:space="preserve"># 438 tests, offline, a few seconds</w:t>
       </w:r>
       <w:r>
         <w:br/>
@@ -15814,18 +16053,18 @@
               <w:pStyle w:val="Compact"/>
             </w:pPr>
             <w:r>
-              <w:t xml:space="preserve">15</w:t>
-            </w:r>
-          </w:p>
-        </w:tc>
-        <w:tc>
-          <w:tcPr/>
-          <w:p>
-            <w:pPr>
-              <w:pStyle w:val="Compact"/>
-            </w:pPr>
-            <w:r>
-              <w:t xml:space="preserve">The transcription matches the source document, including its SHA-256 for every committed revision, the scoped name list agrees with the official one, and switching</w:t>
+              <w:t xml:space="preserve">19</w:t>
+            </w:r>
+          </w:p>
+        </w:tc>
+        <w:tc>
+          <w:tcPr/>
+          <w:p>
+            <w:pPr>
+              <w:pStyle w:val="Compact"/>
+            </w:pPr>
+            <w:r>
+              <w:t xml:space="preserve">The transcription matches the source document, including its SHA-256 for every committed revision, the scoped name list agrees with the official one, switching</w:t>
             </w:r>
             <w:r>
               <w:t xml:space="preserve"> </w:t>
@@ -15840,7 +16079,7 @@
               <w:t xml:space="preserve"> </w:t>
             </w:r>
             <w:r>
-              <w:t xml:space="preserve">carries the help texts with it.</w:t>
+              <w:t xml:space="preserve">carries the help texts with it, and each revision selects its own item 5 rule.</w:t>
             </w:r>
           </w:p>
         </w:tc>
@@ -15870,18 +16109,18 @@
               <w:pStyle w:val="Compact"/>
             </w:pPr>
             <w:r>
-              <w:t xml:space="preserve">75</w:t>
-            </w:r>
-          </w:p>
-        </w:tc>
-        <w:tc>
-          <w:tcPr/>
-          <w:p>
-            <w:pPr>
-              <w:pStyle w:val="Compact"/>
-            </w:pPr>
-            <w:r>
-              <w:t xml:space="preserve">The verdict logic, point by point, including the render gate, the EOSC-asset token rule, that a point 3 summary never denies having a name list it was given, and that a link merely labelled "support" does not settle point 6.</w:t>
+              <w:t xml:space="preserve">83</w:t>
+            </w:r>
+          </w:p>
+        </w:tc>
+        <w:tc>
+          <w:tcPr/>
+          <w:p>
+            <w:pPr>
+              <w:pStyle w:val="Compact"/>
+            </w:pPr>
+            <w:r>
+              <w:t xml:space="preserve">The verdict logic, point by point, including both item 5 rules (v3.2: no AUP/UAP link on the NLP fails, one document for both and a licence are review), including the render gate, the EOSC-asset token rule, that a point 3 summary never denies having a name list it was given, and that a link merely labelled "support" does not settle point 6.</w:t>
             </w:r>
           </w:p>
         </w:tc>
@@ -16239,18 +16478,18 @@
               <w:pStyle w:val="Compact"/>
             </w:pPr>
             <w:r>
-              <w:t xml:space="preserve">36</w:t>
-            </w:r>
-          </w:p>
-        </w:tc>
-        <w:tc>
-          <w:tcPr/>
-          <w:p>
-            <w:pPr>
-              <w:pStyle w:val="Compact"/>
-            </w:pPr>
-            <w:r>
-              <w:t xml:space="preserve">Matrix rendering, the dual-depth tables, the mixed-freshness banner, the name-list provenance, and input that would break a table or a list — a</w:t>
+              <w:t xml:space="preserve">37</w:t>
+            </w:r>
+          </w:p>
+        </w:tc>
+        <w:tc>
+          <w:tcPr/>
+          <w:p>
+            <w:pPr>
+              <w:pStyle w:val="Compact"/>
+            </w:pPr>
+            <w:r>
+              <w:t xml:space="preserve">Matrix rendering, the column legend that follows the item 5 rule, the dual-depth tables, the mixed-freshness banner, the name-list provenance, and input that would break a table or a list — a</w:t>
             </w:r>
             <w:r>
               <w:t xml:space="preserve"> </w:t>
@@ -16424,7 +16663,7 @@
       <w:r>
         <w:t xml:space="preserve"> </w:t>
       </w:r>
-      <w:hyperlink r:id="rId44">
+      <w:hyperlink r:id="rId45">
         <w:r>
           <w:rPr>
             <w:rStyle w:val="Hyperlink"/>
@@ -16488,7 +16727,7 @@
         <w:t xml:space="preserve">test_a_pipe_in_a_url_cannot_break_the_table</w:t>
       </w:r>
     </w:p>
-    <w:bookmarkStart w:id="45" w:name="a-note-on-what-a-passing-suite-means"/>
+    <w:bookmarkStart w:id="46" w:name="a-note-on-what-a-passing-suite-means"/>
     <w:p>
       <w:pPr>
         <w:pStyle w:val="Heading3"/>
@@ -16565,9 +16804,9 @@
         </w:pict>
       </w:r>
     </w:p>
-    <w:bookmarkEnd w:id="45"/>
     <w:bookmarkEnd w:id="46"/>
-    <w:bookmarkStart w:id="47" w:name="continuous-integration"/>
+    <w:bookmarkEnd w:id="47"/>
+    <w:bookmarkStart w:id="48" w:name="continuous-integration"/>
     <w:p>
       <w:pPr>
         <w:pStyle w:val="Heading2"/>
@@ -17240,8 +17479,8 @@
         </w:pict>
       </w:r>
     </w:p>
-    <w:bookmarkEnd w:id="47"/>
-    <w:bookmarkStart w:id="48" w:name="troubleshooting"/>
+    <w:bookmarkEnd w:id="48"/>
+    <w:bookmarkStart w:id="49" w:name="troubleshooting"/>
     <w:p>
       <w:pPr>
         <w:pStyle w:val="Heading2"/>
@@ -18446,8 +18685,8 @@
         </w:pict>
       </w:r>
     </w:p>
-    <w:bookmarkEnd w:id="48"/>
-    <w:bookmarkStart w:id="49" w:name="extending-it"/>
+    <w:bookmarkEnd w:id="49"/>
+    <w:bookmarkStart w:id="50" w:name="extending-it"/>
     <w:p>
       <w:pPr>
         <w:pStyle w:val="Heading2"/>
@@ -18641,7 +18880,7 @@
         <w:rPr>
           <w:rStyle w:val="VerbatimChar"/>
         </w:rPr>
-        <w:t xml:space="preserve">v3.1.yaml</w:t>
+        <w:t xml:space="preserve">v3.2.yaml</w:t>
       </w:r>
       <w:r>
         <w:t xml:space="preserve">, with</w:t>
@@ -19081,8 +19320,8 @@
         <w:t xml:space="preserve">checklist transcription, so none of it is under this module's control.</w:t>
       </w:r>
     </w:p>
-    <w:bookmarkEnd w:id="49"/>
-    <w:bookmarkStart w:id="53" w:name="worked-examples"/>
+    <w:bookmarkEnd w:id="50"/>
+    <w:bookmarkStart w:id="54" w:name="worked-examples"/>
     <w:p>
       <w:pPr>
         <w:pStyle w:val="Heading2"/>
@@ -19379,7 +19618,7 @@
         <w:t xml:space="preserve">own run.</w:t>
       </w:r>
     </w:p>
-    <w:bookmarkStart w:id="50" w:name="X073cb44b8dc5d29e47f376bc008b8613dd82a6a"/>
+    <w:bookmarkStart w:id="51" w:name="X073cb44b8dc5d29e47f376bc008b8613dd82a6a"/>
     <w:p>
       <w:pPr>
         <w:pStyle w:val="Heading3"/>
@@ -19502,7 +19741,7 @@
       <w:r>
         <w:t xml:space="preserve"> </w:t>
       </w:r>
-      <w:hyperlink r:id="rId15">
+      <w:hyperlink r:id="rId16">
         <w:r>
           <w:rPr>
             <w:rStyle w:val="Hyperlink"/>
@@ -20974,7 +21213,7 @@
         <w:rPr>
           <w:rStyle w:val="VerbatimChar"/>
         </w:rPr>
-        <w:t xml:space="preserve">web-11</w:t>
+        <w:t xml:space="preserve">web-11-v3.2</w:t>
       </w:r>
       <w:r>
         <w:t xml:space="preserve">). Update it to the new run's shape.</w:t>
@@ -21055,7 +21294,7 @@
         <w:t xml:space="preserve"> </w:t>
       </w:r>
       <w:r>
-        <w:t xml:space="preserve">("130 cells: 49 PASS · 8 FAIL · 73 review");</w:t>
+        <w:t xml:space="preserve">("130 cells: 49 PASS · 14 FAIL · 67 review");</w:t>
       </w:r>
     </w:p>
     <w:p>
@@ -21183,8 +21422,8 @@
         <w:t xml:space="preserve"> push</w:t>
       </w:r>
     </w:p>
-    <w:bookmarkEnd w:id="50"/>
-    <w:bookmarkStart w:id="51" w:name="Xe23e918a40335caa5ab24e15a733d1ac9e4c070"/>
+    <w:bookmarkEnd w:id="51"/>
+    <w:bookmarkStart w:id="52" w:name="Xe23e918a40335caa5ab24e15a733d1ac9e4c070"/>
     <w:p>
       <w:pPr>
         <w:pStyle w:val="Heading3"/>
@@ -22441,8 +22680,8 @@
         <w:t xml:space="preserve">the documents together.</w:t>
       </w:r>
     </w:p>
-    <w:bookmarkEnd w:id="51"/>
-    <w:bookmarkStart w:id="52" w:name="Xa570dceeae7de3d84789b8e054a5bbb043a3946"/>
+    <w:bookmarkEnd w:id="52"/>
+    <w:bookmarkStart w:id="53" w:name="Xa570dceeae7de3d84789b8e054a5bbb043a3946"/>
     <w:p>
       <w:pPr>
         <w:pStyle w:val="Heading3"/>
@@ -22558,7 +22797,7 @@
               <w:rPr>
                 <w:rStyle w:val="VerbatimChar"/>
               </w:rPr>
-              <w:t xml:space="preserve">DEFAULT_CHECKLIST = ROOT / "checklist" / "v3.1.yaml"</w:t>
+              <w:t xml:space="preserve">DEFAULT_CHECKLIST = ROOT / "checklist" / "v3.2.yaml"</w:t>
             </w:r>
           </w:p>
         </w:tc>
@@ -22803,7 +23042,7 @@
         <w:rPr>
           <w:rStyle w:val="VerbatimChar"/>
         </w:rPr>
-        <w:t xml:space="preserve">v3.1.yaml</w:t>
+        <w:t xml:space="preserve">v3.2.yaml</w:t>
       </w:r>
       <w:r>
         <w:t xml:space="preserve"> </w:t>
@@ -22823,28 +23062,34 @@
         <w:pStyle w:val="BodyText"/>
       </w:pPr>
       <w:r>
-        <w:t xml:space="preserve">The example assumes a v3.2 dated 15 October 2026. Use the real version, date</w:t>
-      </w:r>
-      <w:r>
-        <w:t xml:space="preserve"> </w:t>
-      </w:r>
-      <w:r>
-        <w:t xml:space="preserve">and filenames. This procedure was last applied on 26 September 2026, to move</w:t>
-      </w:r>
-      <w:r>
-        <w:t xml:space="preserve"> </w:t>
-      </w:r>
-      <w:r>
-        <w:t xml:space="preserve">from v3.0 to v3.1; the header of</w:t>
-      </w:r>
-      <w:r>
-        <w:t xml:space="preserve"> </w:t>
-      </w:r>
-      <w:r>
-        <w:rPr>
-          <w:rStyle w:val="VerbatimChar"/>
-        </w:rPr>
-        <w:t xml:space="preserve">checklist/v3.1.yaml</w:t>
+        <w:t xml:space="preserve">The example assumes a v3.3 dated 15 October 2026. Use the real version, date</w:t>
+      </w:r>
+      <w:r>
+        <w:t xml:space="preserve"> </w:t>
+      </w:r>
+      <w:r>
+        <w:t xml:space="preserve">and filenames. This procedure was last applied on 29 September 2026, to move</w:t>
+      </w:r>
+      <w:r>
+        <w:t xml:space="preserve"> </w:t>
+      </w:r>
+      <w:r>
+        <w:t xml:space="preserve">from v3.1 to v3.2 (and before that on 26 September, from v3.0 to v3.1);</w:t>
+      </w:r>
+      <w:r>
+        <w:t xml:space="preserve"> </w:t>
+      </w:r>
+      <w:r>
+        <w:t xml:space="preserve">the header of</w:t>
+      </w:r>
+      <w:r>
+        <w:t xml:space="preserve"> </w:t>
+      </w:r>
+      <w:r>
+        <w:rPr>
+          <w:rStyle w:val="VerbatimChar"/>
+        </w:rPr>
+        <w:t xml:space="preserve">checklist/v3.2.yaml</w:t>
       </w:r>
       <w:r>
         <w:t xml:space="preserve"> </w:t>
@@ -22885,7 +23130,7 @@
         <w:rPr>
           <w:rStyle w:val="NormalTok"/>
         </w:rPr>
-        <w:t xml:space="preserve"> ~/Downloads/20261015_Node_Landing_Page_Verification_Checklist_v3.2.pdf checklist/</w:t>
+        <w:t xml:space="preserve"> ~/Downloads/20261015_Node_Landing_Page_Verification_Checklist_v3.3.pdf checklist/</w:t>
       </w:r>
       <w:r>
         <w:br/>
@@ -22900,7 +23145,7 @@
         <w:rPr>
           <w:rStyle w:val="NormalTok"/>
         </w:rPr>
-        <w:t xml:space="preserve"> checklist/20261015_Node_Landing_Page_Verification_Checklist_v3.2.pdf</w:t>
+        <w:t xml:space="preserve"> checklist/20261015_Node_Landing_Page_Verification_Checklist_v3.3.pdf</w:t>
       </w:r>
       <w:r>
         <w:br/>
@@ -22909,7 +23154,7 @@
         <w:rPr>
           <w:rStyle w:val="CommentTok"/>
         </w:rPr>
-        <w:t xml:space="preserve"># on macOS: shasum -a 256 checklist/20261015_Node_Landing_Page_Verification_Checklist_v3.2.pdf</w:t>
+        <w:t xml:space="preserve"># on macOS: shasum -a 256 checklist/20261015_Node_Landing_Page_Verification_Checklist_v3.3.pdf</w:t>
       </w:r>
     </w:p>
     <w:p>
@@ -22917,7 +23162,7 @@
         <w:pStyle w:val="FirstParagraph"/>
       </w:pPr>
       <w:r>
-        <w:t xml:space="preserve">The committed v3.1 file is a PDF rendering of the circulated</w:t>
+        <w:t xml:space="preserve">The committed v3.2 file is a PDF rendering of the circulated</w:t>
       </w:r>
       <w:r>
         <w:t xml:space="preserve"> </w:t>
@@ -22994,7 +23239,7 @@
         <w:rPr>
           <w:rStyle w:val="NormalTok"/>
         </w:rPr>
-        <w:t xml:space="preserve"> checklist/v3.1.yaml checklist/v3.2.yaml</w:t>
+        <w:t xml:space="preserve"> checklist/v3.2.yaml checklist/v3.3.yaml</w:t>
       </w:r>
     </w:p>
     <w:p>
@@ -23011,7 +23256,7 @@
         <w:rPr>
           <w:rStyle w:val="VerbatimChar"/>
         </w:rPr>
-        <w:t xml:space="preserve">checklist/v3.2.yaml</w:t>
+        <w:t xml:space="preserve">checklist/v3.3.yaml</w:t>
       </w:r>
       <w:r>
         <w:t xml:space="preserve">, change the header:</w:t>
@@ -23043,7 +23288,7 @@
         <w:rPr>
           <w:rStyle w:val="StringTok"/>
         </w:rPr>
-        <w:t xml:space="preserve">"3.2"</w:t>
+        <w:t xml:space="preserve">"3.3"</w:t>
       </w:r>
       <w:r>
         <w:br/>
@@ -23091,7 +23336,7 @@
         <w:rPr>
           <w:rStyle w:val="AttributeTok"/>
         </w:rPr>
-        <w:t xml:space="preserve"> 20261015_Node_Landing_Page_Verification_Checklist_v3.2.docx</w:t>
+        <w:t xml:space="preserve"> 20261015_Node_Landing_Page_Verification_Checklist_v3.3.docx</w:t>
       </w:r>
       <w:r>
         <w:br/>
@@ -23112,7 +23357,7 @@
         <w:rPr>
           <w:rStyle w:val="AttributeTok"/>
         </w:rPr>
-        <w:t xml:space="preserve"> 20261015_Node_Landing_Page_Verification_Checklist_v3.2.pdf</w:t>
+        <w:t xml:space="preserve"> 20261015_Node_Landing_Page_Verification_Checklist_v3.3.pdf</w:t>
       </w:r>
       <w:r>
         <w:br/>
@@ -23147,7 +23392,7 @@
         <w:rPr>
           <w:rStyle w:val="VerbatimChar"/>
         </w:rPr>
-        <w:t xml:space="preserve">v3.2.yaml</w:t>
+        <w:t xml:space="preserve">v3.3.yaml</w:t>
       </w:r>
       <w:r>
         <w:t xml:space="preserve"> </w:t>
@@ -23162,7 +23407,7 @@
         <w:rPr>
           <w:rStyle w:val="VerbatimChar"/>
         </w:rPr>
-        <w:t xml:space="preserve">"3.2"</w:t>
+        <w:t xml:space="preserve">"3.3"</w:t>
       </w:r>
       <w:r>
         <w:t xml:space="preserve">); a test</w:t>
@@ -23204,7 +23449,7 @@
         <w:rPr>
           <w:rStyle w:val="VerbatimChar"/>
         </w:rPr>
-        <w:t xml:space="preserve">v3.2.yaml</w:t>
+        <w:t xml:space="preserve">v3.3.yaml</w:t>
       </w:r>
       <w:r>
         <w:t xml:space="preserve">:</w:t>
@@ -23463,297 +23708,183 @@
     </w:p>
     <w:p>
       <w:pPr>
-        <w:pStyle w:val="FirstParagraph"/>
-      </w:pPr>
+        <w:pStyle w:val="Compact"/>
+        <w:numPr>
+          <w:ilvl w:val="0"/>
+          <w:numId w:val="1009"/>
+        </w:numPr>
+      </w:pPr>
+      <w:r>
+        <w:t xml:space="preserve">If a rule became</w:t>
+      </w:r>
+      <w:r>
+        <w:t xml:space="preserve"> </w:t>
+      </w:r>
       <w:r>
         <w:rPr>
           <w:b/>
           <w:bCs/>
         </w:rPr>
-        <w:t xml:space="preserve">Step 4: try the new revision offline, before switching.</w:t>
-      </w:r>
-      <w:r>
-        <w:t xml:space="preserve"> </w:t>
-      </w:r>
-      <w:r>
-        <w:rPr>
-          <w:rStyle w:val="VerbatimChar"/>
-        </w:rPr>
-        <w:t xml:space="preserve">-c</w:t>
-      </w:r>
-      <w:r>
-        <w:t xml:space="preserve"> </w:t>
-      </w:r>
-      <w:r>
-        <w:t xml:space="preserve">applies it to</w:t>
-      </w:r>
-      <w:r>
-        <w:t xml:space="preserve"> </w:t>
-      </w:r>
-      <w:r>
-        <w:t xml:space="preserve">one run only. Re-scoring saved evidence contacts no one:</w:t>
-      </w:r>
-    </w:p>
-    <w:p>
-      <w:pPr>
-        <w:pStyle w:val="SourceCode"/>
-      </w:pPr>
-      <w:r>
-        <w:rPr>
-          <w:rStyle w:val="ExtensionTok"/>
-        </w:rPr>
-        <w:t xml:space="preserve">uv</w:t>
-      </w:r>
-      <w:r>
-        <w:rPr>
-          <w:rStyle w:val="NormalTok"/>
-        </w:rPr>
-        <w:t xml:space="preserve"> run basic-check points </w:t>
-      </w:r>
-      <w:r>
-        <w:rPr>
-          <w:rStyle w:val="AttributeTok"/>
-        </w:rPr>
-        <w:t xml:space="preserve">-c</w:t>
-      </w:r>
-      <w:r>
-        <w:rPr>
-          <w:rStyle w:val="NormalTok"/>
-        </w:rPr>
-        <w:t xml:space="preserve"> checklist/v3.2.yaml</w:t>
-      </w:r>
-      <w:r>
-        <w:br/>
-      </w:r>
-      <w:r>
-        <w:rPr>
-          <w:rStyle w:val="FunctionTok"/>
-        </w:rPr>
-        <w:t xml:space="preserve">mkdir</w:t>
-      </w:r>
-      <w:r>
-        <w:rPr>
-          <w:rStyle w:val="NormalTok"/>
-        </w:rPr>
-        <w:t xml:space="preserve"> </w:t>
-      </w:r>
-      <w:r>
-        <w:rPr>
-          <w:rStyle w:val="AttributeTok"/>
-        </w:rPr>
-        <w:t xml:space="preserve">-p</w:t>
-      </w:r>
-      <w:r>
-        <w:rPr>
-          <w:rStyle w:val="NormalTok"/>
-        </w:rPr>
-        <w:t xml:space="preserve"> /tmp/v32 </w:t>
-      </w:r>
-      <w:r>
-        <w:rPr>
-          <w:rStyle w:val="KeywordTok"/>
-        </w:rPr>
-        <w:t xml:space="preserve">&amp;&amp;</w:t>
-      </w:r>
-      <w:r>
-        <w:rPr>
-          <w:rStyle w:val="NormalTok"/>
-        </w:rPr>
-        <w:t xml:space="preserve"> </w:t>
-      </w:r>
-      <w:r>
-        <w:rPr>
-          <w:rStyle w:val="FunctionTok"/>
-        </w:rPr>
-        <w:t xml:space="preserve">cp</w:t>
-      </w:r>
-      <w:r>
-        <w:rPr>
-          <w:rStyle w:val="NormalTok"/>
-        </w:rPr>
-        <w:t xml:space="preserve"> </w:t>
-      </w:r>
-      <w:r>
-        <w:rPr>
-          <w:rStyle w:val="AttributeTok"/>
-        </w:rPr>
-        <w:t xml:space="preserve">-r</w:t>
-      </w:r>
-      <w:r>
-        <w:rPr>
-          <w:rStyle w:val="NormalTok"/>
-        </w:rPr>
-        <w:t xml:space="preserve"> results/evidence /tmp/v32/</w:t>
-      </w:r>
-      <w:r>
-        <w:br/>
-      </w:r>
-      <w:r>
-        <w:rPr>
-          <w:rStyle w:val="ExtensionTok"/>
-        </w:rPr>
-        <w:t xml:space="preserve">uv</w:t>
-      </w:r>
-      <w:r>
-        <w:rPr>
-          <w:rStyle w:val="NormalTok"/>
-        </w:rPr>
-        <w:t xml:space="preserve"> run basic-check assess </w:t>
-      </w:r>
-      <w:r>
-        <w:rPr>
-          <w:rStyle w:val="AttributeTok"/>
-        </w:rPr>
-        <w:t xml:space="preserve">-c</w:t>
-      </w:r>
-      <w:r>
-        <w:rPr>
-          <w:rStyle w:val="NormalTok"/>
-        </w:rPr>
-        <w:t xml:space="preserve"> checklist/v3.2.yaml </w:t>
-      </w:r>
-      <w:r>
-        <w:rPr>
-          <w:rStyle w:val="AttributeTok"/>
-        </w:rPr>
-        <w:t xml:space="preserve">--results</w:t>
-      </w:r>
-      <w:r>
-        <w:rPr>
-          <w:rStyle w:val="NormalTok"/>
-        </w:rPr>
-        <w:t xml:space="preserve"> /tmp/v32 </w:t>
-      </w:r>
-      <w:r>
-        <w:rPr>
-          <w:rStyle w:val="AttributeTok"/>
-        </w:rPr>
-        <w:t xml:space="preserve">--run</w:t>
-      </w:r>
-      <w:r>
-        <w:rPr>
-          <w:rStyle w:val="NormalTok"/>
-        </w:rPr>
-        <w:t xml:space="preserve"> trial-v3.2</w:t>
+        <w:t xml:space="preserve">stricter or looser</w:t>
+      </w:r>
+      <w:r>
+        <w:t xml:space="preserve">, older runs must keep the rule they</w:t>
+      </w:r>
+      <w:r>
+        <w:t xml:space="preserve"> </w:t>
+      </w:r>
+      <w:r>
+        <w:t xml:space="preserve">were made under. Do not simply change the function: give it a switch, pass</w:t>
+      </w:r>
+      <w:r>
+        <w:t xml:space="preserve"> </w:t>
+      </w:r>
+      <w:r>
+        <w:t xml:space="preserve">the switch from</w:t>
+      </w:r>
+      <w:r>
+        <w:t xml:space="preserve"> </w:t>
+      </w:r>
+      <w:r>
+        <w:rPr>
+          <w:rStyle w:val="VerbatimChar"/>
+        </w:rPr>
+        <w:t xml:space="preserve">run_all()</w:t>
+      </w:r>
+      <w:r>
+        <w:t xml:space="preserve">, and declare it in the new YAML only, so the older</w:t>
+      </w:r>
+      <w:r>
+        <w:t xml:space="preserve"> </w:t>
+      </w:r>
+      <w:r>
+        <w:t xml:space="preserve">files select the old rule by its absence. v3.2 did this for item 5:</w:t>
+      </w:r>
+      <w:r>
+        <w:t xml:space="preserve"> </w:t>
+      </w:r>
+      <w:r>
+        <w:rPr>
+          <w:rStyle w:val="VerbatimChar"/>
+        </w:rPr>
+        <w:t xml:space="preserve">item5_on_nlp: true</w:t>
+      </w:r>
+      <w:r>
+        <w:t xml:space="preserve"> </w:t>
+      </w:r>
+      <w:r>
+        <w:t xml:space="preserve">in</w:t>
+      </w:r>
+      <w:r>
+        <w:t xml:space="preserve"> </w:t>
+      </w:r>
+      <w:r>
+        <w:rPr>
+          <w:rStyle w:val="VerbatimChar"/>
+        </w:rPr>
+        <w:t xml:space="preserve">v3.2.yaml</w:t>
+      </w:r>
+      <w:r>
+        <w:t xml:space="preserve">, read by</w:t>
+      </w:r>
+      <w:r>
+        <w:t xml:space="preserve"> </w:t>
+      </w:r>
+      <w:r>
+        <w:rPr>
+          <w:rStyle w:val="VerbatimChar"/>
+        </w:rPr>
+        <w:t xml:space="preserve">_item5_on_nlp</w:t>
+      </w:r>
+      <w:r>
+        <w:t xml:space="preserve"> </w:t>
+      </w:r>
+      <w:r>
+        <w:t xml:space="preserve">in</w:t>
+      </w:r>
+      <w:r>
+        <w:t xml:space="preserve"> </w:t>
+      </w:r>
+      <w:r>
+        <w:rPr>
+          <w:rStyle w:val="VerbatimChar"/>
+        </w:rPr>
+        <w:t xml:space="preserve">cli.py</w:t>
+      </w:r>
+      <w:r>
+        <w:t xml:space="preserve">,</w:t>
+      </w:r>
+      <w:r>
+        <w:t xml:space="preserve"> </w:t>
+      </w:r>
+      <w:r>
+        <w:t xml:space="preserve">selects the rule that the AUP and UAP must be linked from the NLP, and</w:t>
+      </w:r>
+      <w:r>
+        <w:t xml:space="preserve"> </w:t>
+      </w:r>
+      <w:r>
+        <w:rPr>
+          <w:rStyle w:val="VerbatimChar"/>
+        </w:rPr>
+        <w:t xml:space="preserve">v3.0.yaml</w:t>
+      </w:r>
+      <w:r>
+        <w:t xml:space="preserve">/</w:t>
+      </w:r>
+      <w:r>
+        <w:rPr>
+          <w:rStyle w:val="VerbatimChar"/>
+        </w:rPr>
+        <w:t xml:space="preserve">v3.1.yaml</w:t>
+      </w:r>
+      <w:r>
+        <w:t xml:space="preserve">, which lack the key, keep "on the NLP or in the</w:t>
+      </w:r>
+      <w:r>
+        <w:t xml:space="preserve"> </w:t>
+      </w:r>
+      <w:r>
+        <w:t xml:space="preserve">Catalogue". Add tests for both rules, and rebuild the published run with the</w:t>
+      </w:r>
+      <w:r>
+        <w:t xml:space="preserve"> </w:t>
+      </w:r>
+      <w:r>
+        <w:t xml:space="preserve">old file to prove it is unchanged.</w:t>
       </w:r>
     </w:p>
     <w:p>
       <w:pPr>
         <w:pStyle w:val="FirstParagraph"/>
-      </w:pPr>
-      <w:r>
-        <w:t xml:space="preserve">Compare</w:t>
-      </w:r>
-      <w:r>
-        <w:t xml:space="preserve"> </w:t>
-      </w:r>
-      <w:r>
-        <w:rPr>
-          <w:rStyle w:val="VerbatimChar"/>
-        </w:rPr>
-        <w:t xml:space="preserve">/tmp/v32/results.md</w:t>
-      </w:r>
-      <w:r>
-        <w:t xml:space="preserve"> </w:t>
-      </w:r>
-      <w:r>
-        <w:t xml:space="preserve">with</w:t>
-      </w:r>
-      <w:r>
-        <w:t xml:space="preserve"> </w:t>
-      </w:r>
-      <w:r>
-        <w:rPr>
-          <w:rStyle w:val="VerbatimChar"/>
-        </w:rPr>
-        <w:t xml:space="preserve">results/results.md</w:t>
-      </w:r>
-      <w:r>
-        <w:t xml:space="preserve">. Any difference comes</w:t>
-      </w:r>
-      <w:r>
-        <w:t xml:space="preserve"> </w:t>
-      </w:r>
-      <w:r>
-        <w:t xml:space="preserve">from the new rules alone, since the evidence is the same. If the published run</w:t>
-      </w:r>
-      <w:r>
-        <w:t xml:space="preserve"> </w:t>
-      </w:r>
-      <w:r>
-        <w:t xml:space="preserve">skipped a node or used an older</w:t>
-      </w:r>
-      <w:r>
-        <w:t xml:space="preserve"> </w:t>
-      </w:r>
-      <w:r>
-        <w:rPr>
-          <w:rStyle w:val="VerbatimChar"/>
-        </w:rPr>
-        <w:t xml:space="preserve">nodes.yaml</w:t>
-      </w:r>
-      <w:r>
-        <w:t xml:space="preserve">, pass the same</w:t>
-      </w:r>
-      <w:r>
-        <w:t xml:space="preserve"> </w:t>
-      </w:r>
-      <w:r>
-        <w:rPr>
-          <w:rStyle w:val="VerbatimChar"/>
-        </w:rPr>
-        <w:t xml:space="preserve">--skip</w:t>
-      </w:r>
-      <w:r>
-        <w:t xml:space="preserve"> </w:t>
-      </w:r>
-      <w:r>
-        <w:t xml:space="preserve">and</w:t>
-      </w:r>
-      <w:r>
-        <w:t xml:space="preserve"> </w:t>
-      </w:r>
-      <w:r>
-        <w:rPr>
-          <w:rStyle w:val="VerbatimChar"/>
-        </w:rPr>
-        <w:t xml:space="preserve">--nodes</w:t>
-      </w:r>
-      <w:r>
-        <w:t xml:space="preserve"> </w:t>
-      </w:r>
-      <w:r>
-        <w:t xml:space="preserve">here.</w:t>
-      </w:r>
-    </w:p>
-    <w:p>
-      <w:pPr>
-        <w:pStyle w:val="BodyText"/>
       </w:pPr>
       <w:r>
         <w:rPr>
           <w:b/>
           <w:bCs/>
         </w:rPr>
-        <w:t xml:space="preserve">Step 5: make it the default, and run the tests.</w:t>
-      </w:r>
-      <w:r>
-        <w:t xml:space="preserve"> </w:t>
-      </w:r>
-      <w:r>
-        <w:t xml:space="preserve">In</w:t>
-      </w:r>
-      <w:r>
-        <w:t xml:space="preserve"> </w:t>
-      </w:r>
-      <w:r>
-        <w:rPr>
-          <w:rStyle w:val="VerbatimChar"/>
-        </w:rPr>
-        <w:t xml:space="preserve">src/basic_check/cli.py</w:t>
-      </w:r>
-      <w:r>
-        <w:t xml:space="preserve">:</w:t>
+        <w:t xml:space="preserve">Step 4: try the new revision offline, before switching.</w:t>
+      </w:r>
+      <w:r>
+        <w:t xml:space="preserve"> </w:t>
+      </w:r>
+      <w:r>
+        <w:rPr>
+          <w:rStyle w:val="VerbatimChar"/>
+        </w:rPr>
+        <w:t xml:space="preserve">-c</w:t>
+      </w:r>
+      <w:r>
+        <w:t xml:space="preserve"> </w:t>
+      </w:r>
+      <w:r>
+        <w:t xml:space="preserve">applies it to</w:t>
+      </w:r>
+      <w:r>
+        <w:t xml:space="preserve"> </w:t>
+      </w:r>
+      <w:r>
+        <w:t xml:space="preserve">one run only. Re-scoring saved evidence contacts no one:</w:t>
       </w:r>
     </w:p>
     <w:p>
@@ -23762,27 +23893,36 @@
       </w:pPr>
       <w:r>
         <w:rPr>
+          <w:rStyle w:val="ExtensionTok"/>
+        </w:rPr>
+        <w:t xml:space="preserve">uv</w:t>
+      </w:r>
+      <w:r>
+        <w:rPr>
           <w:rStyle w:val="NormalTok"/>
         </w:rPr>
-        <w:t xml:space="preserve">DEFAULT_CHECKLIST </w:t>
-      </w:r>
-      <w:r>
-        <w:rPr>
-          <w:rStyle w:val="OperatorTok"/>
-        </w:rPr>
-        <w:t xml:space="preserve">=</w:t>
+        <w:t xml:space="preserve"> run basic-check points </w:t>
+      </w:r>
+      <w:r>
+        <w:rPr>
+          <w:rStyle w:val="AttributeTok"/>
+        </w:rPr>
+        <w:t xml:space="preserve">-c</w:t>
       </w:r>
       <w:r>
         <w:rPr>
           <w:rStyle w:val="NormalTok"/>
         </w:rPr>
-        <w:t xml:space="preserve"> ROOT </w:t>
-      </w:r>
-      <w:r>
-        <w:rPr>
-          <w:rStyle w:val="OperatorTok"/>
-        </w:rPr>
-        <w:t xml:space="preserve">/</w:t>
+        <w:t xml:space="preserve"> checklist/v3.3.yaml</w:t>
+      </w:r>
+      <w:r>
+        <w:br/>
+      </w:r>
+      <w:r>
+        <w:rPr>
+          <w:rStyle w:val="FunctionTok"/>
+        </w:rPr>
+        <w:t xml:space="preserve">mkdir</w:t>
       </w:r>
       <w:r>
         <w:rPr>
@@ -23792,21 +23932,21 @@
       </w:r>
       <w:r>
         <w:rPr>
-          <w:rStyle w:val="StringTok"/>
-        </w:rPr>
-        <w:t xml:space="preserve">"checklist"</w:t>
+          <w:rStyle w:val="AttributeTok"/>
+        </w:rPr>
+        <w:t xml:space="preserve">-p</w:t>
       </w:r>
       <w:r>
         <w:rPr>
           <w:rStyle w:val="NormalTok"/>
         </w:rPr>
-        <w:t xml:space="preserve"> </w:t>
-      </w:r>
-      <w:r>
-        <w:rPr>
-          <w:rStyle w:val="OperatorTok"/>
-        </w:rPr>
-        <w:t xml:space="preserve">/</w:t>
+        <w:t xml:space="preserve"> /tmp/v33 </w:t>
+      </w:r>
+      <w:r>
+        <w:rPr>
+          <w:rStyle w:val="KeywordTok"/>
+        </w:rPr>
+        <w:t xml:space="preserve">&amp;&amp;</w:t>
       </w:r>
       <w:r>
         <w:rPr>
@@ -23816,15 +23956,31 @@
       </w:r>
       <w:r>
         <w:rPr>
-          <w:rStyle w:val="StringTok"/>
-        </w:rPr>
-        <w:t xml:space="preserve">"v3.2.yaml"</w:t>
-      </w:r>
-    </w:p>
-    <w:p>
-      <w:pPr>
-        <w:pStyle w:val="SourceCode"/>
-      </w:pPr>
+          <w:rStyle w:val="FunctionTok"/>
+        </w:rPr>
+        <w:t xml:space="preserve">cp</w:t>
+      </w:r>
+      <w:r>
+        <w:rPr>
+          <w:rStyle w:val="NormalTok"/>
+        </w:rPr>
+        <w:t xml:space="preserve"> </w:t>
+      </w:r>
+      <w:r>
+        <w:rPr>
+          <w:rStyle w:val="AttributeTok"/>
+        </w:rPr>
+        <w:t xml:space="preserve">-r</w:t>
+      </w:r>
+      <w:r>
+        <w:rPr>
+          <w:rStyle w:val="NormalTok"/>
+        </w:rPr>
+        <w:t xml:space="preserve"> results/evidence /tmp/v33/</w:t>
+      </w:r>
+      <w:r>
+        <w:br/>
+      </w:r>
       <w:r>
         <w:rPr>
           <w:rStyle w:val="ExtensionTok"/>
@@ -23835,46 +23991,43 @@
         <w:rPr>
           <w:rStyle w:val="NormalTok"/>
         </w:rPr>
-        <w:t xml:space="preserve"> run pytest </w:t>
+        <w:t xml:space="preserve"> run basic-check assess </w:t>
       </w:r>
       <w:r>
         <w:rPr>
           <w:rStyle w:val="AttributeTok"/>
         </w:rPr>
-        <w:t xml:space="preserve">-q</w:t>
-      </w:r>
-      <w:r>
-        <w:br/>
-      </w:r>
-      <w:r>
-        <w:rPr>
-          <w:rStyle w:val="ExtensionTok"/>
-        </w:rPr>
-        <w:t xml:space="preserve">uv</w:t>
+        <w:t xml:space="preserve">-c</w:t>
       </w:r>
       <w:r>
         <w:rPr>
           <w:rStyle w:val="NormalTok"/>
         </w:rPr>
-        <w:t xml:space="preserve"> run basic-check </w:t>
+        <w:t xml:space="preserve"> checklist/v3.3.yaml </w:t>
       </w:r>
       <w:r>
         <w:rPr>
           <w:rStyle w:val="AttributeTok"/>
         </w:rPr>
-        <w:t xml:space="preserve">--help</w:t>
+        <w:t xml:space="preserve">--results</w:t>
       </w:r>
       <w:r>
         <w:rPr>
           <w:rStyle w:val="NormalTok"/>
         </w:rPr>
-        <w:t xml:space="preserve">     </w:t>
-      </w:r>
-      <w:r>
-        <w:rPr>
-          <w:rStyle w:val="CommentTok"/>
-        </w:rPr>
-        <w:t xml:space="preserve"># now says "against checklist v3.2"</w:t>
+        <w:t xml:space="preserve"> /tmp/v33 </w:t>
+      </w:r>
+      <w:r>
+        <w:rPr>
+          <w:rStyle w:val="AttributeTok"/>
+        </w:rPr>
+        <w:t xml:space="preserve">--run</w:t>
+      </w:r>
+      <w:r>
+        <w:rPr>
+          <w:rStyle w:val="NormalTok"/>
+        </w:rPr>
+        <w:t xml:space="preserve"> trial-v3.3</w:t>
       </w:r>
     </w:p>
     <w:p>
@@ -23882,73 +24035,88 @@
         <w:pStyle w:val="FirstParagraph"/>
       </w:pPr>
       <w:r>
-        <w:t xml:space="preserve">The tests check the new file's hash, that its version matches its filename,</w:t>
-      </w:r>
-      <w:r>
-        <w:t xml:space="preserve"> </w:t>
-      </w:r>
-      <w:r>
-        <w:t xml:space="preserve">and that every point maps to exactly one</w:t>
-      </w:r>
-      <w:r>
-        <w:t xml:space="preserve"> </w:t>
-      </w:r>
-      <w:r>
-        <w:rPr>
-          <w:rStyle w:val="VerbatimChar"/>
-        </w:rPr>
-        <w:t xml:space="preserve">check_*</w:t>
-      </w:r>
-      <w:r>
-        <w:t xml:space="preserve"> </w:t>
-      </w:r>
-      <w:r>
-        <w:t xml:space="preserve">function and every function</w:t>
-      </w:r>
-      <w:r>
-        <w:t xml:space="preserve"> </w:t>
-      </w:r>
-      <w:r>
-        <w:t xml:space="preserve">to one point. They also check that</w:t>
-      </w:r>
-      <w:r>
-        <w:t xml:space="preserve"> </w:t>
-      </w:r>
-      <w:r>
-        <w:rPr>
-          <w:rStyle w:val="VerbatimChar"/>
-        </w:rPr>
-        <w:t xml:space="preserve">v3.1.yaml</w:t>
-      </w:r>
-      <w:r>
-        <w:t xml:space="preserve"> </w:t>
-      </w:r>
-      <w:r>
-        <w:t xml:space="preserve">and its document are still</w:t>
-      </w:r>
-      <w:r>
-        <w:t xml:space="preserve"> </w:t>
-      </w:r>
-      <w:r>
-        <w:t xml:space="preserve">intact, so older runs can still be rebuilt with</w:t>
-      </w:r>
-      <w:r>
-        <w:t xml:space="preserve"> </w:t>
-      </w:r>
-      <w:r>
-        <w:rPr>
-          <w:rStyle w:val="VerbatimChar"/>
-        </w:rPr>
-        <w:t xml:space="preserve">-c checklist/v3.1.yaml</w:t>
-      </w:r>
-      <w:r>
-        <w:t xml:space="preserve">. What</w:t>
-      </w:r>
-      <w:r>
-        <w:t xml:space="preserve"> </w:t>
-      </w:r>
-      <w:r>
-        <w:t xml:space="preserve">they cannot check is whether a rule is right: that is step 3.</w:t>
+        <w:t xml:space="preserve">Compare</w:t>
+      </w:r>
+      <w:r>
+        <w:t xml:space="preserve"> </w:t>
+      </w:r>
+      <w:r>
+        <w:rPr>
+          <w:rStyle w:val="VerbatimChar"/>
+        </w:rPr>
+        <w:t xml:space="preserve">/tmp/v33/results.md</w:t>
+      </w:r>
+      <w:r>
+        <w:t xml:space="preserve"> </w:t>
+      </w:r>
+      <w:r>
+        <w:t xml:space="preserve">with</w:t>
+      </w:r>
+      <w:r>
+        <w:t xml:space="preserve"> </w:t>
+      </w:r>
+      <w:r>
+        <w:rPr>
+          <w:rStyle w:val="VerbatimChar"/>
+        </w:rPr>
+        <w:t xml:space="preserve">results/results.md</w:t>
+      </w:r>
+      <w:r>
+        <w:t xml:space="preserve">. Any difference comes</w:t>
+      </w:r>
+      <w:r>
+        <w:t xml:space="preserve"> </w:t>
+      </w:r>
+      <w:r>
+        <w:t xml:space="preserve">from the new rules alone, since the evidence is the same. If the published run</w:t>
+      </w:r>
+      <w:r>
+        <w:t xml:space="preserve"> </w:t>
+      </w:r>
+      <w:r>
+        <w:t xml:space="preserve">skipped a node or used an older</w:t>
+      </w:r>
+      <w:r>
+        <w:t xml:space="preserve"> </w:t>
+      </w:r>
+      <w:r>
+        <w:rPr>
+          <w:rStyle w:val="VerbatimChar"/>
+        </w:rPr>
+        <w:t xml:space="preserve">nodes.yaml</w:t>
+      </w:r>
+      <w:r>
+        <w:t xml:space="preserve">, pass the same</w:t>
+      </w:r>
+      <w:r>
+        <w:t xml:space="preserve"> </w:t>
+      </w:r>
+      <w:r>
+        <w:rPr>
+          <w:rStyle w:val="VerbatimChar"/>
+        </w:rPr>
+        <w:t xml:space="preserve">--skip</w:t>
+      </w:r>
+      <w:r>
+        <w:t xml:space="preserve"> </w:t>
+      </w:r>
+      <w:r>
+        <w:t xml:space="preserve">and</w:t>
+      </w:r>
+      <w:r>
+        <w:t xml:space="preserve"> </w:t>
+      </w:r>
+      <w:r>
+        <w:rPr>
+          <w:rStyle w:val="VerbatimChar"/>
+        </w:rPr>
+        <w:t xml:space="preserve">--nodes</w:t>
+      </w:r>
+      <w:r>
+        <w:t xml:space="preserve"> </w:t>
+      </w:r>
+      <w:r>
+        <w:t xml:space="preserve">here.</w:t>
       </w:r>
     </w:p>
     <w:p>
@@ -23960,6 +24128,231 @@
           <w:b/>
           <w:bCs/>
         </w:rPr>
+        <w:t xml:space="preserve">Step 5: make it the default, and run the tests.</w:t>
+      </w:r>
+      <w:r>
+        <w:t xml:space="preserve"> </w:t>
+      </w:r>
+      <w:r>
+        <w:t xml:space="preserve">In</w:t>
+      </w:r>
+      <w:r>
+        <w:t xml:space="preserve"> </w:t>
+      </w:r>
+      <w:r>
+        <w:rPr>
+          <w:rStyle w:val="VerbatimChar"/>
+        </w:rPr>
+        <w:t xml:space="preserve">src/basic_check/cli.py</w:t>
+      </w:r>
+      <w:r>
+        <w:t xml:space="preserve">:</w:t>
+      </w:r>
+    </w:p>
+    <w:p>
+      <w:pPr>
+        <w:pStyle w:val="SourceCode"/>
+      </w:pPr>
+      <w:r>
+        <w:rPr>
+          <w:rStyle w:val="NormalTok"/>
+        </w:rPr>
+        <w:t xml:space="preserve">DEFAULT_CHECKLIST </w:t>
+      </w:r>
+      <w:r>
+        <w:rPr>
+          <w:rStyle w:val="OperatorTok"/>
+        </w:rPr>
+        <w:t xml:space="preserve">=</w:t>
+      </w:r>
+      <w:r>
+        <w:rPr>
+          <w:rStyle w:val="NormalTok"/>
+        </w:rPr>
+        <w:t xml:space="preserve"> ROOT </w:t>
+      </w:r>
+      <w:r>
+        <w:rPr>
+          <w:rStyle w:val="OperatorTok"/>
+        </w:rPr>
+        <w:t xml:space="preserve">/</w:t>
+      </w:r>
+      <w:r>
+        <w:rPr>
+          <w:rStyle w:val="NormalTok"/>
+        </w:rPr>
+        <w:t xml:space="preserve"> </w:t>
+      </w:r>
+      <w:r>
+        <w:rPr>
+          <w:rStyle w:val="StringTok"/>
+        </w:rPr>
+        <w:t xml:space="preserve">"checklist"</w:t>
+      </w:r>
+      <w:r>
+        <w:rPr>
+          <w:rStyle w:val="NormalTok"/>
+        </w:rPr>
+        <w:t xml:space="preserve"> </w:t>
+      </w:r>
+      <w:r>
+        <w:rPr>
+          <w:rStyle w:val="OperatorTok"/>
+        </w:rPr>
+        <w:t xml:space="preserve">/</w:t>
+      </w:r>
+      <w:r>
+        <w:rPr>
+          <w:rStyle w:val="NormalTok"/>
+        </w:rPr>
+        <w:t xml:space="preserve"> </w:t>
+      </w:r>
+      <w:r>
+        <w:rPr>
+          <w:rStyle w:val="StringTok"/>
+        </w:rPr>
+        <w:t xml:space="preserve">"v3.3.yaml"</w:t>
+      </w:r>
+    </w:p>
+    <w:p>
+      <w:pPr>
+        <w:pStyle w:val="SourceCode"/>
+      </w:pPr>
+      <w:r>
+        <w:rPr>
+          <w:rStyle w:val="ExtensionTok"/>
+        </w:rPr>
+        <w:t xml:space="preserve">uv</w:t>
+      </w:r>
+      <w:r>
+        <w:rPr>
+          <w:rStyle w:val="NormalTok"/>
+        </w:rPr>
+        <w:t xml:space="preserve"> run pytest </w:t>
+      </w:r>
+      <w:r>
+        <w:rPr>
+          <w:rStyle w:val="AttributeTok"/>
+        </w:rPr>
+        <w:t xml:space="preserve">-q</w:t>
+      </w:r>
+      <w:r>
+        <w:br/>
+      </w:r>
+      <w:r>
+        <w:rPr>
+          <w:rStyle w:val="ExtensionTok"/>
+        </w:rPr>
+        <w:t xml:space="preserve">uv</w:t>
+      </w:r>
+      <w:r>
+        <w:rPr>
+          <w:rStyle w:val="NormalTok"/>
+        </w:rPr>
+        <w:t xml:space="preserve"> run basic-check </w:t>
+      </w:r>
+      <w:r>
+        <w:rPr>
+          <w:rStyle w:val="AttributeTok"/>
+        </w:rPr>
+        <w:t xml:space="preserve">--help</w:t>
+      </w:r>
+      <w:r>
+        <w:rPr>
+          <w:rStyle w:val="NormalTok"/>
+        </w:rPr>
+        <w:t xml:space="preserve">     </w:t>
+      </w:r>
+      <w:r>
+        <w:rPr>
+          <w:rStyle w:val="CommentTok"/>
+        </w:rPr>
+        <w:t xml:space="preserve"># now says "against checklist v3.3"</w:t>
+      </w:r>
+    </w:p>
+    <w:p>
+      <w:pPr>
+        <w:pStyle w:val="FirstParagraph"/>
+      </w:pPr>
+      <w:r>
+        <w:t xml:space="preserve">The tests check the new file's hash, that its version matches its filename,</w:t>
+      </w:r>
+      <w:r>
+        <w:t xml:space="preserve"> </w:t>
+      </w:r>
+      <w:r>
+        <w:t xml:space="preserve">and that every point maps to exactly one</w:t>
+      </w:r>
+      <w:r>
+        <w:t xml:space="preserve"> </w:t>
+      </w:r>
+      <w:r>
+        <w:rPr>
+          <w:rStyle w:val="VerbatimChar"/>
+        </w:rPr>
+        <w:t xml:space="preserve">check_*</w:t>
+      </w:r>
+      <w:r>
+        <w:t xml:space="preserve"> </w:t>
+      </w:r>
+      <w:r>
+        <w:t xml:space="preserve">function and every function</w:t>
+      </w:r>
+      <w:r>
+        <w:t xml:space="preserve"> </w:t>
+      </w:r>
+      <w:r>
+        <w:t xml:space="preserve">to one point. They also check that</w:t>
+      </w:r>
+      <w:r>
+        <w:t xml:space="preserve"> </w:t>
+      </w:r>
+      <w:r>
+        <w:rPr>
+          <w:rStyle w:val="VerbatimChar"/>
+        </w:rPr>
+        <w:t xml:space="preserve">v3.2.yaml</w:t>
+      </w:r>
+      <w:r>
+        <w:t xml:space="preserve"> </w:t>
+      </w:r>
+      <w:r>
+        <w:t xml:space="preserve">and its document are still</w:t>
+      </w:r>
+      <w:r>
+        <w:t xml:space="preserve"> </w:t>
+      </w:r>
+      <w:r>
+        <w:t xml:space="preserve">intact, so older runs can still be rebuilt with</w:t>
+      </w:r>
+      <w:r>
+        <w:t xml:space="preserve"> </w:t>
+      </w:r>
+      <w:r>
+        <w:rPr>
+          <w:rStyle w:val="VerbatimChar"/>
+        </w:rPr>
+        <w:t xml:space="preserve">-c checklist/v3.2.yaml</w:t>
+      </w:r>
+      <w:r>
+        <w:t xml:space="preserve">. What</w:t>
+      </w:r>
+      <w:r>
+        <w:t xml:space="preserve"> </w:t>
+      </w:r>
+      <w:r>
+        <w:t xml:space="preserve">they cannot check is whether a rule is right: that is step 3.</w:t>
+      </w:r>
+    </w:p>
+    <w:p>
+      <w:pPr>
+        <w:pStyle w:val="BodyText"/>
+      </w:pPr>
+      <w:r>
+        <w:rPr>
+          <w:b/>
+          <w:bCs/>
+        </w:rPr>
         <w:t xml:space="preserve">Step 6: produce and publish the results.</w:t>
       </w:r>
       <w:r>
@@ -23972,7 +24365,7 @@
         <w:t xml:space="preserve"> </w:t>
       </w:r>
       <w:r>
-        <w:t xml:space="preserve">v3.2, so no</w:t>
+        <w:t xml:space="preserve">v3.3, so no</w:t>
       </w:r>
       <w:r>
         <w:t xml:space="preserve"> </w:t>
@@ -24037,7 +24430,7 @@
         <w:rPr>
           <w:rStyle w:val="NormalTok"/>
         </w:rPr>
-        <w:t xml:space="preserve"> live-2026-10-20-v3.2</w:t>
+        <w:t xml:space="preserve"> live-2026-10-20-v3.3</w:t>
       </w:r>
       <w:r>
         <w:br/>
@@ -24136,7 +24529,7 @@
         <w:rPr>
           <w:rStyle w:val="NormalTok"/>
         </w:rPr>
-        <w:t xml:space="preserve"> live-2026-10-20-v3.2</w:t>
+        <w:t xml:space="preserve"> live-2026-10-20-v3.3</w:t>
       </w:r>
     </w:p>
     <w:p>
@@ -24144,7 +24537,7 @@
         <w:pStyle w:val="FirstParagraph"/>
       </w:pPr>
       <w:r>
-        <w:t xml:space="preserve">Alternatively, re-score the published evidence against v3.2 without contacting</w:t>
+        <w:t xml:space="preserve">Alternatively, re-score the published evidence against v3.3 without contacting</w:t>
       </w:r>
       <w:r>
         <w:t xml:space="preserve"> </w:t>
@@ -24162,7 +24555,7 @@
         <w:t xml:space="preserve">results/</w:t>
       </w:r>
       <w:r>
-        <w:t xml:space="preserve">. The report then says v3.2,</w:t>
+        <w:t xml:space="preserve">. The report then says v3.3,</w:t>
       </w:r>
       <w:r>
         <w:t xml:space="preserve"> </w:t>
@@ -24185,21 +24578,21 @@
         <w:rPr>
           <w:rStyle w:val="VerbatimChar"/>
         </w:rPr>
+        <w:t xml:space="preserve">results/checklist-v3.3.html</w:t>
+      </w:r>
+      <w:r>
+        <w:t xml:space="preserve">. The old</w:t>
+      </w:r>
+      <w:r>
+        <w:t xml:space="preserve"> </w:t>
+      </w:r>
+      <w:r>
+        <w:rPr>
+          <w:rStyle w:val="VerbatimChar"/>
+        </w:rPr>
         <w:t xml:space="preserve">results/checklist-v3.2.html</w:t>
       </w:r>
       <w:r>
-        <w:t xml:space="preserve">. The old</w:t>
-      </w:r>
-      <w:r>
-        <w:t xml:space="preserve"> </w:t>
-      </w:r>
-      <w:r>
-        <w:rPr>
-          <w:rStyle w:val="VerbatimChar"/>
-        </w:rPr>
-        <w:t xml:space="preserve">results/checklist-v3.1.html</w:t>
-      </w:r>
-      <w:r>
         <w:t xml:space="preserve"> </w:t>
       </w:r>
       <w:r>
@@ -24209,7 +24602,7 @@
         <w:t xml:space="preserve"> </w:t>
       </w:r>
       <w:r>
-        <w:t xml:space="preserve">that name v3.1 in prose or links:</w:t>
+        <w:t xml:space="preserve">that name v3.2 in prose or links:</w:t>
       </w:r>
     </w:p>
     <w:p>
@@ -24226,7 +24619,7 @@
         <w:rPr>
           <w:rStyle w:val="NormalTok"/>
         </w:rPr>
-        <w:t xml:space="preserve"> rm results/checklist-v3.1.html</w:t>
+        <w:t xml:space="preserve"> rm results/checklist-v3.2.html</w:t>
       </w:r>
       <w:r>
         <w:br/>
@@ -24259,7 +24652,7 @@
         <w:rPr>
           <w:rStyle w:val="StringTok"/>
         </w:rPr>
-        <w:t xml:space="preserve">"v3\.1"</w:t>
+        <w:t xml:space="preserve">"v3\.2"</w:t>
       </w:r>
       <w:r>
         <w:rPr>
@@ -24294,7 +24687,7 @@
         <w:rPr>
           <w:rStyle w:val="VerbatimChar"/>
         </w:rPr>
-        <w:t xml:space="preserve">results/checklist-v3.1.html#p…</w:t>
+        <w:t xml:space="preserve">results/checklist-v3.2.html#p…</w:t>
       </w:r>
       <w:r>
         <w:t xml:space="preserve">. Those links break once the file is removed,</w:t>
@@ -24312,7 +24705,7 @@
         <w:rPr>
           <w:rStyle w:val="VerbatimChar"/>
         </w:rPr>
-        <w:t xml:space="preserve">v3.2</w:t>
+        <w:t xml:space="preserve">v3.3</w:t>
       </w:r>
       <w:r>
         <w:t xml:space="preserve">.</w:t>
@@ -24383,7 +24776,7 @@
         <w:rPr>
           <w:rStyle w:val="VerbatimChar"/>
         </w:rPr>
-        <w:t xml:space="preserve">checklist/v3.2.yaml</w:t>
+        <w:t xml:space="preserve">checklist/v3.3.yaml</w:t>
       </w:r>
       <w:r>
         <w:t xml:space="preserve">,</w:t>
@@ -24429,9 +24822,9 @@
         </w:pict>
       </w:r>
     </w:p>
-    <w:bookmarkEnd w:id="52"/>
     <w:bookmarkEnd w:id="53"/>
-    <w:bookmarkStart w:id="54" w:name="sources"/>
+    <w:bookmarkEnd w:id="54"/>
+    <w:bookmarkStart w:id="55" w:name="sources"/>
     <w:p>
       <w:pPr>
         <w:pStyle w:val="Heading2"/>
@@ -24458,7 +24851,7 @@
         <w:rPr>
           <w:rStyle w:val="VerbatimChar"/>
         </w:rPr>
-        <w:t xml:space="preserve">checklist/20260910_Node_Landing_Page_Verification_Checklist_v3.1.pdf</w:t>
+        <w:t xml:space="preserve">checklist/20260928_Node_Landing_Page_Verification_Checklist_v3.2.pdf</w:t>
       </w:r>
       <w:r>
         <w:t xml:space="preserve">, transcribed to</w:t>
@@ -24470,13 +24863,40 @@
         <w:rPr>
           <w:rStyle w:val="VerbatimChar"/>
         </w:rPr>
+        <w:t xml:space="preserve">checklist/v3.2.yaml</w:t>
+      </w:r>
+      <w:r>
+        <w:t xml:space="preserve"> </w:t>
+      </w:r>
+      <w:r>
+        <w:t xml:space="preserve">with its SHA-256 pinned (earlier revisions:</w:t>
+      </w:r>
+      <w:r>
+        <w:t xml:space="preserve"> </w:t>
+      </w:r>
+      <w:r>
+        <w:rPr>
+          <w:rStyle w:val="VerbatimChar"/>
+        </w:rPr>
         <w:t xml:space="preserve">checklist/v3.1.yaml</w:t>
       </w:r>
       <w:r>
         <w:t xml:space="preserve"> </w:t>
       </w:r>
       <w:r>
-        <w:t xml:space="preserve">with its SHA-256 pinned</w:t>
+        <w:t xml:space="preserve">and</w:t>
+      </w:r>
+      <w:r>
+        <w:t xml:space="preserve"> </w:t>
+      </w:r>
+      <w:r>
+        <w:rPr>
+          <w:rStyle w:val="VerbatimChar"/>
+        </w:rPr>
+        <w:t xml:space="preserve">checklist/v3.0.yaml</w:t>
+      </w:r>
+      <w:r>
+        <w:t xml:space="preserve">, with their documents)</w:t>
       </w:r>
     </w:p>
     <w:p>
@@ -24536,9 +24956,9 @@
         <w:t xml:space="preserve">Playwright for Python: https://playwright.dev/python/</w:t>
       </w:r>
     </w:p>
-    <w:bookmarkEnd w:id="54"/>
+    <w:bookmarkEnd w:id="55"/>
     <w:sectPr>
-      <w:footerReference w:type="default" r:id="rId11"/>
+      <w:footerReference w:type="default" r:id="rId12"/>
       <w:footnotePr>
         <w:numRestart w:val="eachSect"/>
       </w:footnotePr>

</xml_diff>

<commit_message>
Publish run web-25 (depth 2, re-issued checklist v3.2, 68/0/62 at both depths, 109 requests): no FAIL left; BBMRI-ERIC's dev3 page served (robots.txt no longer excludes the tool); EOSC Finland links its eosc.eu entry (point 4 passes) and its Node Policies (5c passes); Data Terra 5c passes; GÉANT behind the Cloudflare challenge; fifteen new names on BBMRI-ERIC's dev3 pages masked; names test expects eight matches; docs and Word/PDF guides updated
</commit_message>
<xml_diff>
--- a/docs/eosc-basic-compliance-guide.docx
+++ b/docs/eosc-basic-compliance-guide.docx
@@ -23,7 +23,7 @@
         <w:pStyle w:val="Author"/>
       </w:pPr>
       <w:r>
-        <w:t xml:space="preserve">Verified against a clean clone on 26 September 2026 — rebuilt 5 October 2026 for the re-issued checklist v3.2</w:t>
+        <w:t xml:space="preserve">Verified against a clean clone on 26 September 2026 — rebuilt 6 October 2026 for the re-issued checklist v3.2</w:t>
       </w:r>
     </w:p>
     <w:p>
@@ -499,7 +499,7 @@
           <w:b/>
           <w:bCs/>
         </w:rPr>
-        <w:t xml:space="preserve">The published run changed again on 5 October 2026.</w:t>
+        <w:t xml:space="preserve">The published run changed again on 6 October 2026.</w:t>
       </w:r>
       <w:r>
         <w:t xml:space="preserve"> </w:t>
@@ -529,33 +529,146 @@
         <w:rPr>
           <w:rStyle w:val="VerbatimChar"/>
         </w:rPr>
+        <w:t xml:space="preserve">web-25</w:t>
+      </w:r>
+      <w:r>
+        <w:t xml:space="preserve">, collected by the GitHub workflow at</w:t>
+      </w:r>
+      <w:r>
+        <w:t xml:space="preserve"> </w:t>
+      </w:r>
+      <w:r>
+        <w:rPr>
+          <w:rStyle w:val="VerbatimChar"/>
+        </w:rPr>
+        <w:t xml:space="preserve">--depth 2</w:t>
+      </w:r>
+      <w:r>
+        <w:t xml:space="preserve"> </w:t>
+      </w:r>
+      <w:r>
+        <w:t xml:space="preserve">on 6 October</w:t>
+      </w:r>
+      <w:r>
+        <w:t xml:space="preserve"> </w:t>
+      </w:r>
+      <w:r>
+        <w:t xml:space="preserve">2026 between 10:35 and 10:41 UTC from all thirteen nodes (</w:t>
+      </w:r>
+      <w:hyperlink r:id="rId10">
+        <w:r>
+          <w:rPr>
+            <w:rStyle w:val="Hyperlink"/>
+          </w:rPr>
+          <w:t xml:space="preserve">run 37450646487</w:t>
+        </w:r>
+      </w:hyperlink>
+      <w:r>
+        <w:t xml:space="preserve">, commit</w:t>
+      </w:r>
+      <w:r>
+        <w:t xml:space="preserve"> </w:t>
+      </w:r>
+      <w:r>
+        <w:rPr>
+          <w:rStyle w:val="VerbatimChar"/>
+        </w:rPr>
+        <w:t xml:space="preserve">ddb7711</w:t>
+      </w:r>
+      <w:r>
+        <w:t xml:space="preserve">), under the re-issued v3.2: 68 PASS, 0 FAIL and 62 MANUAL_REVIEW at</w:t>
+      </w:r>
+      <w:r>
+        <w:t xml:space="preserve"> </w:t>
+      </w:r>
+      <w:r>
+        <w:t xml:space="preserve">both depths, in 109 page requests. BBMRI-ERIC’s</w:t>
+      </w:r>
+      <w:r>
+        <w:t xml:space="preserve"> </w:t>
+      </w:r>
+      <w:r>
+        <w:rPr>
+          <w:rStyle w:val="VerbatimChar"/>
+        </w:rPr>
+        <w:t xml:space="preserve">dev3.</w:t>
+      </w:r>
+      <w:r>
+        <w:t xml:space="preserve"> </w:t>
+      </w:r>
+      <w:r>
+        <w:t xml:space="preserve">page was served</w:t>
+      </w:r>
+      <w:r>
+        <w:t xml:space="preserve"> </w:t>
+      </w:r>
+      <w:r>
+        <w:t xml:space="preserve">(its</w:t>
+      </w:r>
+      <w:r>
+        <w:t xml:space="preserve"> </w:t>
+      </w:r>
+      <w:r>
+        <w:rPr>
+          <w:rStyle w:val="VerbatimChar"/>
+        </w:rPr>
+        <w:t xml:space="preserve">robots.txt</w:t>
+      </w:r>
+      <w:r>
+        <w:t xml:space="preserve"> </w:t>
+      </w:r>
+      <w:r>
+        <w:t xml:space="preserve">no longer excludes the tool), EOSC Finland now links its own</w:t>
+      </w:r>
+      <w:r>
+        <w:t xml:space="preserve"> </w:t>
+      </w:r>
+      <w:r>
+        <w:rPr>
+          <w:rStyle w:val="VerbatimChar"/>
+        </w:rPr>
+        <w:t xml:space="preserve">eosc.eu</w:t>
+      </w:r>
+      <w:r>
+        <w:t xml:space="preserve"> </w:t>
+      </w:r>
+      <w:r>
+        <w:t xml:space="preserve">entry, so no FAIL is left, and Finland’s and Data Terra’s 5c moved</w:t>
+      </w:r>
+      <w:r>
+        <w:t xml:space="preserve"> </w:t>
+      </w:r>
+      <w:r>
+        <w:t xml:space="preserve">to</w:t>
+      </w:r>
+      <w:r>
+        <w:t xml:space="preserve"> </w:t>
+      </w:r>
+      <w:r>
+        <w:rPr>
+          <w:rStyle w:val="VerbatimChar"/>
+        </w:rPr>
+        <w:t xml:space="preserve">PASS</w:t>
+      </w:r>
+      <w:r>
+        <w:t xml:space="preserve">; GÉANT got the Cloudflare challenge again. Before it came</w:t>
+      </w:r>
+      <w:r>
+        <w:t xml:space="preserve"> </w:t>
+      </w:r>
+      <w:r>
+        <w:rPr>
+          <w:rStyle w:val="VerbatimChar"/>
+        </w:rPr>
         <w:t xml:space="preserve">web-24</w:t>
       </w:r>
       <w:r>
-        <w:t xml:space="preserve">, collected by the GitHub workflow at</w:t>
-      </w:r>
-      <w:r>
-        <w:t xml:space="preserve"> </w:t>
-      </w:r>
-      <w:r>
-        <w:rPr>
-          <w:rStyle w:val="VerbatimChar"/>
-        </w:rPr>
-        <w:t xml:space="preserve">--depth 2</w:t>
-      </w:r>
-      <w:r>
-        <w:t xml:space="preserve"> </w:t>
-      </w:r>
-      <w:r>
-        <w:t xml:space="preserve">on 5 October</w:t>
-      </w:r>
-      <w:r>
-        <w:t xml:space="preserve"> </w:t>
-      </w:r>
-      <w:r>
-        <w:t xml:space="preserve">2026 between 21:17 and 21:23 UTC from all thirteen nodes (</w:t>
-      </w:r>
-      <w:hyperlink r:id="rId10">
+        <w:t xml:space="preserve"> </w:t>
+      </w:r>
+      <w:r>
+        <w:t xml:space="preserve">(</w:t>
+      </w:r>
+      <w:hyperlink r:id="rId11">
         <w:r>
           <w:rPr>
             <w:rStyle w:val="Hyperlink"/>
@@ -564,126 +677,13 @@
         </w:r>
       </w:hyperlink>
       <w:r>
-        <w:t xml:space="preserve">, commit</w:t>
-      </w:r>
-      <w:r>
-        <w:t xml:space="preserve"> </w:t>
-      </w:r>
-      <w:r>
-        <w:rPr>
-          <w:rStyle w:val="VerbatimChar"/>
-        </w:rPr>
-        <w:t xml:space="preserve">42aacbe</w:t>
-      </w:r>
-      <w:r>
-        <w:t xml:space="preserve">), under the re-issued v3.2: 60 PASS, 1 FAIL, 59 MANUAL_REVIEW and</w:t>
-      </w:r>
-      <w:r>
-        <w:t xml:space="preserve"> </w:t>
-      </w:r>
-      <w:r>
-        <w:t xml:space="preserve">10 ERROR at both depths, in 94 page requests. The ten</w:t>
-      </w:r>
-      <w:r>
-        <w:t xml:space="preserve"> </w:t>
-      </w:r>
-      <w:r>
-        <w:rPr>
-          <w:rStyle w:val="VerbatimChar"/>
-        </w:rPr>
-        <w:t xml:space="preserve">ERROR</w:t>
-      </w:r>
-      <w:r>
-        <w:t xml:space="preserve">s are</w:t>
-      </w:r>
-      <w:r>
-        <w:t xml:space="preserve"> </w:t>
-      </w:r>
-      <w:r>
-        <w:t xml:space="preserve">BBMRI-ERIC’s: its new default address, on the</w:t>
-      </w:r>
-      <w:r>
-        <w:t xml:space="preserve"> </w:t>
-      </w:r>
-      <w:r>
-        <w:rPr>
-          <w:rStyle w:val="VerbatimChar"/>
-        </w:rPr>
-        <w:t xml:space="preserve">dev3.</w:t>
-      </w:r>
-      <w:r>
-        <w:t xml:space="preserve"> </w:t>
-      </w:r>
-      <w:r>
-        <w:t xml:space="preserve">host, is disallowed by</w:t>
-      </w:r>
-      <w:r>
-        <w:t xml:space="preserve"> </w:t>
-      </w:r>
-      <w:r>
-        <w:rPr>
-          <w:rStyle w:val="VerbatimChar"/>
-        </w:rPr>
-        <w:t xml:space="preserve">robots.txt</w:t>
-      </w:r>
-      <w:r>
-        <w:t xml:space="preserve">, so it was not fetched. Czechia’s 5c moved to review and</w:t>
-      </w:r>
-      <w:r>
-        <w:t xml:space="preserve"> </w:t>
-      </w:r>
-      <w:r>
-        <w:t xml:space="preserve">EUDAT’s 5c to</w:t>
-      </w:r>
-      <w:r>
-        <w:t xml:space="preserve"> </w:t>
-      </w:r>
-      <w:r>
-        <w:rPr>
-          <w:rStyle w:val="VerbatimChar"/>
-        </w:rPr>
-        <w:t xml:space="preserve">PASS</w:t>
-      </w:r>
-      <w:r>
-        <w:t xml:space="preserve">; EOSC Finland’s point 4 is still the only FAIL, and</w:t>
-      </w:r>
-      <w:r>
-        <w:t xml:space="preserve"> </w:t>
-      </w:r>
-      <w:r>
-        <w:t xml:space="preserve">GÉANT got the Cloudflare challenge again. Before it came</w:t>
-      </w:r>
-      <w:r>
-        <w:t xml:space="preserve"> </w:t>
-      </w:r>
-      <w:r>
-        <w:rPr>
-          <w:rStyle w:val="VerbatimChar"/>
-        </w:rPr>
-        <w:t xml:space="preserve">web-23</w:t>
-      </w:r>
-      <w:r>
-        <w:t xml:space="preserve"> </w:t>
-      </w:r>
-      <w:r>
-        <w:t xml:space="preserve">(</w:t>
-      </w:r>
-      <w:hyperlink r:id="rId11">
-        <w:r>
-          <w:rPr>
-            <w:rStyle w:val="Hyperlink"/>
-          </w:rPr>
-          <w:t xml:space="preserve">run 37033017657</w:t>
-        </w:r>
-      </w:hyperlink>
-      <w:r>
-        <w:t xml:space="preserve">,</w:t>
-      </w:r>
-      <w:r>
-        <w:t xml:space="preserve"> </w:t>
-      </w:r>
-      <w:r>
-        <w:t xml:space="preserve">2 October, 66 / 1 / 63).</w:t>
+        <w:t xml:space="preserve">, 5 October, 60 / 1 / 59 / 10), in which BBMRI-ERIC’s page was</w:t>
+      </w:r>
+      <w:r>
+        <w:t xml:space="preserve"> </w:t>
+      </w:r>
+      <w:r>
+        <w:t xml:space="preserve">disallowed.</w:t>
       </w:r>
       <w:r>
         <w:t xml:space="preserve"> </w:t>
@@ -3116,19 +3116,22 @@
         <w:t xml:space="preserve">web-24</w:t>
       </w:r>
       <w:r>
-        <w:t xml:space="preserve">, the</w:t>
-      </w:r>
-      <w:r>
-        <w:t xml:space="preserve"> </w:t>
-      </w:r>
-      <w:r>
-        <w:t xml:space="preserve">published run, was collected from it: the page is still disallowed, so all ten</w:t>
-      </w:r>
-      <w:r>
-        <w:t xml:space="preserve"> </w:t>
-      </w:r>
-      <w:r>
-        <w:t xml:space="preserve">BBMRI-ERIC points are</w:t>
+        <w:t xml:space="preserve"> </w:t>
+      </w:r>
+      <w:r>
+        <w:t xml:space="preserve">(5 October)</w:t>
+      </w:r>
+      <w:r>
+        <w:t xml:space="preserve"> </w:t>
+      </w:r>
+      <w:r>
+        <w:t xml:space="preserve">was collected from it while the page was still disallowed, so all ten</w:t>
+      </w:r>
+      <w:r>
+        <w:t xml:space="preserve"> </w:t>
+      </w:r>
+      <w:r>
+        <w:t xml:space="preserve">BBMRI-ERIC points were</w:t>
       </w:r>
       <w:r>
         <w:t xml:space="preserve"> </w:t>
@@ -3143,7 +3146,49 @@
         <w:t xml:space="preserve"> </w:t>
       </w:r>
       <w:r>
-        <w:t xml:space="preserve">(section 6). Its last evidence from the</w:t>
+        <w:t xml:space="preserve">(section 6). By run</w:t>
+      </w:r>
+      <w:r>
+        <w:t xml:space="preserve"> </w:t>
+      </w:r>
+      <w:r>
+        <w:rPr>
+          <w:rStyle w:val="VerbatimChar"/>
+        </w:rPr>
+        <w:t xml:space="preserve">web-25</w:t>
+      </w:r>
+      <w:r>
+        <w:t xml:space="preserve"> </w:t>
+      </w:r>
+      <w:r>
+        <w:t xml:space="preserve">(6 October), the</w:t>
+      </w:r>
+      <w:r>
+        <w:t xml:space="preserve"> </w:t>
+      </w:r>
+      <w:r>
+        <w:t xml:space="preserve">published run, the host’s</w:t>
+      </w:r>
+      <w:r>
+        <w:t xml:space="preserve"> </w:t>
+      </w:r>
+      <w:r>
+        <w:rPr>
+          <w:rStyle w:val="VerbatimChar"/>
+        </w:rPr>
+        <w:t xml:space="preserve">robots.txt</w:t>
+      </w:r>
+      <w:r>
+        <w:t xml:space="preserve"> </w:t>
+      </w:r>
+      <w:r>
+        <w:t xml:space="preserve">no longer excluded the tool, and the</w:t>
+      </w:r>
+      <w:r>
+        <w:t xml:space="preserve"> </w:t>
+      </w:r>
+      <w:r>
+        <w:t xml:space="preserve">page was read. Its last evidence from the</w:t>
       </w:r>
       <w:r>
         <w:t xml:space="preserve"> </w:t>
@@ -3170,7 +3215,13 @@
         <w:t xml:space="preserve">web-23</w:t>
       </w:r>
       <w:r>
-        <w:t xml:space="preserve">, in the git history at</w:t>
+        <w:t xml:space="preserve">, in</w:t>
+      </w:r>
+      <w:r>
+        <w:t xml:space="preserve"> </w:t>
+      </w:r>
+      <w:r>
+        <w:t xml:space="preserve">the git history at</w:t>
       </w:r>
       <w:r>
         <w:t xml:space="preserve"> </w:t>
@@ -3332,43 +3383,19 @@
         <w:t xml:space="preserve">web-21</w:t>
       </w:r>
       <w:r>
-        <w:t xml:space="preserve">,</w:t>
-      </w:r>
-      <w:r>
-        <w:t xml:space="preserve"> </w:t>
-      </w:r>
-      <w:r>
-        <w:rPr>
-          <w:rStyle w:val="VerbatimChar"/>
-        </w:rPr>
-        <w:t xml:space="preserve">web-22</w:t>
-      </w:r>
-      <w:r>
-        <w:t xml:space="preserve">,</w:t>
-      </w:r>
-      <w:r>
-        <w:t xml:space="preserve"> </w:t>
-      </w:r>
-      <w:r>
-        <w:rPr>
-          <w:rStyle w:val="VerbatimChar"/>
-        </w:rPr>
-        <w:t xml:space="preserve">web-23</w:t>
-      </w:r>
-      <w:r>
-        <w:t xml:space="preserve"> </w:t>
-      </w:r>
-      <w:r>
-        <w:t xml:space="preserve">and</w:t>
-      </w:r>
-      <w:r>
-        <w:t xml:space="preserve"> </w:t>
-      </w:r>
-      <w:r>
-        <w:rPr>
-          <w:rStyle w:val="VerbatimChar"/>
-        </w:rPr>
-        <w:t xml:space="preserve">web-24</w:t>
+        <w:t xml:space="preserve"> </w:t>
+      </w:r>
+      <w:r>
+        <w:t xml:space="preserve">to</w:t>
+      </w:r>
+      <w:r>
+        <w:t xml:space="preserve"> </w:t>
+      </w:r>
+      <w:r>
+        <w:rPr>
+          <w:rStyle w:val="VerbatimChar"/>
+        </w:rPr>
+        <w:t xml:space="preserve">web-25</w:t>
       </w:r>
       <w:r>
         <w:t xml:space="preserve"> </w:t>
@@ -3488,7 +3515,7 @@
         <w:rPr>
           <w:rStyle w:val="VerbatimChar"/>
         </w:rPr>
-        <w:t xml:space="preserve">web-24</w:t>
+        <w:t xml:space="preserve">web-25</w:t>
       </w:r>
       <w:r>
         <w:t xml:space="preserve"> </w:t>
@@ -4286,7 +4313,7 @@
         <w:rPr>
           <w:rStyle w:val="NormalTok"/>
         </w:rPr>
-        <w:t xml:space="preserve"> web-24</w:t>
+        <w:t xml:space="preserve"> web-25</w:t>
       </w:r>
     </w:p>
     <w:p>
@@ -4504,7 +4531,31 @@
         <w:t xml:space="preserve"> </w:t>
       </w:r>
       <w:r>
-        <w:t xml:space="preserve">MANUAL_REVIEW and 10 ERROR. The reviewed run of 24 September that it replaced is in the git</w:t>
+        <w:t xml:space="preserve">MANUAL_REVIEW and 10 ERROR for</w:t>
+      </w:r>
+      <w:r>
+        <w:t xml:space="preserve"> </w:t>
+      </w:r>
+      <w:r>
+        <w:rPr>
+          <w:rStyle w:val="VerbatimChar"/>
+        </w:rPr>
+        <w:t xml:space="preserve">web-24</w:t>
+      </w:r>
+      <w:r>
+        <w:t xml:space="preserve">; verified again on 6 October 2026 for</w:t>
+      </w:r>
+      <w:r>
+        <w:t xml:space="preserve"> </w:t>
+      </w:r>
+      <w:r>
+        <w:rPr>
+          <w:rStyle w:val="VerbatimChar"/>
+        </w:rPr>
+        <w:t xml:space="preserve">web-25</w:t>
+      </w:r>
+      <w:r>
+        <w:t xml:space="preserve">, with 68 PASS, 0 FAIL and 62 MANUAL_REVIEW. The reviewed run of 24 September that it replaced is in the git</w:t>
       </w:r>
       <w:r>
         <w:t xml:space="preserve"> </w:t>
@@ -4727,7 +4778,7 @@
         <w:t xml:space="preserve"> </w:t>
       </w:r>
       <w:r>
-        <w:t xml:space="preserve">typical of a staging host and says nothing about compliance. Run</w:t>
+        <w:t xml:space="preserve">typical of a staging host and says nothing about compliance. Runs</w:t>
       </w:r>
       <w:r>
         <w:t xml:space="preserve"> </w:t>
@@ -4742,7 +4793,7 @@
         <w:t xml:space="preserve"> </w:t>
       </w:r>
       <w:r>
-        <w:t xml:space="preserve">(1 October) and the published run</w:t>
+        <w:t xml:space="preserve">(1 October) and</w:t>
       </w:r>
       <w:r>
         <w:t xml:space="preserve"> </w:t>
@@ -4757,28 +4808,34 @@
         <w:t xml:space="preserve"> </w:t>
       </w:r>
       <w:r>
-        <w:t xml:space="preserve">(5 October), with the</w:t>
-      </w:r>
-      <w:r>
-        <w:t xml:space="preserve"> </w:t>
-      </w:r>
-      <w:r>
-        <w:rPr>
-          <w:rStyle w:val="VerbatimChar"/>
-        </w:rPr>
-        <w:t xml:space="preserve">dev3.</w:t>
-      </w:r>
-      <w:r>
-        <w:t xml:space="preserve"> </w:t>
-      </w:r>
-      <w:r>
-        <w:t xml:space="preserve">address as the default, found the same. Ask the node for the public address,</w:t>
-      </w:r>
-      <w:r>
-        <w:t xml:space="preserve"> </w:t>
-      </w:r>
-      <w:r>
-        <w:t xml:space="preserve">or for the development host to allow the checker.</w:t>
+        <w:t xml:space="preserve">(5 October) found the same. By</w:t>
+      </w:r>
+      <w:r>
+        <w:t xml:space="preserve"> </w:t>
+      </w:r>
+      <w:r>
+        <w:rPr>
+          <w:rStyle w:val="VerbatimChar"/>
+        </w:rPr>
+        <w:t xml:space="preserve">web-25</w:t>
+      </w:r>
+      <w:r>
+        <w:t xml:space="preserve"> </w:t>
+      </w:r>
+      <w:r>
+        <w:t xml:space="preserve">(6 October)</w:t>
+      </w:r>
+      <w:r>
+        <w:t xml:space="preserve"> </w:t>
+      </w:r>
+      <w:r>
+        <w:t xml:space="preserve">the host allowed the tool and the page was read. If it happens, ask the node</w:t>
+      </w:r>
+      <w:r>
+        <w:t xml:space="preserve"> </w:t>
+      </w:r>
+      <w:r>
+        <w:t xml:space="preserve">for the public address, or for the development host to allow the checker.</w:t>
       </w:r>
     </w:p>
     <w:bookmarkEnd w:id="22"/>
@@ -7665,34 +7722,160 @@
         <w:rPr>
           <w:rStyle w:val="VerbatimChar"/>
         </w:rPr>
+        <w:t xml:space="preserve">web-25</w:t>
+      </w:r>
+      <w:r>
+        <w:t xml:space="preserve"> </w:t>
+      </w:r>
+      <w:r>
+        <w:t xml:space="preserve">(6 October 2026), eight nodes match: the same</w:t>
+      </w:r>
+      <w:r>
+        <w:t xml:space="preserve"> </w:t>
+      </w:r>
+      <w:r>
+        <w:t xml:space="preserve">four (BBMRI-ERIC now at its</w:t>
+      </w:r>
+      <w:r>
+        <w:t xml:space="preserve"> </w:t>
+      </w:r>
+      <w:r>
+        <w:rPr>
+          <w:rStyle w:val="VerbatimChar"/>
+        </w:rPr>
+        <w:t xml:space="preserve">dev3.</w:t>
+      </w:r>
+      <w:r>
+        <w:t xml:space="preserve"> </w:t>
+      </w:r>
+      <w:r>
+        <w:t xml:space="preserve">page, which writes</w:t>
+      </w:r>
+      <w:r>
+        <w:t xml:space="preserve"> </w:t>
+      </w:r>
+      <w:r>
+        <w:rPr>
+          <w:rStyle w:val="VerbatimChar"/>
+        </w:rPr>
+        <w:t xml:space="preserve">EOSC Node – BBMRI-ERIC</w:t>
+      </w:r>
+      <w:r>
+        <w:t xml:space="preserve">;</w:t>
+      </w:r>
+      <w:r>
+        <w:t xml:space="preserve"> </w:t>
+      </w:r>
+      <w:r>
+        <w:t xml:space="preserve">in</w:t>
+      </w:r>
+      <w:r>
+        <w:t xml:space="preserve"> </w:t>
+      </w:r>
+      <w:r>
+        <w:rPr>
+          <w:rStyle w:val="VerbatimChar"/>
+        </w:rPr>
         <w:t xml:space="preserve">web-24</w:t>
       </w:r>
       <w:r>
         <w:t xml:space="preserve"> </w:t>
       </w:r>
       <w:r>
-        <w:t xml:space="preserve">(5 October 2026), six nodes match: the same</w:t>
-      </w:r>
-      <w:r>
-        <w:t xml:space="preserve"> </w:t>
-      </w:r>
-      <w:r>
-        <w:t xml:space="preserve">four less BBMRI-ERIC, whose</w:t>
-      </w:r>
-      <w:r>
-        <w:t xml:space="preserve"> </w:t>
-      </w:r>
-      <w:r>
-        <w:rPr>
-          <w:rStyle w:val="VerbatimChar"/>
-        </w:rPr>
-        <w:t xml:space="preserve">dev3.</w:t>
-      </w:r>
-      <w:r>
-        <w:t xml:space="preserve"> </w:t>
-      </w:r>
-      <w:r>
-        <w:t xml:space="preserve">page was not fetched (it matched up to</w:t>
+        <w:t xml:space="preserve">it was not fetched), Italy at its new address (</w:t>
+      </w:r>
+      <w:r>
+        <w:rPr>
+          <w:rStyle w:val="VerbatimChar"/>
+        </w:rPr>
+        <w:t xml:space="preserve">EOSC Node | Italy</w:t>
+      </w:r>
+      <w:r>
+        <w:t xml:space="preserve">,</w:t>
+      </w:r>
+      <w:r>
+        <w:t xml:space="preserve"> </w:t>
+      </w:r>
+      <w:r>
+        <w:t xml:space="preserve">the list’s own separator), Data Terra at its new address (</w:t>
+      </w:r>
+      <w:r>
+        <w:rPr>
+          <w:rStyle w:val="VerbatimChar"/>
+        </w:rPr>
+        <w:t xml:space="preserve">EOSC Node Data Terra</w:t>
+      </w:r>
+      <w:r>
+        <w:t xml:space="preserve">), Poland, whose page writes</w:t>
+      </w:r>
+      <w:r>
+        <w:t xml:space="preserve"> </w:t>
+      </w:r>
+      <w:r>
+        <w:rPr>
+          <w:rStyle w:val="VerbatimChar"/>
+        </w:rPr>
+        <w:t xml:space="preserve">EOSC Node Poland</w:t>
+      </w:r>
+      <w:r>
+        <w:t xml:space="preserve"> </w:t>
+      </w:r>
+      <w:r>
+        <w:t xml:space="preserve">in its text, and EOSC</w:t>
+      </w:r>
+      <w:r>
+        <w:t xml:space="preserve"> </w:t>
+      </w:r>
+      <w:r>
+        <w:t xml:space="preserve">Finland, whose page now writes</w:t>
+      </w:r>
+      <w:r>
+        <w:t xml:space="preserve"> </w:t>
+      </w:r>
+      <w:r>
+        <w:rPr>
+          <w:rStyle w:val="VerbatimChar"/>
+        </w:rPr>
+        <w:t xml:space="preserve">EOSC Node Finland</w:t>
+      </w:r>
+      <w:r>
+        <w:t xml:space="preserve">. GÉANT matched (</w:t>
+      </w:r>
+      <w:r>
+        <w:rPr>
+          <w:rStyle w:val="VerbatimChar"/>
+        </w:rPr>
+        <w:t xml:space="preserve">EOSC Node GÉANT</w:t>
+      </w:r>
+      <w:r>
+        <w:t xml:space="preserve">) in</w:t>
+      </w:r>
+      <w:r>
+        <w:t xml:space="preserve"> </w:t>
+      </w:r>
+      <w:r>
+        <w:rPr>
+          <w:rStyle w:val="VerbatimChar"/>
+        </w:rPr>
+        <w:t xml:space="preserve">web-16</w:t>
+      </w:r>
+      <w:r>
+        <w:t xml:space="preserve"> </w:t>
+      </w:r>
+      <w:r>
+        <w:t xml:space="preserve">and</w:t>
+      </w:r>
+      <w:r>
+        <w:t xml:space="preserve"> </w:t>
+      </w:r>
+      <w:r>
+        <w:rPr>
+          <w:rStyle w:val="VerbatimChar"/>
+        </w:rPr>
+        <w:t xml:space="preserve">web-22</w:t>
+      </w:r>
+      <w:r>
+        <w:t xml:space="preserve">, when its page was served; in</w:t>
       </w:r>
       <w:r>
         <w:t xml:space="preserve"> </w:t>
@@ -7704,133 +7887,19 @@
         <w:t xml:space="preserve">web-23</w:t>
       </w:r>
       <w:r>
-        <w:t xml:space="preserve">, from its</w:t>
-      </w:r>
-      <w:r>
-        <w:t xml:space="preserve"> </w:t>
-      </w:r>
-      <w:r>
-        <w:rPr>
-          <w:rStyle w:val="VerbatimChar"/>
-        </w:rPr>
-        <w:t xml:space="preserve">www.</w:t>
-      </w:r>
-      <w:r>
-        <w:t xml:space="preserve"> </w:t>
-      </w:r>
-      <w:r>
-        <w:t xml:space="preserve">page), Italy at its new address (</w:t>
-      </w:r>
-      <w:r>
-        <w:rPr>
-          <w:rStyle w:val="VerbatimChar"/>
-        </w:rPr>
-        <w:t xml:space="preserve">EOSC Node | Italy</w:t>
-      </w:r>
-      <w:r>
-        <w:t xml:space="preserve">, the list’s own separator),</w:t>
-      </w:r>
-      <w:r>
-        <w:t xml:space="preserve"> </w:t>
-      </w:r>
-      <w:r>
-        <w:t xml:space="preserve">Data Terra at its new address (</w:t>
-      </w:r>
-      <w:r>
-        <w:rPr>
-          <w:rStyle w:val="VerbatimChar"/>
-        </w:rPr>
-        <w:t xml:space="preserve">EOSC Node Data Terra</w:t>
-      </w:r>
-      <w:r>
-        <w:t xml:space="preserve">), and Poland, whose page</w:t>
-      </w:r>
-      <w:r>
-        <w:t xml:space="preserve"> </w:t>
-      </w:r>
-      <w:r>
-        <w:t xml:space="preserve">now writes</w:t>
-      </w:r>
-      <w:r>
-        <w:t xml:space="preserve"> </w:t>
-      </w:r>
-      <w:r>
-        <w:rPr>
-          <w:rStyle w:val="VerbatimChar"/>
-        </w:rPr>
-        <w:t xml:space="preserve">EOSC Node Poland</w:t>
-      </w:r>
-      <w:r>
-        <w:t xml:space="preserve"> </w:t>
-      </w:r>
-      <w:r>
-        <w:t xml:space="preserve">in its text. GÉANT matched (</w:t>
-      </w:r>
-      <w:r>
-        <w:rPr>
-          <w:rStyle w:val="VerbatimChar"/>
-        </w:rPr>
-        <w:t xml:space="preserve">EOSC Node GÉANT</w:t>
-      </w:r>
-      <w:r>
-        <w:t xml:space="preserve">)</w:t>
-      </w:r>
-      <w:r>
-        <w:t xml:space="preserve"> </w:t>
-      </w:r>
-      <w:r>
-        <w:t xml:space="preserve">in</w:t>
-      </w:r>
-      <w:r>
-        <w:t xml:space="preserve"> </w:t>
-      </w:r>
-      <w:r>
-        <w:rPr>
-          <w:rStyle w:val="VerbatimChar"/>
-        </w:rPr>
-        <w:t xml:space="preserve">web-16</w:t>
-      </w:r>
-      <w:r>
-        <w:t xml:space="preserve"> </w:t>
-      </w:r>
-      <w:r>
-        <w:t xml:space="preserve">and</w:t>
-      </w:r>
-      <w:r>
-        <w:t xml:space="preserve"> </w:t>
-      </w:r>
-      <w:r>
-        <w:rPr>
-          <w:rStyle w:val="VerbatimChar"/>
-        </w:rPr>
-        <w:t xml:space="preserve">web-22</w:t>
-      </w:r>
-      <w:r>
-        <w:t xml:space="preserve">, when its page was served; in</w:t>
-      </w:r>
-      <w:r>
-        <w:t xml:space="preserve"> </w:t>
-      </w:r>
-      <w:r>
-        <w:rPr>
-          <w:rStyle w:val="VerbatimChar"/>
-        </w:rPr>
-        <w:t xml:space="preserve">web-23</w:t>
-      </w:r>
-      <w:r>
-        <w:t xml:space="preserve"> </w:t>
-      </w:r>
-      <w:r>
-        <w:t xml:space="preserve">and</w:t>
-      </w:r>
-      <w:r>
-        <w:t xml:space="preserve"> </w:t>
-      </w:r>
-      <w:r>
-        <w:rPr>
-          <w:rStyle w:val="VerbatimChar"/>
-        </w:rPr>
-        <w:t xml:space="preserve">web-24</w:t>
+        <w:t xml:space="preserve"> </w:t>
+      </w:r>
+      <w:r>
+        <w:t xml:space="preserve">to</w:t>
+      </w:r>
+      <w:r>
+        <w:t xml:space="preserve"> </w:t>
+      </w:r>
+      <w:r>
+        <w:rPr>
+          <w:rStyle w:val="VerbatimChar"/>
+        </w:rPr>
+        <w:t xml:space="preserve">web-25</w:t>
       </w:r>
       <w:r>
         <w:t xml:space="preserve"> </w:t>
@@ -15046,7 +15115,61 @@
         <w:t xml:space="preserve"> </w:t>
       </w:r>
       <w:r>
-        <w:t xml:space="preserve">verdicts changed (60 / 1 / 59 / 10 at both depths). The second hop reached governance, secretariat and news pages, which is also where it met a personal name that depth 1 had never collected (section on masking). Run it yourself before assuming the same holds for</w:t>
+        <w:t xml:space="preserve">verdicts changed (60 / 1 / 59 / 10 at both depths).</w:t>
+      </w:r>
+      <w:r>
+        <w:t xml:space="preserve"> </w:t>
+      </w:r>
+      <w:r>
+        <w:rPr>
+          <w:b/>
+          <w:bCs/>
+        </w:rPr>
+        <w:t xml:space="preserve">Run</w:t>
+      </w:r>
+      <w:r>
+        <w:rPr>
+          <w:b/>
+          <w:bCs/>
+        </w:rPr>
+        <w:t xml:space="preserve"> </w:t>
+      </w:r>
+      <w:r>
+        <w:rPr>
+          <w:rStyle w:val="VerbatimChar"/>
+          <w:b/>
+          <w:bCs/>
+        </w:rPr>
+        <w:t xml:space="preserve">web-25</w:t>
+      </w:r>
+      <w:r>
+        <w:rPr>
+          <w:b/>
+          <w:bCs/>
+        </w:rPr>
+        <w:t xml:space="preserve">:</w:t>
+      </w:r>
+      <w:r>
+        <w:t xml:space="preserve"> </w:t>
+      </w:r>
+      <w:r>
+        <w:t xml:space="preserve">34 second-hop pages, 109 requests, and again</w:t>
+      </w:r>
+      <w:r>
+        <w:t xml:space="preserve"> </w:t>
+      </w:r>
+      <w:r>
+        <w:rPr>
+          <w:b/>
+          <w:bCs/>
+        </w:rPr>
+        <w:t xml:space="preserve">zero</w:t>
+      </w:r>
+      <w:r>
+        <w:t xml:space="preserve"> </w:t>
+      </w:r>
+      <w:r>
+        <w:t xml:space="preserve">verdicts changed (68 / 0 / 62 at both depths). The second hop reached governance, secretariat and news pages, which is also where it met a personal name that depth 1 had never collected (section on masking). Run it yourself before assuming the same holds for</w:t>
       </w:r>
       <w:r>
         <w:t xml:space="preserve"> </w:t>
@@ -16839,189 +16962,201 @@
         <w:rPr>
           <w:rStyle w:val="VerbatimChar"/>
         </w:rPr>
+        <w:t xml:space="preserve">web-25</w:t>
+      </w:r>
+      <w:r>
+        <w:t xml:space="preserve"> </w:t>
+      </w:r>
+      <w:r>
+        <w:t xml:space="preserve">(6 October 2026) was collected</w:t>
+      </w:r>
+      <w:r>
+        <w:t xml:space="preserve"> </w:t>
+      </w:r>
+      <w:r>
+        <w:t xml:space="preserve">with masking in place, and a search of all its evidence and reports found no</w:t>
+      </w:r>
+      <w:r>
+        <w:t xml:space="preserve"> </w:t>
+      </w:r>
+      <w:r>
+        <w:t xml:space="preserve">personal address or phone number. Two personal names that the masking does not cover were removed by hand from the evidence, each replaced by a placeholder of the same length so every character count and verdict stays as collected: a quotation attribution on CERN’s page (in</w:t>
+      </w:r>
+      <w:r>
+        <w:t xml:space="preserve"> </w:t>
+      </w:r>
+      <w:r>
+        <w:rPr>
+          <w:rStyle w:val="VerbatimChar"/>
+        </w:rPr>
+        <w:t xml:space="preserve">cern.json</w:t>
+      </w:r>
+      <w:r>
+        <w:t xml:space="preserve"> </w:t>
+      </w:r>
+      <w:r>
+        <w:t xml:space="preserve">and in its screenshot) and the node coordinator named on EGI’s page (in</w:t>
+      </w:r>
+      <w:r>
+        <w:t xml:space="preserve"> </w:t>
+      </w:r>
+      <w:r>
+        <w:rPr>
+          <w:rStyle w:val="VerbatimChar"/>
+        </w:rPr>
+        <w:t xml:space="preserve">egi.json</w:t>
+      </w:r>
+      <w:r>
+        <w:t xml:space="preserve">, in the link text and, since</w:t>
+      </w:r>
+      <w:r>
+        <w:t xml:space="preserve"> </w:t>
+      </w:r>
+      <w:r>
+        <w:rPr>
+          <w:rStyle w:val="VerbatimChar"/>
+        </w:rPr>
+        <w:t xml:space="preserve">web-12</w:t>
+      </w:r>
+      <w:r>
+        <w:t xml:space="preserve">, also in the link’s address,</w:t>
+      </w:r>
+      <w:r>
+        <w:t xml:space="preserve"> </w:t>
+      </w:r>
+      <w:r>
+        <w:rPr>
+          <w:rStyle w:val="VerbatimChar"/>
+        </w:rPr>
+        <w:t xml:space="preserve">/person/…/</w:t>
+      </w:r>
+      <w:r>
+        <w:t xml:space="preserve">, which earlier published runs still carried). The second hop of</w:t>
+      </w:r>
+      <w:r>
+        <w:t xml:space="preserve"> </w:t>
+      </w:r>
+      <w:r>
+        <w:rPr>
+          <w:rStyle w:val="VerbatimChar"/>
+        </w:rPr>
+        <w:t xml:space="preserve">web-13</w:t>
+      </w:r>
+      <w:r>
+        <w:t xml:space="preserve"> </w:t>
+      </w:r>
+      <w:r>
+        <w:t xml:space="preserve">added a third: a person quoted in a news item on a Czechia page reached only at depth 2 (in</w:t>
+      </w:r>
+      <w:r>
+        <w:t xml:space="preserve"> </w:t>
+      </w:r>
+      <w:r>
+        <w:rPr>
+          <w:rStyle w:val="VerbatimChar"/>
+        </w:rPr>
+        <w:t xml:space="preserve">eosc-cz.json</w:t>
+      </w:r>
+      <w:r>
+        <w:t xml:space="preserve">, in the quotation and in the address of the interview it links to).</w:t>
+      </w:r>
+      <w:r>
+        <w:t xml:space="preserve"> </w:t>
+      </w:r>
+      <w:r>
+        <w:rPr>
+          <w:rStyle w:val="VerbatimChar"/>
+        </w:rPr>
+        <w:t xml:space="preserve">web-14</w:t>
+      </w:r>
+      <w:r>
+        <w:t xml:space="preserve">, which also reads services and policies pages, added many more, and</w:t>
+      </w:r>
+      <w:r>
+        <w:t xml:space="preserve"> </w:t>
+      </w:r>
+      <w:r>
+        <w:rPr>
+          <w:rStyle w:val="VerbatimChar"/>
+        </w:rPr>
+        <w:t xml:space="preserve">web-15</w:t>
+      </w:r>
+      <w:r>
+        <w:t xml:space="preserve">,</w:t>
+      </w:r>
+      <w:r>
+        <w:t xml:space="preserve"> </w:t>
+      </w:r>
+      <w:r>
+        <w:rPr>
+          <w:rStyle w:val="VerbatimChar"/>
+        </w:rPr>
+        <w:t xml:space="preserve">web-16</w:t>
+      </w:r>
+      <w:r>
+        <w:t xml:space="preserve">,</w:t>
+      </w:r>
+      <w:r>
+        <w:t xml:space="preserve"> </w:t>
+      </w:r>
+      <w:r>
+        <w:rPr>
+          <w:rStyle w:val="VerbatimChar"/>
+        </w:rPr>
+        <w:t xml:space="preserve">web-18</w:t>
+      </w:r>
+      <w:r>
+        <w:t xml:space="preserve">,</w:t>
+      </w:r>
+      <w:r>
+        <w:t xml:space="preserve"> </w:t>
+      </w:r>
+      <w:r>
+        <w:rPr>
+          <w:rStyle w:val="VerbatimChar"/>
+        </w:rPr>
+        <w:t xml:space="preserve">web-21</w:t>
+      </w:r>
+      <w:r>
+        <w:t xml:space="preserve">,</w:t>
+      </w:r>
+      <w:r>
+        <w:t xml:space="preserve"> </w:t>
+      </w:r>
+      <w:r>
+        <w:rPr>
+          <w:rStyle w:val="VerbatimChar"/>
+        </w:rPr>
+        <w:t xml:space="preserve">web-22</w:t>
+      </w:r>
+      <w:r>
+        <w:t xml:space="preserve">,</w:t>
+      </w:r>
+      <w:r>
+        <w:t xml:space="preserve"> </w:t>
+      </w:r>
+      <w:r>
+        <w:rPr>
+          <w:rStyle w:val="VerbatimChar"/>
+        </w:rPr>
+        <w:t xml:space="preserve">web-23</w:t>
+      </w:r>
+      <w:r>
+        <w:t xml:space="preserve">,</w:t>
+      </w:r>
+      <w:r>
+        <w:t xml:space="preserve"> </w:t>
+      </w:r>
+      <w:r>
+        <w:rPr>
+          <w:rStyle w:val="VerbatimChar"/>
+        </w:rPr>
         <w:t xml:space="preserve">web-24</w:t>
       </w:r>
       <w:r>
         <w:t xml:space="preserve"> </w:t>
       </w:r>
       <w:r>
-        <w:t xml:space="preserve">(5 October 2026) was collected</w:t>
-      </w:r>
-      <w:r>
-        <w:t xml:space="preserve"> </w:t>
-      </w:r>
-      <w:r>
-        <w:t xml:space="preserve">with masking in place, and a search of all its evidence and reports found no</w:t>
-      </w:r>
-      <w:r>
-        <w:t xml:space="preserve"> </w:t>
-      </w:r>
-      <w:r>
-        <w:t xml:space="preserve">personal address or phone number. Two personal names that the masking does not cover were removed by hand from the evidence, each replaced by a placeholder of the same length so every character count and verdict stays as collected: a quotation attribution on CERN’s page (in</w:t>
-      </w:r>
-      <w:r>
-        <w:t xml:space="preserve"> </w:t>
-      </w:r>
-      <w:r>
-        <w:rPr>
-          <w:rStyle w:val="VerbatimChar"/>
-        </w:rPr>
-        <w:t xml:space="preserve">cern.json</w:t>
-      </w:r>
-      <w:r>
-        <w:t xml:space="preserve"> </w:t>
-      </w:r>
-      <w:r>
-        <w:t xml:space="preserve">and in its screenshot) and the node coordinator named on EGI’s page (in</w:t>
-      </w:r>
-      <w:r>
-        <w:t xml:space="preserve"> </w:t>
-      </w:r>
-      <w:r>
-        <w:rPr>
-          <w:rStyle w:val="VerbatimChar"/>
-        </w:rPr>
-        <w:t xml:space="preserve">egi.json</w:t>
-      </w:r>
-      <w:r>
-        <w:t xml:space="preserve">, in the link text and, since</w:t>
-      </w:r>
-      <w:r>
-        <w:t xml:space="preserve"> </w:t>
-      </w:r>
-      <w:r>
-        <w:rPr>
-          <w:rStyle w:val="VerbatimChar"/>
-        </w:rPr>
-        <w:t xml:space="preserve">web-12</w:t>
-      </w:r>
-      <w:r>
-        <w:t xml:space="preserve">, also in the link’s address,</w:t>
-      </w:r>
-      <w:r>
-        <w:t xml:space="preserve"> </w:t>
-      </w:r>
-      <w:r>
-        <w:rPr>
-          <w:rStyle w:val="VerbatimChar"/>
-        </w:rPr>
-        <w:t xml:space="preserve">/person/…/</w:t>
-      </w:r>
-      <w:r>
-        <w:t xml:space="preserve">, which earlier published runs still carried). The second hop of</w:t>
-      </w:r>
-      <w:r>
-        <w:t xml:space="preserve"> </w:t>
-      </w:r>
-      <w:r>
-        <w:rPr>
-          <w:rStyle w:val="VerbatimChar"/>
-        </w:rPr>
-        <w:t xml:space="preserve">web-13</w:t>
-      </w:r>
-      <w:r>
-        <w:t xml:space="preserve"> </w:t>
-      </w:r>
-      <w:r>
-        <w:t xml:space="preserve">added a third: a person quoted in a news item on a Czechia page reached only at depth 2 (in</w:t>
-      </w:r>
-      <w:r>
-        <w:t xml:space="preserve"> </w:t>
-      </w:r>
-      <w:r>
-        <w:rPr>
-          <w:rStyle w:val="VerbatimChar"/>
-        </w:rPr>
-        <w:t xml:space="preserve">eosc-cz.json</w:t>
-      </w:r>
-      <w:r>
-        <w:t xml:space="preserve">, in the quotation and in the address of the interview it links to).</w:t>
-      </w:r>
-      <w:r>
-        <w:t xml:space="preserve"> </w:t>
-      </w:r>
-      <w:r>
-        <w:rPr>
-          <w:rStyle w:val="VerbatimChar"/>
-        </w:rPr>
-        <w:t xml:space="preserve">web-14</w:t>
-      </w:r>
-      <w:r>
-        <w:t xml:space="preserve">, which also reads services and policies pages, added many more, and</w:t>
-      </w:r>
-      <w:r>
-        <w:t xml:space="preserve"> </w:t>
-      </w:r>
-      <w:r>
-        <w:rPr>
-          <w:rStyle w:val="VerbatimChar"/>
-        </w:rPr>
-        <w:t xml:space="preserve">web-15</w:t>
-      </w:r>
-      <w:r>
-        <w:t xml:space="preserve">,</w:t>
-      </w:r>
-      <w:r>
-        <w:t xml:space="preserve"> </w:t>
-      </w:r>
-      <w:r>
-        <w:rPr>
-          <w:rStyle w:val="VerbatimChar"/>
-        </w:rPr>
-        <w:t xml:space="preserve">web-16</w:t>
-      </w:r>
-      <w:r>
-        <w:t xml:space="preserve">,</w:t>
-      </w:r>
-      <w:r>
-        <w:t xml:space="preserve"> </w:t>
-      </w:r>
-      <w:r>
-        <w:rPr>
-          <w:rStyle w:val="VerbatimChar"/>
-        </w:rPr>
-        <w:t xml:space="preserve">web-18</w:t>
-      </w:r>
-      <w:r>
-        <w:t xml:space="preserve">,</w:t>
-      </w:r>
-      <w:r>
-        <w:t xml:space="preserve"> </w:t>
-      </w:r>
-      <w:r>
-        <w:rPr>
-          <w:rStyle w:val="VerbatimChar"/>
-        </w:rPr>
-        <w:t xml:space="preserve">web-21</w:t>
-      </w:r>
-      <w:r>
-        <w:t xml:space="preserve">,</w:t>
-      </w:r>
-      <w:r>
-        <w:t xml:space="preserve"> </w:t>
-      </w:r>
-      <w:r>
-        <w:rPr>
-          <w:rStyle w:val="VerbatimChar"/>
-        </w:rPr>
-        <w:t xml:space="preserve">web-22</w:t>
-      </w:r>
-      <w:r>
-        <w:t xml:space="preserve">,</w:t>
-      </w:r>
-      <w:r>
-        <w:t xml:space="preserve"> </w:t>
-      </w:r>
-      <w:r>
-        <w:rPr>
-          <w:rStyle w:val="VerbatimChar"/>
-        </w:rPr>
-        <w:t xml:space="preserve">web-23</w:t>
-      </w:r>
-      <w:r>
-        <w:t xml:space="preserve"> </w:t>
-      </w:r>
-      <w:r>
         <w:t xml:space="preserve">and</w:t>
       </w:r>
       <w:r>
@@ -17031,25 +17166,55 @@
         <w:rPr>
           <w:rStyle w:val="VerbatimChar"/>
         </w:rPr>
+        <w:t xml:space="preserve">web-25</w:t>
+      </w:r>
+      <w:r>
+        <w:t xml:space="preserve"> </w:t>
+      </w:r>
+      <w:r>
+        <w:t xml:space="preserve">carry the same ones (BBMRI-ERIC’s apart, in</w:t>
+      </w:r>
+      <w:r>
+        <w:t xml:space="preserve"> </w:t>
+      </w:r>
+      <w:r>
+        <w:rPr>
+          <w:rStyle w:val="VerbatimChar"/>
+        </w:rPr>
         <w:t xml:space="preserve">web-24</w:t>
       </w:r>
       <w:r>
-        <w:t xml:space="preserve"> </w:t>
-      </w:r>
-      <w:r>
-        <w:t xml:space="preserve">carry the same ones (BBMRI-ERIC’s apart, in</w:t>
-      </w:r>
-      <w:r>
-        <w:t xml:space="preserve"> </w:t>
-      </w:r>
-      <w:r>
-        <w:rPr>
-          <w:rStyle w:val="VerbatimChar"/>
-        </w:rPr>
-        <w:t xml:space="preserve">web-24</w:t>
-      </w:r>
-      <w:r>
-        <w:t xml:space="preserve">, where its page was not fetched) (</w:t>
+        <w:t xml:space="preserve">, where its page was not fetched;</w:t>
+      </w:r>
+      <w:r>
+        <w:t xml:space="preserve"> </w:t>
+      </w:r>
+      <w:r>
+        <w:rPr>
+          <w:rStyle w:val="VerbatimChar"/>
+        </w:rPr>
+        <w:t xml:space="preserve">web-25</w:t>
+      </w:r>
+      <w:r>
+        <w:t xml:space="preserve"> </w:t>
+      </w:r>
+      <w:r>
+        <w:t xml:space="preserve">adds fifteen on BBMRI-ERIC’s</w:t>
+      </w:r>
+      <w:r>
+        <w:t xml:space="preserve"> </w:t>
+      </w:r>
+      <w:r>
+        <w:rPr>
+          <w:rStyle w:val="VerbatimChar"/>
+        </w:rPr>
+        <w:t xml:space="preserve">dev3.</w:t>
+      </w:r>
+      <w:r>
+        <w:t xml:space="preserve"> </w:t>
+      </w:r>
+      <w:r>
+        <w:t xml:space="preserve">pages: its Director General on the legal notice, the seven members of its scientific and ethical advisory board, the Stakeholder Forum chair and the head of public affairs, and five finance, project and HR staff listed in capitals) (</w:t>
       </w:r>
       <w:r>
         <w:rPr>
@@ -18774,7 +18939,7 @@
         <w:t xml:space="preserve"> </w:t>
       </w:r>
       <w:r>
-        <w:t xml:space="preserve">today it asks for BBMRI-ERIC’s</w:t>
+        <w:t xml:space="preserve">today it fetches BBMRI-ERIC’s</w:t>
       </w:r>
       <w:r>
         <w:t xml:space="preserve"> </w:t>
@@ -18795,19 +18960,7 @@
         <w:t xml:space="preserve"> </w:t>
       </w:r>
       <w:r>
-        <w:t xml:space="preserve">published run was collected from (and is refused by its</w:t>
-      </w:r>
-      <w:r>
-        <w:t xml:space="preserve"> </w:t>
-      </w:r>
-      <w:r>
-        <w:rPr>
-          <w:rStyle w:val="VerbatimChar"/>
-        </w:rPr>
-        <w:t xml:space="preserve">robots.txt</w:t>
-      </w:r>
-      <w:r>
-        <w:t xml:space="preserve">).</w:t>
+        <w:t xml:space="preserve">published run was collected from.</w:t>
       </w:r>
     </w:p>
     <w:p>
@@ -19617,7 +19770,7 @@
               <w:t xml:space="preserve"> </w:t>
             </w:r>
             <w:r>
-              <w:t xml:space="preserve">address does it. Ask the node for the public address or an exception; do not work around it. Section 6.</w:t>
+              <w:t xml:space="preserve">address did it until 5 October 2026. Ask the node for the public address or an exception; do not work around it. Section 6.</w:t>
             </w:r>
           </w:p>
         </w:tc>
@@ -22938,7 +23091,7 @@
         <w:t xml:space="preserve">(</w:t>
       </w:r>
       <w:r>
-        <w:t xml:space="preserve">“130 cells: 60 PASS · 1 FAIL · 59 review · 10 ERROR”</w:t>
+        <w:t xml:space="preserve">“130 cells: 68 PASS · 0 FAIL · 62 review”</w:t>
       </w:r>
       <w:r>
         <w:t xml:space="preserve">);</w:t>

</xml_diff>

<commit_message>
Publish run web-26 (depth 2, re-issued checklist v3.2, 67/0/63 at both depths, 109 requests): still no FAIL; Poland's page rendered only its header and footer, so point 4 moved to review; GÉANT behind the Cloudflare challenge; names masked as before; names test expects seven matches; docs and Word/PDF guides updated
</commit_message>
<xml_diff>
--- a/docs/eosc-basic-compliance-guide.docx
+++ b/docs/eosc-basic-compliance-guide.docx
@@ -209,7 +209,7 @@
         <w:pStyle w:val="BodyText"/>
       </w:pPr>
       <w:r>
-        <w:t xml:space="preserve">This edition was revised on 2 October 2026 for checklist v3.2: the test</w:t>
+        <w:t xml:space="preserve">This edition was revised on 6 October 2026 for checklist v3.2: the test</w:t>
       </w:r>
       <w:r>
         <w:t xml:space="preserve"> </w:t>
@@ -499,7 +499,7 @@
           <w:b/>
           <w:bCs/>
         </w:rPr>
-        <w:t xml:space="preserve">The published run changed again on 6 October 2026.</w:t>
+        <w:t xml:space="preserve">The published run changed again on 6 October 2026, in the afternoon.</w:t>
       </w:r>
       <w:r>
         <w:t xml:space="preserve"> </w:t>
@@ -514,13 +514,87 @@
         <w:t xml:space="preserve"> </w:t>
       </w:r>
       <w:r>
-        <w:t xml:space="preserve">now holds</w:t>
-      </w:r>
-      <w:r>
-        <w:t xml:space="preserve"> </w:t>
-      </w:r>
-      <w:r>
-        <w:t xml:space="preserve">run</w:t>
+        <w:t xml:space="preserve">now holds run</w:t>
+      </w:r>
+      <w:r>
+        <w:t xml:space="preserve"> </w:t>
+      </w:r>
+      <w:r>
+        <w:rPr>
+          <w:rStyle w:val="VerbatimChar"/>
+        </w:rPr>
+        <w:t xml:space="preserve">web-26</w:t>
+      </w:r>
+      <w:r>
+        <w:t xml:space="preserve">, collected by the GitHub workflow at</w:t>
+      </w:r>
+      <w:r>
+        <w:t xml:space="preserve"> </w:t>
+      </w:r>
+      <w:r>
+        <w:rPr>
+          <w:rStyle w:val="VerbatimChar"/>
+        </w:rPr>
+        <w:t xml:space="preserve">--depth 2</w:t>
+      </w:r>
+      <w:r>
+        <w:t xml:space="preserve"> </w:t>
+      </w:r>
+      <w:r>
+        <w:t xml:space="preserve">on 6 October 2026 between 16:07 and 16:14 UTC from all thirteen</w:t>
+      </w:r>
+      <w:r>
+        <w:t xml:space="preserve"> </w:t>
+      </w:r>
+      <w:r>
+        <w:t xml:space="preserve">nodes (</w:t>
+      </w:r>
+      <w:hyperlink r:id="rId10">
+        <w:r>
+          <w:rPr>
+            <w:rStyle w:val="Hyperlink"/>
+          </w:rPr>
+          <w:t xml:space="preserve">run 37492974153</w:t>
+        </w:r>
+      </w:hyperlink>
+      <w:r>
+        <w:t xml:space="preserve">, commit</w:t>
+      </w:r>
+      <w:r>
+        <w:t xml:space="preserve"> </w:t>
+      </w:r>
+      <w:r>
+        <w:rPr>
+          <w:rStyle w:val="VerbatimChar"/>
+        </w:rPr>
+        <w:t xml:space="preserve">21d8c7d</w:t>
+      </w:r>
+      <w:r>
+        <w:t xml:space="preserve">), under the re-issued v3.2: 67 PASS, 0 FAIL</w:t>
+      </w:r>
+      <w:r>
+        <w:t xml:space="preserve"> </w:t>
+      </w:r>
+      <w:r>
+        <w:t xml:space="preserve">and 63 MANUAL_REVIEW at both depths, in 109 page requests. One cell changed:</w:t>
+      </w:r>
+      <w:r>
+        <w:t xml:space="preserve"> </w:t>
+      </w:r>
+      <w:r>
+        <w:t xml:space="preserve">Poland’s page rendered only its header and footer (420 characters), so its</w:t>
+      </w:r>
+      <w:r>
+        <w:t xml:space="preserve"> </w:t>
+      </w:r>
+      <w:r>
+        <w:t xml:space="preserve">point 4 moved to review; GÉANT got the Cloudflare challenge again. Before it</w:t>
+      </w:r>
+      <w:r>
+        <w:t xml:space="preserve"> </w:t>
+      </w:r>
+      <w:r>
+        <w:t xml:space="preserve">came</w:t>
       </w:r>
       <w:r>
         <w:t xml:space="preserve"> </w:t>
@@ -532,30 +606,12 @@
         <w:t xml:space="preserve">web-25</w:t>
       </w:r>
       <w:r>
-        <w:t xml:space="preserve">, collected by the GitHub workflow at</w:t>
-      </w:r>
-      <w:r>
-        <w:t xml:space="preserve"> </w:t>
-      </w:r>
-      <w:r>
-        <w:rPr>
-          <w:rStyle w:val="VerbatimChar"/>
-        </w:rPr>
-        <w:t xml:space="preserve">--depth 2</w:t>
-      </w:r>
-      <w:r>
-        <w:t xml:space="preserve"> </w:t>
-      </w:r>
-      <w:r>
-        <w:t xml:space="preserve">on 6 October</w:t>
-      </w:r>
-      <w:r>
-        <w:t xml:space="preserve"> </w:t>
-      </w:r>
-      <w:r>
-        <w:t xml:space="preserve">2026 between 10:35 and 10:41 UTC from all thirteen nodes (</w:t>
-      </w:r>
-      <w:hyperlink r:id="rId10">
+        <w:t xml:space="preserve"> </w:t>
+      </w:r>
+      <w:r>
+        <w:t xml:space="preserve">(</w:t>
+      </w:r>
+      <w:hyperlink r:id="rId11">
         <w:r>
           <w:rPr>
             <w:rStyle w:val="Hyperlink"/>
@@ -564,25 +620,13 @@
         </w:r>
       </w:hyperlink>
       <w:r>
-        <w:t xml:space="preserve">, commit</w:t>
-      </w:r>
-      <w:r>
-        <w:t xml:space="preserve"> </w:t>
-      </w:r>
-      <w:r>
-        <w:rPr>
-          <w:rStyle w:val="VerbatimChar"/>
-        </w:rPr>
-        <w:t xml:space="preserve">ddb7711</w:t>
-      </w:r>
-      <w:r>
-        <w:t xml:space="preserve">), under the re-issued v3.2: 68 PASS, 0 FAIL and 62 MANUAL_REVIEW at</w:t>
-      </w:r>
-      <w:r>
-        <w:t xml:space="preserve"> </w:t>
-      </w:r>
-      <w:r>
-        <w:t xml:space="preserve">both depths, in 109 page requests. BBMRI-ERIC’s</w:t>
+        <w:t xml:space="preserve">, 6 October, morning, 68 / 0 / 62), the first run with</w:t>
+      </w:r>
+      <w:r>
+        <w:t xml:space="preserve"> </w:t>
+      </w:r>
+      <w:r>
+        <w:t xml:space="preserve">no FAIL, in which BBMRI-ERIC’s</w:t>
       </w:r>
       <w:r>
         <w:t xml:space="preserve"> </w:t>
@@ -597,28 +641,13 @@
         <w:t xml:space="preserve"> </w:t>
       </w:r>
       <w:r>
-        <w:t xml:space="preserve">page was served</w:t>
-      </w:r>
-      <w:r>
-        <w:t xml:space="preserve"> </w:t>
-      </w:r>
-      <w:r>
-        <w:t xml:space="preserve">(its</w:t>
-      </w:r>
-      <w:r>
-        <w:t xml:space="preserve"> </w:t>
-      </w:r>
-      <w:r>
-        <w:rPr>
-          <w:rStyle w:val="VerbatimChar"/>
-        </w:rPr>
-        <w:t xml:space="preserve">robots.txt</w:t>
-      </w:r>
-      <w:r>
-        <w:t xml:space="preserve"> </w:t>
-      </w:r>
-      <w:r>
-        <w:t xml:space="preserve">no longer excludes the tool), EOSC Finland now links its own</w:t>
+        <w:t xml:space="preserve">page was first read and EOSC Finland</w:t>
+      </w:r>
+      <w:r>
+        <w:t xml:space="preserve"> </w:t>
+      </w:r>
+      <w:r>
+        <w:t xml:space="preserve">first linked its own</w:t>
       </w:r>
       <w:r>
         <w:t xml:space="preserve"> </w:t>
@@ -633,57 +662,7 @@
         <w:t xml:space="preserve"> </w:t>
       </w:r>
       <w:r>
-        <w:t xml:space="preserve">entry, so no FAIL is left, and Finland’s and Data Terra’s 5c moved</w:t>
-      </w:r>
-      <w:r>
-        <w:t xml:space="preserve"> </w:t>
-      </w:r>
-      <w:r>
-        <w:t xml:space="preserve">to</w:t>
-      </w:r>
-      <w:r>
-        <w:t xml:space="preserve"> </w:t>
-      </w:r>
-      <w:r>
-        <w:rPr>
-          <w:rStyle w:val="VerbatimChar"/>
-        </w:rPr>
-        <w:t xml:space="preserve">PASS</w:t>
-      </w:r>
-      <w:r>
-        <w:t xml:space="preserve">; GÉANT got the Cloudflare challenge again. Before it came</w:t>
-      </w:r>
-      <w:r>
-        <w:t xml:space="preserve"> </w:t>
-      </w:r>
-      <w:r>
-        <w:rPr>
-          <w:rStyle w:val="VerbatimChar"/>
-        </w:rPr>
-        <w:t xml:space="preserve">web-24</w:t>
-      </w:r>
-      <w:r>
-        <w:t xml:space="preserve"> </w:t>
-      </w:r>
-      <w:r>
-        <w:t xml:space="preserve">(</w:t>
-      </w:r>
-      <w:hyperlink r:id="rId11">
-        <w:r>
-          <w:rPr>
-            <w:rStyle w:val="Hyperlink"/>
-          </w:rPr>
-          <w:t xml:space="preserve">run 37374849652</w:t>
-        </w:r>
-      </w:hyperlink>
-      <w:r>
-        <w:t xml:space="preserve">, 5 October, 60 / 1 / 59 / 10), in which BBMRI-ERIC’s page was</w:t>
-      </w:r>
-      <w:r>
-        <w:t xml:space="preserve"> </w:t>
-      </w:r>
-      <w:r>
-        <w:t xml:space="preserve">disallowed.</w:t>
+        <w:t xml:space="preserve">entry.</w:t>
       </w:r>
       <w:r>
         <w:t xml:space="preserve"> </w:t>
@@ -3395,7 +3374,7 @@
         <w:rPr>
           <w:rStyle w:val="VerbatimChar"/>
         </w:rPr>
-        <w:t xml:space="preserve">web-25</w:t>
+        <w:t xml:space="preserve">web-26</w:t>
       </w:r>
       <w:r>
         <w:t xml:space="preserve"> </w:t>
@@ -3515,7 +3494,7 @@
         <w:rPr>
           <w:rStyle w:val="VerbatimChar"/>
         </w:rPr>
-        <w:t xml:space="preserve">web-25</w:t>
+        <w:t xml:space="preserve">web-26</w:t>
       </w:r>
       <w:r>
         <w:t xml:space="preserve"> </w:t>
@@ -4313,7 +4292,7 @@
         <w:rPr>
           <w:rStyle w:val="NormalTok"/>
         </w:rPr>
-        <w:t xml:space="preserve"> web-25</w:t>
+        <w:t xml:space="preserve"> web-26</w:t>
       </w:r>
     </w:p>
     <w:p>
@@ -4555,7 +4534,25 @@
         <w:t xml:space="preserve">web-25</w:t>
       </w:r>
       <w:r>
-        <w:t xml:space="preserve">, with 68 PASS, 0 FAIL and 62 MANUAL_REVIEW. The reviewed run of 24 September that it replaced is in the git</w:t>
+        <w:t xml:space="preserve">, with 68 PASS, 0 FAIL and 62 MANUAL_REVIEW, and for</w:t>
+      </w:r>
+      <w:r>
+        <w:t xml:space="preserve"> </w:t>
+      </w:r>
+      <w:r>
+        <w:rPr>
+          <w:rStyle w:val="VerbatimChar"/>
+        </w:rPr>
+        <w:t xml:space="preserve">web-26</w:t>
+      </w:r>
+      <w:r>
+        <w:t xml:space="preserve">, with 67</w:t>
+      </w:r>
+      <w:r>
+        <w:t xml:space="preserve"> </w:t>
+      </w:r>
+      <w:r>
+        <w:t xml:space="preserve">PASS, 0 FAIL and 63 MANUAL_REVIEW. The reviewed run of 24 September that it replaced is in the git</w:t>
       </w:r>
       <w:r>
         <w:t xml:space="preserve"> </w:t>
@@ -7722,91 +7719,106 @@
         <w:rPr>
           <w:rStyle w:val="VerbatimChar"/>
         </w:rPr>
+        <w:t xml:space="preserve">web-26</w:t>
+      </w:r>
+      <w:r>
+        <w:t xml:space="preserve"> </w:t>
+      </w:r>
+      <w:r>
+        <w:t xml:space="preserve">(6 October 2026, afternoon), seven nodes</w:t>
+      </w:r>
+      <w:r>
+        <w:t xml:space="preserve"> </w:t>
+      </w:r>
+      <w:r>
+        <w:t xml:space="preserve">match: the same four (BBMRI-ERIC at its</w:t>
+      </w:r>
+      <w:r>
+        <w:t xml:space="preserve"> </w:t>
+      </w:r>
+      <w:r>
+        <w:rPr>
+          <w:rStyle w:val="VerbatimChar"/>
+        </w:rPr>
+        <w:t xml:space="preserve">dev3.</w:t>
+      </w:r>
+      <w:r>
+        <w:t xml:space="preserve"> </w:t>
+      </w:r>
+      <w:r>
+        <w:t xml:space="preserve">page, which writes</w:t>
+      </w:r>
+      <w:r>
+        <w:t xml:space="preserve"> </w:t>
+      </w:r>
+      <w:r>
+        <w:rPr>
+          <w:rStyle w:val="VerbatimChar"/>
+        </w:rPr>
+        <w:t xml:space="preserve">EOSC Node – BBMRI-ERIC</w:t>
+      </w:r>
+      <w:r>
+        <w:t xml:space="preserve">; in</w:t>
+      </w:r>
+      <w:r>
+        <w:t xml:space="preserve"> </w:t>
+      </w:r>
+      <w:r>
+        <w:rPr>
+          <w:rStyle w:val="VerbatimChar"/>
+        </w:rPr>
+        <w:t xml:space="preserve">web-24</w:t>
+      </w:r>
+      <w:r>
+        <w:t xml:space="preserve"> </w:t>
+      </w:r>
+      <w:r>
+        <w:t xml:space="preserve">it was not fetched), Italy at its new address (</w:t>
+      </w:r>
+      <w:r>
+        <w:rPr>
+          <w:rStyle w:val="VerbatimChar"/>
+        </w:rPr>
+        <w:t xml:space="preserve">EOSC Node | Italy</w:t>
+      </w:r>
+      <w:r>
+        <w:t xml:space="preserve">, the list’s own separator), Data Terra at its new address (</w:t>
+      </w:r>
+      <w:r>
+        <w:rPr>
+          <w:rStyle w:val="VerbatimChar"/>
+        </w:rPr>
+        <w:t xml:space="preserve">EOSC Node Data Terra</w:t>
+      </w:r>
+      <w:r>
+        <w:t xml:space="preserve">), and EOSC Finland, whose page writes</w:t>
+      </w:r>
+      <w:r>
+        <w:t xml:space="preserve"> </w:t>
+      </w:r>
+      <w:r>
+        <w:rPr>
+          <w:rStyle w:val="VerbatimChar"/>
+        </w:rPr>
+        <w:t xml:space="preserve">EOSC Node Finland</w:t>
+      </w:r>
+      <w:r>
+        <w:t xml:space="preserve"> </w:t>
+      </w:r>
+      <w:r>
+        <w:t xml:space="preserve">(since</w:t>
+      </w:r>
+      <w:r>
+        <w:t xml:space="preserve"> </w:t>
+      </w:r>
+      <w:r>
+        <w:rPr>
+          <w:rStyle w:val="VerbatimChar"/>
+        </w:rPr>
         <w:t xml:space="preserve">web-25</w:t>
       </w:r>
       <w:r>
-        <w:t xml:space="preserve"> </w:t>
-      </w:r>
-      <w:r>
-        <w:t xml:space="preserve">(6 October 2026), eight nodes match: the same</w:t>
-      </w:r>
-      <w:r>
-        <w:t xml:space="preserve"> </w:t>
-      </w:r>
-      <w:r>
-        <w:t xml:space="preserve">four (BBMRI-ERIC now at its</w:t>
-      </w:r>
-      <w:r>
-        <w:t xml:space="preserve"> </w:t>
-      </w:r>
-      <w:r>
-        <w:rPr>
-          <w:rStyle w:val="VerbatimChar"/>
-        </w:rPr>
-        <w:t xml:space="preserve">dev3.</w:t>
-      </w:r>
-      <w:r>
-        <w:t xml:space="preserve"> </w:t>
-      </w:r>
-      <w:r>
-        <w:t xml:space="preserve">page, which writes</w:t>
-      </w:r>
-      <w:r>
-        <w:t xml:space="preserve"> </w:t>
-      </w:r>
-      <w:r>
-        <w:rPr>
-          <w:rStyle w:val="VerbatimChar"/>
-        </w:rPr>
-        <w:t xml:space="preserve">EOSC Node – BBMRI-ERIC</w:t>
-      </w:r>
-      <w:r>
-        <w:t xml:space="preserve">;</w:t>
-      </w:r>
-      <w:r>
-        <w:t xml:space="preserve"> </w:t>
-      </w:r>
-      <w:r>
-        <w:t xml:space="preserve">in</w:t>
-      </w:r>
-      <w:r>
-        <w:t xml:space="preserve"> </w:t>
-      </w:r>
-      <w:r>
-        <w:rPr>
-          <w:rStyle w:val="VerbatimChar"/>
-        </w:rPr>
-        <w:t xml:space="preserve">web-24</w:t>
-      </w:r>
-      <w:r>
-        <w:t xml:space="preserve"> </w:t>
-      </w:r>
-      <w:r>
-        <w:t xml:space="preserve">it was not fetched), Italy at its new address (</w:t>
-      </w:r>
-      <w:r>
-        <w:rPr>
-          <w:rStyle w:val="VerbatimChar"/>
-        </w:rPr>
-        <w:t xml:space="preserve">EOSC Node | Italy</w:t>
-      </w:r>
-      <w:r>
-        <w:t xml:space="preserve">,</w:t>
-      </w:r>
-      <w:r>
-        <w:t xml:space="preserve"> </w:t>
-      </w:r>
-      <w:r>
-        <w:t xml:space="preserve">the list’s own separator), Data Terra at its new address (</w:t>
-      </w:r>
-      <w:r>
-        <w:rPr>
-          <w:rStyle w:val="VerbatimChar"/>
-        </w:rPr>
-        <w:t xml:space="preserve">EOSC Node Data Terra</w:t>
-      </w:r>
-      <w:r>
-        <w:t xml:space="preserve">), Poland, whose page writes</w:t>
+        <w:t xml:space="preserve">). Poland’s page wrote</w:t>
       </w:r>
       <w:r>
         <w:t xml:space="preserve"> </w:t>
@@ -7821,25 +7833,55 @@
         <w:t xml:space="preserve"> </w:t>
       </w:r>
       <w:r>
-        <w:t xml:space="preserve">in its text, and EOSC</w:t>
-      </w:r>
-      <w:r>
-        <w:t xml:space="preserve"> </w:t>
-      </w:r>
-      <w:r>
-        <w:t xml:space="preserve">Finland, whose page now writes</w:t>
-      </w:r>
-      <w:r>
-        <w:t xml:space="preserve"> </w:t>
-      </w:r>
-      <w:r>
-        <w:rPr>
-          <w:rStyle w:val="VerbatimChar"/>
-        </w:rPr>
-        <w:t xml:space="preserve">EOSC Node Finland</w:t>
-      </w:r>
-      <w:r>
-        <w:t xml:space="preserve">. GÉANT matched (</w:t>
+        <w:t xml:space="preserve">and matched from</w:t>
+      </w:r>
+      <w:r>
+        <w:t xml:space="preserve"> </w:t>
+      </w:r>
+      <w:r>
+        <w:rPr>
+          <w:rStyle w:val="VerbatimChar"/>
+        </w:rPr>
+        <w:t xml:space="preserve">web-23</w:t>
+      </w:r>
+      <w:r>
+        <w:t xml:space="preserve"> </w:t>
+      </w:r>
+      <w:r>
+        <w:t xml:space="preserve">to</w:t>
+      </w:r>
+      <w:r>
+        <w:t xml:space="preserve"> </w:t>
+      </w:r>
+      <w:r>
+        <w:rPr>
+          <w:rStyle w:val="VerbatimChar"/>
+        </w:rPr>
+        <w:t xml:space="preserve">web-25</w:t>
+      </w:r>
+      <w:r>
+        <w:t xml:space="preserve">; in</w:t>
+      </w:r>
+      <w:r>
+        <w:t xml:space="preserve"> </w:t>
+      </w:r>
+      <w:r>
+        <w:rPr>
+          <w:rStyle w:val="VerbatimChar"/>
+        </w:rPr>
+        <w:t xml:space="preserve">web-26</w:t>
+      </w:r>
+      <w:r>
+        <w:t xml:space="preserve"> </w:t>
+      </w:r>
+      <w:r>
+        <w:t xml:space="preserve">it rendered only its header and footer, so</w:t>
+      </w:r>
+      <w:r>
+        <w:t xml:space="preserve"> </w:t>
+      </w:r>
+      <w:r>
+        <w:t xml:space="preserve">there was nothing to match. GÉANT matched (</w:t>
       </w:r>
       <w:r>
         <w:rPr>
@@ -7899,7 +7941,7 @@
         <w:rPr>
           <w:rStyle w:val="VerbatimChar"/>
         </w:rPr>
-        <w:t xml:space="preserve">web-25</w:t>
+        <w:t xml:space="preserve">web-26</w:t>
       </w:r>
       <w:r>
         <w:t xml:space="preserve"> </w:t>
@@ -15169,7 +15211,61 @@
         <w:t xml:space="preserve"> </w:t>
       </w:r>
       <w:r>
-        <w:t xml:space="preserve">verdicts changed (68 / 0 / 62 at both depths). The second hop reached governance, secretariat and news pages, which is also where it met a personal name that depth 1 had never collected (section on masking). Run it yourself before assuming the same holds for</w:t>
+        <w:t xml:space="preserve">verdicts changed (68 / 0 / 62 at both depths).</w:t>
+      </w:r>
+      <w:r>
+        <w:t xml:space="preserve"> </w:t>
+      </w:r>
+      <w:r>
+        <w:rPr>
+          <w:b/>
+          <w:bCs/>
+        </w:rPr>
+        <w:t xml:space="preserve">Run</w:t>
+      </w:r>
+      <w:r>
+        <w:rPr>
+          <w:b/>
+          <w:bCs/>
+        </w:rPr>
+        <w:t xml:space="preserve"> </w:t>
+      </w:r>
+      <w:r>
+        <w:rPr>
+          <w:rStyle w:val="VerbatimChar"/>
+          <w:b/>
+          <w:bCs/>
+        </w:rPr>
+        <w:t xml:space="preserve">web-26</w:t>
+      </w:r>
+      <w:r>
+        <w:rPr>
+          <w:b/>
+          <w:bCs/>
+        </w:rPr>
+        <w:t xml:space="preserve">:</w:t>
+      </w:r>
+      <w:r>
+        <w:t xml:space="preserve"> </w:t>
+      </w:r>
+      <w:r>
+        <w:t xml:space="preserve">34 second-hop pages, 109 requests, and again</w:t>
+      </w:r>
+      <w:r>
+        <w:t xml:space="preserve"> </w:t>
+      </w:r>
+      <w:r>
+        <w:rPr>
+          <w:b/>
+          <w:bCs/>
+        </w:rPr>
+        <w:t xml:space="preserve">zero</w:t>
+      </w:r>
+      <w:r>
+        <w:t xml:space="preserve"> </w:t>
+      </w:r>
+      <w:r>
+        <w:t xml:space="preserve">verdicts changed (67 / 0 / 63 at both depths). The second hop reached governance, secretariat and news pages, which is also where it met a personal name that depth 1 had never collected (section on masking). Run it yourself before assuming the same holds for</w:t>
       </w:r>
       <w:r>
         <w:t xml:space="preserve"> </w:t>
@@ -16962,201 +17058,213 @@
         <w:rPr>
           <w:rStyle w:val="VerbatimChar"/>
         </w:rPr>
+        <w:t xml:space="preserve">web-26</w:t>
+      </w:r>
+      <w:r>
+        <w:t xml:space="preserve"> </w:t>
+      </w:r>
+      <w:r>
+        <w:t xml:space="preserve">(6 October 2026) was collected</w:t>
+      </w:r>
+      <w:r>
+        <w:t xml:space="preserve"> </w:t>
+      </w:r>
+      <w:r>
+        <w:t xml:space="preserve">with masking in place, and a search of all its evidence and reports found no</w:t>
+      </w:r>
+      <w:r>
+        <w:t xml:space="preserve"> </w:t>
+      </w:r>
+      <w:r>
+        <w:t xml:space="preserve">personal address or phone number. Two personal names that the masking does not cover were removed by hand from the evidence, each replaced by a placeholder of the same length so every character count and verdict stays as collected: a quotation attribution on CERN’s page (in</w:t>
+      </w:r>
+      <w:r>
+        <w:t xml:space="preserve"> </w:t>
+      </w:r>
+      <w:r>
+        <w:rPr>
+          <w:rStyle w:val="VerbatimChar"/>
+        </w:rPr>
+        <w:t xml:space="preserve">cern.json</w:t>
+      </w:r>
+      <w:r>
+        <w:t xml:space="preserve"> </w:t>
+      </w:r>
+      <w:r>
+        <w:t xml:space="preserve">and in its screenshot) and the node coordinator named on EGI’s page (in</w:t>
+      </w:r>
+      <w:r>
+        <w:t xml:space="preserve"> </w:t>
+      </w:r>
+      <w:r>
+        <w:rPr>
+          <w:rStyle w:val="VerbatimChar"/>
+        </w:rPr>
+        <w:t xml:space="preserve">egi.json</w:t>
+      </w:r>
+      <w:r>
+        <w:t xml:space="preserve">, in the link text and, since</w:t>
+      </w:r>
+      <w:r>
+        <w:t xml:space="preserve"> </w:t>
+      </w:r>
+      <w:r>
+        <w:rPr>
+          <w:rStyle w:val="VerbatimChar"/>
+        </w:rPr>
+        <w:t xml:space="preserve">web-12</w:t>
+      </w:r>
+      <w:r>
+        <w:t xml:space="preserve">, also in the link’s address,</w:t>
+      </w:r>
+      <w:r>
+        <w:t xml:space="preserve"> </w:t>
+      </w:r>
+      <w:r>
+        <w:rPr>
+          <w:rStyle w:val="VerbatimChar"/>
+        </w:rPr>
+        <w:t xml:space="preserve">/person/…/</w:t>
+      </w:r>
+      <w:r>
+        <w:t xml:space="preserve">, which earlier published runs still carried). The second hop of</w:t>
+      </w:r>
+      <w:r>
+        <w:t xml:space="preserve"> </w:t>
+      </w:r>
+      <w:r>
+        <w:rPr>
+          <w:rStyle w:val="VerbatimChar"/>
+        </w:rPr>
+        <w:t xml:space="preserve">web-13</w:t>
+      </w:r>
+      <w:r>
+        <w:t xml:space="preserve"> </w:t>
+      </w:r>
+      <w:r>
+        <w:t xml:space="preserve">added a third: a person quoted in a news item on a Czechia page reached only at depth 2 (in</w:t>
+      </w:r>
+      <w:r>
+        <w:t xml:space="preserve"> </w:t>
+      </w:r>
+      <w:r>
+        <w:rPr>
+          <w:rStyle w:val="VerbatimChar"/>
+        </w:rPr>
+        <w:t xml:space="preserve">eosc-cz.json</w:t>
+      </w:r>
+      <w:r>
+        <w:t xml:space="preserve">, in the quotation and in the address of the interview it links to).</w:t>
+      </w:r>
+      <w:r>
+        <w:t xml:space="preserve"> </w:t>
+      </w:r>
+      <w:r>
+        <w:rPr>
+          <w:rStyle w:val="VerbatimChar"/>
+        </w:rPr>
+        <w:t xml:space="preserve">web-14</w:t>
+      </w:r>
+      <w:r>
+        <w:t xml:space="preserve">, which also reads services and policies pages, added many more, and</w:t>
+      </w:r>
+      <w:r>
+        <w:t xml:space="preserve"> </w:t>
+      </w:r>
+      <w:r>
+        <w:rPr>
+          <w:rStyle w:val="VerbatimChar"/>
+        </w:rPr>
+        <w:t xml:space="preserve">web-15</w:t>
+      </w:r>
+      <w:r>
+        <w:t xml:space="preserve">,</w:t>
+      </w:r>
+      <w:r>
+        <w:t xml:space="preserve"> </w:t>
+      </w:r>
+      <w:r>
+        <w:rPr>
+          <w:rStyle w:val="VerbatimChar"/>
+        </w:rPr>
+        <w:t xml:space="preserve">web-16</w:t>
+      </w:r>
+      <w:r>
+        <w:t xml:space="preserve">,</w:t>
+      </w:r>
+      <w:r>
+        <w:t xml:space="preserve"> </w:t>
+      </w:r>
+      <w:r>
+        <w:rPr>
+          <w:rStyle w:val="VerbatimChar"/>
+        </w:rPr>
+        <w:t xml:space="preserve">web-18</w:t>
+      </w:r>
+      <w:r>
+        <w:t xml:space="preserve">,</w:t>
+      </w:r>
+      <w:r>
+        <w:t xml:space="preserve"> </w:t>
+      </w:r>
+      <w:r>
+        <w:rPr>
+          <w:rStyle w:val="VerbatimChar"/>
+        </w:rPr>
+        <w:t xml:space="preserve">web-21</w:t>
+      </w:r>
+      <w:r>
+        <w:t xml:space="preserve">,</w:t>
+      </w:r>
+      <w:r>
+        <w:t xml:space="preserve"> </w:t>
+      </w:r>
+      <w:r>
+        <w:rPr>
+          <w:rStyle w:val="VerbatimChar"/>
+        </w:rPr>
+        <w:t xml:space="preserve">web-22</w:t>
+      </w:r>
+      <w:r>
+        <w:t xml:space="preserve">,</w:t>
+      </w:r>
+      <w:r>
+        <w:t xml:space="preserve"> </w:t>
+      </w:r>
+      <w:r>
+        <w:rPr>
+          <w:rStyle w:val="VerbatimChar"/>
+        </w:rPr>
+        <w:t xml:space="preserve">web-23</w:t>
+      </w:r>
+      <w:r>
+        <w:t xml:space="preserve">,</w:t>
+      </w:r>
+      <w:r>
+        <w:t xml:space="preserve"> </w:t>
+      </w:r>
+      <w:r>
+        <w:rPr>
+          <w:rStyle w:val="VerbatimChar"/>
+        </w:rPr>
+        <w:t xml:space="preserve">web-24</w:t>
+      </w:r>
+      <w:r>
+        <w:t xml:space="preserve">,</w:t>
+      </w:r>
+      <w:r>
+        <w:t xml:space="preserve"> </w:t>
+      </w:r>
+      <w:r>
+        <w:rPr>
+          <w:rStyle w:val="VerbatimChar"/>
+        </w:rPr>
         <w:t xml:space="preserve">web-25</w:t>
       </w:r>
       <w:r>
         <w:t xml:space="preserve"> </w:t>
       </w:r>
       <w:r>
-        <w:t xml:space="preserve">(6 October 2026) was collected</w:t>
-      </w:r>
-      <w:r>
-        <w:t xml:space="preserve"> </w:t>
-      </w:r>
-      <w:r>
-        <w:t xml:space="preserve">with masking in place, and a search of all its evidence and reports found no</w:t>
-      </w:r>
-      <w:r>
-        <w:t xml:space="preserve"> </w:t>
-      </w:r>
-      <w:r>
-        <w:t xml:space="preserve">personal address or phone number. Two personal names that the masking does not cover were removed by hand from the evidence, each replaced by a placeholder of the same length so every character count and verdict stays as collected: a quotation attribution on CERN’s page (in</w:t>
-      </w:r>
-      <w:r>
-        <w:t xml:space="preserve"> </w:t>
-      </w:r>
-      <w:r>
-        <w:rPr>
-          <w:rStyle w:val="VerbatimChar"/>
-        </w:rPr>
-        <w:t xml:space="preserve">cern.json</w:t>
-      </w:r>
-      <w:r>
-        <w:t xml:space="preserve"> </w:t>
-      </w:r>
-      <w:r>
-        <w:t xml:space="preserve">and in its screenshot) and the node coordinator named on EGI’s page (in</w:t>
-      </w:r>
-      <w:r>
-        <w:t xml:space="preserve"> </w:t>
-      </w:r>
-      <w:r>
-        <w:rPr>
-          <w:rStyle w:val="VerbatimChar"/>
-        </w:rPr>
-        <w:t xml:space="preserve">egi.json</w:t>
-      </w:r>
-      <w:r>
-        <w:t xml:space="preserve">, in the link text and, since</w:t>
-      </w:r>
-      <w:r>
-        <w:t xml:space="preserve"> </w:t>
-      </w:r>
-      <w:r>
-        <w:rPr>
-          <w:rStyle w:val="VerbatimChar"/>
-        </w:rPr>
-        <w:t xml:space="preserve">web-12</w:t>
-      </w:r>
-      <w:r>
-        <w:t xml:space="preserve">, also in the link’s address,</w:t>
-      </w:r>
-      <w:r>
-        <w:t xml:space="preserve"> </w:t>
-      </w:r>
-      <w:r>
-        <w:rPr>
-          <w:rStyle w:val="VerbatimChar"/>
-        </w:rPr>
-        <w:t xml:space="preserve">/person/…/</w:t>
-      </w:r>
-      <w:r>
-        <w:t xml:space="preserve">, which earlier published runs still carried). The second hop of</w:t>
-      </w:r>
-      <w:r>
-        <w:t xml:space="preserve"> </w:t>
-      </w:r>
-      <w:r>
-        <w:rPr>
-          <w:rStyle w:val="VerbatimChar"/>
-        </w:rPr>
-        <w:t xml:space="preserve">web-13</w:t>
-      </w:r>
-      <w:r>
-        <w:t xml:space="preserve"> </w:t>
-      </w:r>
-      <w:r>
-        <w:t xml:space="preserve">added a third: a person quoted in a news item on a Czechia page reached only at depth 2 (in</w:t>
-      </w:r>
-      <w:r>
-        <w:t xml:space="preserve"> </w:t>
-      </w:r>
-      <w:r>
-        <w:rPr>
-          <w:rStyle w:val="VerbatimChar"/>
-        </w:rPr>
-        <w:t xml:space="preserve">eosc-cz.json</w:t>
-      </w:r>
-      <w:r>
-        <w:t xml:space="preserve">, in the quotation and in the address of the interview it links to).</w:t>
-      </w:r>
-      <w:r>
-        <w:t xml:space="preserve"> </w:t>
-      </w:r>
-      <w:r>
-        <w:rPr>
-          <w:rStyle w:val="VerbatimChar"/>
-        </w:rPr>
-        <w:t xml:space="preserve">web-14</w:t>
-      </w:r>
-      <w:r>
-        <w:t xml:space="preserve">, which also reads services and policies pages, added many more, and</w:t>
-      </w:r>
-      <w:r>
-        <w:t xml:space="preserve"> </w:t>
-      </w:r>
-      <w:r>
-        <w:rPr>
-          <w:rStyle w:val="VerbatimChar"/>
-        </w:rPr>
-        <w:t xml:space="preserve">web-15</w:t>
-      </w:r>
-      <w:r>
-        <w:t xml:space="preserve">,</w:t>
-      </w:r>
-      <w:r>
-        <w:t xml:space="preserve"> </w:t>
-      </w:r>
-      <w:r>
-        <w:rPr>
-          <w:rStyle w:val="VerbatimChar"/>
-        </w:rPr>
-        <w:t xml:space="preserve">web-16</w:t>
-      </w:r>
-      <w:r>
-        <w:t xml:space="preserve">,</w:t>
-      </w:r>
-      <w:r>
-        <w:t xml:space="preserve"> </w:t>
-      </w:r>
-      <w:r>
-        <w:rPr>
-          <w:rStyle w:val="VerbatimChar"/>
-        </w:rPr>
-        <w:t xml:space="preserve">web-18</w:t>
-      </w:r>
-      <w:r>
-        <w:t xml:space="preserve">,</w:t>
-      </w:r>
-      <w:r>
-        <w:t xml:space="preserve"> </w:t>
-      </w:r>
-      <w:r>
-        <w:rPr>
-          <w:rStyle w:val="VerbatimChar"/>
-        </w:rPr>
-        <w:t xml:space="preserve">web-21</w:t>
-      </w:r>
-      <w:r>
-        <w:t xml:space="preserve">,</w:t>
-      </w:r>
-      <w:r>
-        <w:t xml:space="preserve"> </w:t>
-      </w:r>
-      <w:r>
-        <w:rPr>
-          <w:rStyle w:val="VerbatimChar"/>
-        </w:rPr>
-        <w:t xml:space="preserve">web-22</w:t>
-      </w:r>
-      <w:r>
-        <w:t xml:space="preserve">,</w:t>
-      </w:r>
-      <w:r>
-        <w:t xml:space="preserve"> </w:t>
-      </w:r>
-      <w:r>
-        <w:rPr>
-          <w:rStyle w:val="VerbatimChar"/>
-        </w:rPr>
-        <w:t xml:space="preserve">web-23</w:t>
-      </w:r>
-      <w:r>
-        <w:t xml:space="preserve">,</w:t>
-      </w:r>
-      <w:r>
-        <w:t xml:space="preserve"> </w:t>
-      </w:r>
-      <w:r>
-        <w:rPr>
-          <w:rStyle w:val="VerbatimChar"/>
-        </w:rPr>
-        <w:t xml:space="preserve">web-24</w:t>
-      </w:r>
-      <w:r>
-        <w:t xml:space="preserve"> </w:t>
-      </w:r>
-      <w:r>
         <w:t xml:space="preserve">and</w:t>
       </w:r>
       <w:r>
@@ -17166,7 +17274,7 @@
         <w:rPr>
           <w:rStyle w:val="VerbatimChar"/>
         </w:rPr>
-        <w:t xml:space="preserve">web-25</w:t>
+        <w:t xml:space="preserve">web-26</w:t>
       </w:r>
       <w:r>
         <w:t xml:space="preserve"> </w:t>
@@ -23091,7 +23199,7 @@
         <w:t xml:space="preserve">(</w:t>
       </w:r>
       <w:r>
-        <w:t xml:space="preserve">“130 cells: 68 PASS · 0 FAIL · 62 review”</w:t>
+        <w:t xml:space="preserve">“130 cells: 67 PASS · 0 FAIL · 63 review”</w:t>
       </w:r>
       <w:r>
         <w:t xml:space="preserve">);</w:t>

</xml_diff>

<commit_message>
Publish run web-27 (depth 2, re-issued checklist v3.2, 69/0/61 at both depths, 109 requests): still no FAIL; Poland's page rendered in full again, so point 4 passes again and 5c passes through a new User Access Policy link (to its privacy policy page, to be confirmed by a reviewer); GÉANT behind the Cloudflare challenge; names masked as before plus the photo captions on Poland's page, CERN screenshot mask redrawn at the attribution's new position; names test expects eight matches; docs and Word/PDF guides updated
</commit_message>
<xml_diff>
--- a/docs/eosc-basic-compliance-guide.docx
+++ b/docs/eosc-basic-compliance-guide.docx
@@ -23,7 +23,7 @@
         <w:pStyle w:val="Author"/>
       </w:pPr>
       <w:r>
-        <w:t xml:space="preserve">Verified against a clean clone on 26 September 2026 — rebuilt 6 October 2026 for the re-issued checklist v3.2</w:t>
+        <w:t xml:space="preserve">Verified against a clean clone on 26 September 2026 — rebuilt 7 October 2026 for the re-issued checklist v3.2</w:t>
       </w:r>
     </w:p>
     <w:p>
@@ -209,7 +209,7 @@
         <w:pStyle w:val="BodyText"/>
       </w:pPr>
       <w:r>
-        <w:t xml:space="preserve">This edition was revised on 6 October 2026 for checklist v3.2: the test</w:t>
+        <w:t xml:space="preserve">This edition was revised on 7 October 2026 for checklist v3.2: the test</w:t>
       </w:r>
       <w:r>
         <w:t xml:space="preserve"> </w:t>
@@ -499,7 +499,7 @@
           <w:b/>
           <w:bCs/>
         </w:rPr>
-        <w:t xml:space="preserve">The published run changed again on 6 October 2026, in the afternoon.</w:t>
+        <w:t xml:space="preserve">The published run changed again on 7 October 2026.</w:t>
       </w:r>
       <w:r>
         <w:t xml:space="preserve"> </w:t>
@@ -523,33 +523,122 @@
         <w:rPr>
           <w:rStyle w:val="VerbatimChar"/>
         </w:rPr>
+        <w:t xml:space="preserve">web-27</w:t>
+      </w:r>
+      <w:r>
+        <w:t xml:space="preserve">, collected by the GitHub workflow at</w:t>
+      </w:r>
+      <w:r>
+        <w:t xml:space="preserve"> </w:t>
+      </w:r>
+      <w:r>
+        <w:rPr>
+          <w:rStyle w:val="VerbatimChar"/>
+        </w:rPr>
+        <w:t xml:space="preserve">--depth 2</w:t>
+      </w:r>
+      <w:r>
+        <w:t xml:space="preserve"> </w:t>
+      </w:r>
+      <w:r>
+        <w:t xml:space="preserve">on 7 October 2026 between 21:59 and 22:05 UTC from all thirteen</w:t>
+      </w:r>
+      <w:r>
+        <w:t xml:space="preserve"> </w:t>
+      </w:r>
+      <w:r>
+        <w:t xml:space="preserve">nodes (</w:t>
+      </w:r>
+      <w:hyperlink r:id="rId10">
+        <w:r>
+          <w:rPr>
+            <w:rStyle w:val="Hyperlink"/>
+          </w:rPr>
+          <w:t xml:space="preserve">run 37692836637</w:t>
+        </w:r>
+      </w:hyperlink>
+      <w:r>
+        <w:t xml:space="preserve">, commit</w:t>
+      </w:r>
+      <w:r>
+        <w:t xml:space="preserve"> </w:t>
+      </w:r>
+      <w:r>
+        <w:rPr>
+          <w:rStyle w:val="VerbatimChar"/>
+        </w:rPr>
+        <w:t xml:space="preserve">5e0e6ce</w:t>
+      </w:r>
+      <w:r>
+        <w:t xml:space="preserve">), under the re-issued v3.2: 69 PASS, 0 FAIL</w:t>
+      </w:r>
+      <w:r>
+        <w:t xml:space="preserve"> </w:t>
+      </w:r>
+      <w:r>
+        <w:t xml:space="preserve">and 61 MANUAL_REVIEW at both depths, in 109 page requests. Two cells changed,</w:t>
+      </w:r>
+      <w:r>
+        <w:t xml:space="preserve"> </w:t>
+      </w:r>
+      <w:r>
+        <w:t xml:space="preserve">both Poland’s: its page rendered in full again, so point 4 (its own</w:t>
+      </w:r>
+      <w:r>
+        <w:t xml:space="preserve"> </w:t>
+      </w:r>
+      <w:r>
+        <w:rPr>
+          <w:rStyle w:val="VerbatimChar"/>
+        </w:rPr>
+        <w:t xml:space="preserve">eosc.eu</w:t>
+      </w:r>
+      <w:r>
+        <w:t xml:space="preserve"> </w:t>
+      </w:r>
+      <w:r>
+        <w:t xml:space="preserve">entry) passes again, and 5c passes through a new</w:t>
+      </w:r>
+      <w:r>
+        <w:t xml:space="preserve"> </w:t>
+      </w:r>
+      <w:r>
+        <w:t xml:space="preserve">“User Access Policy”</w:t>
+      </w:r>
+      <w:r>
+        <w:t xml:space="preserve"> </w:t>
+      </w:r>
+      <w:r>
+        <w:t xml:space="preserve">link to</w:t>
+      </w:r>
+      <w:r>
+        <w:t xml:space="preserve"> </w:t>
+      </w:r>
+      <w:r>
+        <w:t xml:space="preserve">its privacy policy page, which a reviewer should confirm. GÉANT got the</w:t>
+      </w:r>
+      <w:r>
+        <w:t xml:space="preserve"> </w:t>
+      </w:r>
+      <w:r>
+        <w:t xml:space="preserve">Cloudflare challenge again. Before it came</w:t>
+      </w:r>
+      <w:r>
+        <w:t xml:space="preserve"> </w:t>
+      </w:r>
+      <w:r>
+        <w:rPr>
+          <w:rStyle w:val="VerbatimChar"/>
+        </w:rPr>
         <w:t xml:space="preserve">web-26</w:t>
       </w:r>
       <w:r>
-        <w:t xml:space="preserve">, collected by the GitHub workflow at</w:t>
-      </w:r>
-      <w:r>
-        <w:t xml:space="preserve"> </w:t>
-      </w:r>
-      <w:r>
-        <w:rPr>
-          <w:rStyle w:val="VerbatimChar"/>
-        </w:rPr>
-        <w:t xml:space="preserve">--depth 2</w:t>
-      </w:r>
-      <w:r>
-        <w:t xml:space="preserve"> </w:t>
-      </w:r>
-      <w:r>
-        <w:t xml:space="preserve">on 6 October 2026 between 16:07 and 16:14 UTC from all thirteen</w:t>
-      </w:r>
-      <w:r>
-        <w:t xml:space="preserve"> </w:t>
-      </w:r>
-      <w:r>
-        <w:t xml:space="preserve">nodes (</w:t>
-      </w:r>
-      <w:hyperlink r:id="rId10">
+        <w:t xml:space="preserve"> </w:t>
+      </w:r>
+      <w:r>
+        <w:t xml:space="preserve">(</w:t>
+      </w:r>
+      <w:hyperlink r:id="rId11">
         <w:r>
           <w:rPr>
             <w:rStyle w:val="Hyperlink"/>
@@ -558,43 +647,13 @@
         </w:r>
       </w:hyperlink>
       <w:r>
-        <w:t xml:space="preserve">, commit</w:t>
-      </w:r>
-      <w:r>
-        <w:t xml:space="preserve"> </w:t>
-      </w:r>
-      <w:r>
-        <w:rPr>
-          <w:rStyle w:val="VerbatimChar"/>
-        </w:rPr>
-        <w:t xml:space="preserve">21d8c7d</w:t>
-      </w:r>
-      <w:r>
-        <w:t xml:space="preserve">), under the re-issued v3.2: 67 PASS, 0 FAIL</w:t>
-      </w:r>
-      <w:r>
-        <w:t xml:space="preserve"> </w:t>
-      </w:r>
-      <w:r>
-        <w:t xml:space="preserve">and 63 MANUAL_REVIEW at both depths, in 109 page requests. One cell changed:</w:t>
-      </w:r>
-      <w:r>
-        <w:t xml:space="preserve"> </w:t>
-      </w:r>
-      <w:r>
-        <w:t xml:space="preserve">Poland’s page rendered only its header and footer (420 characters), so its</w:t>
-      </w:r>
-      <w:r>
-        <w:t xml:space="preserve"> </w:t>
-      </w:r>
-      <w:r>
-        <w:t xml:space="preserve">point 4 moved to review; GÉANT got the Cloudflare challenge again. Before it</w:t>
-      </w:r>
-      <w:r>
-        <w:t xml:space="preserve"> </w:t>
-      </w:r>
-      <w:r>
-        <w:t xml:space="preserve">came</w:t>
+        <w:t xml:space="preserve">, 6 October,</w:t>
+      </w:r>
+      <w:r>
+        <w:t xml:space="preserve"> </w:t>
+      </w:r>
+      <w:r>
+        <w:t xml:space="preserve">67 / 0 / 63), in which Poland’s page rendered only its header and footer, and</w:t>
       </w:r>
       <w:r>
         <w:t xml:space="preserve"> </w:t>
@@ -609,60 +668,7 @@
         <w:t xml:space="preserve"> </w:t>
       </w:r>
       <w:r>
-        <w:t xml:space="preserve">(</w:t>
-      </w:r>
-      <w:hyperlink r:id="rId11">
-        <w:r>
-          <w:rPr>
-            <w:rStyle w:val="Hyperlink"/>
-          </w:rPr>
-          <w:t xml:space="preserve">run 37450646487</w:t>
-        </w:r>
-      </w:hyperlink>
-      <w:r>
-        <w:t xml:space="preserve">, 6 October, morning, 68 / 0 / 62), the first run with</w:t>
-      </w:r>
-      <w:r>
-        <w:t xml:space="preserve"> </w:t>
-      </w:r>
-      <w:r>
-        <w:t xml:space="preserve">no FAIL, in which BBMRI-ERIC’s</w:t>
-      </w:r>
-      <w:r>
-        <w:t xml:space="preserve"> </w:t>
-      </w:r>
-      <w:r>
-        <w:rPr>
-          <w:rStyle w:val="VerbatimChar"/>
-        </w:rPr>
-        <w:t xml:space="preserve">dev3.</w:t>
-      </w:r>
-      <w:r>
-        <w:t xml:space="preserve"> </w:t>
-      </w:r>
-      <w:r>
-        <w:t xml:space="preserve">page was first read and EOSC Finland</w:t>
-      </w:r>
-      <w:r>
-        <w:t xml:space="preserve"> </w:t>
-      </w:r>
-      <w:r>
-        <w:t xml:space="preserve">first linked its own</w:t>
-      </w:r>
-      <w:r>
-        <w:t xml:space="preserve"> </w:t>
-      </w:r>
-      <w:r>
-        <w:rPr>
-          <w:rStyle w:val="VerbatimChar"/>
-        </w:rPr>
-        <w:t xml:space="preserve">eosc.eu</w:t>
-      </w:r>
-      <w:r>
-        <w:t xml:space="preserve"> </w:t>
-      </w:r>
-      <w:r>
-        <w:t xml:space="preserve">entry.</w:t>
+        <w:t xml:space="preserve">(6 October, morning, 68 / 0 / 62), the first run with no FAIL.</w:t>
       </w:r>
       <w:r>
         <w:t xml:space="preserve"> </w:t>
@@ -3374,7 +3380,7 @@
         <w:rPr>
           <w:rStyle w:val="VerbatimChar"/>
         </w:rPr>
-        <w:t xml:space="preserve">web-26</w:t>
+        <w:t xml:space="preserve">web-27</w:t>
       </w:r>
       <w:r>
         <w:t xml:space="preserve"> </w:t>
@@ -3494,7 +3500,7 @@
         <w:rPr>
           <w:rStyle w:val="VerbatimChar"/>
         </w:rPr>
-        <w:t xml:space="preserve">web-26</w:t>
+        <w:t xml:space="preserve">web-27</w:t>
       </w:r>
       <w:r>
         <w:t xml:space="preserve"> </w:t>
@@ -4292,7 +4298,7 @@
         <w:rPr>
           <w:rStyle w:val="NormalTok"/>
         </w:rPr>
-        <w:t xml:space="preserve"> web-26</w:t>
+        <w:t xml:space="preserve"> web-27</w:t>
       </w:r>
     </w:p>
     <w:p>
@@ -4552,7 +4558,25 @@
         <w:t xml:space="preserve"> </w:t>
       </w:r>
       <w:r>
-        <w:t xml:space="preserve">PASS, 0 FAIL and 63 MANUAL_REVIEW. The reviewed run of 24 September that it replaced is in the git</w:t>
+        <w:t xml:space="preserve">PASS, 0 FAIL and 63 MANUAL_REVIEW; verified on 7 October 2026 for</w:t>
+      </w:r>
+      <w:r>
+        <w:t xml:space="preserve"> </w:t>
+      </w:r>
+      <w:r>
+        <w:rPr>
+          <w:rStyle w:val="VerbatimChar"/>
+        </w:rPr>
+        <w:t xml:space="preserve">web-27</w:t>
+      </w:r>
+      <w:r>
+        <w:t xml:space="preserve">,</w:t>
+      </w:r>
+      <w:r>
+        <w:t xml:space="preserve"> </w:t>
+      </w:r>
+      <w:r>
+        <w:t xml:space="preserve">with 69 PASS, 0 FAIL and 61 MANUAL_REVIEW. The reviewed run of 24 September that it replaced is in the git</w:t>
       </w:r>
       <w:r>
         <w:t xml:space="preserve"> </w:t>
@@ -7719,121 +7743,208 @@
         <w:rPr>
           <w:rStyle w:val="VerbatimChar"/>
         </w:rPr>
+        <w:t xml:space="preserve">web-27</w:t>
+      </w:r>
+      <w:r>
+        <w:t xml:space="preserve"> </w:t>
+      </w:r>
+      <w:r>
+        <w:t xml:space="preserve">(7 October 2026), eight nodes match: the same</w:t>
+      </w:r>
+      <w:r>
+        <w:t xml:space="preserve"> </w:t>
+      </w:r>
+      <w:r>
+        <w:t xml:space="preserve">four (BBMRI-ERIC at its</w:t>
+      </w:r>
+      <w:r>
+        <w:t xml:space="preserve"> </w:t>
+      </w:r>
+      <w:r>
+        <w:rPr>
+          <w:rStyle w:val="VerbatimChar"/>
+        </w:rPr>
+        <w:t xml:space="preserve">dev3.</w:t>
+      </w:r>
+      <w:r>
+        <w:t xml:space="preserve"> </w:t>
+      </w:r>
+      <w:r>
+        <w:t xml:space="preserve">page, which writes</w:t>
+      </w:r>
+      <w:r>
+        <w:t xml:space="preserve"> </w:t>
+      </w:r>
+      <w:r>
+        <w:rPr>
+          <w:rStyle w:val="VerbatimChar"/>
+        </w:rPr>
+        <w:t xml:space="preserve">EOSC Node – BBMRI-ERIC</w:t>
+      </w:r>
+      <w:r>
+        <w:t xml:space="preserve">; in</w:t>
+      </w:r>
+      <w:r>
+        <w:t xml:space="preserve"> </w:t>
+      </w:r>
+      <w:r>
+        <w:rPr>
+          <w:rStyle w:val="VerbatimChar"/>
+        </w:rPr>
+        <w:t xml:space="preserve">web-24</w:t>
+      </w:r>
+      <w:r>
+        <w:t xml:space="preserve"> </w:t>
+      </w:r>
+      <w:r>
+        <w:t xml:space="preserve">it was not fetched), Italy at its new address (</w:t>
+      </w:r>
+      <w:r>
+        <w:rPr>
+          <w:rStyle w:val="VerbatimChar"/>
+        </w:rPr>
+        <w:t xml:space="preserve">EOSC Node | Italy</w:t>
+      </w:r>
+      <w:r>
+        <w:t xml:space="preserve">,</w:t>
+      </w:r>
+      <w:r>
+        <w:t xml:space="preserve"> </w:t>
+      </w:r>
+      <w:r>
+        <w:t xml:space="preserve">the list’s own separator), Data Terra at its new address (</w:t>
+      </w:r>
+      <w:r>
+        <w:rPr>
+          <w:rStyle w:val="VerbatimChar"/>
+        </w:rPr>
+        <w:t xml:space="preserve">EOSC Node Data Terra</w:t>
+      </w:r>
+      <w:r>
+        <w:t xml:space="preserve">), EOSC Finland, whose page writes</w:t>
+      </w:r>
+      <w:r>
+        <w:t xml:space="preserve"> </w:t>
+      </w:r>
+      <w:r>
+        <w:rPr>
+          <w:rStyle w:val="VerbatimChar"/>
+        </w:rPr>
+        <w:t xml:space="preserve">EOSC Node Finland</w:t>
+      </w:r>
+      <w:r>
+        <w:t xml:space="preserve"> </w:t>
+      </w:r>
+      <w:r>
+        <w:t xml:space="preserve">(since</w:t>
+      </w:r>
+      <w:r>
+        <w:t xml:space="preserve"> </w:t>
+      </w:r>
+      <w:r>
+        <w:rPr>
+          <w:rStyle w:val="VerbatimChar"/>
+        </w:rPr>
+        <w:t xml:space="preserve">web-25</w:t>
+      </w:r>
+      <w:r>
+        <w:t xml:space="preserve">),</w:t>
+      </w:r>
+      <w:r>
+        <w:t xml:space="preserve"> </w:t>
+      </w:r>
+      <w:r>
+        <w:t xml:space="preserve">and Poland, whose page writes</w:t>
+      </w:r>
+      <w:r>
+        <w:t xml:space="preserve"> </w:t>
+      </w:r>
+      <w:r>
+        <w:rPr>
+          <w:rStyle w:val="VerbatimChar"/>
+        </w:rPr>
+        <w:t xml:space="preserve">EOSC Node Poland</w:t>
+      </w:r>
+      <w:r>
+        <w:t xml:space="preserve"> </w:t>
+      </w:r>
+      <w:r>
+        <w:t xml:space="preserve">(from</w:t>
+      </w:r>
+      <w:r>
+        <w:t xml:space="preserve"> </w:t>
+      </w:r>
+      <w:r>
+        <w:rPr>
+          <w:rStyle w:val="VerbatimChar"/>
+        </w:rPr>
+        <w:t xml:space="preserve">web-23</w:t>
+      </w:r>
+      <w:r>
+        <w:t xml:space="preserve">; in</w:t>
+      </w:r>
+      <w:r>
+        <w:t xml:space="preserve"> </w:t>
+      </w:r>
+      <w:r>
+        <w:rPr>
+          <w:rStyle w:val="VerbatimChar"/>
+        </w:rPr>
         <w:t xml:space="preserve">web-26</w:t>
       </w:r>
       <w:r>
         <w:t xml:space="preserve"> </w:t>
       </w:r>
       <w:r>
-        <w:t xml:space="preserve">(6 October 2026, afternoon), seven nodes</w:t>
-      </w:r>
-      <w:r>
-        <w:t xml:space="preserve"> </w:t>
-      </w:r>
-      <w:r>
-        <w:t xml:space="preserve">match: the same four (BBMRI-ERIC at its</w:t>
-      </w:r>
-      <w:r>
-        <w:t xml:space="preserve"> </w:t>
-      </w:r>
-      <w:r>
-        <w:rPr>
-          <w:rStyle w:val="VerbatimChar"/>
-        </w:rPr>
-        <w:t xml:space="preserve">dev3.</w:t>
-      </w:r>
-      <w:r>
-        <w:t xml:space="preserve"> </w:t>
-      </w:r>
-      <w:r>
-        <w:t xml:space="preserve">page, which writes</w:t>
-      </w:r>
-      <w:r>
-        <w:t xml:space="preserve"> </w:t>
-      </w:r>
-      <w:r>
-        <w:rPr>
-          <w:rStyle w:val="VerbatimChar"/>
-        </w:rPr>
-        <w:t xml:space="preserve">EOSC Node – BBMRI-ERIC</w:t>
-      </w:r>
-      <w:r>
-        <w:t xml:space="preserve">; in</w:t>
-      </w:r>
-      <w:r>
-        <w:t xml:space="preserve"> </w:t>
-      </w:r>
-      <w:r>
-        <w:rPr>
-          <w:rStyle w:val="VerbatimChar"/>
-        </w:rPr>
-        <w:t xml:space="preserve">web-24</w:t>
-      </w:r>
-      <w:r>
-        <w:t xml:space="preserve"> </w:t>
-      </w:r>
-      <w:r>
-        <w:t xml:space="preserve">it was not fetched), Italy at its new address (</w:t>
-      </w:r>
-      <w:r>
-        <w:rPr>
-          <w:rStyle w:val="VerbatimChar"/>
-        </w:rPr>
-        <w:t xml:space="preserve">EOSC Node | Italy</w:t>
-      </w:r>
-      <w:r>
-        <w:t xml:space="preserve">, the list’s own separator), Data Terra at its new address (</w:t>
-      </w:r>
-      <w:r>
-        <w:rPr>
-          <w:rStyle w:val="VerbatimChar"/>
-        </w:rPr>
-        <w:t xml:space="preserve">EOSC Node Data Terra</w:t>
-      </w:r>
-      <w:r>
-        <w:t xml:space="preserve">), and EOSC Finland, whose page writes</w:t>
-      </w:r>
-      <w:r>
-        <w:t xml:space="preserve"> </w:t>
-      </w:r>
-      <w:r>
-        <w:rPr>
-          <w:rStyle w:val="VerbatimChar"/>
-        </w:rPr>
-        <w:t xml:space="preserve">EOSC Node Finland</w:t>
-      </w:r>
-      <w:r>
-        <w:t xml:space="preserve"> </w:t>
-      </w:r>
-      <w:r>
-        <w:t xml:space="preserve">(since</w:t>
-      </w:r>
-      <w:r>
-        <w:t xml:space="preserve"> </w:t>
-      </w:r>
-      <w:r>
-        <w:rPr>
-          <w:rStyle w:val="VerbatimChar"/>
-        </w:rPr>
-        <w:t xml:space="preserve">web-25</w:t>
-      </w:r>
-      <w:r>
-        <w:t xml:space="preserve">). Poland’s page wrote</w:t>
-      </w:r>
-      <w:r>
-        <w:t xml:space="preserve"> </w:t>
-      </w:r>
-      <w:r>
-        <w:rPr>
-          <w:rStyle w:val="VerbatimChar"/>
-        </w:rPr>
-        <w:t xml:space="preserve">EOSC Node Poland</w:t>
-      </w:r>
-      <w:r>
-        <w:t xml:space="preserve"> </w:t>
-      </w:r>
-      <w:r>
-        <w:t xml:space="preserve">and matched from</w:t>
+        <w:t xml:space="preserve">it rendered only its header and footer, so there was nothing to match). GÉANT</w:t>
+      </w:r>
+      <w:r>
+        <w:t xml:space="preserve"> </w:t>
+      </w:r>
+      <w:r>
+        <w:t xml:space="preserve">matched (</w:t>
+      </w:r>
+      <w:r>
+        <w:rPr>
+          <w:rStyle w:val="VerbatimChar"/>
+        </w:rPr>
+        <w:t xml:space="preserve">EOSC Node GÉANT</w:t>
+      </w:r>
+      <w:r>
+        <w:t xml:space="preserve">) in</w:t>
+      </w:r>
+      <w:r>
+        <w:t xml:space="preserve"> </w:t>
+      </w:r>
+      <w:r>
+        <w:rPr>
+          <w:rStyle w:val="VerbatimChar"/>
+        </w:rPr>
+        <w:t xml:space="preserve">web-16</w:t>
+      </w:r>
+      <w:r>
+        <w:t xml:space="preserve"> </w:t>
+      </w:r>
+      <w:r>
+        <w:t xml:space="preserve">and</w:t>
+      </w:r>
+      <w:r>
+        <w:t xml:space="preserve"> </w:t>
+      </w:r>
+      <w:r>
+        <w:rPr>
+          <w:rStyle w:val="VerbatimChar"/>
+        </w:rPr>
+        <w:t xml:space="preserve">web-22</w:t>
+      </w:r>
+      <w:r>
+        <w:t xml:space="preserve">, when its page was</w:t>
+      </w:r>
+      <w:r>
+        <w:t xml:space="preserve"> </w:t>
+      </w:r>
+      <w:r>
+        <w:t xml:space="preserve">served; in</w:t>
       </w:r>
       <w:r>
         <w:t xml:space="preserve"> </w:t>
@@ -7857,91 +7968,7 @@
         <w:rPr>
           <w:rStyle w:val="VerbatimChar"/>
         </w:rPr>
-        <w:t xml:space="preserve">web-25</w:t>
-      </w:r>
-      <w:r>
-        <w:t xml:space="preserve">; in</w:t>
-      </w:r>
-      <w:r>
-        <w:t xml:space="preserve"> </w:t>
-      </w:r>
-      <w:r>
-        <w:rPr>
-          <w:rStyle w:val="VerbatimChar"/>
-        </w:rPr>
-        <w:t xml:space="preserve">web-26</w:t>
-      </w:r>
-      <w:r>
-        <w:t xml:space="preserve"> </w:t>
-      </w:r>
-      <w:r>
-        <w:t xml:space="preserve">it rendered only its header and footer, so</w:t>
-      </w:r>
-      <w:r>
-        <w:t xml:space="preserve"> </w:t>
-      </w:r>
-      <w:r>
-        <w:t xml:space="preserve">there was nothing to match. GÉANT matched (</w:t>
-      </w:r>
-      <w:r>
-        <w:rPr>
-          <w:rStyle w:val="VerbatimChar"/>
-        </w:rPr>
-        <w:t xml:space="preserve">EOSC Node GÉANT</w:t>
-      </w:r>
-      <w:r>
-        <w:t xml:space="preserve">) in</w:t>
-      </w:r>
-      <w:r>
-        <w:t xml:space="preserve"> </w:t>
-      </w:r>
-      <w:r>
-        <w:rPr>
-          <w:rStyle w:val="VerbatimChar"/>
-        </w:rPr>
-        <w:t xml:space="preserve">web-16</w:t>
-      </w:r>
-      <w:r>
-        <w:t xml:space="preserve"> </w:t>
-      </w:r>
-      <w:r>
-        <w:t xml:space="preserve">and</w:t>
-      </w:r>
-      <w:r>
-        <w:t xml:space="preserve"> </w:t>
-      </w:r>
-      <w:r>
-        <w:rPr>
-          <w:rStyle w:val="VerbatimChar"/>
-        </w:rPr>
-        <w:t xml:space="preserve">web-22</w:t>
-      </w:r>
-      <w:r>
-        <w:t xml:space="preserve">, when its page was served; in</w:t>
-      </w:r>
-      <w:r>
-        <w:t xml:space="preserve"> </w:t>
-      </w:r>
-      <w:r>
-        <w:rPr>
-          <w:rStyle w:val="VerbatimChar"/>
-        </w:rPr>
-        <w:t xml:space="preserve">web-23</w:t>
-      </w:r>
-      <w:r>
-        <w:t xml:space="preserve"> </w:t>
-      </w:r>
-      <w:r>
-        <w:t xml:space="preserve">to</w:t>
-      </w:r>
-      <w:r>
-        <w:t xml:space="preserve"> </w:t>
-      </w:r>
-      <w:r>
-        <w:rPr>
-          <w:rStyle w:val="VerbatimChar"/>
-        </w:rPr>
-        <w:t xml:space="preserve">web-26</w:t>
+        <w:t xml:space="preserve">web-27</w:t>
       </w:r>
       <w:r>
         <w:t xml:space="preserve"> </w:t>
@@ -15265,7 +15292,61 @@
         <w:t xml:space="preserve"> </w:t>
       </w:r>
       <w:r>
-        <w:t xml:space="preserve">verdicts changed (67 / 0 / 63 at both depths). The second hop reached governance, secretariat and news pages, which is also where it met a personal name that depth 1 had never collected (section on masking). Run it yourself before assuming the same holds for</w:t>
+        <w:t xml:space="preserve">verdicts changed (67 / 0 / 63 at both depths).</w:t>
+      </w:r>
+      <w:r>
+        <w:t xml:space="preserve"> </w:t>
+      </w:r>
+      <w:r>
+        <w:rPr>
+          <w:b/>
+          <w:bCs/>
+        </w:rPr>
+        <w:t xml:space="preserve">Run</w:t>
+      </w:r>
+      <w:r>
+        <w:rPr>
+          <w:b/>
+          <w:bCs/>
+        </w:rPr>
+        <w:t xml:space="preserve"> </w:t>
+      </w:r>
+      <w:r>
+        <w:rPr>
+          <w:rStyle w:val="VerbatimChar"/>
+          <w:b/>
+          <w:bCs/>
+        </w:rPr>
+        <w:t xml:space="preserve">web-27</w:t>
+      </w:r>
+      <w:r>
+        <w:rPr>
+          <w:b/>
+          <w:bCs/>
+        </w:rPr>
+        <w:t xml:space="preserve">:</w:t>
+      </w:r>
+      <w:r>
+        <w:t xml:space="preserve"> </w:t>
+      </w:r>
+      <w:r>
+        <w:t xml:space="preserve">33 second-hop pages, 109 requests, and again</w:t>
+      </w:r>
+      <w:r>
+        <w:t xml:space="preserve"> </w:t>
+      </w:r>
+      <w:r>
+        <w:rPr>
+          <w:b/>
+          <w:bCs/>
+        </w:rPr>
+        <w:t xml:space="preserve">zero</w:t>
+      </w:r>
+      <w:r>
+        <w:t xml:space="preserve"> </w:t>
+      </w:r>
+      <w:r>
+        <w:t xml:space="preserve">verdicts changed (69 / 0 / 61 at both depths). The second hop reached governance, secretariat and news pages, which is also where it met a personal name that depth 1 had never collected (section on masking). Run it yourself before assuming the same holds for</w:t>
       </w:r>
       <w:r>
         <w:t xml:space="preserve"> </w:t>
@@ -17058,154 +17139,271 @@
         <w:rPr>
           <w:rStyle w:val="VerbatimChar"/>
         </w:rPr>
+        <w:t xml:space="preserve">web-27</w:t>
+      </w:r>
+      <w:r>
+        <w:t xml:space="preserve"> </w:t>
+      </w:r>
+      <w:r>
+        <w:t xml:space="preserve">(7 October 2026) was collected</w:t>
+      </w:r>
+      <w:r>
+        <w:t xml:space="preserve"> </w:t>
+      </w:r>
+      <w:r>
+        <w:t xml:space="preserve">with masking in place, and a search of all its evidence and reports found no</w:t>
+      </w:r>
+      <w:r>
+        <w:t xml:space="preserve"> </w:t>
+      </w:r>
+      <w:r>
+        <w:t xml:space="preserve">personal address or phone number. Two personal names that the masking does not cover were removed by hand from the evidence, each replaced by a placeholder of the same length so every character count and verdict stays as collected: a quotation attribution on CERN’s page (in</w:t>
+      </w:r>
+      <w:r>
+        <w:t xml:space="preserve"> </w:t>
+      </w:r>
+      <w:r>
+        <w:rPr>
+          <w:rStyle w:val="VerbatimChar"/>
+        </w:rPr>
+        <w:t xml:space="preserve">cern.json</w:t>
+      </w:r>
+      <w:r>
+        <w:t xml:space="preserve"> </w:t>
+      </w:r>
+      <w:r>
+        <w:t xml:space="preserve">and in its screenshot) and the node coordinator named on EGI’s page (in</w:t>
+      </w:r>
+      <w:r>
+        <w:t xml:space="preserve"> </w:t>
+      </w:r>
+      <w:r>
+        <w:rPr>
+          <w:rStyle w:val="VerbatimChar"/>
+        </w:rPr>
+        <w:t xml:space="preserve">egi.json</w:t>
+      </w:r>
+      <w:r>
+        <w:t xml:space="preserve">, in the link text and, since</w:t>
+      </w:r>
+      <w:r>
+        <w:t xml:space="preserve"> </w:t>
+      </w:r>
+      <w:r>
+        <w:rPr>
+          <w:rStyle w:val="VerbatimChar"/>
+        </w:rPr>
+        <w:t xml:space="preserve">web-12</w:t>
+      </w:r>
+      <w:r>
+        <w:t xml:space="preserve">, also in the link’s address,</w:t>
+      </w:r>
+      <w:r>
+        <w:t xml:space="preserve"> </w:t>
+      </w:r>
+      <w:r>
+        <w:rPr>
+          <w:rStyle w:val="VerbatimChar"/>
+        </w:rPr>
+        <w:t xml:space="preserve">/person/…/</w:t>
+      </w:r>
+      <w:r>
+        <w:t xml:space="preserve">, which earlier published runs still carried). The second hop of</w:t>
+      </w:r>
+      <w:r>
+        <w:t xml:space="preserve"> </w:t>
+      </w:r>
+      <w:r>
+        <w:rPr>
+          <w:rStyle w:val="VerbatimChar"/>
+        </w:rPr>
+        <w:t xml:space="preserve">web-13</w:t>
+      </w:r>
+      <w:r>
+        <w:t xml:space="preserve"> </w:t>
+      </w:r>
+      <w:r>
+        <w:t xml:space="preserve">added a third: a person quoted in a news item on a Czechia page reached only at depth 2 (in</w:t>
+      </w:r>
+      <w:r>
+        <w:t xml:space="preserve"> </w:t>
+      </w:r>
+      <w:r>
+        <w:rPr>
+          <w:rStyle w:val="VerbatimChar"/>
+        </w:rPr>
+        <w:t xml:space="preserve">eosc-cz.json</w:t>
+      </w:r>
+      <w:r>
+        <w:t xml:space="preserve">, in the quotation and in the address of the interview it links to).</w:t>
+      </w:r>
+      <w:r>
+        <w:t xml:space="preserve"> </w:t>
+      </w:r>
+      <w:r>
+        <w:rPr>
+          <w:rStyle w:val="VerbatimChar"/>
+        </w:rPr>
+        <w:t xml:space="preserve">web-14</w:t>
+      </w:r>
+      <w:r>
+        <w:t xml:space="preserve">, which also reads services and policies pages, added many more, and</w:t>
+      </w:r>
+      <w:r>
+        <w:t xml:space="preserve"> </w:t>
+      </w:r>
+      <w:r>
+        <w:rPr>
+          <w:rStyle w:val="VerbatimChar"/>
+        </w:rPr>
+        <w:t xml:space="preserve">web-15</w:t>
+      </w:r>
+      <w:r>
+        <w:t xml:space="preserve">,</w:t>
+      </w:r>
+      <w:r>
+        <w:t xml:space="preserve"> </w:t>
+      </w:r>
+      <w:r>
+        <w:rPr>
+          <w:rStyle w:val="VerbatimChar"/>
+        </w:rPr>
+        <w:t xml:space="preserve">web-16</w:t>
+      </w:r>
+      <w:r>
+        <w:t xml:space="preserve">,</w:t>
+      </w:r>
+      <w:r>
+        <w:t xml:space="preserve"> </w:t>
+      </w:r>
+      <w:r>
+        <w:rPr>
+          <w:rStyle w:val="VerbatimChar"/>
+        </w:rPr>
+        <w:t xml:space="preserve">web-18</w:t>
+      </w:r>
+      <w:r>
+        <w:t xml:space="preserve">,</w:t>
+      </w:r>
+      <w:r>
+        <w:t xml:space="preserve"> </w:t>
+      </w:r>
+      <w:r>
+        <w:rPr>
+          <w:rStyle w:val="VerbatimChar"/>
+        </w:rPr>
+        <w:t xml:space="preserve">web-21</w:t>
+      </w:r>
+      <w:r>
+        <w:t xml:space="preserve">,</w:t>
+      </w:r>
+      <w:r>
+        <w:t xml:space="preserve"> </w:t>
+      </w:r>
+      <w:r>
+        <w:rPr>
+          <w:rStyle w:val="VerbatimChar"/>
+        </w:rPr>
+        <w:t xml:space="preserve">web-22</w:t>
+      </w:r>
+      <w:r>
+        <w:t xml:space="preserve">,</w:t>
+      </w:r>
+      <w:r>
+        <w:t xml:space="preserve"> </w:t>
+      </w:r>
+      <w:r>
+        <w:rPr>
+          <w:rStyle w:val="VerbatimChar"/>
+        </w:rPr>
+        <w:t xml:space="preserve">web-23</w:t>
+      </w:r>
+      <w:r>
+        <w:t xml:space="preserve">,</w:t>
+      </w:r>
+      <w:r>
+        <w:t xml:space="preserve"> </w:t>
+      </w:r>
+      <w:r>
+        <w:rPr>
+          <w:rStyle w:val="VerbatimChar"/>
+        </w:rPr>
+        <w:t xml:space="preserve">web-24</w:t>
+      </w:r>
+      <w:r>
+        <w:t xml:space="preserve">,</w:t>
+      </w:r>
+      <w:r>
+        <w:t xml:space="preserve"> </w:t>
+      </w:r>
+      <w:r>
+        <w:rPr>
+          <w:rStyle w:val="VerbatimChar"/>
+        </w:rPr>
+        <w:t xml:space="preserve">web-25</w:t>
+      </w:r>
+      <w:r>
+        <w:t xml:space="preserve"> </w:t>
+      </w:r>
+      <w:r>
+        <w:t xml:space="preserve">and</w:t>
+      </w:r>
+      <w:r>
+        <w:t xml:space="preserve"> </w:t>
+      </w:r>
+      <w:r>
+        <w:rPr>
+          <w:rStyle w:val="VerbatimChar"/>
+        </w:rPr>
         <w:t xml:space="preserve">web-26</w:t>
       </w:r>
       <w:r>
         <w:t xml:space="preserve"> </w:t>
       </w:r>
       <w:r>
-        <w:t xml:space="preserve">(6 October 2026) was collected</w:t>
-      </w:r>
-      <w:r>
-        <w:t xml:space="preserve"> </w:t>
-      </w:r>
-      <w:r>
-        <w:t xml:space="preserve">with masking in place, and a search of all its evidence and reports found no</w:t>
-      </w:r>
-      <w:r>
-        <w:t xml:space="preserve"> </w:t>
-      </w:r>
-      <w:r>
-        <w:t xml:space="preserve">personal address or phone number. Two personal names that the masking does not cover were removed by hand from the evidence, each replaced by a placeholder of the same length so every character count and verdict stays as collected: a quotation attribution on CERN’s page (in</w:t>
-      </w:r>
-      <w:r>
-        <w:t xml:space="preserve"> </w:t>
-      </w:r>
-      <w:r>
-        <w:rPr>
-          <w:rStyle w:val="VerbatimChar"/>
-        </w:rPr>
-        <w:t xml:space="preserve">cern.json</w:t>
-      </w:r>
-      <w:r>
-        <w:t xml:space="preserve"> </w:t>
-      </w:r>
-      <w:r>
-        <w:t xml:space="preserve">and in its screenshot) and the node coordinator named on EGI’s page (in</w:t>
-      </w:r>
-      <w:r>
-        <w:t xml:space="preserve"> </w:t>
-      </w:r>
-      <w:r>
-        <w:rPr>
-          <w:rStyle w:val="VerbatimChar"/>
-        </w:rPr>
-        <w:t xml:space="preserve">egi.json</w:t>
-      </w:r>
-      <w:r>
-        <w:t xml:space="preserve">, in the link text and, since</w:t>
-      </w:r>
-      <w:r>
-        <w:t xml:space="preserve"> </w:t>
-      </w:r>
-      <w:r>
-        <w:rPr>
-          <w:rStyle w:val="VerbatimChar"/>
-        </w:rPr>
-        <w:t xml:space="preserve">web-12</w:t>
-      </w:r>
-      <w:r>
-        <w:t xml:space="preserve">, also in the link’s address,</w:t>
-      </w:r>
-      <w:r>
-        <w:t xml:space="preserve"> </w:t>
-      </w:r>
-      <w:r>
-        <w:rPr>
-          <w:rStyle w:val="VerbatimChar"/>
-        </w:rPr>
-        <w:t xml:space="preserve">/person/…/</w:t>
-      </w:r>
-      <w:r>
-        <w:t xml:space="preserve">, which earlier published runs still carried). The second hop of</w:t>
-      </w:r>
-      <w:r>
-        <w:t xml:space="preserve"> </w:t>
-      </w:r>
-      <w:r>
-        <w:rPr>
-          <w:rStyle w:val="VerbatimChar"/>
-        </w:rPr>
-        <w:t xml:space="preserve">web-13</w:t>
-      </w:r>
-      <w:r>
-        <w:t xml:space="preserve"> </w:t>
-      </w:r>
-      <w:r>
-        <w:t xml:space="preserve">added a third: a person quoted in a news item on a Czechia page reached only at depth 2 (in</w:t>
-      </w:r>
-      <w:r>
-        <w:t xml:space="preserve"> </w:t>
-      </w:r>
-      <w:r>
-        <w:rPr>
-          <w:rStyle w:val="VerbatimChar"/>
-        </w:rPr>
-        <w:t xml:space="preserve">eosc-cz.json</w:t>
-      </w:r>
-      <w:r>
-        <w:t xml:space="preserve">, in the quotation and in the address of the interview it links to).</w:t>
-      </w:r>
-      <w:r>
-        <w:t xml:space="preserve"> </w:t>
-      </w:r>
-      <w:r>
-        <w:rPr>
-          <w:rStyle w:val="VerbatimChar"/>
-        </w:rPr>
-        <w:t xml:space="preserve">web-14</w:t>
-      </w:r>
-      <w:r>
-        <w:t xml:space="preserve">, which also reads services and policies pages, added many more, and</w:t>
-      </w:r>
-      <w:r>
-        <w:t xml:space="preserve"> </w:t>
-      </w:r>
-      <w:r>
-        <w:rPr>
-          <w:rStyle w:val="VerbatimChar"/>
-        </w:rPr>
-        <w:t xml:space="preserve">web-15</w:t>
-      </w:r>
-      <w:r>
-        <w:t xml:space="preserve">,</w:t>
-      </w:r>
-      <w:r>
-        <w:t xml:space="preserve"> </w:t>
-      </w:r>
-      <w:r>
-        <w:rPr>
-          <w:rStyle w:val="VerbatimChar"/>
-        </w:rPr>
-        <w:t xml:space="preserve">web-16</w:t>
-      </w:r>
-      <w:r>
-        <w:t xml:space="preserve">,</w:t>
-      </w:r>
-      <w:r>
-        <w:t xml:space="preserve"> </w:t>
-      </w:r>
-      <w:r>
-        <w:rPr>
-          <w:rStyle w:val="VerbatimChar"/>
-        </w:rPr>
-        <w:t xml:space="preserve">web-18</w:t>
-      </w:r>
-      <w:r>
-        <w:t xml:space="preserve">,</w:t>
-      </w:r>
-      <w:r>
-        <w:t xml:space="preserve"> </w:t>
+        <w:t xml:space="preserve">carry the same ones (BBMRI-ERIC’s apart, in</w:t>
+      </w:r>
+      <w:r>
+        <w:t xml:space="preserve"> </w:t>
+      </w:r>
+      <w:r>
+        <w:rPr>
+          <w:rStyle w:val="VerbatimChar"/>
+        </w:rPr>
+        <w:t xml:space="preserve">web-24</w:t>
+      </w:r>
+      <w:r>
+        <w:t xml:space="preserve">, where its page was not fetched;</w:t>
+      </w:r>
+      <w:r>
+        <w:t xml:space="preserve"> </w:t>
+      </w:r>
+      <w:r>
+        <w:rPr>
+          <w:rStyle w:val="VerbatimChar"/>
+        </w:rPr>
+        <w:t xml:space="preserve">web-25</w:t>
+      </w:r>
+      <w:r>
+        <w:t xml:space="preserve"> </w:t>
+      </w:r>
+      <w:r>
+        <w:t xml:space="preserve">adds fifteen on BBMRI-ERIC’s</w:t>
+      </w:r>
+      <w:r>
+        <w:t xml:space="preserve"> </w:t>
+      </w:r>
+      <w:r>
+        <w:rPr>
+          <w:rStyle w:val="VerbatimChar"/>
+        </w:rPr>
+        <w:t xml:space="preserve">dev3.</w:t>
+      </w:r>
+      <w:r>
+        <w:t xml:space="preserve"> </w:t>
+      </w:r>
+      <w:r>
+        <w:t xml:space="preserve">pages: its Director General on the legal notice, the seven members of its scientific and ethical advisory board, the Stakeholder Forum chair and the head of public affairs, and five finance, project and HR staff listed in capitals) (</w:t>
       </w:r>
       <w:r>
         <w:rPr>
@@ -17214,7 +17412,10 @@
         <w:t xml:space="preserve">web-21</w:t>
       </w:r>
       <w:r>
-        <w:t xml:space="preserve">,</w:t>
+        <w:t xml:space="preserve"> </w:t>
+      </w:r>
+      <w:r>
+        <w:t xml:space="preserve">adds one, a photo credit in an image description on Data Terra’s new page;</w:t>
       </w:r>
       <w:r>
         <w:t xml:space="preserve"> </w:t>
@@ -17226,130 +17427,25 @@
         <w:t xml:space="preserve">web-22</w:t>
       </w:r>
       <w:r>
-        <w:t xml:space="preserve">,</w:t>
-      </w:r>
-      <w:r>
-        <w:t xml:space="preserve"> </w:t>
-      </w:r>
-      <w:r>
-        <w:rPr>
-          <w:rStyle w:val="VerbatimChar"/>
-        </w:rPr>
-        <w:t xml:space="preserve">web-23</w:t>
-      </w:r>
-      <w:r>
-        <w:t xml:space="preserve">,</w:t>
-      </w:r>
-      <w:r>
-        <w:t xml:space="preserve"> </w:t>
-      </w:r>
-      <w:r>
-        <w:rPr>
-          <w:rStyle w:val="VerbatimChar"/>
-        </w:rPr>
-        <w:t xml:space="preserve">web-24</w:t>
-      </w:r>
-      <w:r>
-        <w:t xml:space="preserve">,</w:t>
-      </w:r>
-      <w:r>
-        <w:t xml:space="preserve"> </w:t>
-      </w:r>
-      <w:r>
-        <w:rPr>
-          <w:rStyle w:val="VerbatimChar"/>
-        </w:rPr>
-        <w:t xml:space="preserve">web-25</w:t>
-      </w:r>
-      <w:r>
-        <w:t xml:space="preserve"> </w:t>
-      </w:r>
-      <w:r>
-        <w:t xml:space="preserve">and</w:t>
-      </w:r>
-      <w:r>
-        <w:t xml:space="preserve"> </w:t>
-      </w:r>
-      <w:r>
-        <w:rPr>
-          <w:rStyle w:val="VerbatimChar"/>
-        </w:rPr>
-        <w:t xml:space="preserve">web-26</w:t>
-      </w:r>
-      <w:r>
-        <w:t xml:space="preserve"> </w:t>
-      </w:r>
-      <w:r>
-        <w:t xml:space="preserve">carry the same ones (BBMRI-ERIC’s apart, in</w:t>
-      </w:r>
-      <w:r>
-        <w:t xml:space="preserve"> </w:t>
-      </w:r>
-      <w:r>
-        <w:rPr>
-          <w:rStyle w:val="VerbatimChar"/>
-        </w:rPr>
-        <w:t xml:space="preserve">web-24</w:t>
-      </w:r>
-      <w:r>
-        <w:t xml:space="preserve">, where its page was not fetched;</w:t>
-      </w:r>
-      <w:r>
-        <w:t xml:space="preserve"> </w:t>
-      </w:r>
-      <w:r>
-        <w:rPr>
-          <w:rStyle w:val="VerbatimChar"/>
-        </w:rPr>
-        <w:t xml:space="preserve">web-25</w:t>
-      </w:r>
-      <w:r>
-        <w:t xml:space="preserve"> </w:t>
-      </w:r>
-      <w:r>
-        <w:t xml:space="preserve">adds fifteen on BBMRI-ERIC’s</w:t>
-      </w:r>
-      <w:r>
-        <w:t xml:space="preserve"> </w:t>
-      </w:r>
-      <w:r>
-        <w:rPr>
-          <w:rStyle w:val="VerbatimChar"/>
-        </w:rPr>
-        <w:t xml:space="preserve">dev3.</w:t>
-      </w:r>
-      <w:r>
-        <w:t xml:space="preserve"> </w:t>
-      </w:r>
-      <w:r>
-        <w:t xml:space="preserve">pages: its Director General on the legal notice, the seven members of its scientific and ethical advisory board, the Stakeholder Forum chair and the head of public affairs, and five finance, project and HR staff listed in capitals) (</w:t>
-      </w:r>
-      <w:r>
-        <w:rPr>
-          <w:rStyle w:val="VerbatimChar"/>
-        </w:rPr>
-        <w:t xml:space="preserve">web-21</w:t>
-      </w:r>
-      <w:r>
-        <w:t xml:space="preserve"> </w:t>
-      </w:r>
-      <w:r>
-        <w:t xml:space="preserve">adds one, a photo credit in an image description on Data Terra’s new page;</w:t>
-      </w:r>
-      <w:r>
-        <w:t xml:space="preserve"> </w:t>
-      </w:r>
-      <w:r>
-        <w:rPr>
-          <w:rStyle w:val="VerbatimChar"/>
-        </w:rPr>
-        <w:t xml:space="preserve">web-22</w:t>
-      </w:r>
-      <w:r>
-        <w:t xml:space="preserve"> </w:t>
-      </w:r>
-      <w:r>
-        <w:t xml:space="preserve">adds two staff names in a news item on EUDAT’s new page and one more GÉANT observer): about thirty staff, board and news-author names on BBMRI-ERIC’s and EGI’s pages, and the author lists of publication citations on Czechia’s, D4Science’s (EOSC DTO, Italy) and PaNOSC’s pages. Two of those citation lists were already in the evidence published as</w:t>
+        <w:t xml:space="preserve"> </w:t>
+      </w:r>
+      <w:r>
+        <w:t xml:space="preserve">adds two staff names in a news item on EUDAT’s new page and one more GÉANT observer;</w:t>
+      </w:r>
+      <w:r>
+        <w:t xml:space="preserve"> </w:t>
+      </w:r>
+      <w:r>
+        <w:rPr>
+          <w:rStyle w:val="VerbatimChar"/>
+        </w:rPr>
+        <w:t xml:space="preserve">web-27</w:t>
+      </w:r>
+      <w:r>
+        <w:t xml:space="preserve"> </w:t>
+      </w:r>
+      <w:r>
+        <w:t xml:space="preserve">adds the people named in the captions of historical public-domain photos on Poland’s page): about thirty staff, board and news-author names on BBMRI-ERIC’s and EGI’s pages, and the author lists of publication citations on Czechia’s, D4Science’s (EOSC DTO, Italy) and PaNOSC’s pages. Two of those citation lists were already in the evidence published as</w:t>
       </w:r>
       <w:r>
         <w:t xml:space="preserve"> </w:t>
@@ -23199,7 +23295,7 @@
         <w:t xml:space="preserve">(</w:t>
       </w:r>
       <w:r>
-        <w:t xml:space="preserve">“130 cells: 67 PASS · 0 FAIL · 63 review”</w:t>
+        <w:t xml:space="preserve">“130 cells: 69 PASS · 0 FAIL · 61 review”</w:t>
       </w:r>
       <w:r>
         <w:t xml:space="preserve">);</w:t>

</xml_diff>

<commit_message>
Publish run web-31 (depth 2, 15 nodes, 78 PASS / 4 FAIL / 68 review; PaNOSC at its new URL); README, guide and test-suite guide updated, Word and PDF rebuilt
</commit_message>
<xml_diff>
--- a/docs/eosc-basic-compliance-guide.docx
+++ b/docs/eosc-basic-compliance-guide.docx
@@ -23,7 +23,7 @@
         <w:pStyle w:val="Author"/>
       </w:pPr>
       <w:r>
-        <w:t xml:space="preserve">Verified against a clean clone on 26 September 2026 — rebuilt 9 October 2026 for the re-issued checklist v3.2</w:t>
+        <w:t xml:space="preserve">Verified against a clean clone on 26 September 2026 — rebuilt 19 October 2026 for run web-31 (re-issued checklist v3.2)</w:t>
       </w:r>
     </w:p>
     <w:p>
@@ -195,7 +195,7 @@
         <w:t xml:space="preserve"> </w:t>
       </w:r>
       <w:r>
-        <w:t xml:space="preserve">and each figure says which. Where a command’s behaviour is surprising, that is</w:t>
+        <w:t xml:space="preserve">and each figure says which. Where a command's behaviour is surprising, that is</w:t>
       </w:r>
       <w:r>
         <w:t xml:space="preserve"> </w:t>
@@ -209,13 +209,46 @@
         <w:pStyle w:val="BodyText"/>
       </w:pPr>
       <w:r>
-        <w:t xml:space="preserve">This edition was revised on 9 October 2026, when EBRAINS-RI and Life Sciences</w:t>
-      </w:r>
-      <w:r>
-        <w:t xml:space="preserve"> </w:t>
-      </w:r>
-      <w:r>
-        <w:t xml:space="preserve">Connect were added and run</w:t>
+        <w:t xml:space="preserve">This edition was revised on 19 October 2026, when PaNOSC's landing page</w:t>
+      </w:r>
+      <w:r>
+        <w:t xml:space="preserve"> </w:t>
+      </w:r>
+      <w:r>
+        <w:t xml:space="preserve">changed and run</w:t>
+      </w:r>
+      <w:r>
+        <w:t xml:space="preserve"> </w:t>
+      </w:r>
+      <w:r>
+        <w:rPr>
+          <w:rStyle w:val="VerbatimChar"/>
+        </w:rPr>
+        <w:t xml:space="preserve">web-31</w:t>
+      </w:r>
+      <w:r>
+        <w:t xml:space="preserve"> </w:t>
+      </w:r>
+      <w:r>
+        <w:t xml:space="preserve">was published: the test count (453), the tallies and</w:t>
+      </w:r>
+      <w:r>
+        <w:t xml:space="preserve"> </w:t>
+      </w:r>
+      <w:r>
+        <w:t xml:space="preserve">the rebuild of the published report were re-measured offline that day. The</w:t>
+      </w:r>
+      <w:r>
+        <w:t xml:space="preserve"> </w:t>
+      </w:r>
+      <w:r>
+        <w:t xml:space="preserve">previous edition, of 9 October 2026, added EBRAINS-RI and Life Sciences Connect</w:t>
+      </w:r>
+      <w:r>
+        <w:t xml:space="preserve"> </w:t>
+      </w:r>
+      <w:r>
+        <w:t xml:space="preserve">with run</w:t>
       </w:r>
       <w:r>
         <w:t xml:space="preserve"> </w:t>
@@ -227,28 +260,13 @@
         <w:t xml:space="preserve">web-28</w:t>
       </w:r>
       <w:r>
-        <w:t xml:space="preserve"> </w:t>
-      </w:r>
-      <w:r>
-        <w:t xml:space="preserve">was published: the test count (453), the</w:t>
-      </w:r>
-      <w:r>
-        <w:t xml:space="preserve"> </w:t>
-      </w:r>
-      <w:r>
-        <w:t xml:space="preserve">tallies and the rebuild of the published report were re-measured offline that</w:t>
-      </w:r>
-      <w:r>
-        <w:t xml:space="preserve"> </w:t>
-      </w:r>
-      <w:r>
-        <w:t xml:space="preserve">day. The nodes were contacted only by the GitHub workflow; a hand check of Life</w:t>
-      </w:r>
-      <w:r>
-        <w:t xml:space="preserve"> </w:t>
-      </w:r>
-      <w:r>
-        <w:t xml:space="preserve">Sciences Connect’s pages, made from a browser, is reported where it is used.</w:t>
+        <w:t xml:space="preserve">. The nodes were contacted only by the GitHub workflow; a hand check of Life</w:t>
+      </w:r>
+      <w:r>
+        <w:t xml:space="preserve"> </w:t>
+      </w:r>
+      <w:r>
+        <w:t xml:space="preserve">Sciences Connect's pages, made from a browser, is reported where it is used.</w:t>
       </w:r>
     </w:p>
     <w:p>
@@ -337,7 +355,7 @@
         <w:t xml:space="preserve"> </w:t>
       </w:r>
       <w:r>
-        <w:t xml:space="preserve">resource’s EOSC Catalogue metadata, where v3.1 asked for either. The document</w:t>
+        <w:t xml:space="preserve">resource's EOSC Catalogue metadata, where v3.1 asked for either. The document</w:t>
       </w:r>
       <w:r>
         <w:t xml:space="preserve"> </w:t>
@@ -349,16 +367,7 @@
         <w:t xml:space="preserve"> </w:t>
       </w:r>
       <w:r>
-        <w:t xml:space="preserve">required them</w:t>
-      </w:r>
-      <w:r>
-        <w:t xml:space="preserve"> </w:t>
-      </w:r>
-      <w:r>
-        <w:t xml:space="preserve">“directly on the NLP”</w:t>
-      </w:r>
-      <w:r>
-        <w:t xml:space="preserve">, is discarded and its hash replaced. So a</w:t>
+        <w:t xml:space="preserve">required them "directly on the NLP", is discarded and its hash replaced. So a</w:t>
       </w:r>
       <w:r>
         <w:t xml:space="preserve"> </w:t>
@@ -526,7 +535,7 @@
           <w:b/>
           <w:bCs/>
         </w:rPr>
-        <w:t xml:space="preserve">The published run changed again on 9 October 2026.</w:t>
+        <w:t xml:space="preserve">The published run changed again on 19 October 2026.</w:t>
       </w:r>
       <w:r>
         <w:t xml:space="preserve"> </w:t>
@@ -550,25 +559,126 @@
         <w:rPr>
           <w:rStyle w:val="VerbatimChar"/>
         </w:rPr>
+        <w:t xml:space="preserve">web-31</w:t>
+      </w:r>
+      <w:r>
+        <w:t xml:space="preserve">, collected by the GitHub workflow at</w:t>
+      </w:r>
+      <w:r>
+        <w:t xml:space="preserve"> </w:t>
+      </w:r>
+      <w:r>
+        <w:rPr>
+          <w:rStyle w:val="VerbatimChar"/>
+        </w:rPr>
+        <w:t xml:space="preserve">--depth 2</w:t>
+      </w:r>
+      <w:r>
+        <w:t xml:space="preserve"> </w:t>
+      </w:r>
+      <w:r>
+        <w:t xml:space="preserve">on 19 October 2026 between 20:44 and 20:51 UTC from all fifteen</w:t>
+      </w:r>
+      <w:r>
+        <w:t xml:space="preserve"> </w:t>
+      </w:r>
+      <w:r>
+        <w:t xml:space="preserve">nodes (</w:t>
+      </w:r>
+      <w:hyperlink r:id="rId26">
+        <w:r>
+          <w:rPr>
+            <w:rStyle w:val="Hyperlink"/>
+          </w:rPr>
+          <w:t xml:space="preserve">run 39321743220</w:t>
+        </w:r>
+      </w:hyperlink>
+      <w:r>
+        <w:t xml:space="preserve">, commit</w:t>
+      </w:r>
+      <w:r>
+        <w:t xml:space="preserve"> </w:t>
+      </w:r>
+      <w:r>
+        <w:rPr>
+          <w:rStyle w:val="VerbatimChar"/>
+        </w:rPr>
+        <w:t xml:space="preserve">e9c5f9c</w:t>
+      </w:r>
+      <w:r>
+        <w:t xml:space="preserve">), under the re-issued v3.2: 78 PASS, 4 FAIL</w:t>
+      </w:r>
+      <w:r>
+        <w:t xml:space="preserve"> </w:t>
+      </w:r>
+      <w:r>
+        <w:t xml:space="preserve">and 68 MANUAL_REVIEW at depth 2 (76 / 4 / 70 at depth 1), in 129 page</w:t>
+      </w:r>
+      <w:r>
+        <w:t xml:space="preserve"> </w:t>
+      </w:r>
+      <w:r>
+        <w:t xml:space="preserve">requests. PaNOSC's landing page changed that day to</w:t>
+      </w:r>
+      <w:r>
+        <w:t xml:space="preserve"> </w:t>
+      </w:r>
+      <w:r>
+        <w:rPr>
+          <w:rStyle w:val="VerbatimChar"/>
+        </w:rPr>
+        <w:t xml:space="preserve">https://panosc.eu/panosc-eosc-node</w:t>
+      </w:r>
+      <w:r>
+        <w:t xml:space="preserve">; the old address redirected to the same</w:t>
+      </w:r>
+      <w:r>
+        <w:t xml:space="preserve"> </w:t>
+      </w:r>
+      <w:r>
+        <w:t xml:space="preserve">page, so its verdicts did not change. At depth 2 no cell changed against</w:t>
+      </w:r>
+      <w:r>
+        <w:t xml:space="preserve"> </w:t>
+      </w:r>
+      <w:r>
+        <w:rPr>
+          <w:rStyle w:val="VerbatimChar"/>
+        </w:rPr>
         <w:t xml:space="preserve">web-28</w:t>
       </w:r>
       <w:r>
-        <w:t xml:space="preserve">, collected by the GitHub workflow at</w:t>
-      </w:r>
-      <w:r>
-        <w:t xml:space="preserve"> </w:t>
-      </w:r>
-      <w:r>
-        <w:rPr>
-          <w:rStyle w:val="VerbatimChar"/>
-        </w:rPr>
-        <w:t xml:space="preserve">--depth 2</w:t>
-      </w:r>
-      <w:r>
-        <w:t xml:space="preserve"> </w:t>
-      </w:r>
-      <w:r>
-        <w:t xml:space="preserve">on 9 October 2026 between 14:24 and 14:32 UTC from all</w:t>
+        <w:t xml:space="preserve">; at depth 1 Poland point 6 moved from PASS to review (its landing page</w:t>
+      </w:r>
+      <w:r>
+        <w:t xml:space="preserve"> </w:t>
+      </w:r>
+      <w:r>
+        <w:t xml:space="preserve">now shows</w:t>
+      </w:r>
+      <w:r>
+        <w:t xml:space="preserve"> </w:t>
+      </w:r>
+      <w:r>
+        <w:rPr>
+          <w:rStyle w:val="VerbatimChar"/>
+        </w:rPr>
+        <w:t xml:space="preserve">contact@eosc.pl</w:t>
+      </w:r>
+      <w:r>
+        <w:t xml:space="preserve">, not</w:t>
+      </w:r>
+      <w:r>
+        <w:t xml:space="preserve"> </w:t>
+      </w:r>
+      <w:r>
+        <w:rPr>
+          <w:rStyle w:val="VerbatimChar"/>
+        </w:rPr>
+        <w:t xml:space="preserve">support@eosc.pl</w:t>
+      </w:r>
+      <w:r>
+        <w:t xml:space="preserve">). It has</w:t>
       </w:r>
       <w:r>
         <w:t xml:space="preserve"> </w:t>
@@ -578,6 +688,82 @@
           <w:b/>
           <w:bCs/>
         </w:rPr>
+        <w:t xml:space="preserve">not</w:t>
+      </w:r>
+      <w:r>
+        <w:t xml:space="preserve"> </w:t>
+      </w:r>
+      <w:r>
+        <w:t xml:space="preserve">been</w:t>
+      </w:r>
+      <w:r>
+        <w:t xml:space="preserve"> </w:t>
+      </w:r>
+      <w:r>
+        <w:t xml:space="preserve">reviewed by hand.</w:t>
+      </w:r>
+    </w:p>
+    <w:p>
+      <w:pPr>
+        <w:pStyle w:val="BlockText"/>
+      </w:pPr>
+      <w:r>
+        <w:rPr>
+          <w:b/>
+          <w:bCs/>
+        </w:rPr>
+        <w:t xml:space="preserve">Previously, on 9 October 2026,</w:t>
+      </w:r>
+      <w:r>
+        <w:t xml:space="preserve"> </w:t>
+      </w:r>
+      <w:r>
+        <w:rPr>
+          <w:rStyle w:val="VerbatimChar"/>
+        </w:rPr>
+        <w:t xml:space="preserve">results/</w:t>
+      </w:r>
+      <w:r>
+        <w:t xml:space="preserve"> </w:t>
+      </w:r>
+      <w:r>
+        <w:t xml:space="preserve">held run</w:t>
+      </w:r>
+      <w:r>
+        <w:t xml:space="preserve"> </w:t>
+      </w:r>
+      <w:r>
+        <w:rPr>
+          <w:rStyle w:val="VerbatimChar"/>
+        </w:rPr>
+        <w:t xml:space="preserve">web-28</w:t>
+      </w:r>
+      <w:r>
+        <w:t xml:space="preserve">, collected by the GitHub workflow at</w:t>
+      </w:r>
+      <w:r>
+        <w:t xml:space="preserve"> </w:t>
+      </w:r>
+      <w:r>
+        <w:rPr>
+          <w:rStyle w:val="VerbatimChar"/>
+        </w:rPr>
+        <w:t xml:space="preserve">--depth 2</w:t>
+      </w:r>
+      <w:r>
+        <w:t xml:space="preserve"> </w:t>
+      </w:r>
+      <w:r>
+        <w:t xml:space="preserve">on 9 October 2026 between 14:24 and 14:32 UTC from all</w:t>
+      </w:r>
+      <w:r>
+        <w:t xml:space="preserve"> </w:t>
+      </w:r>
+      <w:r>
+        <w:rPr>
+          <w:b/>
+          <w:bCs/>
+        </w:rPr>
         <w:t xml:space="preserve">fifteen</w:t>
       </w:r>
       <w:r>
@@ -586,7 +772,7 @@
       <w:r>
         <w:t xml:space="preserve">nodes (</w:t>
       </w:r>
-      <w:hyperlink r:id="rId26">
+      <w:hyperlink r:id="rId27">
         <w:r>
           <w:rPr>
             <w:rStyle w:val="Hyperlink"/>
@@ -673,7 +859,7 @@
         <w:t xml:space="preserve"> </w:t>
       </w:r>
       <w:r>
-        <w:t xml:space="preserve">Sciences Connect’s menu items are</w:t>
+        <w:t xml:space="preserve">Sciences Connect's menu items are</w:t>
       </w:r>
       <w:r>
         <w:t xml:space="preserve"> </w:t>
@@ -727,7 +913,7 @@
         <w:t xml:space="preserve"> </w:t>
       </w:r>
       <w:r>
-        <w:t xml:space="preserve">need a reviewer’s confirmation. On the other thirteen nodes, one cell changed:</w:t>
+        <w:t xml:space="preserve">need a reviewer's confirmation. On the other thirteen nodes, one cell changed:</w:t>
       </w:r>
       <w:r>
         <w:t xml:space="preserve"> </w:t>
@@ -817,7 +1003,7 @@
       <w:r>
         <w:t xml:space="preserve">nodes (</w:t>
       </w:r>
-      <w:hyperlink r:id="rId27">
+      <w:hyperlink r:id="rId28">
         <w:r>
           <w:rPr>
             <w:rStyle w:val="Hyperlink"/>
@@ -850,7 +1036,7 @@
         <w:t xml:space="preserve"> </w:t>
       </w:r>
       <w:r>
-        <w:t xml:space="preserve">both Poland’s: its page rendered in full again, so point 4 (its own</w:t>
+        <w:t xml:space="preserve">both Poland's: its page rendered in full again, so point 4 (its own</w:t>
       </w:r>
       <w:r>
         <w:t xml:space="preserve"> </w:t>
@@ -865,19 +1051,7 @@
         <w:t xml:space="preserve"> </w:t>
       </w:r>
       <w:r>
-        <w:t xml:space="preserve">entry) passes again, and 5c passes through a new</w:t>
-      </w:r>
-      <w:r>
-        <w:t xml:space="preserve"> </w:t>
-      </w:r>
-      <w:r>
-        <w:t xml:space="preserve">“User Access Policy”</w:t>
-      </w:r>
-      <w:r>
-        <w:t xml:space="preserve"> </w:t>
-      </w:r>
-      <w:r>
-        <w:t xml:space="preserve">link to</w:t>
+        <w:t xml:space="preserve">entry) passes again, and 5c passes through a new "User Access Policy" link to</w:t>
       </w:r>
       <w:r>
         <w:t xml:space="preserve"> </w:t>
@@ -906,7 +1080,7 @@
       <w:r>
         <w:t xml:space="preserve">(</w:t>
       </w:r>
-      <w:hyperlink r:id="rId28">
+      <w:hyperlink r:id="rId29">
         <w:r>
           <w:rPr>
             <w:rStyle w:val="Hyperlink"/>
@@ -921,7 +1095,7 @@
         <w:t xml:space="preserve"> </w:t>
       </w:r>
       <w:r>
-        <w:t xml:space="preserve">67 / 0 / 63), in which Poland’s page rendered only its header and footer, and</w:t>
+        <w:t xml:space="preserve">67 / 0 / 63), in which Poland's page rendered only its header and footer, and</w:t>
       </w:r>
       <w:r>
         <w:t xml:space="preserve"> </w:t>
@@ -957,19 +1131,19 @@
         <w:t xml:space="preserve"> </w:t>
       </w:r>
       <w:r>
-        <w:t xml:space="preserve">services pages linked from the landing pages. CERN’s 5b and 5c pass through</w:t>
-      </w:r>
-      <w:r>
-        <w:t xml:space="preserve"> </w:t>
-      </w:r>
-      <w:r>
-        <w:t xml:space="preserve">its Policies page; Data Terra’s fail after its services pages were read (a</w:t>
-      </w:r>
-      <w:r>
-        <w:t xml:space="preserve"> </w:t>
-      </w:r>
-      <w:r>
-        <w:t xml:space="preserve">French-named policy would be missed, so check it by hand); PaNOSC’s are review.</w:t>
+        <w:t xml:space="preserve">services pages linked from the landing pages. CERN's 5b and 5c pass through</w:t>
+      </w:r>
+      <w:r>
+        <w:t xml:space="preserve"> </w:t>
+      </w:r>
+      <w:r>
+        <w:t xml:space="preserve">its Policies page; Data Terra's fail after its services pages were read (a</w:t>
+      </w:r>
+      <w:r>
+        <w:t xml:space="preserve"> </w:t>
+      </w:r>
+      <w:r>
+        <w:t xml:space="preserve">French-named policy would be missed, so check it by hand); PaNOSC's are review.</w:t>
       </w:r>
       <w:r>
         <w:t xml:space="preserve"> </w:t>
@@ -1107,7 +1281,7 @@
       <w:r>
         <w:t xml:space="preserve">(</w:t>
       </w:r>
-      <w:hyperlink r:id="rId29">
+      <w:hyperlink r:id="rId30">
         <w:r>
           <w:rPr>
             <w:rStyle w:val="Hyperlink"/>
@@ -1145,7 +1319,7 @@
       <w:r>
         <w:t xml:space="preserve">(</w:t>
       </w:r>
-      <w:hyperlink r:id="rId30">
+      <w:hyperlink r:id="rId31">
         <w:r>
           <w:rPr>
             <w:rStyle w:val="Hyperlink"/>
@@ -1189,7 +1363,7 @@
       <w:r>
         <w:t xml:space="preserve">(</w:t>
       </w:r>
-      <w:hyperlink r:id="rId31">
+      <w:hyperlink r:id="rId32">
         <w:r>
           <w:rPr>
             <w:rStyle w:val="Hyperlink"/>
@@ -1225,7 +1399,7 @@
         <w:t xml:space="preserve"> </w:t>
       </w:r>
       <w:r>
-        <w:t xml:space="preserve">was the first run with CERN’s new landing page,</w:t>
+        <w:t xml:space="preserve">was the first run with CERN's new landing page,</w:t>
       </w:r>
       <w:r>
         <w:t xml:space="preserve"> </w:t>
@@ -1307,19 +1481,7 @@
         <w:t xml:space="preserve"> </w:t>
       </w:r>
       <w:r>
-        <w:t xml:space="preserve">history. Passages below that describe</w:t>
-      </w:r>
-      <w:r>
-        <w:t xml:space="preserve"> </w:t>
-      </w:r>
-      <w:r>
-        <w:t xml:space="preserve">“the published run of 24 September”</w:t>
-      </w:r>
-      <w:r>
-        <w:t xml:space="preserve"> </w:t>
-      </w:r>
-      <w:r>
-        <w:t xml:space="preserve">are</w:t>
+        <w:t xml:space="preserve">history. Passages below that describe "the published run of 24 September" are</w:t>
       </w:r>
       <w:r>
         <w:t xml:space="preserve"> </w:t>
@@ -1449,7 +1611,7 @@
         </w:pict>
       </w:r>
     </w:p>
-    <w:bookmarkStart w:id="33" w:name="requirements"/>
+    <w:bookmarkStart w:id="34" w:name="Xa849b483e716a0fdd106fab4604fc7be81f0402"/>
     <w:p>
       <w:pPr>
         <w:pStyle w:val="Heading2"/>
@@ -1463,33 +1625,30 @@
         <w:tblStyle w:val="Table"/>
         <w:tblW w:type="pct" w:w="5000"/>
         <w:tblLayout w:type="fixed"/>
-        <w:tblLook w:firstRow="0" w:lastRow="0" w:firstColumn="0" w:lastColumn="0" w:noHBand="0" w:noVBand="0" w:val="0000"/>
+        <w:tblLook w:firstRow="1" w:lastRow="0" w:firstColumn="0" w:lastColumn="0" w:noHBand="0" w:noVBand="0" w:val="0020"/>
       </w:tblPr>
       <w:tblGrid>
         <w:gridCol w:w="3960"/>
         <w:gridCol w:w="3960"/>
       </w:tblGrid>
       <w:tr>
-        <w:tc>
-          <w:tcPr/>
-          <w:p>
-            <w:pPr>
-              <w:pStyle w:val="Compact"/>
-            </w:pPr>
-            <w:r>
-              <w:t xml:space="preserve">Python</w:t>
-            </w:r>
-          </w:p>
-        </w:tc>
-        <w:tc>
-          <w:tcPr/>
-          <w:p>
-            <w:pPr>
-              <w:pStyle w:val="Compact"/>
-            </w:pPr>
-            <w:r>
-              <w:t xml:space="preserve">3.12 or newer (the project is developed on 3.14)</w:t>
-            </w:r>
+        <w:trPr>
+          <w:tblHeader w:val="on"/>
+        </w:trPr>
+        <w:tc>
+          <w:tcPr/>
+          <w:p>
+            <w:pPr>
+              <w:pStyle w:val="Compact"/>
+            </w:pPr>
+          </w:p>
+        </w:tc>
+        <w:tc>
+          <w:tcPr/>
+          <w:p>
+            <w:pPr>
+              <w:pStyle w:val="Compact"/>
+            </w:pPr>
           </w:p>
         </w:tc>
       </w:tr>
@@ -1501,6 +1660,30 @@
               <w:pStyle w:val="Compact"/>
             </w:pPr>
             <w:r>
+              <w:t xml:space="preserve">Python</w:t>
+            </w:r>
+          </w:p>
+        </w:tc>
+        <w:tc>
+          <w:tcPr/>
+          <w:p>
+            <w:pPr>
+              <w:pStyle w:val="Compact"/>
+            </w:pPr>
+            <w:r>
+              <w:t xml:space="preserve">3.12 or newer (the project is developed on 3.14)</w:t>
+            </w:r>
+          </w:p>
+        </w:tc>
+      </w:tr>
+      <w:tr>
+        <w:tc>
+          <w:tcPr/>
+          <w:p>
+            <w:pPr>
+              <w:pStyle w:val="Compact"/>
+            </w:pPr>
+            <w:r>
               <w:t xml:space="preserve">Package manager</w:t>
             </w:r>
           </w:p>
@@ -1511,7 +1694,7 @@
             <w:pPr>
               <w:pStyle w:val="Compact"/>
             </w:pPr>
-            <w:hyperlink r:id="rId32">
+            <w:hyperlink r:id="rId33">
               <w:r>
                 <w:rPr>
                   <w:rStyle w:val="VerbatimChar"/>
@@ -1868,8 +2051,8 @@
         </w:pict>
       </w:r>
     </w:p>
-    <w:bookmarkEnd w:id="33"/>
-    <w:bookmarkStart w:id="36" w:name="installation"/>
+    <w:bookmarkEnd w:id="34"/>
+    <w:bookmarkStart w:id="37" w:name="X6078cdea213b88e89d26f75066193281dac3f5a"/>
     <w:p>
       <w:pPr>
         <w:pStyle w:val="Heading2"/>
@@ -2041,7 +2224,7 @@
         <w:t xml:space="preserve"> </w:t>
       </w:r>
       <w:r>
-        <w:t xml:space="preserve">when the point is to reproduce someone else’s result. CI uses</w:t>
+        <w:t xml:space="preserve">when the point is to reproduce someone else's result. CI uses</w:t>
       </w:r>
       <w:r>
         <w:t xml:space="preserve"> </w:t>
@@ -2168,7 +2351,7 @@
         <w:t xml:space="preserve">this step.</w:t>
       </w:r>
     </w:p>
-    <w:bookmarkStart w:id="34" w:name="what-needs-a-browser-and-what-does-not"/>
+    <w:bookmarkStart w:id="35" w:name="what-needs-a-browser-and-what-does-not"/>
     <w:p>
       <w:pPr>
         <w:pStyle w:val="Heading3"/>
@@ -2389,7 +2572,7 @@
               <w:pStyle w:val="Compact"/>
             </w:pPr>
             <w:r>
-              <w:t xml:space="preserve">Prints one node’s results in the terminal</w:t>
+              <w:t xml:space="preserve">Prints one node's results in the terminal</w:t>
             </w:r>
           </w:p>
         </w:tc>
@@ -2614,7 +2797,7 @@
         <w:t xml:space="preserve"> </w:t>
       </w:r>
       <w:r>
-        <w:t xml:space="preserve">fails with Playwright’s</w:t>
+        <w:t xml:space="preserve">fails with Playwright's</w:t>
       </w:r>
       <w:r>
         <w:t xml:space="preserve"> </w:t>
@@ -2629,8 +2812,8 @@
         <w:t xml:space="preserve">.</w:t>
       </w:r>
     </w:p>
-    <w:bookmarkEnd w:id="34"/>
-    <w:bookmarkStart w:id="35" w:name="verifying-the-installation"/>
+    <w:bookmarkEnd w:id="35"/>
+    <w:bookmarkStart w:id="36" w:name="verifying-the-installation"/>
     <w:p>
       <w:pPr>
         <w:pStyle w:val="Heading3"/>
@@ -2752,9 +2935,9 @@
         </w:pict>
       </w:r>
     </w:p>
-    <w:bookmarkEnd w:id="35"/>
     <w:bookmarkEnd w:id="36"/>
-    <w:bookmarkStart w:id="50" w:name="configuration"/>
+    <w:bookmarkEnd w:id="37"/>
+    <w:bookmarkStart w:id="51" w:name="X36a2f22c204b35ab145e33f27bc3a3711e9d130"/>
     <w:p>
       <w:pPr>
         <w:pStyle w:val="Heading2"/>
@@ -2783,7 +2966,7 @@
         <w:t xml:space="preserve">edited; the third is a plain text list you write yourself.</w:t>
       </w:r>
     </w:p>
-    <w:bookmarkStart w:id="38" w:name="nodes.yaml-which-pages-to-check"/>
+    <w:bookmarkStart w:id="39" w:name="nodesyaml--which-pages-to-check"/>
     <w:p>
       <w:pPr>
         <w:pStyle w:val="Heading3"/>
@@ -3089,13 +3272,7 @@
               <w:t xml:space="preserve"> </w:t>
             </w:r>
             <w:r>
-              <w:t xml:space="preserve">(</w:t>
-            </w:r>
-            <w:r>
-              <w:t xml:space="preserve">“Website address”</w:t>
-            </w:r>
-            <w:r>
-              <w:t xml:space="preserve">, section 1.2 field 6). That registered URL is what the checklist defines as the Node Landing Page. If the URL here differs from the registered value, the registered value wins — correct this file.</w:t>
+              <w:t xml:space="preserve">("Website address", section 1.2 field 6). That registered URL is what the checklist defines as the Node Landing Page. If the URL here differs from the registered value, the registered value wins — correct this file.</w:t>
             </w:r>
           </w:p>
         </w:tc>
@@ -3122,7 +3299,7 @@
               <w:pStyle w:val="Compact"/>
             </w:pPr>
             <w:r>
-              <w:t xml:space="preserve">The node’s dedicated entry on</w:t>
+              <w:t xml:space="preserve">The node's dedicated entry on</w:t>
             </w:r>
             <w:r>
               <w:t xml:space="preserve"> </w:t>
@@ -3171,7 +3348,7 @@
       <w:r>
         <w:t xml:space="preserve"> </w:t>
       </w:r>
-      <w:hyperlink r:id="rId37">
+      <w:hyperlink r:id="rId38">
         <w:r>
           <w:rPr>
             <w:rStyle w:val="Hyperlink"/>
@@ -3198,7 +3375,7 @@
           <w:b/>
           <w:bCs/>
         </w:rPr>
-        <w:t xml:space="preserve">BBMRI-ERIC’s URL has changed several times.</w:t>
+        <w:t xml:space="preserve">BBMRI-ERIC's URL has changed several times.</w:t>
       </w:r>
       <w:r>
         <w:t xml:space="preserve"> </w:t>
@@ -3258,7 +3435,7 @@
         <w:t xml:space="preserve"> </w:t>
       </w:r>
       <w:r>
-        <w:t xml:space="preserve">host’s</w:t>
+        <w:t xml:space="preserve">host's</w:t>
       </w:r>
       <w:r>
         <w:t xml:space="preserve"> </w:t>
@@ -3420,7 +3597,7 @@
         <w:t xml:space="preserve"> </w:t>
       </w:r>
       <w:r>
-        <w:t xml:space="preserve">published run, the host’s</w:t>
+        <w:t xml:space="preserve">published run, the host's</w:t>
       </w:r>
       <w:r>
         <w:t xml:space="preserve"> </w:t>
@@ -3498,7 +3675,7 @@
           <w:b/>
           <w:bCs/>
         </w:rPr>
-        <w:t xml:space="preserve">EOSC Node Italy’s URL changed twice.</w:t>
+        <w:t xml:space="preserve">EOSC Node Italy's URL changed twice.</w:t>
       </w:r>
       <w:r>
         <w:t xml:space="preserve"> </w:t>
@@ -3648,7 +3825,7 @@
         <w:rPr>
           <w:rStyle w:val="VerbatimChar"/>
         </w:rPr>
-        <w:t xml:space="preserve">web-28</w:t>
+        <w:t xml:space="preserve">web-31</w:t>
       </w:r>
       <w:r>
         <w:t xml:space="preserve"> </w:t>
@@ -3678,7 +3855,7 @@
           <w:b/>
           <w:bCs/>
         </w:rPr>
-        <w:t xml:space="preserve">Data Terra’s URL changed on 1 October 2026</w:t>
+        <w:t xml:space="preserve">Data Terra's URL changed on 1 October 2026</w:t>
       </w:r>
       <w:r>
         <w:t xml:space="preserve">, from</w:t>
@@ -3768,7 +3945,7 @@
         <w:rPr>
           <w:rStyle w:val="VerbatimChar"/>
         </w:rPr>
-        <w:t xml:space="preserve">web-28</w:t>
+        <w:t xml:space="preserve">web-31</w:t>
       </w:r>
       <w:r>
         <w:t xml:space="preserve"> </w:t>
@@ -3777,644 +3954,809 @@
         <w:t xml:space="preserve">(the published run) read the new one.</w:t>
       </w:r>
     </w:p>
-    <w:bookmarkEnd w:id="38"/>
-    <w:bookmarkStart w:id="39" w:name="changing-a-nodes-url"/>
-    <w:p>
-      <w:pPr>
-        <w:pStyle w:val="Heading3"/>
-      </w:pPr>
-      <w:r>
-        <w:t xml:space="preserve">Changing a node’s URL</w:t>
-      </w:r>
-    </w:p>
-    <w:p>
-      <w:pPr>
-        <w:pStyle w:val="FirstParagraph"/>
-      </w:pPr>
-      <w:r>
-        <w:t xml:space="preserve">Change</w:t>
-      </w:r>
-      <w:r>
-        <w:t xml:space="preserve"> </w:t>
-      </w:r>
-      <w:r>
-        <w:rPr>
-          <w:rStyle w:val="VerbatimChar"/>
-        </w:rPr>
-        <w:t xml:space="preserve">url</w:t>
-      </w:r>
-      <w:r>
-        <w:t xml:space="preserve"> </w:t>
-      </w:r>
-      <w:r>
-        <w:t xml:space="preserve">in</w:t>
-      </w:r>
-      <w:r>
-        <w:t xml:space="preserve"> </w:t>
-      </w:r>
-      <w:r>
-        <w:rPr>
-          <w:rStyle w:val="VerbatimChar"/>
-        </w:rPr>
-        <w:t xml:space="preserve">nodes.yaml</w:t>
-      </w:r>
-      <w:r>
-        <w:t xml:space="preserve"> </w:t>
-      </w:r>
-      <w:r>
-        <w:t xml:space="preserve">and run</w:t>
-      </w:r>
-      <w:r>
-        <w:t xml:space="preserve"> </w:t>
-      </w:r>
-      <w:r>
-        <w:rPr>
-          <w:rStyle w:val="VerbatimChar"/>
-        </w:rPr>
-        <w:t xml:space="preserve">uv run pytest -q</w:t>
-      </w:r>
-      <w:r>
-        <w:t xml:space="preserve">. Nothing else in the</w:t>
-      </w:r>
-      <w:r>
-        <w:t xml:space="preserve"> </w:t>
-      </w:r>
-      <w:r>
-        <w:t xml:space="preserve">repository stores the URL. You can edit the file by hand, or let the tool do it:</w:t>
-      </w:r>
-    </w:p>
-    <w:p>
-      <w:pPr>
-        <w:pStyle w:val="SourceCode"/>
-      </w:pPr>
-      <w:r>
-        <w:rPr>
-          <w:rStyle w:val="ExtensionTok"/>
-        </w:rPr>
-        <w:t xml:space="preserve">uv</w:t>
-      </w:r>
-      <w:r>
-        <w:rPr>
-          <w:rStyle w:val="NormalTok"/>
-        </w:rPr>
-        <w:t xml:space="preserve"> run basic-check </w:t>
-      </w:r>
-      <w:r>
-        <w:rPr>
-          <w:rStyle w:val="AttributeTok"/>
-        </w:rPr>
-        <w:t xml:space="preserve">--update-nlp</w:t>
-      </w:r>
-      <w:r>
-        <w:rPr>
-          <w:rStyle w:val="NormalTok"/>
-        </w:rPr>
-        <w:t xml:space="preserve"> bbmri-eric https://new.example.org/eosc-node/</w:t>
-      </w:r>
-    </w:p>
-    <w:p>
-      <w:pPr>
-        <w:pStyle w:val="FirstParagraph"/>
-      </w:pPr>
-      <w:r>
-        <w:rPr>
-          <w:rStyle w:val="VerbatimChar"/>
-        </w:rPr>
-        <w:t xml:space="preserve">--update-nlp</w:t>
-      </w:r>
-      <w:r>
-        <w:t xml:space="preserve"> </w:t>
-      </w:r>
-      <w:r>
-        <w:t xml:space="preserve">takes the node id (the id exactly, not the name) and the new URL.</w:t>
-      </w:r>
-      <w:r>
-        <w:t xml:space="preserve"> </w:t>
-      </w:r>
-      <w:r>
-        <w:t xml:space="preserve">It changes only that node’s</w:t>
-      </w:r>
-      <w:r>
-        <w:t xml:space="preserve"> </w:t>
-      </w:r>
-      <w:r>
-        <w:rPr>
-          <w:rStyle w:val="VerbatimChar"/>
-        </w:rPr>
-        <w:t xml:space="preserve">url:</w:t>
-      </w:r>
-      <w:r>
-        <w:t xml:space="preserve"> </w:t>
-      </w:r>
-      <w:r>
-        <w:t xml:space="preserve">line, adds a comment above it with the date</w:t>
-      </w:r>
-      <w:r>
-        <w:t xml:space="preserve"> </w:t>
-      </w:r>
-      <w:r>
-        <w:t xml:space="preserve">and the old URL, and keeps every other line and comment as it was. It refuses a</w:t>
-      </w:r>
-      <w:r>
-        <w:t xml:space="preserve"> </w:t>
-      </w:r>
-      <w:r>
-        <w:t xml:space="preserve">URL that is not absolute https, one that is already another node’s landing</w:t>
-      </w:r>
-      <w:r>
-        <w:t xml:space="preserve"> </w:t>
-      </w:r>
-      <w:r>
-        <w:t xml:space="preserve">page, and an unknown id, and it prints the old and new URL. It contacts no site,</w:t>
-      </w:r>
-      <w:r>
-        <w:t xml:space="preserve"> </w:t>
-      </w:r>
-      <w:r>
-        <w:t xml:space="preserve">commits nothing and leaves</w:t>
-      </w:r>
-      <w:r>
-        <w:t xml:space="preserve"> </w:t>
-      </w:r>
-      <w:r>
-        <w:rPr>
-          <w:rStyle w:val="VerbatimChar"/>
-        </w:rPr>
-        <w:t xml:space="preserve">results/</w:t>
-      </w:r>
-      <w:r>
-        <w:t xml:space="preserve"> </w:t>
-      </w:r>
-      <w:r>
-        <w:t xml:space="preserve">alone; check the change with</w:t>
-      </w:r>
-      <w:r>
-        <w:t xml:space="preserve"> </w:t>
-      </w:r>
-      <w:r>
-        <w:rPr>
-          <w:rStyle w:val="VerbatimChar"/>
-        </w:rPr>
-        <w:t xml:space="preserve">git diff nodes.yaml</w:t>
-      </w:r>
-      <w:r>
-        <w:t xml:space="preserve"> </w:t>
-      </w:r>
-      <w:r>
-        <w:t xml:space="preserve">and commit it yourself.</w:t>
-      </w:r>
-    </w:p>
     <w:p>
       <w:pPr>
         <w:pStyle w:val="BodyText"/>
       </w:pPr>
       <w:r>
-        <w:t xml:space="preserve">To undo it, and any other edit to</w:t>
-      </w:r>
-      <w:r>
-        <w:t xml:space="preserve"> </w:t>
-      </w:r>
-      <w:r>
-        <w:rPr>
-          <w:rStyle w:val="VerbatimChar"/>
-        </w:rPr>
-        <w:t xml:space="preserve">nodes.yaml</w:t>
-      </w:r>
-      <w:r>
-        <w:t xml:space="preserve">, put the file back as it was</w:t>
-      </w:r>
-      <w:r>
-        <w:t xml:space="preserve"> </w:t>
-      </w:r>
-      <w:r>
-        <w:t xml:space="preserve">downloaded from GitHub:</w:t>
-      </w:r>
-    </w:p>
-    <w:p>
-      <w:pPr>
-        <w:pStyle w:val="SourceCode"/>
-      </w:pPr>
-      <w:r>
-        <w:rPr>
-          <w:rStyle w:val="ExtensionTok"/>
-        </w:rPr>
-        <w:t xml:space="preserve">uv</w:t>
-      </w:r>
-      <w:r>
-        <w:rPr>
-          <w:rStyle w:val="NormalTok"/>
-        </w:rPr>
-        <w:t xml:space="preserve"> run basic-check </w:t>
-      </w:r>
-      <w:r>
-        <w:rPr>
-          <w:rStyle w:val="AttributeTok"/>
-        </w:rPr>
-        <w:t xml:space="preserve">--restore-default-config</w:t>
-      </w:r>
-    </w:p>
-    <w:p>
-      <w:pPr>
-        <w:pStyle w:val="FirstParagraph"/>
-      </w:pPr>
-      <w:r>
-        <w:t xml:space="preserve">The replaced file is kept beside it as</w:t>
-      </w:r>
-      <w:r>
-        <w:t xml:space="preserve"> </w:t>
-      </w:r>
-      <w:r>
-        <w:rPr>
-          <w:rStyle w:val="VerbatimChar"/>
-        </w:rPr>
-        <w:t xml:space="preserve">nodes.yaml.&lt;date-time&gt;.bak</w:t>
-      </w:r>
-      <w:r>
-        <w:t xml:space="preserve"> </w:t>
-      </w:r>
-      <w:r>
-        <w:t xml:space="preserve">(ignored by</w:t>
-      </w:r>
-      <w:r>
-        <w:t xml:space="preserve"> </w:t>
-      </w:r>
-      <w:r>
-        <w:t xml:space="preserve">git), and the output lists every node whose URL was restored, added back or</w:t>
-      </w:r>
-      <w:r>
-        <w:t xml:space="preserve"> </w:t>
-      </w:r>
-      <w:r>
-        <w:t xml:space="preserve">removed. If the file is already the default, nothing changes. The default is a</w:t>
-      </w:r>
-      <w:r>
-        <w:t xml:space="preserve"> </w:t>
-      </w:r>
-      <w:r>
-        <w:t xml:space="preserve">copy shipped inside the package (</w:t>
-      </w:r>
-      <w:r>
-        <w:rPr>
-          <w:rStyle w:val="VerbatimChar"/>
-        </w:rPr>
-        <w:t xml:space="preserve">src/basic_check/defaults/nodes.yaml</w:t>
-      </w:r>
-      <w:r>
-        <w:t xml:space="preserve">), so this</w:t>
-      </w:r>
-      <w:r>
-        <w:t xml:space="preserve"> </w:t>
-      </w:r>
-      <w:r>
-        <w:t xml:space="preserve">works without git, from a zip download too. Only</w:t>
-      </w:r>
-      <w:r>
-        <w:t xml:space="preserve"> </w:t>
-      </w:r>
-      <w:r>
-        <w:rPr>
-          <w:rStyle w:val="VerbatimChar"/>
-        </w:rPr>
-        <w:t xml:space="preserve">nodes.yaml</w:t>
-      </w:r>
-      <w:r>
-        <w:t xml:space="preserve"> </w:t>
-      </w:r>
-      <w:r>
-        <w:t xml:space="preserve">is restored: the</w:t>
-      </w:r>
-      <w:r>
-        <w:t xml:space="preserve"> </w:t>
-      </w:r>
-      <w:r>
-        <w:t xml:space="preserve">approved-name lists in</w:t>
-      </w:r>
-      <w:r>
-        <w:t xml:space="preserve"> </w:t>
-      </w:r>
-      <w:r>
-        <w:rPr>
-          <w:rStyle w:val="VerbatimChar"/>
-        </w:rPr>
-        <w:t xml:space="preserve">checklist/</w:t>
-      </w:r>
-      <w:r>
-        <w:t xml:space="preserve"> </w:t>
-      </w:r>
-      <w:r>
-        <w:t xml:space="preserve">are not touched. Like</w:t>
-      </w:r>
-      <w:r>
-        <w:t xml:space="preserve"> </w:t>
-      </w:r>
-      <w:r>
-        <w:rPr>
-          <w:rStyle w:val="VerbatimChar"/>
-        </w:rPr>
-        <w:t xml:space="preserve">--update-nlp</w:t>
-      </w:r>
-      <w:r>
-        <w:t xml:space="preserve">, it</w:t>
-      </w:r>
-      <w:r>
-        <w:t xml:space="preserve"> </w:t>
-      </w:r>
-      <w:r>
-        <w:t xml:space="preserve">contacts no site, commits nothing and leaves</w:t>
-      </w:r>
-      <w:r>
-        <w:t xml:space="preserve"> </w:t>
-      </w:r>
-      <w:r>
-        <w:rPr>
-          <w:rStyle w:val="VerbatimChar"/>
-        </w:rPr>
-        <w:t xml:space="preserve">results/</w:t>
-      </w:r>
-      <w:r>
-        <w:t xml:space="preserve"> </w:t>
-      </w:r>
-      <w:r>
-        <w:t xml:space="preserve">alone; for a node whose</w:t>
-      </w:r>
-      <w:r>
-        <w:t xml:space="preserve"> </w:t>
-      </w:r>
-      <w:r>
-        <w:t xml:space="preserve">URL it restored,</w:t>
-      </w:r>
-      <w:r>
-        <w:t xml:space="preserve"> </w:t>
-      </w:r>
-      <w:r>
-        <w:rPr>
-          <w:rStyle w:val="VerbatimChar"/>
-        </w:rPr>
-        <w:t xml:space="preserve">run --update-results-for-node &lt;id&gt;</w:t>
-      </w:r>
-      <w:r>
-        <w:t xml:space="preserve"> </w:t>
-      </w:r>
-      <w:r>
-        <w:t xml:space="preserve">re-checks that node.</w:t>
-      </w:r>
-      <w:r>
-        <w:t xml:space="preserve"> </w:t>
-      </w:r>
-      <w:r>
-        <w:t xml:space="preserve">To re-check only that node and update only its row in the results, keeping the</w:t>
-      </w:r>
-      <w:r>
-        <w:t xml:space="preserve"> </w:t>
-      </w:r>
-      <w:r>
-        <w:t xml:space="preserve">others, use</w:t>
-      </w:r>
-      <w:r>
-        <w:t xml:space="preserve"> </w:t>
-      </w:r>
-      <w:r>
-        <w:rPr>
-          <w:rStyle w:val="VerbatimChar"/>
-        </w:rPr>
-        <w:t xml:space="preserve">run --update-results-for-node</w:t>
-      </w:r>
-      <w:r>
-        <w:t xml:space="preserve"> </w:t>
-      </w:r>
-      <w:r>
-        <w:t xml:space="preserve">(section 4). To look first without</w:t>
-      </w:r>
-      <w:r>
-        <w:t xml:space="preserve"> </w:t>
-      </w:r>
-      <w:r>
-        <w:t xml:space="preserve">changing anything published, collect it into a scratch</w:t>
-      </w:r>
-      <w:r>
-        <w:t xml:space="preserve"> </w:t>
-      </w:r>
-      <w:r>
-        <w:t xml:space="preserve">directory first, so you can see what the new page gives before anything</w:t>
-      </w:r>
-      <w:r>
-        <w:t xml:space="preserve"> </w:t>
-      </w:r>
-      <w:r>
-        <w:t xml:space="preserve">published changes:</w:t>
-      </w:r>
-    </w:p>
-    <w:p>
-      <w:pPr>
-        <w:pStyle w:val="SourceCode"/>
-      </w:pPr>
-      <w:r>
-        <w:rPr>
-          <w:rStyle w:val="ExtensionTok"/>
-        </w:rPr>
-        <w:t xml:space="preserve">uv</w:t>
-      </w:r>
-      <w:r>
-        <w:rPr>
-          <w:rStyle w:val="NormalTok"/>
-        </w:rPr>
-        <w:t xml:space="preserve"> run basic-check collect </w:t>
-      </w:r>
-      <w:r>
-        <w:rPr>
-          <w:rStyle w:val="AttributeTok"/>
-        </w:rPr>
-        <w:t xml:space="preserve">--only</w:t>
-      </w:r>
-      <w:r>
-        <w:rPr>
-          <w:rStyle w:val="NormalTok"/>
-        </w:rPr>
-        <w:t xml:space="preserve"> bbmri-eric </w:t>
-      </w:r>
-      <w:r>
-        <w:rPr>
-          <w:rStyle w:val="AttributeTok"/>
-        </w:rPr>
-        <w:t xml:space="preserve">--results</w:t>
-      </w:r>
-      <w:r>
-        <w:rPr>
-          <w:rStyle w:val="NormalTok"/>
-        </w:rPr>
-        <w:t xml:space="preserve"> /tmp/trial</w:t>
-      </w:r>
-      <w:r>
-        <w:br/>
-      </w:r>
-      <w:r>
-        <w:rPr>
-          <w:rStyle w:val="ExtensionTok"/>
-        </w:rPr>
-        <w:t xml:space="preserve">uv</w:t>
-      </w:r>
-      <w:r>
-        <w:rPr>
-          <w:rStyle w:val="NormalTok"/>
-        </w:rPr>
-        <w:t xml:space="preserve"> run basic-check assess  </w:t>
-      </w:r>
-      <w:r>
-        <w:rPr>
-          <w:rStyle w:val="AttributeTok"/>
-        </w:rPr>
-        <w:t xml:space="preserve">--only</w:t>
-      </w:r>
-      <w:r>
-        <w:rPr>
-          <w:rStyle w:val="NormalTok"/>
-        </w:rPr>
-        <w:t xml:space="preserve"> bbmri-eric </w:t>
-      </w:r>
-      <w:r>
-        <w:rPr>
-          <w:rStyle w:val="AttributeTok"/>
-        </w:rPr>
-        <w:t xml:space="preserve">--results</w:t>
-      </w:r>
-      <w:r>
-        <w:rPr>
-          <w:rStyle w:val="NormalTok"/>
-        </w:rPr>
-        <w:t xml:space="preserve"> /tmp/trial</w:t>
-      </w:r>
-    </w:p>
-    <w:p>
-      <w:pPr>
-        <w:pStyle w:val="FirstParagraph"/>
-      </w:pPr>
-      <w:r>
-        <w:rPr>
-          <w:rStyle w:val="VerbatimChar"/>
+        <w:rPr>
           <w:b/>
           <w:bCs/>
         </w:rPr>
-        <w:t xml:space="preserve">assess</w:t>
-      </w:r>
-      <w:r>
-        <w:rPr>
+        <w:t xml:space="preserve">PaNOSC's URL changed on 19 October 2026</w:t>
+      </w:r>
+      <w:r>
+        <w:t xml:space="preserve">, from</w:t>
+      </w:r>
+      <w:r>
+        <w:t xml:space="preserve"> </w:t>
+      </w:r>
+      <w:r>
+        <w:rPr>
+          <w:rStyle w:val="VerbatimChar"/>
+        </w:rPr>
+        <w:t xml:space="preserve">https://eosc.panosc.eu/</w:t>
+      </w:r>
+      <w:r>
+        <w:t xml:space="preserve"> </w:t>
+      </w:r>
+      <w:r>
+        <w:t xml:space="preserve">to</w:t>
+      </w:r>
+      <w:r>
+        <w:t xml:space="preserve"> </w:t>
+      </w:r>
+      <w:r>
+        <w:rPr>
+          <w:rStyle w:val="VerbatimChar"/>
+        </w:rPr>
+        <w:t xml:space="preserve">https://panosc.eu/panosc-eosc-node</w:t>
+      </w:r>
+      <w:r>
+        <w:t xml:space="preserve">, with</w:t>
+      </w:r>
+      <w:r>
+        <w:t xml:space="preserve"> </w:t>
+      </w:r>
+      <w:r>
+        <w:rPr>
+          <w:rStyle w:val="VerbatimChar"/>
+        </w:rPr>
+        <w:t xml:space="preserve">basic-check --update-nlp</w:t>
+      </w:r>
+      <w:r>
+        <w:t xml:space="preserve"> </w:t>
+      </w:r>
+      <w:r>
+        <w:t xml:space="preserve">(commit</w:t>
+      </w:r>
+      <w:r>
+        <w:t xml:space="preserve"> </w:t>
+      </w:r>
+      <w:r>
+        <w:rPr>
+          <w:rStyle w:val="VerbatimChar"/>
+        </w:rPr>
+        <w:t xml:space="preserve">e9c5f9c</w:t>
+      </w:r>
+      <w:r>
+        <w:t xml:space="preserve">);</w:t>
+      </w:r>
+      <w:r>
+        <w:t xml:space="preserve"> </w:t>
+      </w:r>
+      <w:r>
+        <w:rPr>
+          <w:rStyle w:val="VerbatimChar"/>
+        </w:rPr>
+        <w:t xml:space="preserve">nodes.yaml</w:t>
+      </w:r>
+      <w:r>
+        <w:t xml:space="preserve"> </w:t>
+      </w:r>
+      <w:r>
+        <w:t xml:space="preserve">and the shipped default copy carry the same comment.</w:t>
+      </w:r>
+      <w:r>
+        <w:t xml:space="preserve"> </w:t>
+      </w:r>
+      <w:r>
+        <w:t xml:space="preserve">Both addresses redirect to</w:t>
+      </w:r>
+      <w:r>
+        <w:t xml:space="preserve"> </w:t>
+      </w:r>
+      <w:r>
+        <w:rPr>
+          <w:rStyle w:val="VerbatimChar"/>
+        </w:rPr>
+        <w:t xml:space="preserve">https://www.panosc.eu/panosc-eosc-node/</w:t>
+      </w:r>
+      <w:r>
+        <w:t xml:space="preserve">, which is</w:t>
+      </w:r>
+      <w:r>
+        <w:t xml:space="preserve"> </w:t>
+      </w:r>
+      <w:r>
+        <w:t xml:space="preserve">the</w:t>
+      </w:r>
+      <w:r>
+        <w:t xml:space="preserve"> </w:t>
+      </w:r>
+      <w:r>
+        <w:rPr>
+          <w:rStyle w:val="VerbatimChar"/>
+        </w:rPr>
+        <w:t xml:space="preserve">final_url</w:t>
+      </w:r>
+      <w:r>
+        <w:t xml:space="preserve"> </w:t>
+      </w:r>
+      <w:r>
+        <w:t xml:space="preserve">of every run since the redirect appeared, so the change records</w:t>
+      </w:r>
+      <w:r>
+        <w:t xml:space="preserve"> </w:t>
+      </w:r>
+      <w:r>
+        <w:t xml:space="preserve">the node's chosen address rather than a different page. Runs up to</w:t>
+      </w:r>
+      <w:r>
+        <w:t xml:space="preserve"> </w:t>
+      </w:r>
+      <w:r>
+        <w:rPr>
+          <w:rStyle w:val="VerbatimChar"/>
+        </w:rPr>
+        <w:t xml:space="preserve">web-28</w:t>
+      </w:r>
+      <w:r>
+        <w:t xml:space="preserve"> </w:t>
+      </w:r>
+      <w:r>
+        <w:t xml:space="preserve">were</w:t>
+      </w:r>
+      <w:r>
+        <w:t xml:space="preserve"> </w:t>
+      </w:r>
+      <w:r>
+        <w:t xml:space="preserve">requested at the old address;</w:t>
+      </w:r>
+      <w:r>
+        <w:t xml:space="preserve"> </w:t>
+      </w:r>
+      <w:r>
+        <w:rPr>
+          <w:rStyle w:val="VerbatimChar"/>
+        </w:rPr>
+        <w:t xml:space="preserve">web-31</w:t>
+      </w:r>
+      <w:r>
+        <w:t xml:space="preserve"> </w:t>
+      </w:r>
+      <w:r>
+        <w:t xml:space="preserve">(the published run) at the new one.</w:t>
+      </w:r>
+    </w:p>
+    <w:bookmarkEnd w:id="39"/>
+    <w:bookmarkStart w:id="40" w:name="changing-a-nodes-url"/>
+    <w:p>
+      <w:pPr>
+        <w:pStyle w:val="Heading3"/>
+      </w:pPr>
+      <w:r>
+        <w:t xml:space="preserve">Changing a node's URL</w:t>
+      </w:r>
+    </w:p>
+    <w:p>
+      <w:pPr>
+        <w:pStyle w:val="FirstParagraph"/>
+      </w:pPr>
+      <w:r>
+        <w:t xml:space="preserve">Change</w:t>
+      </w:r>
+      <w:r>
+        <w:t xml:space="preserve"> </w:t>
+      </w:r>
+      <w:r>
+        <w:rPr>
+          <w:rStyle w:val="VerbatimChar"/>
+        </w:rPr>
+        <w:t xml:space="preserve">url</w:t>
+      </w:r>
+      <w:r>
+        <w:t xml:space="preserve"> </w:t>
+      </w:r>
+      <w:r>
+        <w:t xml:space="preserve">in</w:t>
+      </w:r>
+      <w:r>
+        <w:t xml:space="preserve"> </w:t>
+      </w:r>
+      <w:r>
+        <w:rPr>
+          <w:rStyle w:val="VerbatimChar"/>
+        </w:rPr>
+        <w:t xml:space="preserve">nodes.yaml</w:t>
+      </w:r>
+      <w:r>
+        <w:t xml:space="preserve"> </w:t>
+      </w:r>
+      <w:r>
+        <w:t xml:space="preserve">and run</w:t>
+      </w:r>
+      <w:r>
+        <w:t xml:space="preserve"> </w:t>
+      </w:r>
+      <w:r>
+        <w:rPr>
+          <w:rStyle w:val="VerbatimChar"/>
+        </w:rPr>
+        <w:t xml:space="preserve">uv run pytest -q</w:t>
+      </w:r>
+      <w:r>
+        <w:t xml:space="preserve">. Nothing else in the</w:t>
+      </w:r>
+      <w:r>
+        <w:t xml:space="preserve"> </w:t>
+      </w:r>
+      <w:r>
+        <w:t xml:space="preserve">repository stores the URL. You can edit the file by hand, or let the tool do it:</w:t>
+      </w:r>
+    </w:p>
+    <w:p>
+      <w:pPr>
+        <w:pStyle w:val="SourceCode"/>
+      </w:pPr>
+      <w:r>
+        <w:rPr>
+          <w:rStyle w:val="ExtensionTok"/>
+        </w:rPr>
+        <w:t xml:space="preserve">uv</w:t>
+      </w:r>
+      <w:r>
+        <w:rPr>
+          <w:rStyle w:val="NormalTok"/>
+        </w:rPr>
+        <w:t xml:space="preserve"> run basic-check </w:t>
+      </w:r>
+      <w:r>
+        <w:rPr>
+          <w:rStyle w:val="AttributeTok"/>
+        </w:rPr>
+        <w:t xml:space="preserve">--update-nlp</w:t>
+      </w:r>
+      <w:r>
+        <w:rPr>
+          <w:rStyle w:val="NormalTok"/>
+        </w:rPr>
+        <w:t xml:space="preserve"> bbmri-eric https://new.example.org/eosc-node/</w:t>
+      </w:r>
+    </w:p>
+    <w:p>
+      <w:pPr>
+        <w:pStyle w:val="FirstParagraph"/>
+      </w:pPr>
+      <w:r>
+        <w:rPr>
+          <w:rStyle w:val="VerbatimChar"/>
+        </w:rPr>
+        <w:t xml:space="preserve">--update-nlp</w:t>
+      </w:r>
+      <w:r>
+        <w:t xml:space="preserve"> </w:t>
+      </w:r>
+      <w:r>
+        <w:t xml:space="preserve">takes the node id (the id exactly, not the name) and the new URL.</w:t>
+      </w:r>
+      <w:r>
+        <w:t xml:space="preserve"> </w:t>
+      </w:r>
+      <w:r>
+        <w:t xml:space="preserve">It changes only that node's</w:t>
+      </w:r>
+      <w:r>
+        <w:t xml:space="preserve"> </w:t>
+      </w:r>
+      <w:r>
+        <w:rPr>
+          <w:rStyle w:val="VerbatimChar"/>
+        </w:rPr>
+        <w:t xml:space="preserve">url:</w:t>
+      </w:r>
+      <w:r>
+        <w:t xml:space="preserve"> </w:t>
+      </w:r>
+      <w:r>
+        <w:t xml:space="preserve">line, adds a comment above it with the date</w:t>
+      </w:r>
+      <w:r>
+        <w:t xml:space="preserve"> </w:t>
+      </w:r>
+      <w:r>
+        <w:t xml:space="preserve">and the old URL, and keeps every other line and comment as it was. It refuses a</w:t>
+      </w:r>
+      <w:r>
+        <w:t xml:space="preserve"> </w:t>
+      </w:r>
+      <w:r>
+        <w:t xml:space="preserve">URL that is not absolute https, one that is already another node's landing</w:t>
+      </w:r>
+      <w:r>
+        <w:t xml:space="preserve"> </w:t>
+      </w:r>
+      <w:r>
+        <w:t xml:space="preserve">page, and an unknown id, and it prints the old and new URL. It contacts no site,</w:t>
+      </w:r>
+      <w:r>
+        <w:t xml:space="preserve"> </w:t>
+      </w:r>
+      <w:r>
+        <w:t xml:space="preserve">commits nothing and leaves</w:t>
+      </w:r>
+      <w:r>
+        <w:t xml:space="preserve"> </w:t>
+      </w:r>
+      <w:r>
+        <w:rPr>
+          <w:rStyle w:val="VerbatimChar"/>
+        </w:rPr>
+        <w:t xml:space="preserve">results/</w:t>
+      </w:r>
+      <w:r>
+        <w:t xml:space="preserve"> </w:t>
+      </w:r>
+      <w:r>
+        <w:t xml:space="preserve">alone; check the change with</w:t>
+      </w:r>
+      <w:r>
+        <w:t xml:space="preserve"> </w:t>
+      </w:r>
+      <w:r>
+        <w:rPr>
+          <w:rStyle w:val="VerbatimChar"/>
+        </w:rPr>
+        <w:t xml:space="preserve">git diff nodes.yaml</w:t>
+      </w:r>
+      <w:r>
+        <w:t xml:space="preserve"> </w:t>
+      </w:r>
+      <w:r>
+        <w:t xml:space="preserve">and commit it yourself.</w:t>
+      </w:r>
+    </w:p>
+    <w:p>
+      <w:pPr>
+        <w:pStyle w:val="BodyText"/>
+      </w:pPr>
+      <w:r>
+        <w:t xml:space="preserve">To undo it, and any other edit to</w:t>
+      </w:r>
+      <w:r>
+        <w:t xml:space="preserve"> </w:t>
+      </w:r>
+      <w:r>
+        <w:rPr>
+          <w:rStyle w:val="VerbatimChar"/>
+        </w:rPr>
+        <w:t xml:space="preserve">nodes.yaml</w:t>
+      </w:r>
+      <w:r>
+        <w:t xml:space="preserve">, put the file back as it was</w:t>
+      </w:r>
+      <w:r>
+        <w:t xml:space="preserve"> </w:t>
+      </w:r>
+      <w:r>
+        <w:t xml:space="preserve">downloaded from GitHub:</w:t>
+      </w:r>
+    </w:p>
+    <w:p>
+      <w:pPr>
+        <w:pStyle w:val="SourceCode"/>
+      </w:pPr>
+      <w:r>
+        <w:rPr>
+          <w:rStyle w:val="ExtensionTok"/>
+        </w:rPr>
+        <w:t xml:space="preserve">uv</w:t>
+      </w:r>
+      <w:r>
+        <w:rPr>
+          <w:rStyle w:val="NormalTok"/>
+        </w:rPr>
+        <w:t xml:space="preserve"> run basic-check </w:t>
+      </w:r>
+      <w:r>
+        <w:rPr>
+          <w:rStyle w:val="AttributeTok"/>
+        </w:rPr>
+        <w:t xml:space="preserve">--restore-default-config</w:t>
+      </w:r>
+    </w:p>
+    <w:p>
+      <w:pPr>
+        <w:pStyle w:val="FirstParagraph"/>
+      </w:pPr>
+      <w:r>
+        <w:t xml:space="preserve">The replaced file is kept beside it as</w:t>
+      </w:r>
+      <w:r>
+        <w:t xml:space="preserve"> </w:t>
+      </w:r>
+      <w:r>
+        <w:rPr>
+          <w:rStyle w:val="VerbatimChar"/>
+        </w:rPr>
+        <w:t xml:space="preserve">nodes.yaml.&lt;date-time&gt;.bak</w:t>
+      </w:r>
+      <w:r>
+        <w:t xml:space="preserve"> </w:t>
+      </w:r>
+      <w:r>
+        <w:t xml:space="preserve">(ignored by</w:t>
+      </w:r>
+      <w:r>
+        <w:t xml:space="preserve"> </w:t>
+      </w:r>
+      <w:r>
+        <w:t xml:space="preserve">git), and the output lists every node whose URL was restored, added back or</w:t>
+      </w:r>
+      <w:r>
+        <w:t xml:space="preserve"> </w:t>
+      </w:r>
+      <w:r>
+        <w:t xml:space="preserve">removed. If the file is already the default, nothing changes. The default is a</w:t>
+      </w:r>
+      <w:r>
+        <w:t xml:space="preserve"> </w:t>
+      </w:r>
+      <w:r>
+        <w:t xml:space="preserve">copy shipped inside the package (</w:t>
+      </w:r>
+      <w:r>
+        <w:rPr>
+          <w:rStyle w:val="VerbatimChar"/>
+        </w:rPr>
+        <w:t xml:space="preserve">src/basic_check/defaults/nodes.yaml</w:t>
+      </w:r>
+      <w:r>
+        <w:t xml:space="preserve">), so this</w:t>
+      </w:r>
+      <w:r>
+        <w:t xml:space="preserve"> </w:t>
+      </w:r>
+      <w:r>
+        <w:t xml:space="preserve">works without git, from a zip download too. Only</w:t>
+      </w:r>
+      <w:r>
+        <w:t xml:space="preserve"> </w:t>
+      </w:r>
+      <w:r>
+        <w:rPr>
+          <w:rStyle w:val="VerbatimChar"/>
+        </w:rPr>
+        <w:t xml:space="preserve">nodes.yaml</w:t>
+      </w:r>
+      <w:r>
+        <w:t xml:space="preserve"> </w:t>
+      </w:r>
+      <w:r>
+        <w:t xml:space="preserve">is restored: the</w:t>
+      </w:r>
+      <w:r>
+        <w:t xml:space="preserve"> </w:t>
+      </w:r>
+      <w:r>
+        <w:t xml:space="preserve">approved-name lists in</w:t>
+      </w:r>
+      <w:r>
+        <w:t xml:space="preserve"> </w:t>
+      </w:r>
+      <w:r>
+        <w:rPr>
+          <w:rStyle w:val="VerbatimChar"/>
+        </w:rPr>
+        <w:t xml:space="preserve">checklist/</w:t>
+      </w:r>
+      <w:r>
+        <w:t xml:space="preserve"> </w:t>
+      </w:r>
+      <w:r>
+        <w:t xml:space="preserve">are not touched. Like</w:t>
+      </w:r>
+      <w:r>
+        <w:t xml:space="preserve"> </w:t>
+      </w:r>
+      <w:r>
+        <w:rPr>
+          <w:rStyle w:val="VerbatimChar"/>
+        </w:rPr>
+        <w:t xml:space="preserve">--update-nlp</w:t>
+      </w:r>
+      <w:r>
+        <w:t xml:space="preserve">, it</w:t>
+      </w:r>
+      <w:r>
+        <w:t xml:space="preserve"> </w:t>
+      </w:r>
+      <w:r>
+        <w:t xml:space="preserve">contacts no site, commits nothing and leaves</w:t>
+      </w:r>
+      <w:r>
+        <w:t xml:space="preserve"> </w:t>
+      </w:r>
+      <w:r>
+        <w:rPr>
+          <w:rStyle w:val="VerbatimChar"/>
+        </w:rPr>
+        <w:t xml:space="preserve">results/</w:t>
+      </w:r>
+      <w:r>
+        <w:t xml:space="preserve"> </w:t>
+      </w:r>
+      <w:r>
+        <w:t xml:space="preserve">alone; for a node whose</w:t>
+      </w:r>
+      <w:r>
+        <w:t xml:space="preserve"> </w:t>
+      </w:r>
+      <w:r>
+        <w:t xml:space="preserve">URL it restored,</w:t>
+      </w:r>
+      <w:r>
+        <w:t xml:space="preserve"> </w:t>
+      </w:r>
+      <w:r>
+        <w:rPr>
+          <w:rStyle w:val="VerbatimChar"/>
+        </w:rPr>
+        <w:t xml:space="preserve">run --update-results-for-node &lt;id&gt;</w:t>
+      </w:r>
+      <w:r>
+        <w:t xml:space="preserve"> </w:t>
+      </w:r>
+      <w:r>
+        <w:t xml:space="preserve">re-checks that node.</w:t>
+      </w:r>
+      <w:r>
+        <w:t xml:space="preserve"> </w:t>
+      </w:r>
+      <w:r>
+        <w:t xml:space="preserve">To re-check only that node and update only its row in the results, keeping the</w:t>
+      </w:r>
+      <w:r>
+        <w:t xml:space="preserve"> </w:t>
+      </w:r>
+      <w:r>
+        <w:t xml:space="preserve">others, use</w:t>
+      </w:r>
+      <w:r>
+        <w:t xml:space="preserve"> </w:t>
+      </w:r>
+      <w:r>
+        <w:rPr>
+          <w:rStyle w:val="VerbatimChar"/>
+        </w:rPr>
+        <w:t xml:space="preserve">run --update-results-for-node</w:t>
+      </w:r>
+      <w:r>
+        <w:t xml:space="preserve"> </w:t>
+      </w:r>
+      <w:r>
+        <w:t xml:space="preserve">(section 4). To look first without</w:t>
+      </w:r>
+      <w:r>
+        <w:t xml:space="preserve"> </w:t>
+      </w:r>
+      <w:r>
+        <w:t xml:space="preserve">changing anything published, collect it into a scratch</w:t>
+      </w:r>
+      <w:r>
+        <w:t xml:space="preserve"> </w:t>
+      </w:r>
+      <w:r>
+        <w:t xml:space="preserve">directory first, so you can see what the new page gives before anything</w:t>
+      </w:r>
+      <w:r>
+        <w:t xml:space="preserve"> </w:t>
+      </w:r>
+      <w:r>
+        <w:t xml:space="preserve">published changes:</w:t>
+      </w:r>
+    </w:p>
+    <w:p>
+      <w:pPr>
+        <w:pStyle w:val="SourceCode"/>
+      </w:pPr>
+      <w:r>
+        <w:rPr>
+          <w:rStyle w:val="ExtensionTok"/>
+        </w:rPr>
+        <w:t xml:space="preserve">uv</w:t>
+      </w:r>
+      <w:r>
+        <w:rPr>
+          <w:rStyle w:val="NormalTok"/>
+        </w:rPr>
+        <w:t xml:space="preserve"> run basic-check collect </w:t>
+      </w:r>
+      <w:r>
+        <w:rPr>
+          <w:rStyle w:val="AttributeTok"/>
+        </w:rPr>
+        <w:t xml:space="preserve">--only</w:t>
+      </w:r>
+      <w:r>
+        <w:rPr>
+          <w:rStyle w:val="NormalTok"/>
+        </w:rPr>
+        <w:t xml:space="preserve"> bbmri-eric </w:t>
+      </w:r>
+      <w:r>
+        <w:rPr>
+          <w:rStyle w:val="AttributeTok"/>
+        </w:rPr>
+        <w:t xml:space="preserve">--results</w:t>
+      </w:r>
+      <w:r>
+        <w:rPr>
+          <w:rStyle w:val="NormalTok"/>
+        </w:rPr>
+        <w:t xml:space="preserve"> /tmp/trial</w:t>
+      </w:r>
+      <w:r>
+        <w:br/>
+      </w:r>
+      <w:r>
+        <w:rPr>
+          <w:rStyle w:val="ExtensionTok"/>
+        </w:rPr>
+        <w:t xml:space="preserve">uv</w:t>
+      </w:r>
+      <w:r>
+        <w:rPr>
+          <w:rStyle w:val="NormalTok"/>
+        </w:rPr>
+        <w:t xml:space="preserve"> run basic-check assess  </w:t>
+      </w:r>
+      <w:r>
+        <w:rPr>
+          <w:rStyle w:val="AttributeTok"/>
+        </w:rPr>
+        <w:t xml:space="preserve">--only</w:t>
+      </w:r>
+      <w:r>
+        <w:rPr>
+          <w:rStyle w:val="NormalTok"/>
+        </w:rPr>
+        <w:t xml:space="preserve"> bbmri-eric </w:t>
+      </w:r>
+      <w:r>
+        <w:rPr>
+          <w:rStyle w:val="AttributeTok"/>
+        </w:rPr>
+        <w:t xml:space="preserve">--results</w:t>
+      </w:r>
+      <w:r>
+        <w:rPr>
+          <w:rStyle w:val="NormalTok"/>
+        </w:rPr>
+        <w:t xml:space="preserve"> /tmp/trial</w:t>
+      </w:r>
+    </w:p>
+    <w:p>
+      <w:pPr>
+        <w:pStyle w:val="FirstParagraph"/>
+      </w:pPr>
+      <w:r>
+        <w:rPr>
+          <w:rStyle w:val="VerbatimChar"/>
           <w:b/>
           <w:bCs/>
         </w:rPr>
-        <w:t xml:space="preserve"> </w:t>
+        <w:t xml:space="preserve">assess</w:t>
       </w:r>
       <w:r>
         <w:rPr>
           <w:b/>
           <w:bCs/>
         </w:rPr>
-        <w:t xml:space="preserve">takes each node’s URL from</w:t>
+        <w:t xml:space="preserve"> </w:t>
       </w:r>
       <w:r>
         <w:rPr>
           <w:b/>
           <w:bCs/>
         </w:rPr>
-        <w:t xml:space="preserve"> </w:t>
-      </w:r>
-      <w:r>
-        <w:rPr>
-          <w:rStyle w:val="VerbatimChar"/>
+        <w:t xml:space="preserve">takes each node's URL from</w:t>
+      </w:r>
+      <w:r>
+        <w:rPr>
           <w:b/>
           <w:bCs/>
         </w:rPr>
-        <w:t xml:space="preserve">nodes.yaml</w:t>
-      </w:r>
-      <w:r>
-        <w:rPr>
+        <w:t xml:space="preserve"> </w:t>
+      </w:r>
+      <w:r>
+        <w:rPr>
+          <w:rStyle w:val="VerbatimChar"/>
           <w:b/>
           <w:bCs/>
         </w:rPr>
-        <w:t xml:space="preserve">, not from the evidence.</w:t>
-      </w:r>
-      <w:r>
-        <w:t xml:space="preserve"> </w:t>
-      </w:r>
-      <w:r>
-        <w:t xml:space="preserve">So</w:t>
-      </w:r>
-      <w:r>
-        <w:t xml:space="preserve"> </w:t>
-      </w:r>
-      <w:r>
-        <w:t xml:space="preserve">after a URL change, a bare</w:t>
-      </w:r>
-      <w:r>
-        <w:t xml:space="preserve"> </w:t>
-      </w:r>
-      <w:r>
-        <w:rPr>
-          <w:rStyle w:val="VerbatimChar"/>
-        </w:rPr>
-        <w:t xml:space="preserve">uv run basic-check assess</w:t>
-      </w:r>
-      <w:r>
-        <w:t xml:space="preserve"> </w:t>
-      </w:r>
-      <w:r>
-        <w:t xml:space="preserve">pairs the new URL with</w:t>
-      </w:r>
-      <w:r>
-        <w:t xml:space="preserve"> </w:t>
-      </w:r>
-      <w:r>
-        <w:t xml:space="preserve">evidence collected from the old page. It no longer does so silently.</w:t>
-      </w:r>
-      <w:r>
-        <w:t xml:space="preserve"> </w:t>
-      </w:r>
-      <w:r>
-        <w:rPr>
-          <w:rStyle w:val="VerbatimChar"/>
-        </w:rPr>
-        <w:t xml:space="preserve">assess</w:t>
-      </w:r>
-      <w:r>
-        <w:t xml:space="preserve"> </w:t>
-      </w:r>
-      <w:r>
-        <w:t xml:space="preserve">compares each node’s configured URL with the</w:t>
-      </w:r>
-      <w:r>
-        <w:t xml:space="preserve"> </w:t>
-      </w:r>
-      <w:r>
-        <w:rPr>
-          <w:rStyle w:val="VerbatimChar"/>
-        </w:rPr>
-        <w:t xml:space="preserve">requested_url</w:t>
-      </w:r>
-      <w:r>
-        <w:t xml:space="preserve"> </w:t>
-      </w:r>
-      <w:r>
-        <w:t xml:space="preserve">stored in its</w:t>
-      </w:r>
-      <w:r>
-        <w:t xml:space="preserve"> </w:t>
-      </w:r>
-      <w:r>
-        <w:t xml:space="preserve">evidence. When they differ, it prints a warning naming the node and both</w:t>
-      </w:r>
-      <w:r>
-        <w:t xml:space="preserve"> </w:t>
-      </w:r>
-      <w:r>
-        <w:t xml:space="preserve">addresses, adds an</w:t>
-      </w:r>
-      <w:r>
-        <w:t xml:space="preserve"> </w:t>
+        <w:t xml:space="preserve">nodes.yaml</w:t>
       </w:r>
       <w:r>
         <w:rPr>
           <w:b/>
           <w:bCs/>
         </w:rPr>
+        <w:t xml:space="preserve">, not from the evidence.</w:t>
+      </w:r>
+      <w:r>
+        <w:t xml:space="preserve"> </w:t>
+      </w:r>
+      <w:r>
+        <w:t xml:space="preserve">So</w:t>
+      </w:r>
+      <w:r>
+        <w:t xml:space="preserve"> </w:t>
+      </w:r>
+      <w:r>
+        <w:t xml:space="preserve">after a URL change, a bare</w:t>
+      </w:r>
+      <w:r>
+        <w:t xml:space="preserve"> </w:t>
+      </w:r>
+      <w:r>
+        <w:rPr>
+          <w:rStyle w:val="VerbatimChar"/>
+        </w:rPr>
+        <w:t xml:space="preserve">uv run basic-check assess</w:t>
+      </w:r>
+      <w:r>
+        <w:t xml:space="preserve"> </w:t>
+      </w:r>
+      <w:r>
+        <w:t xml:space="preserve">pairs the new URL with</w:t>
+      </w:r>
+      <w:r>
+        <w:t xml:space="preserve"> </w:t>
+      </w:r>
+      <w:r>
+        <w:t xml:space="preserve">evidence collected from the old page. It no longer does so silently.</w:t>
+      </w:r>
+      <w:r>
+        <w:t xml:space="preserve"> </w:t>
+      </w:r>
+      <w:r>
+        <w:rPr>
+          <w:rStyle w:val="VerbatimChar"/>
+        </w:rPr>
+        <w:t xml:space="preserve">assess</w:t>
+      </w:r>
+      <w:r>
+        <w:t xml:space="preserve"> </w:t>
+      </w:r>
+      <w:r>
+        <w:t xml:space="preserve">compares each node's configured URL with the</w:t>
+      </w:r>
+      <w:r>
+        <w:t xml:space="preserve"> </w:t>
+      </w:r>
+      <w:r>
+        <w:rPr>
+          <w:rStyle w:val="VerbatimChar"/>
+        </w:rPr>
+        <w:t xml:space="preserve">requested_url</w:t>
+      </w:r>
+      <w:r>
+        <w:t xml:space="preserve"> </w:t>
+      </w:r>
+      <w:r>
+        <w:t xml:space="preserve">stored in its</w:t>
+      </w:r>
+      <w:r>
+        <w:t xml:space="preserve"> </w:t>
+      </w:r>
+      <w:r>
+        <w:t xml:space="preserve">evidence. When they differ, it prints a warning naming the node and both</w:t>
+      </w:r>
+      <w:r>
+        <w:t xml:space="preserve"> </w:t>
+      </w:r>
+      <w:r>
+        <w:t xml:space="preserve">addresses, adds an</w:t>
+      </w:r>
+      <w:r>
+        <w:t xml:space="preserve"> </w:t>
+      </w:r>
+      <w:r>
+        <w:rPr>
+          <w:b/>
+          <w:bCs/>
+        </w:rPr>
         <w:t xml:space="preserve">Evidence from a different URL</w:t>
       </w:r>
       <w:r>
@@ -4566,7 +4908,7 @@
         <w:rPr>
           <w:rStyle w:val="NormalTok"/>
         </w:rPr>
-        <w:t xml:space="preserve"> web-28</w:t>
+        <w:t xml:space="preserve"> web-31</w:t>
       </w:r>
     </w:p>
     <w:p>
@@ -4728,7 +5070,7 @@
         <w:t xml:space="preserve">web-10</w:t>
       </w:r>
       <w:r>
-        <w:t xml:space="preserve">, collected before CERN’s URL changed, needs its own node list</w:t>
+        <w:t xml:space="preserve">, collected before CERN's URL changed, needs its own node list</w:t>
       </w:r>
       <w:r>
         <w:t xml:space="preserve"> </w:t>
@@ -4844,7 +5186,7 @@
         <w:t xml:space="preserve"> </w:t>
       </w:r>
       <w:r>
-        <w:t xml:space="preserve">with 69 PASS, 0 FAIL and 61 MANUAL_REVIEW; and on 9 October 2026 for</w:t>
+        <w:t xml:space="preserve">with 69 PASS, 0 FAIL and 61 MANUAL_REVIEW; on 9 October 2026 for</w:t>
       </w:r>
       <w:r>
         <w:t xml:space="preserve"> </w:t>
@@ -4856,7 +5198,19 @@
         <w:t xml:space="preserve">web-28</w:t>
       </w:r>
       <w:r>
-        <w:t xml:space="preserve">, with 78 PASS, 4 FAIL and 68 MANUAL_REVIEW at depth 2. The reviewed run of 24 September that it replaced is in the git</w:t>
+        <w:t xml:space="preserve">, with 78 PASS, 4 FAIL and 68 MANUAL_REVIEW at depth 2; and on 19 October 2026 for</w:t>
+      </w:r>
+      <w:r>
+        <w:t xml:space="preserve"> </w:t>
+      </w:r>
+      <w:r>
+        <w:rPr>
+          <w:rStyle w:val="VerbatimChar"/>
+        </w:rPr>
+        <w:t xml:space="preserve">web-31</w:t>
+      </w:r>
+      <w:r>
+        <w:t xml:space="preserve">, with the same counts at depth 2. The reviewed run of 24 September that it replaced is in the git</w:t>
       </w:r>
       <w:r>
         <w:t xml:space="preserve"> </w:t>
@@ -4952,7 +5306,7 @@
         <w:t xml:space="preserve">--approved-names /tmp/names-before-2026-09-28.txt</w:t>
       </w:r>
       <w:r>
-        <w:t xml:space="preserve">. The full procedure, including how to publish the new node’s</w:t>
+        <w:t xml:space="preserve">. The full procedure, including how to publish the new node's</w:t>
       </w:r>
       <w:r>
         <w:t xml:space="preserve"> </w:t>
@@ -5139,8 +5493,8 @@
         <w:t xml:space="preserve">for the public address, or for the development host to allow the checker.</w:t>
       </w:r>
     </w:p>
-    <w:bookmarkEnd w:id="39"/>
-    <w:bookmarkStart w:id="40" w:name="checklistv3.2.yaml-the-rules"/>
+    <w:bookmarkEnd w:id="40"/>
+    <w:bookmarkStart w:id="41" w:name="checklistv32yaml--the-rules"/>
     <w:p>
       <w:pPr>
         <w:pStyle w:val="Heading3"/>
@@ -5306,7 +5660,7 @@
         <w:t xml:space="preserve"> </w:t>
       </w:r>
       <w:r>
-        <w:t xml:space="preserve">is that file’s hash, asserted by</w:t>
+        <w:t xml:space="preserve">is that file's hash, asserted by</w:t>
       </w:r>
       <w:r>
         <w:t xml:space="preserve"> </w:t>
@@ -5657,8 +6011,8 @@
         <w:t xml:space="preserve">section 11.</w:t>
       </w:r>
     </w:p>
-    <w:bookmarkEnd w:id="40"/>
-    <w:bookmarkStart w:id="47" w:name="the-approved-names-file---approved-names"/>
+    <w:bookmarkEnd w:id="41"/>
+    <w:bookmarkStart w:id="48" w:name="Xc146b4f82f74707b022a286a4e4575eddb27a27"/>
     <w:p>
       <w:pPr>
         <w:pStyle w:val="Heading3"/>
@@ -5920,7 +6274,7 @@
         <w:t xml:space="preserve">the names they think it did.</w:t>
       </w:r>
     </w:p>
-    <w:bookmarkStart w:id="41" w:name="which-list-is-used"/>
+    <w:bookmarkStart w:id="42" w:name="which-list-is-used"/>
     <w:p>
       <w:pPr>
         <w:pStyle w:val="Heading4"/>
@@ -6058,7 +6412,7 @@
               <w:pStyle w:val="Compact"/>
             </w:pPr>
             <w:r>
-              <w:t xml:space="preserve">none; point 3’s name half is not assessed</w:t>
+              <w:t xml:space="preserve">none; point 3's name half is not assessed</w:t>
             </w:r>
           </w:p>
         </w:tc>
@@ -6150,8 +6504,8 @@
         <w:t xml:space="preserve">.</w:t>
       </w:r>
     </w:p>
-    <w:bookmarkEnd w:id="41"/>
-    <w:bookmarkStart w:id="42" w:name="supplying-your-own-list"/>
+    <w:bookmarkEnd w:id="42"/>
+    <w:bookmarkStart w:id="43" w:name="supplying-your-own-list"/>
     <w:p>
       <w:pPr>
         <w:pStyle w:val="Heading4"/>
@@ -6282,28 +6636,13 @@
         <w:t xml:space="preserve"> </w:t>
       </w:r>
       <w:r>
-        <w:t xml:space="preserve">“this page shows this node’s approved name”</w:t>
-      </w:r>
-      <w:r>
-        <w:t xml:space="preserve"> </w:t>
-      </w:r>
-      <w:r>
-        <w:t xml:space="preserve">and the much weaker</w:t>
-      </w:r>
-      <w:r>
-        <w:t xml:space="preserve"> </w:t>
-      </w:r>
-      <w:r>
-        <w:t xml:space="preserve">“some approved</w:t>
-      </w:r>
-      <w:r>
-        <w:t xml:space="preserve"> </w:t>
-      </w:r>
-      <w:r>
-        <w:t xml:space="preserve">name appears somewhere on this page”</w:t>
-      </w:r>
-      <w:r>
-        <w:t xml:space="preserve">. The committed official list is</w:t>
+        <w:t xml:space="preserve">"this page shows this node's approved name" and the much weaker "some approved</w:t>
+      </w:r>
+      <w:r>
+        <w:t xml:space="preserve"> </w:t>
+      </w:r>
+      <w:r>
+        <w:t xml:space="preserve">name appears somewhere on this page". The committed official list is</w:t>
       </w:r>
       <w:r>
         <w:t xml:space="preserve"> </w:t>
@@ -6513,8 +6852,8 @@
         <w:t xml:space="preserve">is unaffected.</w:t>
       </w:r>
     </w:p>
-    <w:bookmarkEnd w:id="42"/>
-    <w:bookmarkStart w:id="43" w:name="how-a-name-is-matched"/>
+    <w:bookmarkEnd w:id="43"/>
+    <w:bookmarkStart w:id="44" w:name="how-a-name-is-matched"/>
     <w:p>
       <w:pPr>
         <w:pStyle w:val="Heading4"/>
@@ -6623,25 +6962,7 @@
               <w:t xml:space="preserve"> </w:t>
             </w:r>
             <w:r>
-              <w:t xml:space="preserve">matches</w:t>
-            </w:r>
-            <w:r>
-              <w:t xml:space="preserve"> </w:t>
-            </w:r>
-            <w:r>
-              <w:t xml:space="preserve">“the EGI Foundation”</w:t>
-            </w:r>
-            <w:r>
-              <w:t xml:space="preserve"> </w:t>
-            </w:r>
-            <w:r>
-              <w:t xml:space="preserve">but not</w:t>
-            </w:r>
-            <w:r>
-              <w:t xml:space="preserve"> </w:t>
-            </w:r>
-            <w:r>
-              <w:t xml:space="preserve">“strat</w:t>
+              <w:t xml:space="preserve">matches "the EGI Foundation" but not "strat</w:t>
             </w:r>
             <w:r>
               <w:rPr>
@@ -6651,10 +6972,7 @@
               <w:t xml:space="preserve">egi</w:t>
             </w:r>
             <w:r>
-              <w:t xml:space="preserve">c”</w:t>
-            </w:r>
-            <w:r>
-              <w:t xml:space="preserve">. A hyphen counts as part of a word, so</w:t>
+              <w:t xml:space="preserve">c". A hyphen counts as part of a word, so</w:t>
             </w:r>
             <w:r>
               <w:t xml:space="preserve"> </w:t>
@@ -7007,7 +7325,7 @@
         <w:t xml:space="preserve">&lt;title&gt;</w:t>
       </w:r>
       <w:r>
-        <w:t xml:space="preserve">. The EGI page’s title is</w:t>
+        <w:t xml:space="preserve">. The EGI page's title is</w:t>
       </w:r>
       <w:r>
         <w:t xml:space="preserve"> </w:t>
@@ -7088,13 +7406,7 @@
         <w:t xml:space="preserve"> </w:t>
       </w:r>
       <w:r>
-        <w:t xml:space="preserve">the list reported a match on the BBMRI-ERIC page (inside</w:t>
-      </w:r>
-      <w:r>
-        <w:t xml:space="preserve"> </w:t>
-      </w:r>
-      <w:r>
-        <w:t xml:space="preserve">“strat</w:t>
+        <w:t xml:space="preserve">the list reported a match on the BBMRI-ERIC page (inside "strat</w:t>
       </w:r>
       <w:r>
         <w:rPr>
@@ -7104,22 +7416,13 @@
         <w:t xml:space="preserve">egi</w:t>
       </w:r>
       <w:r>
-        <w:t xml:space="preserve">c”</w:t>
-      </w:r>
-      <w:r>
-        <w:t xml:space="preserve">) and</w:t>
-      </w:r>
-      <w:r>
-        <w:t xml:space="preserve"> </w:t>
-      </w:r>
-      <w:r>
-        <w:t xml:space="preserve">on Data Terra (inside</w:t>
-      </w:r>
-      <w:r>
-        <w:t xml:space="preserve"> </w:t>
-      </w:r>
-      <w:r>
-        <w:t xml:space="preserve">“Norw</w:t>
+        <w:t xml:space="preserve">c") and</w:t>
+      </w:r>
+      <w:r>
+        <w:t xml:space="preserve"> </w:t>
+      </w:r>
+      <w:r>
+        <w:t xml:space="preserve">on Data Terra (inside "Norw</w:t>
       </w:r>
       <w:r>
         <w:rPr>
@@ -7129,10 +7432,7 @@
         <w:t xml:space="preserve">egi</w:t>
       </w:r>
       <w:r>
-        <w:t xml:space="preserve">an”</w:t>
-      </w:r>
-      <w:r>
-        <w:t xml:space="preserve">). Neither page names the EGI node.</w:t>
+        <w:t xml:space="preserve">an"). Neither page names the EGI node.</w:t>
       </w:r>
     </w:p>
     <w:p>
@@ -7276,8 +7576,8 @@
         <w:t xml:space="preserve">matches none of the twelve.</w:t>
       </w:r>
     </w:p>
-    <w:bookmarkEnd w:id="43"/>
-    <w:bookmarkStart w:id="44" w:name="a-match-is-not-proof-of-the-right-name"/>
+    <w:bookmarkEnd w:id="44"/>
+    <w:bookmarkStart w:id="45" w:name="a-match-is-not-proof-of-the-right-name"/>
     <w:p>
       <w:pPr>
         <w:pStyle w:val="Heading4"/>
@@ -7304,7 +7604,7 @@
         <w:t xml:space="preserve">unscoped</w:t>
       </w:r>
       <w:r>
-        <w:t xml:space="preserve">: any name in it, matching anywhere in a page’s</w:t>
+        <w:t xml:space="preserve">: any name in it, matching anywhere in a page's</w:t>
       </w:r>
       <w:r>
         <w:t xml:space="preserve"> </w:t>
@@ -7332,13 +7632,13 @@
         <w:t xml:space="preserve"> </w:t>
       </w:r>
       <w:r>
-        <w:t xml:space="preserve">page’s own name. A node listing its partners</w:t>
-      </w:r>
-      <w:r>
-        <w:t xml:space="preserve"> </w:t>
-      </w:r>
-      <w:r>
-        <w:t xml:space="preserve">would match on a partner’s name.</w:t>
+        <w:t xml:space="preserve">page's own name. A node listing its partners</w:t>
+      </w:r>
+      <w:r>
+        <w:t xml:space="preserve"> </w:t>
+      </w:r>
+      <w:r>
+        <w:t xml:space="preserve">would match on a partner's name.</w:t>
       </w:r>
     </w:p>
     <w:p>
@@ -7547,11 +7847,11 @@
         <w:t xml:space="preserve"> </w:t>
       </w:r>
       <w:r>
-        <w:t xml:space="preserve">file’s header comment says the same thing.</w:t>
-      </w:r>
-    </w:p>
-    <w:bookmarkEnd w:id="44"/>
-    <w:bookmarkStart w:id="45" w:name="which-list-was-used-is-recorded"/>
+        <w:t xml:space="preserve">file's header comment says the same thing.</w:t>
+      </w:r>
+    </w:p>
+    <w:bookmarkEnd w:id="45"/>
+    <w:bookmarkStart w:id="46" w:name="which-list-was-used-is-recorded"/>
     <w:p>
       <w:pPr>
         <w:pStyle w:val="Heading4"/>
@@ -7636,8 +7936,8 @@
         <w:t xml:space="preserve"> checklist/approved-names.txt</w:t>
       </w:r>
     </w:p>
-    <w:bookmarkEnd w:id="45"/>
-    <w:bookmarkStart w:id="46" w:name="what-the-official-list-actually-finds"/>
+    <w:bookmarkEnd w:id="46"/>
+    <w:bookmarkStart w:id="47" w:name="what-the-official-list-actually-finds"/>
     <w:p>
       <w:pPr>
         <w:pStyle w:val="Heading4"/>
@@ -7916,16 +8216,7 @@
               <w:pStyle w:val="Compact"/>
             </w:pPr>
             <w:r>
-              <w:t xml:space="preserve">no match; the header logo reads</w:t>
-            </w:r>
-            <w:r>
-              <w:t xml:space="preserve"> </w:t>
-            </w:r>
-            <w:r>
-              <w:t xml:space="preserve">“EOSC Node | Poland”</w:t>
-            </w:r>
-            <w:r>
-              <w:t xml:space="preserve">, and the phrase</w:t>
+              <w:t xml:space="preserve">no match; the header logo reads "EOSC Node | Poland", and the phrase</w:t>
             </w:r>
             <w:r>
               <w:t xml:space="preserve"> </w:t>
@@ -8092,7 +8383,7 @@
         <w:t xml:space="preserve"> </w:t>
       </w:r>
       <w:r>
-        <w:t xml:space="preserve">the list’s own separator), Data Terra at its new address (</w:t>
+        <w:t xml:space="preserve">the list's own separator), Data Terra at its new address (</w:t>
       </w:r>
       <w:r>
         <w:rPr>
@@ -8248,52 +8539,55 @@
         <w:rPr>
           <w:rStyle w:val="VerbatimChar"/>
         </w:rPr>
+        <w:t xml:space="preserve">web-31</w:t>
+      </w:r>
+      <w:r>
+        <w:t xml:space="preserve"> </w:t>
+      </w:r>
+      <w:r>
+        <w:t xml:space="preserve">it was not. In</w:t>
+      </w:r>
+      <w:r>
+        <w:t xml:space="preserve"> </w:t>
+      </w:r>
+      <w:r>
+        <w:rPr>
+          <w:rStyle w:val="VerbatimChar"/>
+        </w:rPr>
         <w:t xml:space="preserve">web-28</w:t>
       </w:r>
       <w:r>
         <w:t xml:space="preserve"> </w:t>
       </w:r>
       <w:r>
-        <w:t xml:space="preserve">it was not. In</w:t>
-      </w:r>
-      <w:r>
-        <w:t xml:space="preserve"> </w:t>
-      </w:r>
-      <w:r>
-        <w:rPr>
-          <w:rStyle w:val="VerbatimChar"/>
-        </w:rPr>
-        <w:t xml:space="preserve">web-28</w:t>
-      </w:r>
-      <w:r>
-        <w:t xml:space="preserve"> </w:t>
-      </w:r>
-      <w:r>
         <w:t xml:space="preserve">(9 October 2026, fifteen</w:t>
       </w:r>
       <w:r>
         <w:t xml:space="preserve"> </w:t>
       </w:r>
       <w:r>
-        <w:t xml:space="preserve">names) the same eight match. Neither new node does: Life Sciences Connect’s</w:t>
-      </w:r>
-      <w:r>
-        <w:t xml:space="preserve"> </w:t>
-      </w:r>
-      <w:r>
-        <w:t xml:space="preserve">logo reads</w:t>
-      </w:r>
-      <w:r>
-        <w:t xml:space="preserve"> </w:t>
-      </w:r>
-      <w:r>
-        <w:t xml:space="preserve">“EOSC Node | Life Sciences Connect”</w:t>
-      </w:r>
-      <w:r>
-        <w:t xml:space="preserve"> </w:t>
-      </w:r>
-      <w:r>
-        <w:t xml:space="preserve">and the phrase</w:t>
+        <w:t xml:space="preserve">names) and</w:t>
+      </w:r>
+      <w:r>
+        <w:t xml:space="preserve"> </w:t>
+      </w:r>
+      <w:r>
+        <w:rPr>
+          <w:rStyle w:val="VerbatimChar"/>
+        </w:rPr>
+        <w:t xml:space="preserve">web-31</w:t>
+      </w:r>
+      <w:r>
+        <w:t xml:space="preserve"> </w:t>
+      </w:r>
+      <w:r>
+        <w:t xml:space="preserve">(19 October 2026) the same eight match. Neither new node does: Life Sciences Connect's</w:t>
+      </w:r>
+      <w:r>
+        <w:t xml:space="preserve"> </w:t>
+      </w:r>
+      <w:r>
+        <w:t xml:space="preserve">logo reads "EOSC Node | Life Sciences Connect" and the phrase</w:t>
       </w:r>
       <w:r>
         <w:t xml:space="preserve"> </w:t>
@@ -8314,25 +8608,13 @@
         <w:t xml:space="preserve"> </w:t>
       </w:r>
       <w:r>
-        <w:t xml:space="preserve">once in its text, but never followed by an approved name; EBRAINS-RI’s page</w:t>
-      </w:r>
-      <w:r>
-        <w:t xml:space="preserve"> </w:t>
-      </w:r>
-      <w:r>
-        <w:t xml:space="preserve">writes</w:t>
-      </w:r>
-      <w:r>
-        <w:t xml:space="preserve"> </w:t>
-      </w:r>
-      <w:r>
-        <w:t xml:space="preserve">“EBRAINS RI”</w:t>
-      </w:r>
-      <w:r>
-        <w:t xml:space="preserve"> </w:t>
-      </w:r>
-      <w:r>
-        <w:t xml:space="preserve">without</w:t>
+        <w:t xml:space="preserve">once in its text, but never followed by an approved name; EBRAINS-RI's page</w:t>
+      </w:r>
+      <w:r>
+        <w:t xml:space="preserve"> </w:t>
+      </w:r>
+      <w:r>
+        <w:t xml:space="preserve">writes "EBRAINS RI" without</w:t>
       </w:r>
       <w:r>
         <w:t xml:space="preserve"> </w:t>
@@ -8352,43 +8634,19 @@
         <w:pStyle w:val="BodyText"/>
       </w:pPr>
       <w:r>
-        <w:t xml:space="preserve">CERN’s new page shows</w:t>
-      </w:r>
-      <w:r>
-        <w:t xml:space="preserve"> </w:t>
-      </w:r>
-      <w:r>
-        <w:t xml:space="preserve">“EOSC Node | CERN”</w:t>
-      </w:r>
-      <w:r>
-        <w:t xml:space="preserve"> </w:t>
-      </w:r>
-      <w:r>
-        <w:t xml:space="preserve">only in its logo image, which is not</w:t>
-      </w:r>
-      <w:r>
-        <w:t xml:space="preserve"> </w:t>
-      </w:r>
-      <w:r>
-        <w:t xml:space="preserve">text; its previous URL, a sign-in endpoint, had almost nothing to match against. Italy’s page shows</w:t>
-      </w:r>
-      <w:r>
-        <w:t xml:space="preserve"> </w:t>
-      </w:r>
-      <w:r>
-        <w:t xml:space="preserve">“EOSC Node | Italy”</w:t>
-      </w:r>
-      <w:r>
-        <w:t xml:space="preserve"> </w:t>
-      </w:r>
-      <w:r>
-        <w:t xml:space="preserve">in its</w:t>
-      </w:r>
-      <w:r>
-        <w:t xml:space="preserve"> </w:t>
-      </w:r>
-      <w:r>
-        <w:t xml:space="preserve">logo image, which is not text. GÉANT’s page, when served on 24 September, wrote</w:t>
+        <w:t xml:space="preserve">CERN's new page shows "EOSC Node | CERN" only in its logo image, which is not</w:t>
+      </w:r>
+      <w:r>
+        <w:t xml:space="preserve"> </w:t>
+      </w:r>
+      <w:r>
+        <w:t xml:space="preserve">text; its previous URL, a sign-in endpoint, had almost nothing to match against. Italy's page shows "EOSC Node | Italy" in its</w:t>
+      </w:r>
+      <w:r>
+        <w:t xml:space="preserve"> </w:t>
+      </w:r>
+      <w:r>
+        <w:t xml:space="preserve">logo image, which is not text. GÉANT's page, when served on 24 September, wrote</w:t>
       </w:r>
       <w:r>
         <w:t xml:space="preserve"> </w:t>
@@ -8489,7 +8747,7 @@
         <w:t xml:space="preserve"> </w:t>
       </w:r>
       <w:r>
-        <w:t xml:space="preserve">list is out of date. Deciding which is the reviewer’s job; the tool’s job is to</w:t>
+        <w:t xml:space="preserve">list is out of date. Deciding which is the reviewer's job; the tool's job is to</w:t>
       </w:r>
       <w:r>
         <w:t xml:space="preserve"> </w:t>
@@ -8539,7 +8797,7 @@
         <w:t xml:space="preserve"> </w:t>
       </w:r>
       <w:r>
-        <w:t xml:space="preserve">in that node’s evidence</w:t>
+        <w:t xml:space="preserve">in that node's evidence</w:t>
       </w:r>
       <w:r>
         <w:t xml:space="preserve"> </w:t>
@@ -8548,9 +8806,9 @@
         <w:t xml:space="preserve">file before assuming the page is at fault.</w:t>
       </w:r>
     </w:p>
-    <w:bookmarkEnd w:id="46"/>
     <w:bookmarkEnd w:id="47"/>
-    <w:bookmarkStart w:id="48" w:name="adding-a-node"/>
+    <w:bookmarkEnd w:id="48"/>
+    <w:bookmarkStart w:id="49" w:name="adding-a-node"/>
     <w:p>
       <w:pPr>
         <w:pStyle w:val="Heading3"/>
@@ -8643,19 +8901,13 @@
         <w:t xml:space="preserve"> </w:t>
       </w:r>
       <w:r>
-        <w:t xml:space="preserve">field</w:t>
-      </w:r>
-      <w:r>
-        <w:t xml:space="preserve"> </w:t>
-      </w:r>
-      <w:r>
-        <w:t xml:space="preserve">“Website address”</w:t>
-      </w:r>
-      <w:r>
-        <w:t xml:space="preserve"> </w:t>
-      </w:r>
-      <w:r>
-        <w:t xml:space="preserve">(section 1.2, field 6), not from a search engine and not from the node’s</w:t>
+        <w:t xml:space="preserve">field "Website address"</w:t>
+      </w:r>
+      <w:r>
+        <w:t xml:space="preserve"> </w:t>
+      </w:r>
+      <w:r>
+        <w:t xml:space="preserve">(section 1.2, field 6), not from a search engine and not from the node's</w:t>
       </w:r>
       <w:r>
         <w:t xml:space="preserve"> </w:t>
@@ -8701,7 +8953,7 @@
       <w:r>
         <w:t xml:space="preserve"> </w:t>
       </w:r>
-      <w:hyperlink r:id="rId37">
+      <w:hyperlink r:id="rId38">
         <w:r>
           <w:rPr>
             <w:rStyle w:val="Hyperlink"/>
@@ -8713,7 +8965,7 @@
         <w:t xml:space="preserve"> </w:t>
       </w:r>
       <w:r>
-        <w:t xml:space="preserve">and copy the slug. Do not guess it from the node’s name: the slugs are not</w:t>
+        <w:t xml:space="preserve">and copy the slug. Do not guess it from the node's name: the slugs are not</w:t>
       </w:r>
       <w:r>
         <w:t xml:space="preserve"> </w:t>
@@ -8803,7 +9055,7 @@
         <w:t xml:space="preserve"> </w:t>
       </w:r>
       <w:r>
-        <w:t xml:space="preserve">— add the node’s approved name, exactly as</w:t>
+        <w:t xml:space="preserve">— add the node's approved name, exactly as</w:t>
       </w:r>
       <w:r>
         <w:t xml:space="preserve"> </w:t>
@@ -8818,7 +9070,7 @@
         <w:rPr>
           <w:rStyle w:val="VerbatimChar"/>
         </w:rPr>
-        <w:t xml:space="preserve">EOSC Node |</w:t>
+        <w:t xml:space="preserve">EOSC Node | </w:t>
       </w:r>
       <w:r>
         <w:t xml:space="preserve"> </w:t>
@@ -9044,7 +9296,7 @@
         <w:t xml:space="preserve"> </w:t>
       </w:r>
       <w:r>
-        <w:t xml:space="preserve">or that points at the federation index rather than the node’s own</w:t>
+        <w:t xml:space="preserve">or that points at the federation index rather than the node's own</w:t>
       </w:r>
       <w:r>
         <w:t xml:space="preserve"> </w:t>
@@ -9299,8 +9551,8 @@
         <w:t xml:space="preserve">unless you intend to publish a partial one and say so.</w:t>
       </w:r>
     </w:p>
-    <w:bookmarkEnd w:id="48"/>
-    <w:bookmarkStart w:id="49" w:name="X84bdf4d6d4e37947911920c44f1c0e29ac695a1"/>
+    <w:bookmarkEnd w:id="49"/>
+    <w:bookmarkStart w:id="50" w:name="X84bdf4d6d4e37947911920c44f1c0e29ac695a1"/>
     <w:p>
       <w:pPr>
         <w:pStyle w:val="Heading3"/>
@@ -9470,7 +9722,7 @@
         <w:t xml:space="preserve"> </w:t>
       </w:r>
       <w:r>
-        <w:t xml:space="preserve">fetching other organisations’ production websites on a timer.</w:t>
+        <w:t xml:space="preserve">fetching other organisations' production websites on a timer.</w:t>
       </w:r>
     </w:p>
     <w:p>
@@ -9497,7 +9749,7 @@
         <w:t xml:space="preserve"> </w:t>
       </w:r>
       <w:r>
-        <w:t xml:space="preserve">directory is this repository’s published output. A</w:t>
+        <w:t xml:space="preserve">directory is this repository's published output. A</w:t>
       </w:r>
       <w:r>
         <w:t xml:space="preserve"> </w:t>
@@ -9525,9 +9777,9 @@
         </w:pict>
       </w:r>
     </w:p>
-    <w:bookmarkEnd w:id="49"/>
     <w:bookmarkEnd w:id="50"/>
-    <w:bookmarkStart w:id="59" w:name="running-it"/>
+    <w:bookmarkEnd w:id="51"/>
+    <w:bookmarkStart w:id="60" w:name="X685e14c5476d1631112074ccb73d9ddb4da6e0f"/>
     <w:p>
       <w:pPr>
         <w:pStyle w:val="Heading2"/>
@@ -9573,7 +9825,7 @@
         <w:t xml:space="preserve">requests.</w:t>
       </w:r>
     </w:p>
-    <w:bookmarkStart w:id="51" w:name="the-commands"/>
+    <w:bookmarkStart w:id="52" w:name="the-commands"/>
     <w:p>
       <w:pPr>
         <w:pStyle w:val="Heading3"/>
@@ -9689,8 +9941,8 @@
         <w:t xml:space="preserve"># one node's results in the terminal</w:t>
       </w:r>
     </w:p>
-    <w:bookmarkEnd w:id="51"/>
-    <w:bookmarkStart w:id="52" w:name="listing-the-configuration"/>
+    <w:bookmarkEnd w:id="52"/>
+    <w:bookmarkStart w:id="53" w:name="listing-the-configuration"/>
     <w:p>
       <w:pPr>
         <w:pStyle w:val="Heading3"/>
@@ -10186,19 +10438,19 @@
         <w:t xml:space="preserve"> </w:t>
       </w:r>
       <w:r>
-        <w:t xml:space="preserve">nodes.yaml; approved names from checklist/approved-names-scoped.txt.” and</w:t>
-      </w:r>
-      <w:r>
-        <w:t xml:space="preserve"> </w:t>
-      </w:r>
-      <w:r>
-        <w:t xml:space="preserve">“assess and run use checklist/approved-names.txt by default: the same names,</w:t>
-      </w:r>
-      <w:r>
-        <w:t xml:space="preserve"> </w:t>
-      </w:r>
-      <w:r>
-        <w:t xml:space="preserve">unscoped, so each counts for every node.”</w:t>
+        <w:t xml:space="preserve">nodes.yaml; approved names from checklist/approved-names-scoped.txt." and</w:t>
+      </w:r>
+      <w:r>
+        <w:t xml:space="preserve"> </w:t>
+      </w:r>
+      <w:r>
+        <w:t xml:space="preserve">"assess and run use checklist/approved-names.txt by default: the same names,</w:t>
+      </w:r>
+      <w:r>
+        <w:t xml:space="preserve"> </w:t>
+      </w:r>
+      <w:r>
+        <w:t xml:space="preserve">unscoped, so each counts for every node."</w:t>
       </w:r>
     </w:p>
     <w:p>
@@ -10269,7 +10521,7 @@
         <w:t xml:space="preserve">EOSC Node Italy</w:t>
       </w:r>
       <w:r>
-        <w:t xml:space="preserve">), and prints that node’s row of the</w:t>
+        <w:t xml:space="preserve">), and prints that node's row of the</w:t>
       </w:r>
       <w:r>
         <w:t xml:space="preserve"> </w:t>
@@ -10577,8 +10829,8 @@
         <w:t xml:space="preserve">the next run will check.</w:t>
       </w:r>
     </w:p>
-    <w:bookmarkEnd w:id="52"/>
-    <w:bookmarkStart w:id="53" w:name="useful-options"/>
+    <w:bookmarkEnd w:id="53"/>
+    <w:bookmarkStart w:id="54" w:name="useful-options"/>
     <w:p>
       <w:pPr>
         <w:pStyle w:val="Heading3"/>
@@ -11203,7 +11455,7 @@
               <w:t xml:space="preserve">--url</w:t>
             </w:r>
             <w:r>
-              <w:t xml:space="preserve">: that node’s own</w:t>
+              <w:t xml:space="preserve">: that node's own</w:t>
             </w:r>
             <w:r>
               <w:t xml:space="preserve"> </w:t>
@@ -11230,7 +11482,7 @@
               <w:t xml:space="preserve">--node</w:t>
             </w:r>
             <w:r>
-              <w:t xml:space="preserve">, replaces that node’s configured one.</w:t>
+              <w:t xml:space="preserve">, replaces that node's configured one.</w:t>
             </w:r>
           </w:p>
         </w:tc>
@@ -11466,7 +11718,7 @@
               <w:pStyle w:val="Compact"/>
             </w:pPr>
             <w:r>
-              <w:t xml:space="preserve">Use no name list at all, not even the committed default. Point 3’s name requirement is then not assessed.</w:t>
+              <w:t xml:space="preserve">Use no name list at all, not even the committed default. Point 3's name requirement is then not assessed.</w:t>
             </w:r>
           </w:p>
         </w:tc>
@@ -11764,8 +12016,8 @@
         </w:tc>
       </w:tr>
     </w:tbl>
-    <w:bookmarkEnd w:id="53"/>
-    <w:bookmarkStart w:id="54" w:name="only-narrows-the-fetch-not-the-report"/>
+    <w:bookmarkEnd w:id="54"/>
+    <w:bookmarkStart w:id="55" w:name="X554c04b9c5f94e8928b231e8c7ee7978c23d680"/>
     <w:p>
       <w:pPr>
         <w:pStyle w:val="Heading3"/>
@@ -12378,8 +12630,8 @@
         <w:t xml:space="preserve"> run basic-check assess</w:t>
       </w:r>
     </w:p>
-    <w:bookmarkEnd w:id="54"/>
-    <w:bookmarkStart w:id="55" w:name="skip-leaves-nodes-out-and-says-so"/>
+    <w:bookmarkEnd w:id="55"/>
+    <w:bookmarkStart w:id="56" w:name="X68450229b7899696107d4f9a0d6edfeb9b31753"/>
     <w:p>
       <w:pPr>
         <w:pStyle w:val="Heading3"/>
@@ -12448,22 +12700,13 @@
         <w:t xml:space="preserve"> </w:t>
       </w:r>
       <w:r>
-        <w:t xml:space="preserve">names</w:t>
-      </w:r>
-      <w:r>
-        <w:t xml:space="preserve"> </w:t>
-      </w:r>
-      <w:r>
-        <w:t xml:space="preserve">“EOSC Node</w:t>
-      </w:r>
-      <w:r>
-        <w:t xml:space="preserve"> </w:t>
-      </w:r>
-      <w:r>
-        <w:t xml:space="preserve">Italy”</w:t>
-      </w:r>
-      <w:r>
-        <w:t xml:space="preserve">:</w:t>
+        <w:t xml:space="preserve">names "EOSC Node</w:t>
+      </w:r>
+      <w:r>
+        <w:t xml:space="preserve"> </w:t>
+      </w:r>
+      <w:r>
+        <w:t xml:space="preserve">Italy":</w:t>
       </w:r>
     </w:p>
     <w:p>
@@ -12958,8 +13201,8 @@
         <w:t xml:space="preserve">fetches EUDAT alone.</w:t>
       </w:r>
     </w:p>
-    <w:bookmarkEnd w:id="55"/>
-    <w:bookmarkStart w:id="56" w:name="checking-a-page-not-in-nodes.yaml"/>
+    <w:bookmarkEnd w:id="56"/>
+    <w:bookmarkStart w:id="57" w:name="checking-a-page-not-in-nodesyaml"/>
     <w:p>
       <w:pPr>
         <w:pStyle w:val="Heading3"/>
@@ -13047,14 +13290,14 @@
         <w:t xml:space="preserve">stray single-page file that looks official is a genuine hazard.</w:t>
       </w:r>
     </w:p>
-    <w:bookmarkEnd w:id="56"/>
-    <w:bookmarkStart w:id="57" w:name="Xff864b2a738710e69d56a09dc1146f678e1e3b2"/>
+    <w:bookmarkEnd w:id="57"/>
+    <w:bookmarkStart w:id="58" w:name="Xff864b2a738710e69d56a09dc1146f678e1e3b2"/>
     <w:p>
       <w:pPr>
         <w:pStyle w:val="Heading3"/>
       </w:pPr>
       <w:r>
-        <w:t xml:space="preserve">Updating one node’s row:</w:t>
+        <w:t xml:space="preserve">Updating one node's row:</w:t>
       </w:r>
       <w:r>
         <w:t xml:space="preserve"> </w:t>
@@ -13071,7 +13314,7 @@
         <w:pStyle w:val="FirstParagraph"/>
       </w:pPr>
       <w:r>
-        <w:t xml:space="preserve">After a node’s URL changes, or when one node’s page has been fixed, there is no</w:t>
+        <w:t xml:space="preserve">After a node's URL changes, or when one node's page has been fixed, there is no</w:t>
       </w:r>
       <w:r>
         <w:t xml:space="preserve"> </w:t>
@@ -13206,7 +13449,7 @@
               <w:pStyle w:val="Compact"/>
             </w:pPr>
             <w:r>
-              <w:t xml:space="preserve">Fetches that one page again, into a scratch directory. Only if the page loaded does it replace the node’s evidence and screenshot, and its row.</w:t>
+              <w:t xml:space="preserve">Fetches that one page again, into a scratch directory. Only if the page loaded does it replace the node's evidence and screenshot, and its row.</w:t>
             </w:r>
             <w:r>
               <w:t xml:space="preserve"> </w:t>
@@ -13248,7 +13491,7 @@
               <w:pStyle w:val="Compact"/>
             </w:pPr>
             <w:r>
-              <w:t xml:space="preserve">Judges the node’s evidence already in</w:t>
+              <w:t xml:space="preserve">Judges the node's evidence already in</w:t>
             </w:r>
             <w:r>
               <w:t xml:space="preserve"> </w:t>
@@ -13322,7 +13565,7 @@
         <w:t xml:space="preserve"> </w:t>
       </w:r>
       <w:r>
-        <w:t xml:space="preserve">stored rows, and the command prints each point’s old and new verdict.</w:t>
+        <w:t xml:space="preserve">stored rows, and the command prints each point's old and new verdict.</w:t>
       </w:r>
       <w:r>
         <w:t xml:space="preserve"> </w:t>
@@ -13409,7 +13652,7 @@
         <w:t xml:space="preserve"> </w:t>
       </w:r>
       <w:r>
-        <w:t xml:space="preserve">list with the node’s previous URL, capture time and</w:t>
+        <w:t xml:space="preserve">list with the node's previous URL, capture time and</w:t>
       </w:r>
       <w:r>
         <w:t xml:space="preserve"> </w:t>
@@ -13746,8 +13989,8 @@
         <w:t xml:space="preserve"> /tmp/copy</w:t>
       </w:r>
     </w:p>
-    <w:bookmarkEnd w:id="57"/>
-    <w:bookmarkStart w:id="58" w:name="checking-a-node-at-an-alternative-url"/>
+    <w:bookmarkEnd w:id="58"/>
+    <w:bookmarkStart w:id="59" w:name="checking-a-node-at-an-alternative-url"/>
     <w:p>
       <w:pPr>
         <w:pStyle w:val="Heading3"/>
@@ -14192,7 +14435,7 @@
               <w:t xml:space="preserve"> </w:t>
             </w:r>
             <w:r>
-              <w:t xml:space="preserve">replaces the node’s</w:t>
+              <w:t xml:space="preserve">replaces the node's</w:t>
             </w:r>
             <w:r>
               <w:t xml:space="preserve"> </w:t>
@@ -14375,7 +14618,7 @@
         <w:pStyle w:val="BodyText"/>
       </w:pPr>
       <w:r>
-        <w:t xml:space="preserve">This is the way to try a node’s new address before changing</w:t>
+        <w:t xml:space="preserve">This is the way to try a node's new address before changing</w:t>
       </w:r>
       <w:r>
         <w:t xml:space="preserve"> </w:t>
@@ -14414,9 +14657,9 @@
         </w:pict>
       </w:r>
     </w:p>
-    <w:bookmarkEnd w:id="58"/>
     <w:bookmarkEnd w:id="59"/>
-    <w:bookmarkStart w:id="61" w:name="how-deep-to-go---depth"/>
+    <w:bookmarkEnd w:id="60"/>
+    <w:bookmarkStart w:id="62" w:name="X7cf5a1e9623dd54905417df66d4a360904ae2c8"/>
     <w:p>
       <w:pPr>
         <w:pStyle w:val="Heading2"/>
@@ -15035,25 +15278,13 @@
         <w:t xml:space="preserve"> </w:t>
       </w:r>
       <w:r>
-        <w:t xml:space="preserve">judgement (</w:t>
-      </w:r>
-      <w:r>
-        <w:t xml:space="preserve">“clearly state”</w:t>
-      </w:r>
-      <w:r>
-        <w:t xml:space="preserve">) or quantify over things no crawl enumerates (</w:t>
-      </w:r>
-      <w:r>
-        <w:t xml:space="preserve">“all</w:t>
-      </w:r>
-      <w:r>
-        <w:t xml:space="preserve"> </w:t>
-      </w:r>
-      <w:r>
-        <w:t xml:space="preserve">research resources offered by the Node”</w:t>
-      </w:r>
-      <w:r>
-        <w:t xml:space="preserve">), and no amount of fetching settles</w:t>
+        <w:t xml:space="preserve">judgement ("clearly state") or quantify over things no crawl enumerates ("all</w:t>
+      </w:r>
+      <w:r>
+        <w:t xml:space="preserve"> </w:t>
+      </w:r>
+      <w:r>
+        <w:t xml:space="preserve">research resources offered by the Node"), and no amount of fetching settles</w:t>
       </w:r>
       <w:r>
         <w:t xml:space="preserve"> </w:t>
@@ -15167,16 +15398,7 @@
         <w:t xml:space="preserve"> </w:t>
       </w:r>
       <w:r>
-        <w:t xml:space="preserve">verdicts changed (52 PASS, 10 FAIL, 68 review at both depths). That run also looked for services and policies pages at the second hop, which used the whole fetch budget before Italy and Slovakia were reached; since then those pages are looked for on the landing page only, as</w:t>
-      </w:r>
-      <w:r>
-        <w:t xml:space="preserve"> </w:t>
-      </w:r>
-      <w:r>
-        <w:t xml:space="preserve">“pages linked by the NLP”</w:t>
-      </w:r>
-      <w:r>
-        <w:t xml:space="preserve">, and the second hop follows policy links alone.</w:t>
+        <w:t xml:space="preserve">verdicts changed (52 PASS, 10 FAIL, 68 review at both depths). That run also looked for services and policies pages at the second hop, which used the whole fetch budget before Italy and Slovakia were reached; since then those pages are looked for on the landing page only, as "pages linked by the NLP", and the second hop follows policy links alone.</w:t>
       </w:r>
       <w:r>
         <w:t xml:space="preserve"> </w:t>
@@ -15725,13 +15947,13 @@
         <w:t xml:space="preserve">another federation or a later date.</w:t>
       </w:r>
     </w:p>
-    <w:bookmarkStart w:id="60" w:name="X2a91d9b1ee4bf6327b51d59c91d7740875558d5"/>
+    <w:bookmarkStart w:id="61" w:name="X2a91d9b1ee4bf6327b51d59c91d7740875558d5"/>
     <w:p>
       <w:pPr>
         <w:pStyle w:val="Heading3"/>
       </w:pPr>
       <w:r>
-        <w:t xml:space="preserve">Be considerate with other people’s servers</w:t>
+        <w:t xml:space="preserve">Be considerate with other people's servers</w:t>
       </w:r>
     </w:p>
     <w:p>
@@ -15888,7 +16110,7 @@
         <w:t xml:space="preserve">checking</w:t>
       </w:r>
       <w:r>
-        <w:t xml:space="preserve">, and the block tracks the requesting address rather than the tool’s</w:t>
+        <w:t xml:space="preserve">, and the block tracks the requesting address rather than the tool's</w:t>
       </w:r>
       <w:r>
         <w:t xml:space="preserve"> </w:t>
@@ -15922,9 +16144,9 @@
         </w:pict>
       </w:r>
     </w:p>
-    <w:bookmarkEnd w:id="60"/>
     <w:bookmarkEnd w:id="61"/>
-    <w:bookmarkStart w:id="65" w:name="reading-the-output"/>
+    <w:bookmarkEnd w:id="62"/>
+    <w:bookmarkStart w:id="66" w:name="X20230d89ad096c6409926418866ff11e40ef490"/>
     <w:p>
       <w:pPr>
         <w:pStyle w:val="Heading2"/>
@@ -16231,7 +16453,7 @@
         </w:tc>
       </w:tr>
     </w:tbl>
-    <w:bookmarkStart w:id="62" w:name="the-four-verdicts"/>
+    <w:bookmarkStart w:id="63" w:name="the-four-verdicts"/>
     <w:p>
       <w:pPr>
         <w:pStyle w:val="Heading3"/>
@@ -16454,7 +16676,7 @@
         <w:t xml:space="preserve"> </w:t>
       </w:r>
       <w:r>
-        <w:t xml:space="preserve">crawlers to stay away and the tool complied. The reason is in each cell’s</w:t>
+        <w:t xml:space="preserve">crawlers to stay away and the tool complied. The reason is in each cell's</w:t>
       </w:r>
       <w:r>
         <w:t xml:space="preserve"> </w:t>
@@ -16532,7 +16754,7 @@
         <w:t xml:space="preserve">ERROR</w:t>
       </w:r>
       <w:r>
-        <w:t xml:space="preserve">. On the 25 September trial, BBMRI-ERIC’s new</w:t>
+        <w:t xml:space="preserve">. On the 25 September trial, BBMRI-ERIC's new</w:t>
       </w:r>
       <w:r>
         <w:t xml:space="preserve"> </w:t>
@@ -16619,31 +16841,13 @@
         <w:t xml:space="preserve"> </w:t>
       </w:r>
       <w:r>
-        <w:t xml:space="preserve">returns review rather than FAIL. The point is that</w:t>
-      </w:r>
-      <w:r>
-        <w:t xml:space="preserve"> </w:t>
-      </w:r>
-      <w:r>
-        <w:t xml:space="preserve">“we found no contact link”</w:t>
-      </w:r>
-      <w:r>
-        <w:t xml:space="preserve"> </w:t>
-      </w:r>
-      <w:r>
-        <w:t xml:space="preserve">and</w:t>
-      </w:r>
-      <w:r>
-        <w:t xml:space="preserve"> </w:t>
-      </w:r>
-      <w:r>
-        <w:t xml:space="preserve">“the page did not load for us”</w:t>
-      </w:r>
-      <w:r>
-        <w:t xml:space="preserve"> </w:t>
-      </w:r>
-      <w:r>
-        <w:t xml:space="preserve">must not produce the same verdict.</w:t>
+        <w:t xml:space="preserve">returns review rather than FAIL. The point is that "we found no contact link" and</w:t>
+      </w:r>
+      <w:r>
+        <w:t xml:space="preserve"> </w:t>
+      </w:r>
+      <w:r>
+        <w:t xml:space="preserve">"the page did not load for us" must not produce the same verdict.</w:t>
       </w:r>
     </w:p>
     <w:p>
@@ -16651,7 +16855,7 @@
         <w:pStyle w:val="BodyText"/>
       </w:pPr>
       <w:r>
-        <w:t xml:space="preserve">The same restraint applies to being blocked. GÉANT’s</w:t>
+        <w:t xml:space="preserve">The same restraint applies to being blocked. GÉANT's</w:t>
       </w:r>
       <w:r>
         <w:t xml:space="preserve"> </w:t>
@@ -16705,8 +16909,8 @@
         <w:t xml:space="preserve">26 September, and the same four cells are review there.</w:t>
       </w:r>
     </w:p>
-    <w:bookmarkEnd w:id="62"/>
-    <w:bookmarkStart w:id="63" w:name="reproducing-a-verdict-by-hand"/>
+    <w:bookmarkEnd w:id="63"/>
+    <w:bookmarkStart w:id="64" w:name="reproducing-a-verdict-by-hand"/>
     <w:p>
       <w:pPr>
         <w:pStyle w:val="Heading3"/>
@@ -16890,8 +17094,8 @@
         <w:t xml:space="preserve">a verdict surprises you.</w:t>
       </w:r>
     </w:p>
-    <w:bookmarkEnd w:id="63"/>
-    <w:bookmarkStart w:id="64" w:name="personal-data-is-masked"/>
+    <w:bookmarkEnd w:id="64"/>
+    <w:bookmarkStart w:id="65" w:name="personal-data-is-masked"/>
     <w:p>
       <w:pPr>
         <w:pStyle w:val="Heading3"/>
@@ -17509,76 +17713,379 @@
         <w:rPr>
           <w:rStyle w:val="VerbatimChar"/>
         </w:rPr>
+        <w:t xml:space="preserve">web-31</w:t>
+      </w:r>
+      <w:r>
+        <w:t xml:space="preserve"> </w:t>
+      </w:r>
+      <w:r>
+        <w:t xml:space="preserve">(19 October 2026) was collected</w:t>
+      </w:r>
+      <w:r>
+        <w:t xml:space="preserve"> </w:t>
+      </w:r>
+      <w:r>
+        <w:t xml:space="preserve">with masking in place, and a search of all its evidence and reports found no</w:t>
+      </w:r>
+      <w:r>
+        <w:t xml:space="preserve"> </w:t>
+      </w:r>
+      <w:r>
+        <w:t xml:space="preserve">personal address or phone number. Two personal names that the masking does not cover were removed by hand from the evidence, each replaced by a placeholder of the same length so every character count and verdict stays as collected: a quotation attribution on CERN's page (in</w:t>
+      </w:r>
+      <w:r>
+        <w:t xml:space="preserve"> </w:t>
+      </w:r>
+      <w:r>
+        <w:rPr>
+          <w:rStyle w:val="VerbatimChar"/>
+        </w:rPr>
+        <w:t xml:space="preserve">cern.json</w:t>
+      </w:r>
+      <w:r>
+        <w:t xml:space="preserve"> </w:t>
+      </w:r>
+      <w:r>
+        <w:t xml:space="preserve">and in its screenshot) and the node coordinator named on EGI's page (in</w:t>
+      </w:r>
+      <w:r>
+        <w:t xml:space="preserve"> </w:t>
+      </w:r>
+      <w:r>
+        <w:rPr>
+          <w:rStyle w:val="VerbatimChar"/>
+        </w:rPr>
+        <w:t xml:space="preserve">egi.json</w:t>
+      </w:r>
+      <w:r>
+        <w:t xml:space="preserve">, in the link text and, since</w:t>
+      </w:r>
+      <w:r>
+        <w:t xml:space="preserve"> </w:t>
+      </w:r>
+      <w:r>
+        <w:rPr>
+          <w:rStyle w:val="VerbatimChar"/>
+        </w:rPr>
+        <w:t xml:space="preserve">web-12</w:t>
+      </w:r>
+      <w:r>
+        <w:t xml:space="preserve">, also in the link's address,</w:t>
+      </w:r>
+      <w:r>
+        <w:t xml:space="preserve"> </w:t>
+      </w:r>
+      <w:r>
+        <w:rPr>
+          <w:rStyle w:val="VerbatimChar"/>
+        </w:rPr>
+        <w:t xml:space="preserve">/person/…/</w:t>
+      </w:r>
+      <w:r>
+        <w:t xml:space="preserve">, which earlier published runs still carried). The second hop of</w:t>
+      </w:r>
+      <w:r>
+        <w:t xml:space="preserve"> </w:t>
+      </w:r>
+      <w:r>
+        <w:rPr>
+          <w:rStyle w:val="VerbatimChar"/>
+        </w:rPr>
+        <w:t xml:space="preserve">web-13</w:t>
+      </w:r>
+      <w:r>
+        <w:t xml:space="preserve"> </w:t>
+      </w:r>
+      <w:r>
+        <w:t xml:space="preserve">added a third: a person quoted in a news item on a Czechia page reached only at depth 2 (in</w:t>
+      </w:r>
+      <w:r>
+        <w:t xml:space="preserve"> </w:t>
+      </w:r>
+      <w:r>
+        <w:rPr>
+          <w:rStyle w:val="VerbatimChar"/>
+        </w:rPr>
+        <w:t xml:space="preserve">eosc-cz.json</w:t>
+      </w:r>
+      <w:r>
+        <w:t xml:space="preserve">, in the quotation and in the address of the interview it links to).</w:t>
+      </w:r>
+      <w:r>
+        <w:t xml:space="preserve"> </w:t>
+      </w:r>
+      <w:r>
+        <w:rPr>
+          <w:rStyle w:val="VerbatimChar"/>
+        </w:rPr>
+        <w:t xml:space="preserve">web-14</w:t>
+      </w:r>
+      <w:r>
+        <w:t xml:space="preserve">, which also reads services and policies pages, added many more, and</w:t>
+      </w:r>
+      <w:r>
+        <w:t xml:space="preserve"> </w:t>
+      </w:r>
+      <w:r>
+        <w:rPr>
+          <w:rStyle w:val="VerbatimChar"/>
+        </w:rPr>
+        <w:t xml:space="preserve">web-15</w:t>
+      </w:r>
+      <w:r>
+        <w:t xml:space="preserve">,</w:t>
+      </w:r>
+      <w:r>
+        <w:t xml:space="preserve"> </w:t>
+      </w:r>
+      <w:r>
+        <w:rPr>
+          <w:rStyle w:val="VerbatimChar"/>
+        </w:rPr>
+        <w:t xml:space="preserve">web-16</w:t>
+      </w:r>
+      <w:r>
+        <w:t xml:space="preserve">,</w:t>
+      </w:r>
+      <w:r>
+        <w:t xml:space="preserve"> </w:t>
+      </w:r>
+      <w:r>
+        <w:rPr>
+          <w:rStyle w:val="VerbatimChar"/>
+        </w:rPr>
+        <w:t xml:space="preserve">web-18</w:t>
+      </w:r>
+      <w:r>
+        <w:t xml:space="preserve">,</w:t>
+      </w:r>
+      <w:r>
+        <w:t xml:space="preserve"> </w:t>
+      </w:r>
+      <w:r>
+        <w:rPr>
+          <w:rStyle w:val="VerbatimChar"/>
+        </w:rPr>
+        <w:t xml:space="preserve">web-21</w:t>
+      </w:r>
+      <w:r>
+        <w:t xml:space="preserve">,</w:t>
+      </w:r>
+      <w:r>
+        <w:t xml:space="preserve"> </w:t>
+      </w:r>
+      <w:r>
+        <w:rPr>
+          <w:rStyle w:val="VerbatimChar"/>
+        </w:rPr>
+        <w:t xml:space="preserve">web-22</w:t>
+      </w:r>
+      <w:r>
+        <w:t xml:space="preserve">,</w:t>
+      </w:r>
+      <w:r>
+        <w:t xml:space="preserve"> </w:t>
+      </w:r>
+      <w:r>
+        <w:rPr>
+          <w:rStyle w:val="VerbatimChar"/>
+        </w:rPr>
+        <w:t xml:space="preserve">web-23</w:t>
+      </w:r>
+      <w:r>
+        <w:t xml:space="preserve">,</w:t>
+      </w:r>
+      <w:r>
+        <w:t xml:space="preserve"> </w:t>
+      </w:r>
+      <w:r>
+        <w:rPr>
+          <w:rStyle w:val="VerbatimChar"/>
+        </w:rPr>
+        <w:t xml:space="preserve">web-24</w:t>
+      </w:r>
+      <w:r>
+        <w:t xml:space="preserve">,</w:t>
+      </w:r>
+      <w:r>
+        <w:t xml:space="preserve"> </w:t>
+      </w:r>
+      <w:r>
+        <w:rPr>
+          <w:rStyle w:val="VerbatimChar"/>
+        </w:rPr>
+        <w:t xml:space="preserve">web-25</w:t>
+      </w:r>
+      <w:r>
+        <w:t xml:space="preserve">,</w:t>
+      </w:r>
+      <w:r>
+        <w:t xml:space="preserve"> </w:t>
+      </w:r>
+      <w:r>
+        <w:rPr>
+          <w:rStyle w:val="VerbatimChar"/>
+        </w:rPr>
+        <w:t xml:space="preserve">web-26</w:t>
+      </w:r>
+      <w:r>
+        <w:t xml:space="preserve">,</w:t>
+      </w:r>
+      <w:r>
+        <w:t xml:space="preserve"> </w:t>
+      </w:r>
+      <w:r>
+        <w:rPr>
+          <w:rStyle w:val="VerbatimChar"/>
+        </w:rPr>
+        <w:t xml:space="preserve">web-27</w:t>
+      </w:r>
+      <w:r>
+        <w:t xml:space="preserve">,</w:t>
+      </w:r>
+      <w:r>
+        <w:t xml:space="preserve"> </w:t>
+      </w:r>
+      <w:r>
+        <w:rPr>
+          <w:rStyle w:val="VerbatimChar"/>
+        </w:rPr>
         <w:t xml:space="preserve">web-28</w:t>
       </w:r>
       <w:r>
         <w:t xml:space="preserve"> </w:t>
       </w:r>
       <w:r>
-        <w:t xml:space="preserve">(9 October 2026) was collected</w:t>
-      </w:r>
-      <w:r>
-        <w:t xml:space="preserve"> </w:t>
-      </w:r>
-      <w:r>
-        <w:t xml:space="preserve">with masking in place, and a search of all its evidence and reports found no</w:t>
-      </w:r>
-      <w:r>
-        <w:t xml:space="preserve"> </w:t>
-      </w:r>
-      <w:r>
-        <w:t xml:space="preserve">personal address or phone number. Two personal names that the masking does not cover were removed by hand from the evidence, each replaced by a placeholder of the same length so every character count and verdict stays as collected: a quotation attribution on CERN’s page (in</w:t>
-      </w:r>
-      <w:r>
-        <w:t xml:space="preserve"> </w:t>
-      </w:r>
-      <w:r>
-        <w:rPr>
-          <w:rStyle w:val="VerbatimChar"/>
-        </w:rPr>
-        <w:t xml:space="preserve">cern.json</w:t>
-      </w:r>
-      <w:r>
-        <w:t xml:space="preserve"> </w:t>
-      </w:r>
-      <w:r>
-        <w:t xml:space="preserve">and in its screenshot) and the node coordinator named on EGI’s page (in</w:t>
-      </w:r>
-      <w:r>
-        <w:t xml:space="preserve"> </w:t>
-      </w:r>
-      <w:r>
-        <w:rPr>
-          <w:rStyle w:val="VerbatimChar"/>
-        </w:rPr>
-        <w:t xml:space="preserve">egi.json</w:t>
-      </w:r>
-      <w:r>
-        <w:t xml:space="preserve">, in the link text and, since</w:t>
-      </w:r>
-      <w:r>
-        <w:t xml:space="preserve"> </w:t>
-      </w:r>
-      <w:r>
-        <w:rPr>
-          <w:rStyle w:val="VerbatimChar"/>
-        </w:rPr>
-        <w:t xml:space="preserve">web-12</w:t>
-      </w:r>
-      <w:r>
-        <w:t xml:space="preserve">, also in the link’s address,</w:t>
-      </w:r>
-      <w:r>
-        <w:t xml:space="preserve"> </w:t>
-      </w:r>
-      <w:r>
-        <w:rPr>
-          <w:rStyle w:val="VerbatimChar"/>
-        </w:rPr>
-        <w:t xml:space="preserve">/person/…/</w:t>
-      </w:r>
-      <w:r>
-        <w:t xml:space="preserve">, which earlier published runs still carried). The second hop of</w:t>
+        <w:t xml:space="preserve">and</w:t>
+      </w:r>
+      <w:r>
+        <w:t xml:space="preserve"> </w:t>
+      </w:r>
+      <w:r>
+        <w:rPr>
+          <w:rStyle w:val="VerbatimChar"/>
+        </w:rPr>
+        <w:t xml:space="preserve">web-31</w:t>
+      </w:r>
+      <w:r>
+        <w:t xml:space="preserve"> </w:t>
+      </w:r>
+      <w:r>
+        <w:t xml:space="preserve">carry the same ones (BBMRI-ERIC's apart, in</w:t>
+      </w:r>
+      <w:r>
+        <w:t xml:space="preserve"> </w:t>
+      </w:r>
+      <w:r>
+        <w:rPr>
+          <w:rStyle w:val="VerbatimChar"/>
+        </w:rPr>
+        <w:t xml:space="preserve">web-24</w:t>
+      </w:r>
+      <w:r>
+        <w:t xml:space="preserve">, where its page was not fetched;</w:t>
+      </w:r>
+      <w:r>
+        <w:t xml:space="preserve"> </w:t>
+      </w:r>
+      <w:r>
+        <w:rPr>
+          <w:rStyle w:val="VerbatimChar"/>
+        </w:rPr>
+        <w:t xml:space="preserve">web-25</w:t>
+      </w:r>
+      <w:r>
+        <w:t xml:space="preserve"> </w:t>
+      </w:r>
+      <w:r>
+        <w:t xml:space="preserve">adds fifteen on BBMRI-ERIC's</w:t>
+      </w:r>
+      <w:r>
+        <w:t xml:space="preserve"> </w:t>
+      </w:r>
+      <w:r>
+        <w:rPr>
+          <w:rStyle w:val="VerbatimChar"/>
+        </w:rPr>
+        <w:t xml:space="preserve">dev3.</w:t>
+      </w:r>
+      <w:r>
+        <w:t xml:space="preserve"> </w:t>
+      </w:r>
+      <w:r>
+        <w:t xml:space="preserve">pages: its Director General on the legal notice, the seven members of its scientific and ethical advisory board, the Stakeholder Forum chair and the head of public affairs, and five finance, project and HR staff listed in capitals) (</w:t>
+      </w:r>
+      <w:r>
+        <w:rPr>
+          <w:rStyle w:val="VerbatimChar"/>
+        </w:rPr>
+        <w:t xml:space="preserve">web-21</w:t>
+      </w:r>
+      <w:r>
+        <w:t xml:space="preserve"> </w:t>
+      </w:r>
+      <w:r>
+        <w:t xml:space="preserve">adds one, a photo credit in an image description on Data Terra's new page;</w:t>
+      </w:r>
+      <w:r>
+        <w:t xml:space="preserve"> </w:t>
+      </w:r>
+      <w:r>
+        <w:rPr>
+          <w:rStyle w:val="VerbatimChar"/>
+        </w:rPr>
+        <w:t xml:space="preserve">web-22</w:t>
+      </w:r>
+      <w:r>
+        <w:t xml:space="preserve"> </w:t>
+      </w:r>
+      <w:r>
+        <w:t xml:space="preserve">adds two staff names in a news item on EUDAT's new page and one more GÉANT observer;</w:t>
+      </w:r>
+      <w:r>
+        <w:t xml:space="preserve"> </w:t>
+      </w:r>
+      <w:r>
+        <w:rPr>
+          <w:rStyle w:val="VerbatimChar"/>
+        </w:rPr>
+        <w:t xml:space="preserve">web-27</w:t>
+      </w:r>
+      <w:r>
+        <w:t xml:space="preserve"> </w:t>
+      </w:r>
+      <w:r>
+        <w:t xml:space="preserve">adds the people named in the captions of historical public-domain photos on Poland's page;</w:t>
+      </w:r>
+      <w:r>
+        <w:t xml:space="preserve"> </w:t>
+      </w:r>
+      <w:r>
+        <w:rPr>
+          <w:rStyle w:val="VerbatimChar"/>
+        </w:rPr>
+        <w:t xml:space="preserve">web-28</w:t>
+      </w:r>
+      <w:r>
+        <w:t xml:space="preserve"> </w:t>
+      </w:r>
+      <w:r>
+        <w:t xml:space="preserve">adds, on EBRAINS-RI's pages, its CEO, a section head, its press contact, three testimonial authors and two people named in news items and image captions, also in image file names and link addresses, and the coordinator named in a video title in Life Sciences Connect's screenshot;</w:t>
+      </w:r>
+      <w:r>
+        <w:t xml:space="preserve"> </w:t>
+      </w:r>
+      <w:r>
+        <w:rPr>
+          <w:rStyle w:val="VerbatimChar"/>
+        </w:rPr>
+        <w:t xml:space="preserve">web-31</w:t>
+      </w:r>
+      <w:r>
+        <w:t xml:space="preserve"> </w:t>
+      </w:r>
+      <w:r>
+        <w:t xml:space="preserve">adds the author credited in the document log of BBMRI-ERIC's Acceptable Use Policy and a person interviewed in an EBRAINS-RI news item): about thirty staff, board and news-author names on BBMRI-ERIC's and EGI's pages, and the author lists of publication citations on Czechia's, D4Science's (EOSC DTO, Italy) and PaNOSC's pages. Two of those citation lists were already in the evidence published as</w:t>
       </w:r>
       <w:r>
         <w:t xml:space="preserve"> </w:t>
@@ -17593,43 +18100,7 @@
         <w:t xml:space="preserve"> </w:t>
       </w:r>
       <w:r>
-        <w:t xml:space="preserve">added a third: a person quoted in a news item on a Czechia page reached only at depth 2 (in</w:t>
-      </w:r>
-      <w:r>
-        <w:t xml:space="preserve"> </w:t>
-      </w:r>
-      <w:r>
-        <w:rPr>
-          <w:rStyle w:val="VerbatimChar"/>
-        </w:rPr>
-        <w:t xml:space="preserve">eosc-cz.json</w:t>
-      </w:r>
-      <w:r>
-        <w:t xml:space="preserve">, in the quotation and in the address of the interview it links to).</w:t>
-      </w:r>
-      <w:r>
-        <w:t xml:space="preserve"> </w:t>
-      </w:r>
-      <w:r>
-        <w:rPr>
-          <w:rStyle w:val="VerbatimChar"/>
-        </w:rPr>
-        <w:t xml:space="preserve">web-14</w:t>
-      </w:r>
-      <w:r>
-        <w:t xml:space="preserve">, which also reads services and policies pages, added many more, and</w:t>
-      </w:r>
-      <w:r>
-        <w:t xml:space="preserve"> </w:t>
-      </w:r>
-      <w:r>
-        <w:rPr>
-          <w:rStyle w:val="VerbatimChar"/>
-        </w:rPr>
-        <w:t xml:space="preserve">web-15</w:t>
-      </w:r>
-      <w:r>
-        <w:t xml:space="preserve">,</w:t>
+        <w:t xml:space="preserve">and were missed then; they remain in the git history.</w:t>
       </w:r>
       <w:r>
         <w:t xml:space="preserve"> </w:t>
@@ -17641,295 +18112,7 @@
         <w:t xml:space="preserve">web-16</w:t>
       </w:r>
       <w:r>
-        <w:t xml:space="preserve">,</w:t>
-      </w:r>
-      <w:r>
-        <w:t xml:space="preserve"> </w:t>
-      </w:r>
-      <w:r>
-        <w:rPr>
-          <w:rStyle w:val="VerbatimChar"/>
-        </w:rPr>
-        <w:t xml:space="preserve">web-18</w:t>
-      </w:r>
-      <w:r>
-        <w:t xml:space="preserve">,</w:t>
-      </w:r>
-      <w:r>
-        <w:t xml:space="preserve"> </w:t>
-      </w:r>
-      <w:r>
-        <w:rPr>
-          <w:rStyle w:val="VerbatimChar"/>
-        </w:rPr>
-        <w:t xml:space="preserve">web-21</w:t>
-      </w:r>
-      <w:r>
-        <w:t xml:space="preserve">,</w:t>
-      </w:r>
-      <w:r>
-        <w:t xml:space="preserve"> </w:t>
-      </w:r>
-      <w:r>
-        <w:rPr>
-          <w:rStyle w:val="VerbatimChar"/>
-        </w:rPr>
-        <w:t xml:space="preserve">web-22</w:t>
-      </w:r>
-      <w:r>
-        <w:t xml:space="preserve">,</w:t>
-      </w:r>
-      <w:r>
-        <w:t xml:space="preserve"> </w:t>
-      </w:r>
-      <w:r>
-        <w:rPr>
-          <w:rStyle w:val="VerbatimChar"/>
-        </w:rPr>
-        <w:t xml:space="preserve">web-23</w:t>
-      </w:r>
-      <w:r>
-        <w:t xml:space="preserve">,</w:t>
-      </w:r>
-      <w:r>
-        <w:t xml:space="preserve"> </w:t>
-      </w:r>
-      <w:r>
-        <w:rPr>
-          <w:rStyle w:val="VerbatimChar"/>
-        </w:rPr>
-        <w:t xml:space="preserve">web-24</w:t>
-      </w:r>
-      <w:r>
-        <w:t xml:space="preserve">,</w:t>
-      </w:r>
-      <w:r>
-        <w:t xml:space="preserve"> </w:t>
-      </w:r>
-      <w:r>
-        <w:rPr>
-          <w:rStyle w:val="VerbatimChar"/>
-        </w:rPr>
-        <w:t xml:space="preserve">web-25</w:t>
-      </w:r>
-      <w:r>
-        <w:t xml:space="preserve">,</w:t>
-      </w:r>
-      <w:r>
-        <w:t xml:space="preserve"> </w:t>
-      </w:r>
-      <w:r>
-        <w:rPr>
-          <w:rStyle w:val="VerbatimChar"/>
-        </w:rPr>
-        <w:t xml:space="preserve">web-26</w:t>
-      </w:r>
-      <w:r>
-        <w:t xml:space="preserve">,</w:t>
-      </w:r>
-      <w:r>
-        <w:t xml:space="preserve"> </w:t>
-      </w:r>
-      <w:r>
-        <w:rPr>
-          <w:rStyle w:val="VerbatimChar"/>
-        </w:rPr>
-        <w:t xml:space="preserve">web-27</w:t>
-      </w:r>
-      <w:r>
-        <w:t xml:space="preserve"> </w:t>
-      </w:r>
-      <w:r>
-        <w:t xml:space="preserve">and</w:t>
-      </w:r>
-      <w:r>
-        <w:t xml:space="preserve"> </w:t>
-      </w:r>
-      <w:r>
-        <w:rPr>
-          <w:rStyle w:val="VerbatimChar"/>
-        </w:rPr>
-        <w:t xml:space="preserve">web-28</w:t>
-      </w:r>
-      <w:r>
-        <w:t xml:space="preserve"> </w:t>
-      </w:r>
-      <w:r>
-        <w:t xml:space="preserve">carry the same ones (BBMRI-ERIC’s apart, in</w:t>
-      </w:r>
-      <w:r>
-        <w:t xml:space="preserve"> </w:t>
-      </w:r>
-      <w:r>
-        <w:rPr>
-          <w:rStyle w:val="VerbatimChar"/>
-        </w:rPr>
-        <w:t xml:space="preserve">web-24</w:t>
-      </w:r>
-      <w:r>
-        <w:t xml:space="preserve">, where its page was not fetched;</w:t>
-      </w:r>
-      <w:r>
-        <w:t xml:space="preserve"> </w:t>
-      </w:r>
-      <w:r>
-        <w:rPr>
-          <w:rStyle w:val="VerbatimChar"/>
-        </w:rPr>
-        <w:t xml:space="preserve">web-25</w:t>
-      </w:r>
-      <w:r>
-        <w:t xml:space="preserve"> </w:t>
-      </w:r>
-      <w:r>
-        <w:t xml:space="preserve">adds fifteen on BBMRI-ERIC’s</w:t>
-      </w:r>
-      <w:r>
-        <w:t xml:space="preserve"> </w:t>
-      </w:r>
-      <w:r>
-        <w:rPr>
-          <w:rStyle w:val="VerbatimChar"/>
-        </w:rPr>
-        <w:t xml:space="preserve">dev3.</w:t>
-      </w:r>
-      <w:r>
-        <w:t xml:space="preserve"> </w:t>
-      </w:r>
-      <w:r>
-        <w:t xml:space="preserve">pages: its Director General on the legal notice, the seven members of its scientific and ethical advisory board, the Stakeholder Forum chair and the head of public affairs, and five finance, project and HR staff listed in capitals) (</w:t>
-      </w:r>
-      <w:r>
-        <w:rPr>
-          <w:rStyle w:val="VerbatimChar"/>
-        </w:rPr>
-        <w:t xml:space="preserve">web-21</w:t>
-      </w:r>
-      <w:r>
-        <w:t xml:space="preserve"> </w:t>
-      </w:r>
-      <w:r>
-        <w:t xml:space="preserve">adds one, a photo credit in an image description on Data Terra’s new page;</w:t>
-      </w:r>
-      <w:r>
-        <w:t xml:space="preserve"> </w:t>
-      </w:r>
-      <w:r>
-        <w:rPr>
-          <w:rStyle w:val="VerbatimChar"/>
-        </w:rPr>
-        <w:t xml:space="preserve">web-22</w:t>
-      </w:r>
-      <w:r>
-        <w:t xml:space="preserve"> </w:t>
-      </w:r>
-      <w:r>
-        <w:t xml:space="preserve">adds two staff names in a news item on EUDAT’s new page and one more GÉANT observer;</w:t>
-      </w:r>
-      <w:r>
-        <w:t xml:space="preserve"> </w:t>
-      </w:r>
-      <w:r>
-        <w:rPr>
-          <w:rStyle w:val="VerbatimChar"/>
-        </w:rPr>
-        <w:t xml:space="preserve">web-27</w:t>
-      </w:r>
-      <w:r>
-        <w:t xml:space="preserve"> </w:t>
-      </w:r>
-      <w:r>
-        <w:t xml:space="preserve">adds the people named in the captions of historical public-domain photos on Poland’s page;</w:t>
-      </w:r>
-      <w:r>
-        <w:t xml:space="preserve"> </w:t>
-      </w:r>
-      <w:r>
-        <w:rPr>
-          <w:rStyle w:val="VerbatimChar"/>
-        </w:rPr>
-        <w:t xml:space="preserve">web-28</w:t>
-      </w:r>
-      <w:r>
-        <w:t xml:space="preserve"> </w:t>
-      </w:r>
-      <w:r>
-        <w:t xml:space="preserve">adds, on EBRAINS-RI’s pages, its CEO, a section head, its press contact, three testimonial authors and two people named in news items and image captions, also in image file names and link addresses, and the coordinator named in a video title in Life Sciences Connect’s screenshot): about thirty staff, board and news-author names on BBMRI-ERIC’s and EGI’s pages, and the author lists of publication citations on Czechia’s, D4Science’s (EOSC DTO, Italy) and PaNOSC’s pages. Two of those citation lists were already in the evidence published as</w:t>
-      </w:r>
-      <w:r>
-        <w:t xml:space="preserve"> </w:t>
-      </w:r>
-      <w:r>
-        <w:rPr>
-          <w:rStyle w:val="VerbatimChar"/>
-        </w:rPr>
-        <w:t xml:space="preserve">web-13</w:t>
-      </w:r>
-      <w:r>
-        <w:t xml:space="preserve"> </w:t>
-      </w:r>
-      <w:r>
-        <w:t xml:space="preserve">and were missed then; they remain in the git history.</w:t>
-      </w:r>
-      <w:r>
-        <w:t xml:space="preserve"> </w:t>
-      </w:r>
-      <w:r>
-        <w:rPr>
-          <w:rStyle w:val="VerbatimChar"/>
-        </w:rPr>
-        <w:t xml:space="preserve">web-16</w:t>
-      </w:r>
-      <w:r>
-        <w:t xml:space="preserve">, the first run with GÉANT’s page served since 24 September, reached its executive team, governance and membership pages: about 120 names of officers, board members and General Assembly representatives, some cut short at the end of a link label (</w:t>
-      </w:r>
-      <w:r>
-        <w:t xml:space="preserve">“Firstname Lastna…”</w:t>
-      </w:r>
-      <w:r>
-        <w:t xml:space="preserve">). They were taken from the fixed patterns of those pages (</w:t>
-      </w:r>
-      <w:r>
-        <w:t xml:space="preserve">“Representative:”</w:t>
-      </w:r>
-      <w:r>
-        <w:t xml:space="preserve">,</w:t>
-      </w:r>
-      <w:r>
-        <w:t xml:space="preserve"> </w:t>
-      </w:r>
-      <w:r>
-        <w:t xml:space="preserve">“Substitute:”</w:t>
-      </w:r>
-      <w:r>
-        <w:t xml:space="preserve">,</w:t>
-      </w:r>
-      <w:r>
-        <w:t xml:space="preserve"> </w:t>
-      </w:r>
-      <w:r>
-        <w:t xml:space="preserve">“… Chief … Officer”</w:t>
-      </w:r>
-      <w:r>
-        <w:t xml:space="preserve">,</w:t>
-      </w:r>
-      <w:r>
-        <w:t xml:space="preserve"> </w:t>
-      </w:r>
-      <w:r>
-        <w:t xml:space="preserve">“… Member”</w:t>
-      </w:r>
-      <w:r>
-        <w:t xml:space="preserve">) and masked everywhere, truncated forms included. A deeper run reads more pages, and so needs this check more; look for citations (</w:t>
-      </w:r>
-      <w:r>
-        <w:t xml:space="preserve">“Surname, I.”</w:t>
-      </w:r>
-      <w:r>
-        <w:t xml:space="preserve"> </w:t>
-      </w:r>
-      <w:r>
-        <w:t xml:space="preserve">lists before a year) as well as for people named in prose. The masking handles addresses and phone numbers only, so a new run needs the same check for names. Before it, commit</w:t>
+        <w:t xml:space="preserve">, the first run with GÉANT's page served since 24 September, reached its executive team, governance and membership pages: about 120 names of officers, board members and General Assembly representatives, some cut short at the end of a link label ("Firstname Lastna…"). They were taken from the fixed patterns of those pages ("Representative:", "Substitute:", "… Chief … Officer", "… Member") and masked everywhere, truncated forms included. A deeper run reads more pages, and so needs this check more; look for citations ("Surname, I." lists before a year) as well as for people named in prose. The masking handles addresses and phone numbers only, so a new run needs the same check for names. Before it, commit</w:t>
       </w:r>
       <w:r>
         <w:t xml:space="preserve"> </w:t>
@@ -17950,7 +18133,7 @@
         <w:t xml:space="preserve"> </w:t>
       </w:r>
       <w:r>
-        <w:t xml:space="preserve">2026) masked the 24 September run’s</w:t>
+        <w:t xml:space="preserve">2026) masked the 24 September run's</w:t>
       </w:r>
       <w:r>
         <w:t xml:space="preserve"> </w:t>
@@ -17977,7 +18160,7 @@
         <w:t xml:space="preserve"> </w:t>
       </w:r>
       <w:r>
-        <w:t xml:space="preserve">slightly, by the length of the masked text (BBMRI-ERIC’s page from 7100 to</w:t>
+        <w:t xml:space="preserve">slightly, by the length of the masked text (BBMRI-ERIC's page from 7100 to</w:t>
       </w:r>
       <w:r>
         <w:t xml:space="preserve"> </w:t>
@@ -18271,10 +18454,7 @@
         <w:t xml:space="preserve"> </w:t>
       </w:r>
       <w:r>
-        <w:t xml:space="preserve">“Changing a node’s URL”</w:t>
-      </w:r>
-      <w:r>
-        <w:t xml:space="preserve">).</w:t>
+        <w:t xml:space="preserve">"Changing a node's URL").</w:t>
       </w:r>
     </w:p>
     <w:p>
@@ -18284,9 +18464,9 @@
         </w:pict>
       </w:r>
     </w:p>
-    <w:bookmarkEnd w:id="64"/>
     <w:bookmarkEnd w:id="65"/>
-    <w:bookmarkStart w:id="68" w:name="the-test-suite"/>
+    <w:bookmarkEnd w:id="66"/>
+    <w:bookmarkStart w:id="69" w:name="X8c4c4ed22fb4dcefc9eca31097b000686e9bb12"/>
     <w:p>
       <w:pPr>
         <w:pStyle w:val="Heading2"/>
@@ -18574,19 +18754,7 @@
               <w:pStyle w:val="Compact"/>
             </w:pPr>
             <w:r>
-              <w:t xml:space="preserve">The verdict logic, point by point, including both item 5 rules (v3.2: no AUP/UAP link on the NLP fails, one document for both and a licence are review), including the render gate, the EOSC-asset token rule, that a point 3 summary never denies having a name list it was given, and that a link merely labelled</w:t>
-            </w:r>
-            <w:r>
-              <w:t xml:space="preserve"> </w:t>
-            </w:r>
-            <w:r>
-              <w:t xml:space="preserve">“support”</w:t>
-            </w:r>
-            <w:r>
-              <w:t xml:space="preserve"> </w:t>
-            </w:r>
-            <w:r>
-              <w:t xml:space="preserve">does not settle point 6.</w:t>
+              <w:t xml:space="preserve">The verdict logic, point by point, including both item 5 rules (v3.2: no AUP/UAP link on the NLP fails, one document for both and a licence are review), including the render gate, the EOSC-asset token rule, that a point 3 summary never denies having a name list it was given, and that a link merely labelled "support" does not settle point 6.</w:t>
             </w:r>
           </w:p>
         </w:tc>
@@ -18937,22 +19105,7 @@
               <w:pStyle w:val="Compact"/>
             </w:pPr>
             <w:r>
-              <w:t xml:space="preserve">Matrix rendering, the column legend that follows the item 5 rule, the dual-depth tables, the mixed-freshness banner, the name-list provenance, and input that would break a table or a list — a</w:t>
-            </w:r>
-            <w:r>
-              <w:t xml:space="preserve"> </w:t>
-            </w:r>
-            <w:r>
-              <w:rPr>
-                <w:rStyle w:val="VerbatimChar"/>
-              </w:rPr>
-              <w:t xml:space="preserve">|</w:t>
-            </w:r>
-            <w:r>
-              <w:t xml:space="preserve"> </w:t>
-            </w:r>
-            <w:r>
-              <w:t xml:space="preserve">or a newline in a node name, an evidence line, a followed-link reason or a point title.</w:t>
+              <w:t xml:space="preserve">Matrix rendering, the column legend that follows the item 5 rule, the dual-depth tables, the mixed-freshness banner, the name-list provenance, and input that would break a table or a list — a `</w:t>
             </w:r>
           </w:p>
         </w:tc>
@@ -19108,7 +19261,7 @@
       <w:r>
         <w:t xml:space="preserve"> </w:t>
       </w:r>
-      <w:hyperlink r:id="rId66">
+      <w:hyperlink r:id="rId67">
         <w:r>
           <w:rPr>
             <w:rStyle w:val="Hyperlink"/>
@@ -19172,7 +19325,7 @@
         <w:t xml:space="preserve">test_a_pipe_in_a_url_cannot_break_the_table</w:t>
       </w:r>
     </w:p>
-    <w:bookmarkStart w:id="67" w:name="a-note-on-what-a-passing-suite-means"/>
+    <w:bookmarkStart w:id="68" w:name="a-note-on-what-a-passing-suite-means"/>
     <w:p>
       <w:pPr>
         <w:pStyle w:val="Heading3"/>
@@ -19249,9 +19402,9 @@
         </w:pict>
       </w:r>
     </w:p>
-    <w:bookmarkEnd w:id="67"/>
     <w:bookmarkEnd w:id="68"/>
-    <w:bookmarkStart w:id="69" w:name="continuous-integration"/>
+    <w:bookmarkEnd w:id="69"/>
+    <w:bookmarkStart w:id="70" w:name="X5b3efa2c0f9c923f21ce32023ca2c65a6e0f0ef"/>
     <w:p>
       <w:pPr>
         <w:pStyle w:val="Heading2"/>
@@ -19504,13 +19657,13 @@
         <w:t xml:space="preserve"> </w:t>
       </w:r>
       <w:r>
-        <w:t xml:space="preserve">A scheduled compliance run would mean fetching every node’s production website on a</w:t>
-      </w:r>
-      <w:r>
-        <w:t xml:space="preserve"> </w:t>
-      </w:r>
-      <w:r>
-        <w:t xml:space="preserve">timer, which is exactly the behaviour that got GÉANT’s bot protection to start</w:t>
+        <w:t xml:space="preserve">A scheduled compliance run would mean fetching every node's production website on a</w:t>
+      </w:r>
+      <w:r>
+        <w:t xml:space="preserve"> </w:t>
+      </w:r>
+      <w:r>
+        <w:t xml:space="preserve">timer, which is exactly the behaviour that got GÉANT's bot protection to start</w:t>
       </w:r>
       <w:r>
         <w:t xml:space="preserve"> </w:t>
@@ -19552,7 +19705,7 @@
         <w:t xml:space="preserve"> </w:t>
       </w:r>
       <w:r>
-        <w:t xml:space="preserve">today it fetches BBMRI-ERIC’s</w:t>
+        <w:t xml:space="preserve">today it fetches BBMRI-ERIC's</w:t>
       </w:r>
       <w:r>
         <w:t xml:space="preserve"> </w:t>
@@ -19734,7 +19887,7 @@
         <w:t xml:space="preserve"> </w:t>
       </w:r>
       <w:r>
-        <w:t xml:space="preserve">people’s sites.</w:t>
+        <w:t xml:space="preserve">people's sites.</w:t>
       </w:r>
     </w:p>
     <w:p>
@@ -19881,7 +20034,7 @@
         <w:t xml:space="preserve"> </w:t>
       </w:r>
       <w:r>
-        <w:t xml:space="preserve">the repository’s name reads as a finding rather than as a draft. The summary</w:t>
+        <w:t xml:space="preserve">the repository's name reads as a finding rather than as a draft. The summary</w:t>
       </w:r>
       <w:r>
         <w:t xml:space="preserve"> </w:t>
@@ -19908,7 +20061,7 @@
         <w:t xml:space="preserve"> </w:t>
       </w:r>
       <w:r>
-        <w:t xml:space="preserve">reviewed run’s counts out of a fresh checkout and published them under a new run</w:t>
+        <w:t xml:space="preserve">reviewed run's counts out of a fresh checkout and published them under a new run</w:t>
       </w:r>
       <w:r>
         <w:t xml:space="preserve"> </w:t>
@@ -19924,8 +20077,8 @@
         </w:pict>
       </w:r>
     </w:p>
-    <w:bookmarkEnd w:id="69"/>
-    <w:bookmarkStart w:id="70" w:name="troubleshooting"/>
+    <w:bookmarkEnd w:id="70"/>
+    <w:bookmarkStart w:id="71" w:name="X604d32d4245089c058c4a17a722c369f414c972"/>
     <w:p>
       <w:pPr>
         <w:pStyle w:val="Heading2"/>
@@ -20353,7 +20506,7 @@
               <w:pStyle w:val="Compact"/>
             </w:pPr>
             <w:r>
-              <w:t xml:space="preserve">The site’s</w:t>
+              <w:t xml:space="preserve">The site's</w:t>
             </w:r>
             <w:r>
               <w:t xml:space="preserve"> </w:t>
@@ -20368,7 +20521,7 @@
               <w:t xml:space="preserve"> </w:t>
             </w:r>
             <w:r>
-              <w:t xml:space="preserve">excludes the tool, and it complied. Common on staging hosts: BBMRI-ERIC’s</w:t>
+              <w:t xml:space="preserve">excludes the tool, and it complied. Common on staging hosts: BBMRI-ERIC's</w:t>
             </w:r>
             <w:r>
               <w:t xml:space="preserve"> </w:t>
@@ -20432,7 +20585,7 @@
               <w:pStyle w:val="Compact"/>
             </w:pPr>
             <w:r>
-              <w:t xml:space="preserve">A node’s</w:t>
+              <w:t xml:space="preserve">A node's</w:t>
             </w:r>
             <w:r>
               <w:t xml:space="preserve"> </w:t>
@@ -20462,7 +20615,7 @@
               <w:t xml:space="preserve"> </w:t>
             </w:r>
             <w:r>
-              <w:t xml:space="preserve">changed after its evidence was collected, so the row shows the new address above the old page’s verdicts. Collect that node again, or rebuild with the old node list via</w:t>
+              <w:t xml:space="preserve">changed after its evidence was collected, so the row shows the new address above the old page's verdicts. Collect that node again, or rebuild with the old node list via</w:t>
             </w:r>
             <w:r>
               <w:t xml:space="preserve"> </w:t>
@@ -20474,16 +20627,7 @@
               <w:t xml:space="preserve">--nodes</w:t>
             </w:r>
             <w:r>
-              <w:t xml:space="preserve">. Section 3,</w:t>
-            </w:r>
-            <w:r>
-              <w:t xml:space="preserve"> </w:t>
-            </w:r>
-            <w:r>
-              <w:t xml:space="preserve">“Changing a node’s URL”</w:t>
-            </w:r>
-            <w:r>
-              <w:t xml:space="preserve">, and example 2 in section 11.</w:t>
+              <w:t xml:space="preserve">. Section 3, "Changing a node's URL", and example 2 in section 11.</w:t>
             </w:r>
           </w:p>
         </w:tc>
@@ -20786,7 +20930,7 @@
               <w:t xml:space="preserve"> </w:t>
             </w:r>
             <w:r>
-              <w:t xml:space="preserve">in that node’s evidence file. Section 3.</w:t>
+              <w:t xml:space="preserve">in that node's evidence file. Section 3.</w:t>
             </w:r>
           </w:p>
         </w:tc>
@@ -21084,8 +21228,8 @@
         </w:pict>
       </w:r>
     </w:p>
-    <w:bookmarkEnd w:id="70"/>
-    <w:bookmarkStart w:id="71" w:name="extending-it"/>
+    <w:bookmarkEnd w:id="71"/>
+    <w:bookmarkStart w:id="72" w:name="X06fd69237b69b86c25fbae3186e71511448d9d7"/>
     <w:p>
       <w:pPr>
         <w:pStyle w:val="Heading2"/>
@@ -21212,7 +21356,7 @@
           <w:b/>
           <w:bCs/>
         </w:rPr>
-        <w:t xml:space="preserve">Change a node’s URL:</w:t>
+        <w:t xml:space="preserve">Change a node's URL:</w:t>
       </w:r>
       <w:r>
         <w:t xml:space="preserve"> </w:t>
@@ -21709,11 +21853,11 @@
         <w:t xml:space="preserve"> </w:t>
       </w:r>
       <w:r>
-        <w:t xml:space="preserve">checklist transcription, so none of it is under this module’s control.</w:t>
-      </w:r>
-    </w:p>
-    <w:bookmarkEnd w:id="71"/>
-    <w:bookmarkStart w:id="75" w:name="worked-examples"/>
+        <w:t xml:space="preserve">checklist transcription, so none of it is under this module's control.</w:t>
+      </w:r>
+    </w:p>
+    <w:bookmarkEnd w:id="72"/>
+    <w:bookmarkStart w:id="76" w:name="Xda1205f52db61b26639938baa97f3777a4c7991"/>
     <w:p>
       <w:pPr>
         <w:pStyle w:val="Heading2"/>
@@ -21733,7 +21877,7 @@
         <w:t xml:space="preserve"> </w:t>
       </w:r>
       <w:r>
-        <w:t xml:space="preserve">adding a node, changing a node’s URL, and adopting a new revision of the</w:t>
+        <w:t xml:space="preserve">adding a node, changing a node's URL, and adopting a new revision of the</w:t>
       </w:r>
       <w:r>
         <w:t xml:space="preserve"> </w:t>
@@ -21969,7 +22113,7 @@
         <w:t xml:space="preserve"> </w:t>
       </w:r>
       <w:r>
-        <w:t xml:space="preserve">tool’s verdicts are not a compliance statement (section 6). Write the review down, as</w:t>
+        <w:t xml:space="preserve">tool's verdicts are not a compliance statement (section 6). Write the review down, as</w:t>
       </w:r>
       <w:r>
         <w:t xml:space="preserve"> </w:t>
@@ -22010,7 +22154,7 @@
         <w:t xml:space="preserve">own run.</w:t>
       </w:r>
     </w:p>
-    <w:bookmarkStart w:id="72" w:name="X6b9c9d2e59e13da41f347184ca67a475fa8b7ce"/>
+    <w:bookmarkStart w:id="73" w:name="X073cb44b8dc5d29e47f376bc008b8613dd82a6a"/>
     <w:p>
       <w:pPr>
         <w:pStyle w:val="Heading3"/>
@@ -22107,13 +22251,7 @@
         <w:t xml:space="preserve"> </w:t>
       </w:r>
       <w:r>
-        <w:t xml:space="preserve">EOSC EU Node Contributors Dashboard (</w:t>
-      </w:r>
-      <w:r>
-        <w:t xml:space="preserve">“Website address”</w:t>
-      </w:r>
-      <w:r>
-        <w:t xml:space="preserve">, section 1.2, field 6).</w:t>
+        <w:t xml:space="preserve">EOSC EU Node Contributors Dashboard ("Website address", section 1.2, field 6).</w:t>
       </w:r>
       <w:r>
         <w:t xml:space="preserve"> </w:t>
@@ -22139,7 +22277,7 @@
       <w:r>
         <w:t xml:space="preserve"> </w:t>
       </w:r>
-      <w:hyperlink r:id="rId37">
+      <w:hyperlink r:id="rId38">
         <w:r>
           <w:rPr>
             <w:rStyle w:val="Hyperlink"/>
@@ -23236,34 +23374,13 @@
           <w:b/>
           <w:bCs/>
         </w:rPr>
-        <w:t xml:space="preserve">warns</w:t>
-      </w:r>
-      <w:r>
-        <w:rPr>
-          <w:b/>
-          <w:bCs/>
-        </w:rPr>
-        <w:t xml:space="preserve"> </w:t>
-      </w:r>
-      <w:r>
-        <w:rPr>
-          <w:b/>
-          <w:bCs/>
-        </w:rPr>
-        <w:t xml:space="preserve">“Evidence from a different URL”</w:t>
-      </w:r>
-      <w:r>
-        <w:rPr>
-          <w:b/>
-          <w:bCs/>
-        </w:rPr>
-        <w:t xml:space="preserve">.</w:t>
-      </w:r>
-      <w:r>
-        <w:t xml:space="preserve"> </w:t>
-      </w:r>
-      <w:r>
-        <w:t xml:space="preserve">It means a node’s URL</w:t>
+        <w:t xml:space="preserve">warns "Evidence from a different URL".</w:t>
+      </w:r>
+      <w:r>
+        <w:t xml:space="preserve"> </w:t>
+      </w:r>
+      <w:r>
+        <w:t xml:space="preserve">It means a node's URL</w:t>
       </w:r>
       <w:r>
         <w:t xml:space="preserve"> </w:t>
@@ -23578,7 +23695,7 @@
         <w:t xml:space="preserve"> </w:t>
       </w:r>
       <w:r>
-        <w:t xml:space="preserve">on 24 September, when GÉANT’s page was served). If the new page shows its</w:t>
+        <w:t xml:space="preserve">on 24 September, when GÉANT's page was served). If the new page shows its</w:t>
       </w:r>
       <w:r>
         <w:t xml:space="preserve"> </w:t>
@@ -23623,7 +23740,7 @@
         <w:t xml:space="preserve">web-13</w:t>
       </w:r>
       <w:r>
-        <w:t xml:space="preserve">). Update it to the new run’s shape.</w:t>
+        <w:t xml:space="preserve">). Update it to the new run's shape.</w:t>
       </w:r>
     </w:p>
     <w:p>
@@ -23701,13 +23818,7 @@
         <w:t xml:space="preserve"> </w:t>
       </w:r>
       <w:r>
-        <w:t xml:space="preserve">(</w:t>
-      </w:r>
-      <w:r>
-        <w:t xml:space="preserve">“130 cells: 69 PASS · 0 FAIL · 61 review”</w:t>
-      </w:r>
-      <w:r>
-        <w:t xml:space="preserve">);</w:t>
+        <w:t xml:space="preserve">("130 cells: 69 PASS · 0 FAIL · 61 review");</w:t>
       </w:r>
     </w:p>
     <w:p>
@@ -23719,13 +23830,7 @@
         </w:numPr>
       </w:pPr>
       <w:r>
-        <w:t xml:space="preserve">“The published figures”</w:t>
-      </w:r>
-      <w:r>
-        <w:t xml:space="preserve"> </w:t>
-      </w:r>
-      <w:r>
-        <w:t xml:space="preserve">in</w:t>
+        <w:t xml:space="preserve">"The published figures" in</w:t>
       </w:r>
       <w:r>
         <w:t xml:space="preserve"> </w:t>
@@ -23743,13 +23848,7 @@
         <w:t xml:space="preserve"> </w:t>
       </w:r>
       <w:r>
-        <w:t xml:space="preserve">“The node list — a YAML file”</w:t>
-      </w:r>
-      <w:r>
-        <w:t xml:space="preserve"> </w:t>
-      </w:r>
-      <w:r>
-        <w:t xml:space="preserve">in the same file.</w:t>
+        <w:t xml:space="preserve">"The node list — a YAML file" in the same file.</w:t>
       </w:r>
     </w:p>
     <w:p>
@@ -23847,14 +23946,14 @@
         <w:t xml:space="preserve"> push</w:t>
       </w:r>
     </w:p>
-    <w:bookmarkEnd w:id="72"/>
-    <w:bookmarkStart w:id="73" w:name="X5431a82e20a06edfb102374e037ce7ea9ce6896"/>
+    <w:bookmarkEnd w:id="73"/>
+    <w:bookmarkStart w:id="74" w:name="Xe23e918a40335caa5ab24e15a733d1ac9e4c070"/>
     <w:p>
       <w:pPr>
         <w:pStyle w:val="Heading3"/>
       </w:pPr>
       <w:r>
-        <w:t xml:space="preserve">Example 2 — changing a node’s landing page URL</w:t>
+        <w:t xml:space="preserve">Example 2 — changing a node's landing page URL</w:t>
       </w:r>
     </w:p>
     <w:p>
@@ -23916,7 +24015,7 @@
         <w:t xml:space="preserve"> </w:t>
       </w:r>
       <w:r>
-        <w:t xml:space="preserve">host’s</w:t>
+        <w:t xml:space="preserve">host's</w:t>
       </w:r>
       <w:r>
         <w:t xml:space="preserve"> </w:t>
@@ -24006,7 +24105,7 @@
         <w:t xml:space="preserve">nodes.yaml</w:t>
       </w:r>
       <w:r>
-        <w:t xml:space="preserve">. Nothing else in the repository stores a node’s URL. Add a comment</w:t>
+        <w:t xml:space="preserve">. Nothing else in the repository stores a node's URL. Add a comment</w:t>
       </w:r>
       <w:r>
         <w:t xml:space="preserve"> </w:t>
@@ -24181,7 +24280,7 @@
         <w:t xml:space="preserve"> </w:t>
       </w:r>
       <w:r>
-        <w:t xml:space="preserve">as well only if the node’s own entry on</w:t>
+        <w:t xml:space="preserve">as well only if the node's own entry on</w:t>
       </w:r>
       <w:r>
         <w:t xml:space="preserve"> </w:t>
@@ -24223,7 +24322,7 @@
         <w:t xml:space="preserve"> </w:t>
       </w:r>
       <w:r>
-        <w:t xml:space="preserve">change only if the node’s approved name changed. Keep the</w:t>
+        <w:t xml:space="preserve">change only if the node's approved name changed. Keep the</w:t>
       </w:r>
       <w:r>
         <w:t xml:space="preserve"> </w:t>
@@ -24424,7 +24523,7 @@
         <w:t xml:space="preserve"> </w:t>
       </w:r>
       <w:r>
-        <w:t xml:space="preserve">host’s</w:t>
+        <w:t xml:space="preserve">host's</w:t>
       </w:r>
       <w:r>
         <w:t xml:space="preserve"> </w:t>
@@ -24475,7 +24574,7 @@
           <w:b/>
           <w:bCs/>
         </w:rPr>
-        <w:t xml:space="preserve">Step 3: update that node’s row in the published run.</w:t>
+        <w:t xml:space="preserve">Step 3: update that node's row in the published run.</w:t>
       </w:r>
       <w:r>
         <w:t xml:space="preserve"> </w:t>
@@ -24563,7 +24662,7 @@
         <w:t xml:space="preserve">bbmri-eric</w:t>
       </w:r>
       <w:r>
-        <w:t xml:space="preserve">’s evidence, screenshot and row, then rebuild</w:t>
+        <w:t xml:space="preserve">'s evidence, screenshot and row, then rebuild</w:t>
       </w:r>
       <w:r>
         <w:t xml:space="preserve"> </w:t>
@@ -24632,7 +24731,7 @@
         <w:t xml:space="preserve"> </w:t>
       </w:r>
       <w:r>
-        <w:t xml:space="preserve">point’s old and new verdict, and both reports gain an</w:t>
+        <w:t xml:space="preserve">point's old and new verdict, and both reports gain an</w:t>
       </w:r>
       <w:r>
         <w:t xml:space="preserve"> </w:t>
@@ -25105,8 +25204,8 @@
         <w:t xml:space="preserve">the documents together.</w:t>
       </w:r>
     </w:p>
-    <w:bookmarkEnd w:id="73"/>
-    <w:bookmarkStart w:id="74" w:name="Xbb3e2d317a0d811066009804bfa0a222a6197de"/>
+    <w:bookmarkEnd w:id="74"/>
+    <w:bookmarkStart w:id="75" w:name="Xa570dceeae7de3d84789b8e054a5bbb043a3946"/>
     <w:p>
       <w:pPr>
         <w:pStyle w:val="Heading3"/>
@@ -25637,7 +25736,7 @@
           <w:b/>
           <w:bCs/>
         </w:rPr>
-        <w:t xml:space="preserve">Step 2: create the new revision’s file from the old one.</w:t>
+        <w:t xml:space="preserve">Step 2: create the new revision's file from the old one.</w:t>
       </w:r>
     </w:p>
     <w:p>
@@ -26069,7 +26168,7 @@
         <w:t xml:space="preserve"> </w:t>
       </w:r>
       <w:r>
-        <w:t xml:space="preserve">in checklist order, name it in the point’s</w:t>
+        <w:t xml:space="preserve">in checklist order, name it in the point's</w:t>
       </w:r>
       <w:r>
         <w:t xml:space="preserve"> </w:t>
@@ -26254,22 +26353,13 @@
         <w:t xml:space="preserve">v3.1.yaml</w:t>
       </w:r>
       <w:r>
-        <w:t xml:space="preserve">, which lack the key, keep</w:t>
-      </w:r>
-      <w:r>
-        <w:t xml:space="preserve"> </w:t>
-      </w:r>
-      <w:r>
-        <w:t xml:space="preserve">“on the NLP or in the</w:t>
-      </w:r>
-      <w:r>
-        <w:t xml:space="preserve"> </w:t>
-      </w:r>
-      <w:r>
-        <w:t xml:space="preserve">Catalogue”</w:t>
-      </w:r>
-      <w:r>
-        <w:t xml:space="preserve">. Add tests for both rules, and rebuild the published run with the</w:t>
+        <w:t xml:space="preserve">, which lack the key, keep "on the NLP or in the</w:t>
+      </w:r>
+      <w:r>
+        <w:t xml:space="preserve"> </w:t>
+      </w:r>
+      <w:r>
+        <w:t xml:space="preserve">Catalogue". Add tests for both rules, and rebuild the published run with the</w:t>
       </w:r>
       <w:r>
         <w:t xml:space="preserve"> </w:t>
@@ -26699,7 +26789,7 @@
         <w:pStyle w:val="FirstParagraph"/>
       </w:pPr>
       <w:r>
-        <w:t xml:space="preserve">The tests check the new file’s hash, that its version matches its filename,</w:t>
+        <w:t xml:space="preserve">The tests check the new file's hash, that its version matches its filename,</w:t>
       </w:r>
       <w:r>
         <w:t xml:space="preserve"> </w:t>
@@ -27191,7 +27281,7 @@
         <w:t xml:space="preserve"> </w:t>
       </w:r>
       <w:r>
-        <w:t xml:space="preserve">each point’s rule branch by branch. Commit the new document,</w:t>
+        <w:t xml:space="preserve">each point's rule branch by branch. Commit the new document,</w:t>
       </w:r>
       <w:r>
         <w:t xml:space="preserve"> </w:t>
@@ -27246,9 +27336,9 @@
         </w:pict>
       </w:r>
     </w:p>
-    <w:bookmarkEnd w:id="74"/>
     <w:bookmarkEnd w:id="75"/>
-    <w:bookmarkStart w:id="76" w:name="sources"/>
+    <w:bookmarkEnd w:id="76"/>
+    <w:bookmarkStart w:id="79" w:name="sources"/>
     <w:p>
       <w:pPr>
         <w:pStyle w:val="Heading2"/>
@@ -27332,8 +27422,19 @@
         </w:numPr>
       </w:pPr>
       <w:r>
-        <w:t xml:space="preserve">EOSC Federation node index: https://eosc.eu/building-the-eosc-federation/</w:t>
-      </w:r>
+        <w:t xml:space="preserve">EOSC Federation node index:</w:t>
+      </w:r>
+      <w:r>
+        <w:t xml:space="preserve"> </w:t>
+      </w:r>
+      <w:hyperlink r:id="rId38">
+        <w:r>
+          <w:rPr>
+            <w:rStyle w:val="Hyperlink"/>
+          </w:rPr>
+          <w:t xml:space="preserve">https://eosc.eu/building-the-eosc-federation/</w:t>
+        </w:r>
+      </w:hyperlink>
     </w:p>
     <w:p>
       <w:pPr>
@@ -27344,8 +27445,19 @@
         </w:numPr>
       </w:pPr>
       <w:r>
-        <w:t xml:space="preserve">Repository: https://github.com/marioreale/eosc-basic-compliance</w:t>
-      </w:r>
+        <w:t xml:space="preserve">Repository:</w:t>
+      </w:r>
+      <w:r>
+        <w:t xml:space="preserve"> </w:t>
+      </w:r>
+      <w:hyperlink r:id="rId77">
+        <w:r>
+          <w:rPr>
+            <w:rStyle w:val="Hyperlink"/>
+          </w:rPr>
+          <w:t xml:space="preserve">https://github.com/marioreale/eosc-basic-compliance</w:t>
+        </w:r>
+      </w:hyperlink>
     </w:p>
     <w:p>
       <w:pPr>
@@ -27365,8 +27477,19 @@
         <w:t xml:space="preserve"> </w:t>
       </w:r>
       <w:r>
-        <w:t xml:space="preserve">documentation: https://docs.astral.sh/uv/</w:t>
-      </w:r>
+        <w:t xml:space="preserve">documentation:</w:t>
+      </w:r>
+      <w:r>
+        <w:t xml:space="preserve"> </w:t>
+      </w:r>
+      <w:hyperlink r:id="rId33">
+        <w:r>
+          <w:rPr>
+            <w:rStyle w:val="Hyperlink"/>
+          </w:rPr>
+          <w:t xml:space="preserve">https://docs.astral.sh/uv/</w:t>
+        </w:r>
+      </w:hyperlink>
     </w:p>
     <w:p>
       <w:pPr>
@@ -27377,10 +27500,21 @@
         </w:numPr>
       </w:pPr>
       <w:r>
-        <w:t xml:space="preserve">Playwright for Python: https://playwright.dev/python/</w:t>
-      </w:r>
-    </w:p>
-    <w:bookmarkEnd w:id="76"/>
+        <w:t xml:space="preserve">Playwright for Python:</w:t>
+      </w:r>
+      <w:r>
+        <w:t xml:space="preserve"> </w:t>
+      </w:r>
+      <w:hyperlink r:id="rId78">
+        <w:r>
+          <w:rPr>
+            <w:rStyle w:val="Hyperlink"/>
+          </w:rPr>
+          <w:t xml:space="preserve">https://playwright.dev/python/</w:t>
+        </w:r>
+      </w:hyperlink>
+    </w:p>
+    <w:bookmarkEnd w:id="79"/>
     <w:sectPr>
       <w:footerReference r:id="rId16" w:type="default"/>
       <w:footnotePr>

</xml_diff>

<commit_message>
Per-node time limit (--node-timeout, default 300 s): a hung node is recorded as ERROR and the run continues; robots.txt reads off the event loop, bounded clean-up, unbuffered progress; 9 tests; docs, Word and PDF updated
</commit_message>
<xml_diff>
--- a/docs/eosc-basic-compliance-guide.docx
+++ b/docs/eosc-basic-compliance-guide.docx
@@ -23,7 +23,7 @@
         <w:pStyle w:val="Author"/>
       </w:pPr>
       <w:r>
-        <w:t xml:space="preserve">Verified against a clean clone on 26 September 2026 — rebuilt 19 October 2026 for run web-31 (re-issued checklist v3.2)</w:t>
+        <w:t xml:space="preserve">Verified against a clean clone on 26 September 2026 — rebuilt 20 October 2026 for the per-node time limit (re-issued checklist v3.2, published run web-31)</w:t>
       </w:r>
     </w:p>
     <w:p>
@@ -209,13 +209,28 @@
         <w:pStyle w:val="BodyText"/>
       </w:pPr>
       <w:r>
-        <w:t xml:space="preserve">This edition was revised on 19 October 2026, when PaNOSC's landing page</w:t>
-      </w:r>
-      <w:r>
-        <w:t xml:space="preserve"> </w:t>
-      </w:r>
-      <w:r>
-        <w:t xml:space="preserve">changed and run</w:t>
+        <w:t xml:space="preserve">This edition was revised on 20 October 2026, when a per-node time limit</w:t>
+      </w:r>
+      <w:r>
+        <w:t xml:space="preserve"> </w:t>
+      </w:r>
+      <w:r>
+        <w:t xml:space="preserve">(</w:t>
+      </w:r>
+      <w:r>
+        <w:rPr>
+          <w:rStyle w:val="VerbatimChar"/>
+        </w:rPr>
+        <w:t xml:space="preserve">--node-timeout</w:t>
+      </w:r>
+      <w:r>
+        <w:t xml:space="preserve">, section 4) was added and the test count became 462. The</w:t>
+      </w:r>
+      <w:r>
+        <w:t xml:space="preserve"> </w:t>
+      </w:r>
+      <w:r>
+        <w:t xml:space="preserve">edition of 19 October 2026 published run</w:t>
       </w:r>
       <w:r>
         <w:t xml:space="preserve"> </w:t>
@@ -230,13 +245,19 @@
         <w:t xml:space="preserve"> </w:t>
       </w:r>
       <w:r>
-        <w:t xml:space="preserve">was published: the test count (453), the tallies and</w:t>
-      </w:r>
-      <w:r>
-        <w:t xml:space="preserve"> </w:t>
-      </w:r>
-      <w:r>
-        <w:t xml:space="preserve">the rebuild of the published report were re-measured offline that day. The</w:t>
+        <w:t xml:space="preserve">after PaNOSC's landing page</w:t>
+      </w:r>
+      <w:r>
+        <w:t xml:space="preserve"> </w:t>
+      </w:r>
+      <w:r>
+        <w:t xml:space="preserve">changed; its tallies and the rebuild of the published report were re-measured</w:t>
+      </w:r>
+      <w:r>
+        <w:t xml:space="preserve"> </w:t>
+      </w:r>
+      <w:r>
+        <w:t xml:space="preserve">offline that day. The</w:t>
       </w:r>
       <w:r>
         <w:t xml:space="preserve"> </w:t>
@@ -2782,7 +2803,7 @@
         <w:t xml:space="preserve"> </w:t>
       </w:r>
       <w:r>
-        <w:t xml:space="preserve">453 tests still pass, while</w:t>
+        <w:t xml:space="preserve">462 tests still pass, while</w:t>
       </w:r>
       <w:r>
         <w:t xml:space="preserve"> </w:t>
@@ -2854,7 +2875,7 @@
         <w:rPr>
           <w:rStyle w:val="CommentTok"/>
         </w:rPr>
-        <w:t xml:space="preserve"># expect: 453 passed</w:t>
+        <w:t xml:space="preserve"># expect: 462 passed</w:t>
       </w:r>
       <w:r>
         <w:br/>
@@ -11038,6 +11059,93 @@
             </w:r>
             <w:r>
               <w:t xml:space="preserve">(default 60).</w:t>
+            </w:r>
+          </w:p>
+        </w:tc>
+      </w:tr>
+      <w:tr>
+        <w:tc>
+          <w:tcPr/>
+          <w:p>
+            <w:pPr>
+              <w:pStyle w:val="Compact"/>
+            </w:pPr>
+            <w:r>
+              <w:rPr>
+                <w:rStyle w:val="VerbatimChar"/>
+              </w:rPr>
+              <w:t xml:space="preserve">--node-timeout S</w:t>
+            </w:r>
+          </w:p>
+        </w:tc>
+        <w:tc>
+          <w:tcPr/>
+          <w:p>
+            <w:pPr>
+              <w:pStyle w:val="Compact"/>
+            </w:pPr>
+            <w:r>
+              <w:t xml:space="preserve">The most seconds one node may take, landing page and linked pages together (default 300;</w:t>
+            </w:r>
+            <w:r>
+              <w:t xml:space="preserve"> </w:t>
+            </w:r>
+            <w:r>
+              <w:rPr>
+                <w:rStyle w:val="VerbatimChar"/>
+              </w:rPr>
+              <w:t xml:space="preserve">0</w:t>
+            </w:r>
+            <w:r>
+              <w:t xml:space="preserve"> </w:t>
+            </w:r>
+            <w:r>
+              <w:t xml:space="preserve">= no limit). A node that hits it is abandoned: every point reads</w:t>
+            </w:r>
+            <w:r>
+              <w:t xml:space="preserve"> </w:t>
+            </w:r>
+            <w:r>
+              <w:rPr>
+                <w:rStyle w:val="VerbatimChar"/>
+              </w:rPr>
+              <w:t xml:space="preserve">ERROR</w:t>
+            </w:r>
+            <w:r>
+              <w:t xml:space="preserve"> </w:t>
+            </w:r>
+            <w:r>
+              <w:t xml:space="preserve">with a</w:t>
+            </w:r>
+            <w:r>
+              <w:t xml:space="preserve"> </w:t>
+            </w:r>
+            <w:r>
+              <w:rPr>
+                <w:rStyle w:val="VerbatimChar"/>
+              </w:rPr>
+              <w:t xml:space="preserve">TimeoutError</w:t>
+            </w:r>
+            <w:r>
+              <w:t xml:space="preserve"> </w:t>
+            </w:r>
+            <w:r>
+              <w:t xml:space="preserve">message, the browser is restarted, and the run goes on to the next node. Added on 20 October 2026, after one node's collection stalled and held the GitHub run of</w:t>
+            </w:r>
+            <w:r>
+              <w:t xml:space="preserve"> </w:t>
+            </w:r>
+            <w:r>
+              <w:rPr>
+                <w:rStyle w:val="VerbatimChar"/>
+              </w:rPr>
+              <w:t xml:space="preserve">web-29</w:t>
+            </w:r>
+            <w:r>
+              <w:t xml:space="preserve"> </w:t>
+            </w:r>
+            <w:r>
+              <w:t xml:space="preserve">until its 30-minute limit.</w:t>
             </w:r>
           </w:p>
         </w:tc>
@@ -18507,7 +18615,7 @@
         <w:rPr>
           <w:rStyle w:val="CommentTok"/>
         </w:rPr>
-        <w:t xml:space="preserve"># 453 tests, offline, a few seconds</w:t>
+        <w:t xml:space="preserve"># 462 tests, offline, a few seconds</w:t>
       </w:r>
       <w:r>
         <w:br/>

</xml_diff>

<commit_message>
Publish run web-34 (depth 2, 16 nodes, 85 PASS / 7 FAIL / 68 review; GÉANT served again: 1, 4, 5b, 6 to PASS, tenth name match); GÉANT governance names masked; test pinned to 10 name matches; README, guides, Word and PDF updated
</commit_message>
<xml_diff>
--- a/docs/eosc-basic-compliance-guide.docx
+++ b/docs/eosc-basic-compliance-guide.docx
@@ -23,7 +23,7 @@
         <w:pStyle w:val="Author"/>
       </w:pPr>
       <w:r>
-        <w:t xml:space="preserve">Verified against a clean clone on 26 September 2026 — rebuilt 20 October 2026 for run web-33 and EOSC Node Germany (re-issued checklist v3.2)</w:t>
+        <w:t xml:space="preserve">Verified against a clean clone on 26 September 2026 — rebuilt 27 October 2026 for run web-34 (re-issued checklist v3.2, sixteen nodes)</w:t>
       </w:r>
     </w:p>
     <w:p>
@@ -209,13 +209,34 @@
         <w:pStyle w:val="BodyText"/>
       </w:pPr>
       <w:r>
-        <w:t xml:space="preserve">This edition was revised on 20 October 2026, when EOSC Node Germany was added</w:t>
-      </w:r>
-      <w:r>
-        <w:t xml:space="preserve"> </w:t>
-      </w:r>
-      <w:r>
-        <w:t xml:space="preserve">and run</w:t>
+        <w:t xml:space="preserve">This edition was revised on 27 October 2026, when run</w:t>
+      </w:r>
+      <w:r>
+        <w:t xml:space="preserve"> </w:t>
+      </w:r>
+      <w:r>
+        <w:rPr>
+          <w:rStyle w:val="VerbatimChar"/>
+        </w:rPr>
+        <w:t xml:space="preserve">web-34</w:t>
+      </w:r>
+      <w:r>
+        <w:t xml:space="preserve"> </w:t>
+      </w:r>
+      <w:r>
+        <w:t xml:space="preserve">was published</w:t>
+      </w:r>
+      <w:r>
+        <w:t xml:space="preserve"> </w:t>
+      </w:r>
+      <w:r>
+        <w:t xml:space="preserve">(all sixteen nodes; GÉANT's page served again). The edition of 20 October 2026</w:t>
+      </w:r>
+      <w:r>
+        <w:t xml:space="preserve"> </w:t>
+      </w:r>
+      <w:r>
+        <w:t xml:space="preserve">added EOSC Node Germany and published run</w:t>
       </w:r>
       <w:r>
         <w:t xml:space="preserve"> </w:t>
@@ -227,10 +248,7 @@
         <w:t xml:space="preserve">web-33</w:t>
       </w:r>
       <w:r>
-        <w:t xml:space="preserve"> </w:t>
-      </w:r>
-      <w:r>
-        <w:t xml:space="preserve">was published, after a per-node time limit</w:t>
+        <w:t xml:space="preserve">, after a per-node time limit</w:t>
       </w:r>
       <w:r>
         <w:t xml:space="preserve"> </w:t>
@@ -577,7 +595,7 @@
           <w:b/>
           <w:bCs/>
         </w:rPr>
-        <w:t xml:space="preserve">The published run changed again on 20 October 2026.</w:t>
+        <w:t xml:space="preserve">The published run changed again on 27 October 2026.</w:t>
       </w:r>
       <w:r>
         <w:t xml:space="preserve"> </w:t>
@@ -601,9 +619,214 @@
         <w:rPr>
           <w:rStyle w:val="VerbatimChar"/>
         </w:rPr>
+        <w:t xml:space="preserve">web-34</w:t>
+      </w:r>
+      <w:r>
+        <w:t xml:space="preserve">, collected by the GitHub workflow at</w:t>
+      </w:r>
+      <w:r>
+        <w:t xml:space="preserve"> </w:t>
+      </w:r>
+      <w:r>
+        <w:rPr>
+          <w:rStyle w:val="VerbatimChar"/>
+        </w:rPr>
+        <w:t xml:space="preserve">--depth 2</w:t>
+      </w:r>
+      <w:r>
+        <w:t xml:space="preserve"> </w:t>
+      </w:r>
+      <w:r>
+        <w:t xml:space="preserve">on 27 October 2026 between 10:20 and 10:29 UTC from all sixteen</w:t>
+      </w:r>
+      <w:r>
+        <w:t xml:space="preserve"> </w:t>
+      </w:r>
+      <w:r>
+        <w:t xml:space="preserve">nodes (</w:t>
+      </w:r>
+      <w:hyperlink r:id="rId26">
+        <w:r>
+          <w:rPr>
+            <w:rStyle w:val="Hyperlink"/>
+          </w:rPr>
+          <w:t xml:space="preserve">run 40486581247</w:t>
+        </w:r>
+      </w:hyperlink>
+      <w:r>
+        <w:t xml:space="preserve">, commit</w:t>
+      </w:r>
+      <w:r>
+        <w:t xml:space="preserve"> </w:t>
+      </w:r>
+      <w:r>
+        <w:rPr>
+          <w:rStyle w:val="VerbatimChar"/>
+        </w:rPr>
+        <w:t xml:space="preserve">55657ac</w:t>
+      </w:r>
+      <w:r>
+        <w:t xml:space="preserve">), under the re-issued v3.2: 85 PASS, 7 FAIL</w:t>
+      </w:r>
+      <w:r>
+        <w:t xml:space="preserve"> </w:t>
+      </w:r>
+      <w:r>
+        <w:t xml:space="preserve">and 68 MANUAL_REVIEW at depth 2 (83 / 7 / 70 at depth 1), in 145 page</w:t>
+      </w:r>
+      <w:r>
+        <w:t xml:space="preserve"> </w:t>
+      </w:r>
+      <w:r>
+        <w:t xml:space="preserve">requests (16 landing pages, 77 direct links, 52 second-hop pages; the shared</w:t>
+      </w:r>
+      <w:r>
+        <w:t xml:space="preserve"> </w:t>
+      </w:r>
+      <w:r>
+        <w:t xml:space="preserve">second-hop budget used 52 of 60). Only</w:t>
+      </w:r>
+      <w:r>
+        <w:t xml:space="preserve"> </w:t>
+      </w:r>
+      <w:r>
+        <w:rPr>
+          <w:b/>
+          <w:bCs/>
+        </w:rPr>
+        <w:t xml:space="preserve">GÉANT</w:t>
+      </w:r>
+      <w:r>
+        <w:t xml:space="preserve"> </w:t>
+      </w:r>
+      <w:r>
+        <w:t xml:space="preserve">changed: its page was served</w:t>
+      </w:r>
+      <w:r>
+        <w:t xml:space="preserve"> </w:t>
+      </w:r>
+      <w:r>
+        <w:t xml:space="preserve">(</w:t>
+      </w:r>
+      <w:r>
+        <w:rPr>
+          <w:rStyle w:val="VerbatimChar"/>
+        </w:rPr>
+        <w:t xml:space="preserve">HTTP 200</w:t>
+      </w:r>
+      <w:r>
+        <w:t xml:space="preserve">) for the first time since</w:t>
+      </w:r>
+      <w:r>
+        <w:t xml:space="preserve"> </w:t>
+      </w:r>
+      <w:r>
+        <w:rPr>
+          <w:rStyle w:val="VerbatimChar"/>
+        </w:rPr>
+        <w:t xml:space="preserve">web-22</w:t>
+      </w:r>
+      <w:r>
+        <w:t xml:space="preserve">, so points 1, 4, 5b and 6 moved</w:t>
+      </w:r>
+      <w:r>
+        <w:t xml:space="preserve"> </w:t>
+      </w:r>
+      <w:r>
+        <w:t xml:space="preserve">from review to</w:t>
+      </w:r>
+      <w:r>
+        <w:t xml:space="preserve"> </w:t>
+      </w:r>
+      <w:r>
+        <w:rPr>
+          <w:rStyle w:val="VerbatimChar"/>
+        </w:rPr>
+        <w:t xml:space="preserve">PASS</w:t>
+      </w:r>
+      <w:r>
+        <w:t xml:space="preserve"> </w:t>
+      </w:r>
+      <w:r>
+        <w:t xml:space="preserve">at both depths. No cell of the other fifteen nodes</w:t>
+      </w:r>
+      <w:r>
+        <w:t xml:space="preserve"> </w:t>
+      </w:r>
+      <w:r>
+        <w:t xml:space="preserve">changed against</w:t>
+      </w:r>
+      <w:r>
+        <w:t xml:space="preserve"> </w:t>
+      </w:r>
+      <w:r>
+        <w:rPr>
+          <w:rStyle w:val="VerbatimChar"/>
+        </w:rPr>
         <w:t xml:space="preserve">web-33</w:t>
       </w:r>
       <w:r>
+        <w:t xml:space="preserve">, and every node finished within its time limit. It</w:t>
+      </w:r>
+      <w:r>
+        <w:t xml:space="preserve"> </w:t>
+      </w:r>
+      <w:r>
+        <w:t xml:space="preserve">has</w:t>
+      </w:r>
+      <w:r>
+        <w:t xml:space="preserve"> </w:t>
+      </w:r>
+      <w:r>
+        <w:rPr>
+          <w:b/>
+          <w:bCs/>
+        </w:rPr>
+        <w:t xml:space="preserve">not</w:t>
+      </w:r>
+      <w:r>
+        <w:t xml:space="preserve"> </w:t>
+      </w:r>
+      <w:r>
+        <w:t xml:space="preserve">been reviewed by hand.</w:t>
+      </w:r>
+    </w:p>
+    <w:p>
+      <w:pPr>
+        <w:pStyle w:val="BlockText"/>
+      </w:pPr>
+      <w:r>
+        <w:rPr>
+          <w:b/>
+          <w:bCs/>
+        </w:rPr>
+        <w:t xml:space="preserve">Previously, on 20 October 2026,</w:t>
+      </w:r>
+      <w:r>
+        <w:t xml:space="preserve"> </w:t>
+      </w:r>
+      <w:r>
+        <w:rPr>
+          <w:rStyle w:val="VerbatimChar"/>
+        </w:rPr>
+        <w:t xml:space="preserve">results/</w:t>
+      </w:r>
+      <w:r>
+        <w:t xml:space="preserve"> </w:t>
+      </w:r>
+      <w:r>
+        <w:t xml:space="preserve">held run</w:t>
+      </w:r>
+      <w:r>
+        <w:t xml:space="preserve"> </w:t>
+      </w:r>
+      <w:r>
+        <w:rPr>
+          <w:rStyle w:val="VerbatimChar"/>
+        </w:rPr>
+        <w:t xml:space="preserve">web-33</w:t>
+      </w:r>
+      <w:r>
         <w:t xml:space="preserve">, collected by the GitHub workflow at</w:t>
       </w:r>
       <w:r>
@@ -627,7 +850,7 @@
       <w:r>
         <w:t xml:space="preserve">nodes (</w:t>
       </w:r>
-      <w:hyperlink r:id="rId26">
+      <w:hyperlink r:id="rId27">
         <w:r>
           <w:rPr>
             <w:rStyle w:val="Hyperlink"/>
@@ -744,7 +967,7 @@
       <w:r>
         <w:t xml:space="preserve">(</w:t>
       </w:r>
-      <w:hyperlink r:id="rId27">
+      <w:hyperlink r:id="rId28">
         <w:r>
           <w:rPr>
             <w:rStyle w:val="Hyperlink"/>
@@ -849,7 +1072,7 @@
       <w:r>
         <w:t xml:space="preserve">nodes (</w:t>
       </w:r>
-      <w:hyperlink r:id="rId28">
+      <w:hyperlink r:id="rId29">
         <w:r>
           <w:rPr>
             <w:rStyle w:val="Hyperlink"/>
@@ -1036,7 +1259,7 @@
       <w:r>
         <w:t xml:space="preserve">nodes (</w:t>
       </w:r>
-      <w:hyperlink r:id="rId29">
+      <w:hyperlink r:id="rId30">
         <w:r>
           <w:rPr>
             <w:rStyle w:val="Hyperlink"/>
@@ -1267,7 +1490,7 @@
       <w:r>
         <w:t xml:space="preserve">nodes (</w:t>
       </w:r>
-      <w:hyperlink r:id="rId30">
+      <w:hyperlink r:id="rId31">
         <w:r>
           <w:rPr>
             <w:rStyle w:val="Hyperlink"/>
@@ -1344,7 +1567,7 @@
       <w:r>
         <w:t xml:space="preserve">(</w:t>
       </w:r>
-      <w:hyperlink r:id="rId31">
+      <w:hyperlink r:id="rId32">
         <w:r>
           <w:rPr>
             <w:rStyle w:val="Hyperlink"/>
@@ -1545,7 +1768,7 @@
       <w:r>
         <w:t xml:space="preserve">(</w:t>
       </w:r>
-      <w:hyperlink r:id="rId32">
+      <w:hyperlink r:id="rId33">
         <w:r>
           <w:rPr>
             <w:rStyle w:val="Hyperlink"/>
@@ -1583,7 +1806,7 @@
       <w:r>
         <w:t xml:space="preserve">(</w:t>
       </w:r>
-      <w:hyperlink r:id="rId33">
+      <w:hyperlink r:id="rId34">
         <w:r>
           <w:rPr>
             <w:rStyle w:val="Hyperlink"/>
@@ -1627,7 +1850,7 @@
       <w:r>
         <w:t xml:space="preserve">(</w:t>
       </w:r>
-      <w:hyperlink r:id="rId34">
+      <w:hyperlink r:id="rId35">
         <w:r>
           <w:rPr>
             <w:rStyle w:val="Hyperlink"/>
@@ -1875,7 +2098,7 @@
         </w:pict>
       </w:r>
     </w:p>
-    <w:bookmarkStart w:id="36" w:name="Xa849b483e716a0fdd106fab4604fc7be81f0402"/>
+    <w:bookmarkStart w:id="37" w:name="Xa849b483e716a0fdd106fab4604fc7be81f0402"/>
     <w:p>
       <w:pPr>
         <w:pStyle w:val="Heading2"/>
@@ -1958,7 +2181,7 @@
             <w:pPr>
               <w:pStyle w:val="Compact"/>
             </w:pPr>
-            <w:hyperlink r:id="rId35">
+            <w:hyperlink r:id="rId36">
               <w:r>
                 <w:rPr>
                   <w:rStyle w:val="VerbatimChar"/>
@@ -2315,8 +2538,8 @@
         </w:pict>
       </w:r>
     </w:p>
-    <w:bookmarkEnd w:id="36"/>
-    <w:bookmarkStart w:id="39" w:name="X6078cdea213b88e89d26f75066193281dac3f5a"/>
+    <w:bookmarkEnd w:id="37"/>
+    <w:bookmarkStart w:id="40" w:name="X6078cdea213b88e89d26f75066193281dac3f5a"/>
     <w:p>
       <w:pPr>
         <w:pStyle w:val="Heading2"/>
@@ -2615,7 +2838,7 @@
         <w:t xml:space="preserve">this step.</w:t>
       </w:r>
     </w:p>
-    <w:bookmarkStart w:id="37" w:name="what-needs-a-browser-and-what-does-not"/>
+    <w:bookmarkStart w:id="38" w:name="what-needs-a-browser-and-what-does-not"/>
     <w:p>
       <w:pPr>
         <w:pStyle w:val="Heading3"/>
@@ -3076,8 +3299,8 @@
         <w:t xml:space="preserve">.</w:t>
       </w:r>
     </w:p>
-    <w:bookmarkEnd w:id="37"/>
-    <w:bookmarkStart w:id="38" w:name="verifying-the-installation"/>
+    <w:bookmarkEnd w:id="38"/>
+    <w:bookmarkStart w:id="39" w:name="verifying-the-installation"/>
     <w:p>
       <w:pPr>
         <w:pStyle w:val="Heading3"/>
@@ -3199,9 +3422,9 @@
         </w:pict>
       </w:r>
     </w:p>
-    <w:bookmarkEnd w:id="38"/>
     <w:bookmarkEnd w:id="39"/>
-    <w:bookmarkStart w:id="53" w:name="X36a2f22c204b35ab145e33f27bc3a3711e9d130"/>
+    <w:bookmarkEnd w:id="40"/>
+    <w:bookmarkStart w:id="54" w:name="X36a2f22c204b35ab145e33f27bc3a3711e9d130"/>
     <w:p>
       <w:pPr>
         <w:pStyle w:val="Heading2"/>
@@ -3230,7 +3453,7 @@
         <w:t xml:space="preserve">edited; the third is a plain text list you write yourself.</w:t>
       </w:r>
     </w:p>
-    <w:bookmarkStart w:id="41" w:name="nodesyaml--which-pages-to-check"/>
+    <w:bookmarkStart w:id="42" w:name="nodesyaml--which-pages-to-check"/>
     <w:p>
       <w:pPr>
         <w:pStyle w:val="Heading3"/>
@@ -3612,7 +3835,7 @@
       <w:r>
         <w:t xml:space="preserve"> </w:t>
       </w:r>
-      <w:hyperlink r:id="rId40">
+      <w:hyperlink r:id="rId41">
         <w:r>
           <w:rPr>
             <w:rStyle w:val="Hyperlink"/>
@@ -4089,13 +4312,25 @@
         <w:rPr>
           <w:rStyle w:val="VerbatimChar"/>
         </w:rPr>
-        <w:t xml:space="preserve">web-33</w:t>
-      </w:r>
-      <w:r>
-        <w:t xml:space="preserve"> </w:t>
-      </w:r>
-      <w:r>
-        <w:t xml:space="preserve">(the published run) were collected from</w:t>
+        <w:t xml:space="preserve">web-34</w:t>
+      </w:r>
+      <w:r>
+        <w:t xml:space="preserve"> </w:t>
+      </w:r>
+      <w:r>
+        <w:t xml:space="preserve">(</w:t>
+      </w:r>
+      <w:r>
+        <w:rPr>
+          <w:rStyle w:val="VerbatimChar"/>
+        </w:rPr>
+        <w:t xml:space="preserve">web-34</w:t>
+      </w:r>
+      <w:r>
+        <w:t xml:space="preserve"> </w:t>
+      </w:r>
+      <w:r>
+        <w:t xml:space="preserve">is the published run) were collected from</w:t>
       </w:r>
       <w:r>
         <w:t xml:space="preserve"> </w:t>
@@ -4209,13 +4444,25 @@
         <w:rPr>
           <w:rStyle w:val="VerbatimChar"/>
         </w:rPr>
-        <w:t xml:space="preserve">web-33</w:t>
-      </w:r>
-      <w:r>
-        <w:t xml:space="preserve"> </w:t>
-      </w:r>
-      <w:r>
-        <w:t xml:space="preserve">(the published run) read the new one.</w:t>
+        <w:t xml:space="preserve">web-34</w:t>
+      </w:r>
+      <w:r>
+        <w:t xml:space="preserve"> </w:t>
+      </w:r>
+      <w:r>
+        <w:t xml:space="preserve">(</w:t>
+      </w:r>
+      <w:r>
+        <w:rPr>
+          <w:rStyle w:val="VerbatimChar"/>
+        </w:rPr>
+        <w:t xml:space="preserve">web-34</w:t>
+      </w:r>
+      <w:r>
+        <w:t xml:space="preserve"> </w:t>
+      </w:r>
+      <w:r>
+        <w:t xml:space="preserve">is the published run) read the new one.</w:t>
       </w:r>
     </w:p>
     <w:p>
@@ -4377,6 +4624,18 @@
         <w:t xml:space="preserve">web-31</w:t>
       </w:r>
       <w:r>
+        <w:t xml:space="preserve">,</w:t>
+      </w:r>
+      <w:r>
+        <w:t xml:space="preserve"> </w:t>
+      </w:r>
+      <w:r>
+        <w:rPr>
+          <w:rStyle w:val="VerbatimChar"/>
+        </w:rPr>
+        <w:t xml:space="preserve">web-33</w:t>
+      </w:r>
+      <w:r>
         <w:t xml:space="preserve"> </w:t>
       </w:r>
       <w:r>
@@ -4389,7 +4648,7 @@
         <w:rPr>
           <w:rStyle w:val="VerbatimChar"/>
         </w:rPr>
-        <w:t xml:space="preserve">web-33</w:t>
+        <w:t xml:space="preserve">web-34</w:t>
       </w:r>
       <w:r>
         <w:t xml:space="preserve"> </w:t>
@@ -4500,11 +4759,23 @@
         <w:t xml:space="preserve">web-33</w:t>
       </w:r>
       <w:r>
+        <w:t xml:space="preserve">, and again in</w:t>
+      </w:r>
+      <w:r>
+        <w:t xml:space="preserve"> </w:t>
+      </w:r>
+      <w:r>
+        <w:rPr>
+          <w:rStyle w:val="VerbatimChar"/>
+        </w:rPr>
+        <w:t xml:space="preserve">web-34</w:t>
+      </w:r>
+      <w:r>
         <w:t xml:space="preserve">.</w:t>
       </w:r>
     </w:p>
-    <w:bookmarkEnd w:id="41"/>
-    <w:bookmarkStart w:id="42" w:name="changing-a-nodes-url"/>
+    <w:bookmarkEnd w:id="42"/>
+    <w:bookmarkStart w:id="43" w:name="changing-a-nodes-url"/>
     <w:p>
       <w:pPr>
         <w:pStyle w:val="Heading3"/>
@@ -5292,7 +5563,7 @@
         <w:rPr>
           <w:rStyle w:val="NormalTok"/>
         </w:rPr>
-        <w:t xml:space="preserve"> web-33</w:t>
+        <w:t xml:space="preserve"> web-34</w:t>
       </w:r>
     </w:p>
     <w:p>
@@ -5594,7 +5865,7 @@
         <w:t xml:space="preserve">web-31</w:t>
       </w:r>
       <w:r>
-        <w:t xml:space="preserve">, with the same counts at depth 2; and on 20 October 2026 for</w:t>
+        <w:t xml:space="preserve">, with the same counts at depth 2; on 20 October 2026 for</w:t>
       </w:r>
       <w:r>
         <w:t xml:space="preserve"> </w:t>
@@ -5606,7 +5877,19 @@
         <w:t xml:space="preserve">web-33</w:t>
       </w:r>
       <w:r>
-        <w:t xml:space="preserve">, with 81 PASS, 7 FAIL and 72 MANUAL_REVIEW. The reviewed run of 24 September that it replaced is in the git</w:t>
+        <w:t xml:space="preserve">, with 81 PASS, 7 FAIL and 72 MANUAL_REVIEW; and on 27 October 2026 for</w:t>
+      </w:r>
+      <w:r>
+        <w:t xml:space="preserve"> </w:t>
+      </w:r>
+      <w:r>
+        <w:rPr>
+          <w:rStyle w:val="VerbatimChar"/>
+        </w:rPr>
+        <w:t xml:space="preserve">web-34</w:t>
+      </w:r>
+      <w:r>
+        <w:t xml:space="preserve">, with 85 PASS, 7 FAIL and 68 MANUAL_REVIEW. The reviewed run of 24 September that it replaced is in the git</w:t>
       </w:r>
       <w:r>
         <w:t xml:space="preserve"> </w:t>
@@ -5889,8 +6172,8 @@
         <w:t xml:space="preserve">for the public address, or for the development host to allow the checker.</w:t>
       </w:r>
     </w:p>
-    <w:bookmarkEnd w:id="42"/>
-    <w:bookmarkStart w:id="43" w:name="checklistv32yaml--the-rules"/>
+    <w:bookmarkEnd w:id="43"/>
+    <w:bookmarkStart w:id="44" w:name="checklistv32yaml--the-rules"/>
     <w:p>
       <w:pPr>
         <w:pStyle w:val="Heading3"/>
@@ -6407,8 +6690,8 @@
         <w:t xml:space="preserve">section 11.</w:t>
       </w:r>
     </w:p>
-    <w:bookmarkEnd w:id="43"/>
-    <w:bookmarkStart w:id="50" w:name="Xc146b4f82f74707b022a286a4e4575eddb27a27"/>
+    <w:bookmarkEnd w:id="44"/>
+    <w:bookmarkStart w:id="51" w:name="Xc146b4f82f74707b022a286a4e4575eddb27a27"/>
     <w:p>
       <w:pPr>
         <w:pStyle w:val="Heading3"/>
@@ -6670,7 +6953,7 @@
         <w:t xml:space="preserve">the names they think it did.</w:t>
       </w:r>
     </w:p>
-    <w:bookmarkStart w:id="44" w:name="which-list-is-used"/>
+    <w:bookmarkStart w:id="45" w:name="which-list-is-used"/>
     <w:p>
       <w:pPr>
         <w:pStyle w:val="Heading4"/>
@@ -6900,8 +7183,8 @@
         <w:t xml:space="preserve">.</w:t>
       </w:r>
     </w:p>
-    <w:bookmarkEnd w:id="44"/>
-    <w:bookmarkStart w:id="45" w:name="supplying-your-own-list"/>
+    <w:bookmarkEnd w:id="45"/>
+    <w:bookmarkStart w:id="46" w:name="supplying-your-own-list"/>
     <w:p>
       <w:pPr>
         <w:pStyle w:val="Heading4"/>
@@ -7248,8 +7531,8 @@
         <w:t xml:space="preserve">is unaffected.</w:t>
       </w:r>
     </w:p>
-    <w:bookmarkEnd w:id="45"/>
-    <w:bookmarkStart w:id="46" w:name="how-a-name-is-matched"/>
+    <w:bookmarkEnd w:id="46"/>
+    <w:bookmarkStart w:id="47" w:name="how-a-name-is-matched"/>
     <w:p>
       <w:pPr>
         <w:pStyle w:val="Heading4"/>
@@ -7972,8 +8255,8 @@
         <w:t xml:space="preserve">matches none of the twelve.</w:t>
       </w:r>
     </w:p>
-    <w:bookmarkEnd w:id="46"/>
-    <w:bookmarkStart w:id="47" w:name="a-match-is-not-proof-of-the-right-name"/>
+    <w:bookmarkEnd w:id="47"/>
+    <w:bookmarkStart w:id="48" w:name="a-match-is-not-proof-of-the-right-name"/>
     <w:p>
       <w:pPr>
         <w:pStyle w:val="Heading4"/>
@@ -8246,8 +8529,8 @@
         <w:t xml:space="preserve">file's header comment says the same thing.</w:t>
       </w:r>
     </w:p>
-    <w:bookmarkEnd w:id="47"/>
-    <w:bookmarkStart w:id="48" w:name="which-list-was-used-is-recorded"/>
+    <w:bookmarkEnd w:id="48"/>
+    <w:bookmarkStart w:id="49" w:name="which-list-was-used-is-recorded"/>
     <w:p>
       <w:pPr>
         <w:pStyle w:val="Heading4"/>
@@ -8332,8 +8615,8 @@
         <w:t xml:space="preserve"> checklist/approved-names.txt</w:t>
       </w:r>
     </w:p>
-    <w:bookmarkEnd w:id="48"/>
-    <w:bookmarkStart w:id="49" w:name="what-the-official-list-actually-finds"/>
+    <w:bookmarkEnd w:id="49"/>
+    <w:bookmarkStart w:id="50" w:name="what-the-official-list-actually-finds"/>
     <w:p>
       <w:pPr>
         <w:pStyle w:val="Heading4"/>
@@ -8890,6 +9173,18 @@
         <w:t xml:space="preserve">web-16</w:t>
       </w:r>
       <w:r>
+        <w:t xml:space="preserve">,</w:t>
+      </w:r>
+      <w:r>
+        <w:t xml:space="preserve"> </w:t>
+      </w:r>
+      <w:r>
+        <w:rPr>
+          <w:rStyle w:val="VerbatimChar"/>
+        </w:rPr>
+        <w:t xml:space="preserve">web-22</w:t>
+      </w:r>
+      <w:r>
         <w:t xml:space="preserve"> </w:t>
       </w:r>
       <w:r>
@@ -8902,7 +9197,7 @@
         <w:rPr>
           <w:rStyle w:val="VerbatimChar"/>
         </w:rPr>
-        <w:t xml:space="preserve">web-22</w:t>
+        <w:t xml:space="preserve">web-34</w:t>
       </w:r>
       <w:r>
         <w:t xml:space="preserve">, when its page was</w:t>
@@ -8992,7 +9287,22 @@
         <w:t xml:space="preserve"> </w:t>
       </w:r>
       <w:r>
-        <w:t xml:space="preserve">(20 October 2026, sixteen names) the new node, Germany, writes "EOSC Node Germany" and matches too: nine. Neither new node does: Life Sciences Connect's</w:t>
+        <w:t xml:space="preserve">(20 October 2026, sixteen names) the new node, Germany, writes "EOSC Node Germany" and matches too: nine. In</w:t>
+      </w:r>
+      <w:r>
+        <w:t xml:space="preserve"> </w:t>
+      </w:r>
+      <w:r>
+        <w:rPr>
+          <w:rStyle w:val="VerbatimChar"/>
+        </w:rPr>
+        <w:t xml:space="preserve">web-34</w:t>
+      </w:r>
+      <w:r>
+        <w:t xml:space="preserve"> </w:t>
+      </w:r>
+      <w:r>
+        <w:t xml:space="preserve">(27 October 2026) GÉANT's page was served and matches again: ten. Neither new node does: Life Sciences Connect's</w:t>
       </w:r>
       <w:r>
         <w:t xml:space="preserve"> </w:t>
@@ -9217,9 +9527,9 @@
         <w:t xml:space="preserve">file before assuming the page is at fault.</w:t>
       </w:r>
     </w:p>
-    <w:bookmarkEnd w:id="49"/>
     <w:bookmarkEnd w:id="50"/>
-    <w:bookmarkStart w:id="51" w:name="adding-a-node"/>
+    <w:bookmarkEnd w:id="51"/>
+    <w:bookmarkStart w:id="52" w:name="adding-a-node"/>
     <w:p>
       <w:pPr>
         <w:pStyle w:val="Heading3"/>
@@ -9364,7 +9674,7 @@
       <w:r>
         <w:t xml:space="preserve"> </w:t>
       </w:r>
-      <w:hyperlink r:id="rId40">
+      <w:hyperlink r:id="rId41">
         <w:r>
           <w:rPr>
             <w:rStyle w:val="Hyperlink"/>
@@ -9962,8 +10272,8 @@
         <w:t xml:space="preserve">unless you intend to publish a partial one and say so.</w:t>
       </w:r>
     </w:p>
-    <w:bookmarkEnd w:id="51"/>
-    <w:bookmarkStart w:id="52" w:name="X84bdf4d6d4e37947911920c44f1c0e29ac695a1"/>
+    <w:bookmarkEnd w:id="52"/>
+    <w:bookmarkStart w:id="53" w:name="X84bdf4d6d4e37947911920c44f1c0e29ac695a1"/>
     <w:p>
       <w:pPr>
         <w:pStyle w:val="Heading3"/>
@@ -10188,9 +10498,9 @@
         </w:pict>
       </w:r>
     </w:p>
-    <w:bookmarkEnd w:id="52"/>
     <w:bookmarkEnd w:id="53"/>
-    <w:bookmarkStart w:id="62" w:name="X685e14c5476d1631112074ccb73d9ddb4da6e0f"/>
+    <w:bookmarkEnd w:id="54"/>
+    <w:bookmarkStart w:id="63" w:name="X685e14c5476d1631112074ccb73d9ddb4da6e0f"/>
     <w:p>
       <w:pPr>
         <w:pStyle w:val="Heading2"/>
@@ -10236,7 +10546,7 @@
         <w:t xml:space="preserve">requests.</w:t>
       </w:r>
     </w:p>
-    <w:bookmarkStart w:id="54" w:name="the-commands"/>
+    <w:bookmarkStart w:id="55" w:name="the-commands"/>
     <w:p>
       <w:pPr>
         <w:pStyle w:val="Heading3"/>
@@ -10352,8 +10662,8 @@
         <w:t xml:space="preserve"># one node's results in the terminal</w:t>
       </w:r>
     </w:p>
-    <w:bookmarkEnd w:id="54"/>
-    <w:bookmarkStart w:id="55" w:name="listing-the-configuration"/>
+    <w:bookmarkEnd w:id="55"/>
+    <w:bookmarkStart w:id="56" w:name="listing-the-configuration"/>
     <w:p>
       <w:pPr>
         <w:pStyle w:val="Heading3"/>
@@ -11240,8 +11550,8 @@
         <w:t xml:space="preserve">the next run will check.</w:t>
       </w:r>
     </w:p>
-    <w:bookmarkEnd w:id="55"/>
-    <w:bookmarkStart w:id="56" w:name="useful-options"/>
+    <w:bookmarkEnd w:id="56"/>
+    <w:bookmarkStart w:id="57" w:name="useful-options"/>
     <w:p>
       <w:pPr>
         <w:pStyle w:val="Heading3"/>
@@ -12514,8 +12824,8 @@
         </w:tc>
       </w:tr>
     </w:tbl>
-    <w:bookmarkEnd w:id="56"/>
-    <w:bookmarkStart w:id="57" w:name="X554c04b9c5f94e8928b231e8c7ee7978c23d680"/>
+    <w:bookmarkEnd w:id="57"/>
+    <w:bookmarkStart w:id="58" w:name="X554c04b9c5f94e8928b231e8c7ee7978c23d680"/>
     <w:p>
       <w:pPr>
         <w:pStyle w:val="Heading3"/>
@@ -13128,8 +13438,8 @@
         <w:t xml:space="preserve"> run basic-check assess</w:t>
       </w:r>
     </w:p>
-    <w:bookmarkEnd w:id="57"/>
-    <w:bookmarkStart w:id="58" w:name="X68450229b7899696107d4f9a0d6edfeb9b31753"/>
+    <w:bookmarkEnd w:id="58"/>
+    <w:bookmarkStart w:id="59" w:name="X68450229b7899696107d4f9a0d6edfeb9b31753"/>
     <w:p>
       <w:pPr>
         <w:pStyle w:val="Heading3"/>
@@ -13699,8 +14009,8 @@
         <w:t xml:space="preserve">fetches EUDAT alone.</w:t>
       </w:r>
     </w:p>
-    <w:bookmarkEnd w:id="58"/>
-    <w:bookmarkStart w:id="59" w:name="checking-a-page-not-in-nodesyaml"/>
+    <w:bookmarkEnd w:id="59"/>
+    <w:bookmarkStart w:id="60" w:name="checking-a-page-not-in-nodesyaml"/>
     <w:p>
       <w:pPr>
         <w:pStyle w:val="Heading3"/>
@@ -13788,8 +14098,8 @@
         <w:t xml:space="preserve">stray single-page file that looks official is a genuine hazard.</w:t>
       </w:r>
     </w:p>
-    <w:bookmarkEnd w:id="59"/>
-    <w:bookmarkStart w:id="60" w:name="Xff864b2a738710e69d56a09dc1146f678e1e3b2"/>
+    <w:bookmarkEnd w:id="60"/>
+    <w:bookmarkStart w:id="61" w:name="Xff864b2a738710e69d56a09dc1146f678e1e3b2"/>
     <w:p>
       <w:pPr>
         <w:pStyle w:val="Heading3"/>
@@ -14487,8 +14797,8 @@
         <w:t xml:space="preserve"> /tmp/copy</w:t>
       </w:r>
     </w:p>
-    <w:bookmarkEnd w:id="60"/>
-    <w:bookmarkStart w:id="61" w:name="checking-a-node-at-an-alternative-url"/>
+    <w:bookmarkEnd w:id="61"/>
+    <w:bookmarkStart w:id="62" w:name="checking-a-node-at-an-alternative-url"/>
     <w:p>
       <w:pPr>
         <w:pStyle w:val="Heading3"/>
@@ -15155,9 +15465,9 @@
         </w:pict>
       </w:r>
     </w:p>
-    <w:bookmarkEnd w:id="61"/>
     <w:bookmarkEnd w:id="62"/>
-    <w:bookmarkStart w:id="64" w:name="X7cf5a1e9623dd54905417df66d4a360904ae2c8"/>
+    <w:bookmarkEnd w:id="63"/>
+    <w:bookmarkStart w:id="65" w:name="X7cf5a1e9623dd54905417df66d4a360904ae2c8"/>
     <w:p>
       <w:pPr>
         <w:pStyle w:val="Heading2"/>
@@ -16445,7 +16755,7 @@
         <w:t xml:space="preserve">another federation or a later date.</w:t>
       </w:r>
     </w:p>
-    <w:bookmarkStart w:id="63" w:name="X2a91d9b1ee4bf6327b51d59c91d7740875558d5"/>
+    <w:bookmarkStart w:id="64" w:name="X2a91d9b1ee4bf6327b51d59c91d7740875558d5"/>
     <w:p>
       <w:pPr>
         <w:pStyle w:val="Heading3"/>
@@ -16642,9 +16952,9 @@
         </w:pict>
       </w:r>
     </w:p>
-    <w:bookmarkEnd w:id="63"/>
     <w:bookmarkEnd w:id="64"/>
-    <w:bookmarkStart w:id="68" w:name="X20230d89ad096c6409926418866ff11e40ef490"/>
+    <w:bookmarkEnd w:id="65"/>
+    <w:bookmarkStart w:id="69" w:name="X20230d89ad096c6409926418866ff11e40ef490"/>
     <w:p>
       <w:pPr>
         <w:pStyle w:val="Heading2"/>
@@ -16951,7 +17261,7 @@
         </w:tc>
       </w:tr>
     </w:tbl>
-    <w:bookmarkStart w:id="65" w:name="the-four-verdicts"/>
+    <w:bookmarkStart w:id="66" w:name="the-four-verdicts"/>
     <w:p>
       <w:pPr>
         <w:pStyle w:val="Heading3"/>
@@ -17407,8 +17717,8 @@
         <w:t xml:space="preserve">26 September, and the same four cells are review there.</w:t>
       </w:r>
     </w:p>
-    <w:bookmarkEnd w:id="65"/>
-    <w:bookmarkStart w:id="66" w:name="reproducing-a-verdict-by-hand"/>
+    <w:bookmarkEnd w:id="66"/>
+    <w:bookmarkStart w:id="67" w:name="reproducing-a-verdict-by-hand"/>
     <w:p>
       <w:pPr>
         <w:pStyle w:val="Heading3"/>
@@ -17592,8 +17902,8 @@
         <w:t xml:space="preserve">a verdict surprises you.</w:t>
       </w:r>
     </w:p>
-    <w:bookmarkEnd w:id="66"/>
-    <w:bookmarkStart w:id="67" w:name="personal-data-is-masked"/>
+    <w:bookmarkEnd w:id="67"/>
+    <w:bookmarkStart w:id="68" w:name="personal-data-is-masked"/>
     <w:p>
       <w:pPr>
         <w:pStyle w:val="Heading3"/>
@@ -18211,76 +18521,403 @@
         <w:rPr>
           <w:rStyle w:val="VerbatimChar"/>
         </w:rPr>
+        <w:t xml:space="preserve">web-34</w:t>
+      </w:r>
+      <w:r>
+        <w:t xml:space="preserve"> </w:t>
+      </w:r>
+      <w:r>
+        <w:t xml:space="preserve">(27 October 2026) was collected</w:t>
+      </w:r>
+      <w:r>
+        <w:t xml:space="preserve"> </w:t>
+      </w:r>
+      <w:r>
+        <w:t xml:space="preserve">with masking in place, and a search of all its evidence and reports found no</w:t>
+      </w:r>
+      <w:r>
+        <w:t xml:space="preserve"> </w:t>
+      </w:r>
+      <w:r>
+        <w:t xml:space="preserve">personal address or phone number. Two personal names that the masking does not cover were removed by hand from the evidence, each replaced by a placeholder of the same length so every character count and verdict stays as collected: a quotation attribution on CERN's page (in</w:t>
+      </w:r>
+      <w:r>
+        <w:t xml:space="preserve"> </w:t>
+      </w:r>
+      <w:r>
+        <w:rPr>
+          <w:rStyle w:val="VerbatimChar"/>
+        </w:rPr>
+        <w:t xml:space="preserve">cern.json</w:t>
+      </w:r>
+      <w:r>
+        <w:t xml:space="preserve"> </w:t>
+      </w:r>
+      <w:r>
+        <w:t xml:space="preserve">and in its screenshot) and the node coordinator named on EGI's page (in</w:t>
+      </w:r>
+      <w:r>
+        <w:t xml:space="preserve"> </w:t>
+      </w:r>
+      <w:r>
+        <w:rPr>
+          <w:rStyle w:val="VerbatimChar"/>
+        </w:rPr>
+        <w:t xml:space="preserve">egi.json</w:t>
+      </w:r>
+      <w:r>
+        <w:t xml:space="preserve">, in the link text and, since</w:t>
+      </w:r>
+      <w:r>
+        <w:t xml:space="preserve"> </w:t>
+      </w:r>
+      <w:r>
+        <w:rPr>
+          <w:rStyle w:val="VerbatimChar"/>
+        </w:rPr>
+        <w:t xml:space="preserve">web-12</w:t>
+      </w:r>
+      <w:r>
+        <w:t xml:space="preserve">, also in the link's address,</w:t>
+      </w:r>
+      <w:r>
+        <w:t xml:space="preserve"> </w:t>
+      </w:r>
+      <w:r>
+        <w:rPr>
+          <w:rStyle w:val="VerbatimChar"/>
+        </w:rPr>
+        <w:t xml:space="preserve">/person/…/</w:t>
+      </w:r>
+      <w:r>
+        <w:t xml:space="preserve">, which earlier published runs still carried). The second hop of</w:t>
+      </w:r>
+      <w:r>
+        <w:t xml:space="preserve"> </w:t>
+      </w:r>
+      <w:r>
+        <w:rPr>
+          <w:rStyle w:val="VerbatimChar"/>
+        </w:rPr>
+        <w:t xml:space="preserve">web-13</w:t>
+      </w:r>
+      <w:r>
+        <w:t xml:space="preserve"> </w:t>
+      </w:r>
+      <w:r>
+        <w:t xml:space="preserve">added a third: a person quoted in a news item on a Czechia page reached only at depth 2 (in</w:t>
+      </w:r>
+      <w:r>
+        <w:t xml:space="preserve"> </w:t>
+      </w:r>
+      <w:r>
+        <w:rPr>
+          <w:rStyle w:val="VerbatimChar"/>
+        </w:rPr>
+        <w:t xml:space="preserve">eosc-cz.json</w:t>
+      </w:r>
+      <w:r>
+        <w:t xml:space="preserve">, in the quotation and in the address of the interview it links to).</w:t>
+      </w:r>
+      <w:r>
+        <w:t xml:space="preserve"> </w:t>
+      </w:r>
+      <w:r>
+        <w:rPr>
+          <w:rStyle w:val="VerbatimChar"/>
+        </w:rPr>
+        <w:t xml:space="preserve">web-14</w:t>
+      </w:r>
+      <w:r>
+        <w:t xml:space="preserve">, which also reads services and policies pages, added many more, and</w:t>
+      </w:r>
+      <w:r>
+        <w:t xml:space="preserve"> </w:t>
+      </w:r>
+      <w:r>
+        <w:rPr>
+          <w:rStyle w:val="VerbatimChar"/>
+        </w:rPr>
+        <w:t xml:space="preserve">web-15</w:t>
+      </w:r>
+      <w:r>
+        <w:t xml:space="preserve">,</w:t>
+      </w:r>
+      <w:r>
+        <w:t xml:space="preserve"> </w:t>
+      </w:r>
+      <w:r>
+        <w:rPr>
+          <w:rStyle w:val="VerbatimChar"/>
+        </w:rPr>
+        <w:t xml:space="preserve">web-16</w:t>
+      </w:r>
+      <w:r>
+        <w:t xml:space="preserve">,</w:t>
+      </w:r>
+      <w:r>
+        <w:t xml:space="preserve"> </w:t>
+      </w:r>
+      <w:r>
+        <w:rPr>
+          <w:rStyle w:val="VerbatimChar"/>
+        </w:rPr>
+        <w:t xml:space="preserve">web-18</w:t>
+      </w:r>
+      <w:r>
+        <w:t xml:space="preserve">,</w:t>
+      </w:r>
+      <w:r>
+        <w:t xml:space="preserve"> </w:t>
+      </w:r>
+      <w:r>
+        <w:rPr>
+          <w:rStyle w:val="VerbatimChar"/>
+        </w:rPr>
+        <w:t xml:space="preserve">web-21</w:t>
+      </w:r>
+      <w:r>
+        <w:t xml:space="preserve">,</w:t>
+      </w:r>
+      <w:r>
+        <w:t xml:space="preserve"> </w:t>
+      </w:r>
+      <w:r>
+        <w:rPr>
+          <w:rStyle w:val="VerbatimChar"/>
+        </w:rPr>
+        <w:t xml:space="preserve">web-22</w:t>
+      </w:r>
+      <w:r>
+        <w:t xml:space="preserve">,</w:t>
+      </w:r>
+      <w:r>
+        <w:t xml:space="preserve"> </w:t>
+      </w:r>
+      <w:r>
+        <w:rPr>
+          <w:rStyle w:val="VerbatimChar"/>
+        </w:rPr>
+        <w:t xml:space="preserve">web-23</w:t>
+      </w:r>
+      <w:r>
+        <w:t xml:space="preserve">,</w:t>
+      </w:r>
+      <w:r>
+        <w:t xml:space="preserve"> </w:t>
+      </w:r>
+      <w:r>
+        <w:rPr>
+          <w:rStyle w:val="VerbatimChar"/>
+        </w:rPr>
+        <w:t xml:space="preserve">web-24</w:t>
+      </w:r>
+      <w:r>
+        <w:t xml:space="preserve">,</w:t>
+      </w:r>
+      <w:r>
+        <w:t xml:space="preserve"> </w:t>
+      </w:r>
+      <w:r>
+        <w:rPr>
+          <w:rStyle w:val="VerbatimChar"/>
+        </w:rPr>
+        <w:t xml:space="preserve">web-25</w:t>
+      </w:r>
+      <w:r>
+        <w:t xml:space="preserve">,</w:t>
+      </w:r>
+      <w:r>
+        <w:t xml:space="preserve"> </w:t>
+      </w:r>
+      <w:r>
+        <w:rPr>
+          <w:rStyle w:val="VerbatimChar"/>
+        </w:rPr>
+        <w:t xml:space="preserve">web-26</w:t>
+      </w:r>
+      <w:r>
+        <w:t xml:space="preserve">,</w:t>
+      </w:r>
+      <w:r>
+        <w:t xml:space="preserve"> </w:t>
+      </w:r>
+      <w:r>
+        <w:rPr>
+          <w:rStyle w:val="VerbatimChar"/>
+        </w:rPr>
+        <w:t xml:space="preserve">web-27</w:t>
+      </w:r>
+      <w:r>
+        <w:t xml:space="preserve">,</w:t>
+      </w:r>
+      <w:r>
+        <w:t xml:space="preserve"> </w:t>
+      </w:r>
+      <w:r>
+        <w:rPr>
+          <w:rStyle w:val="VerbatimChar"/>
+        </w:rPr>
+        <w:t xml:space="preserve">web-28</w:t>
+      </w:r>
+      <w:r>
+        <w:t xml:space="preserve">,</w:t>
+      </w:r>
+      <w:r>
+        <w:t xml:space="preserve"> </w:t>
+      </w:r>
+      <w:r>
+        <w:rPr>
+          <w:rStyle w:val="VerbatimChar"/>
+        </w:rPr>
+        <w:t xml:space="preserve">web-31</w:t>
+      </w:r>
+      <w:r>
+        <w:t xml:space="preserve">,</w:t>
+      </w:r>
+      <w:r>
+        <w:t xml:space="preserve"> </w:t>
+      </w:r>
+      <w:r>
+        <w:rPr>
+          <w:rStyle w:val="VerbatimChar"/>
+        </w:rPr>
         <w:t xml:space="preserve">web-33</w:t>
       </w:r>
       <w:r>
         <w:t xml:space="preserve"> </w:t>
       </w:r>
       <w:r>
-        <w:t xml:space="preserve">(20 October 2026) was collected</w:t>
-      </w:r>
-      <w:r>
-        <w:t xml:space="preserve"> </w:t>
-      </w:r>
-      <w:r>
-        <w:t xml:space="preserve">with masking in place, and a search of all its evidence and reports found no</w:t>
-      </w:r>
-      <w:r>
-        <w:t xml:space="preserve"> </w:t>
-      </w:r>
-      <w:r>
-        <w:t xml:space="preserve">personal address or phone number. Two personal names that the masking does not cover were removed by hand from the evidence, each replaced by a placeholder of the same length so every character count and verdict stays as collected: a quotation attribution on CERN's page (in</w:t>
-      </w:r>
-      <w:r>
-        <w:t xml:space="preserve"> </w:t>
-      </w:r>
-      <w:r>
-        <w:rPr>
-          <w:rStyle w:val="VerbatimChar"/>
-        </w:rPr>
-        <w:t xml:space="preserve">cern.json</w:t>
-      </w:r>
-      <w:r>
-        <w:t xml:space="preserve"> </w:t>
-      </w:r>
-      <w:r>
-        <w:t xml:space="preserve">and in its screenshot) and the node coordinator named on EGI's page (in</w:t>
-      </w:r>
-      <w:r>
-        <w:t xml:space="preserve"> </w:t>
-      </w:r>
-      <w:r>
-        <w:rPr>
-          <w:rStyle w:val="VerbatimChar"/>
-        </w:rPr>
-        <w:t xml:space="preserve">egi.json</w:t>
-      </w:r>
-      <w:r>
-        <w:t xml:space="preserve">, in the link text and, since</w:t>
-      </w:r>
-      <w:r>
-        <w:t xml:space="preserve"> </w:t>
-      </w:r>
-      <w:r>
-        <w:rPr>
-          <w:rStyle w:val="VerbatimChar"/>
-        </w:rPr>
-        <w:t xml:space="preserve">web-12</w:t>
-      </w:r>
-      <w:r>
-        <w:t xml:space="preserve">, also in the link's address,</w:t>
-      </w:r>
-      <w:r>
-        <w:t xml:space="preserve"> </w:t>
-      </w:r>
-      <w:r>
-        <w:rPr>
-          <w:rStyle w:val="VerbatimChar"/>
-        </w:rPr>
-        <w:t xml:space="preserve">/person/…/</w:t>
-      </w:r>
-      <w:r>
-        <w:t xml:space="preserve">, which earlier published runs still carried). The second hop of</w:t>
+        <w:t xml:space="preserve">and</w:t>
+      </w:r>
+      <w:r>
+        <w:t xml:space="preserve"> </w:t>
+      </w:r>
+      <w:r>
+        <w:rPr>
+          <w:rStyle w:val="VerbatimChar"/>
+        </w:rPr>
+        <w:t xml:space="preserve">web-34</w:t>
+      </w:r>
+      <w:r>
+        <w:t xml:space="preserve"> </w:t>
+      </w:r>
+      <w:r>
+        <w:t xml:space="preserve">carry the same ones (BBMRI-ERIC's apart, in</w:t>
+      </w:r>
+      <w:r>
+        <w:t xml:space="preserve"> </w:t>
+      </w:r>
+      <w:r>
+        <w:rPr>
+          <w:rStyle w:val="VerbatimChar"/>
+        </w:rPr>
+        <w:t xml:space="preserve">web-24</w:t>
+      </w:r>
+      <w:r>
+        <w:t xml:space="preserve">, where its page was not fetched;</w:t>
+      </w:r>
+      <w:r>
+        <w:t xml:space="preserve"> </w:t>
+      </w:r>
+      <w:r>
+        <w:rPr>
+          <w:rStyle w:val="VerbatimChar"/>
+        </w:rPr>
+        <w:t xml:space="preserve">web-25</w:t>
+      </w:r>
+      <w:r>
+        <w:t xml:space="preserve"> </w:t>
+      </w:r>
+      <w:r>
+        <w:t xml:space="preserve">adds fifteen on BBMRI-ERIC's</w:t>
+      </w:r>
+      <w:r>
+        <w:t xml:space="preserve"> </w:t>
+      </w:r>
+      <w:r>
+        <w:rPr>
+          <w:rStyle w:val="VerbatimChar"/>
+        </w:rPr>
+        <w:t xml:space="preserve">dev3.</w:t>
+      </w:r>
+      <w:r>
+        <w:t xml:space="preserve"> </w:t>
+      </w:r>
+      <w:r>
+        <w:t xml:space="preserve">pages: its Director General on the legal notice, the seven members of its scientific and ethical advisory board, the Stakeholder Forum chair and the head of public affairs, and five finance, project and HR staff listed in capitals) (</w:t>
+      </w:r>
+      <w:r>
+        <w:rPr>
+          <w:rStyle w:val="VerbatimChar"/>
+        </w:rPr>
+        <w:t xml:space="preserve">web-21</w:t>
+      </w:r>
+      <w:r>
+        <w:t xml:space="preserve"> </w:t>
+      </w:r>
+      <w:r>
+        <w:t xml:space="preserve">adds one, a photo credit in an image description on Data Terra's new page;</w:t>
+      </w:r>
+      <w:r>
+        <w:t xml:space="preserve"> </w:t>
+      </w:r>
+      <w:r>
+        <w:rPr>
+          <w:rStyle w:val="VerbatimChar"/>
+        </w:rPr>
+        <w:t xml:space="preserve">web-22</w:t>
+      </w:r>
+      <w:r>
+        <w:t xml:space="preserve"> </w:t>
+      </w:r>
+      <w:r>
+        <w:t xml:space="preserve">adds two staff names in a news item on EUDAT's new page and one more GÉANT observer;</w:t>
+      </w:r>
+      <w:r>
+        <w:t xml:space="preserve"> </w:t>
+      </w:r>
+      <w:r>
+        <w:rPr>
+          <w:rStyle w:val="VerbatimChar"/>
+        </w:rPr>
+        <w:t xml:space="preserve">web-27</w:t>
+      </w:r>
+      <w:r>
+        <w:t xml:space="preserve"> </w:t>
+      </w:r>
+      <w:r>
+        <w:t xml:space="preserve">adds the people named in the captions of historical public-domain photos on Poland's page;</w:t>
+      </w:r>
+      <w:r>
+        <w:t xml:space="preserve"> </w:t>
+      </w:r>
+      <w:r>
+        <w:rPr>
+          <w:rStyle w:val="VerbatimChar"/>
+        </w:rPr>
+        <w:t xml:space="preserve">web-28</w:t>
+      </w:r>
+      <w:r>
+        <w:t xml:space="preserve"> </w:t>
+      </w:r>
+      <w:r>
+        <w:t xml:space="preserve">adds, on EBRAINS-RI's pages, its CEO, a section head, its press contact, three testimonial authors and two people named in news items and image captions, also in image file names and link addresses, and the coordinator named in a video title in Life Sciences Connect's screenshot;</w:t>
+      </w:r>
+      <w:r>
+        <w:t xml:space="preserve"> </w:t>
+      </w:r>
+      <w:r>
+        <w:rPr>
+          <w:rStyle w:val="VerbatimChar"/>
+        </w:rPr>
+        <w:t xml:space="preserve">web-31</w:t>
+      </w:r>
+      <w:r>
+        <w:t xml:space="preserve"> </w:t>
+      </w:r>
+      <w:r>
+        <w:t xml:space="preserve">adds the author credited in the document log of BBMRI-ERIC's Acceptable Use Policy and a person interviewed in an EBRAINS-RI news item): about thirty staff, board and news-author names on BBMRI-ERIC's and EGI's pages, and the author lists of publication citations on Czechia's, D4Science's (EOSC DTO, Italy) and PaNOSC's pages. Two of those citation lists were already in the evidence published as</w:t>
       </w:r>
       <w:r>
         <w:t xml:space="preserve"> </w:t>
@@ -18295,43 +18932,7 @@
         <w:t xml:space="preserve"> </w:t>
       </w:r>
       <w:r>
-        <w:t xml:space="preserve">added a third: a person quoted in a news item on a Czechia page reached only at depth 2 (in</w:t>
-      </w:r>
-      <w:r>
-        <w:t xml:space="preserve"> </w:t>
-      </w:r>
-      <w:r>
-        <w:rPr>
-          <w:rStyle w:val="VerbatimChar"/>
-        </w:rPr>
-        <w:t xml:space="preserve">eosc-cz.json</w:t>
-      </w:r>
-      <w:r>
-        <w:t xml:space="preserve">, in the quotation and in the address of the interview it links to).</w:t>
-      </w:r>
-      <w:r>
-        <w:t xml:space="preserve"> </w:t>
-      </w:r>
-      <w:r>
-        <w:rPr>
-          <w:rStyle w:val="VerbatimChar"/>
-        </w:rPr>
-        <w:t xml:space="preserve">web-14</w:t>
-      </w:r>
-      <w:r>
-        <w:t xml:space="preserve">, which also reads services and policies pages, added many more, and</w:t>
-      </w:r>
-      <w:r>
-        <w:t xml:space="preserve"> </w:t>
-      </w:r>
-      <w:r>
-        <w:rPr>
-          <w:rStyle w:val="VerbatimChar"/>
-        </w:rPr>
-        <w:t xml:space="preserve">web-15</w:t>
-      </w:r>
-      <w:r>
-        <w:t xml:space="preserve">,</w:t>
+        <w:t xml:space="preserve">and were missed then; they remain in the git history.</w:t>
       </w:r>
       <w:r>
         <w:t xml:space="preserve"> </w:t>
@@ -18343,286 +18944,19 @@
         <w:t xml:space="preserve">web-16</w:t>
       </w:r>
       <w:r>
-        <w:t xml:space="preserve">,</w:t>
-      </w:r>
-      <w:r>
-        <w:t xml:space="preserve"> </w:t>
-      </w:r>
-      <w:r>
-        <w:rPr>
-          <w:rStyle w:val="VerbatimChar"/>
-        </w:rPr>
-        <w:t xml:space="preserve">web-18</w:t>
-      </w:r>
-      <w:r>
-        <w:t xml:space="preserve">,</w:t>
-      </w:r>
-      <w:r>
-        <w:t xml:space="preserve"> </w:t>
-      </w:r>
-      <w:r>
-        <w:rPr>
-          <w:rStyle w:val="VerbatimChar"/>
-        </w:rPr>
-        <w:t xml:space="preserve">web-21</w:t>
-      </w:r>
-      <w:r>
-        <w:t xml:space="preserve">,</w:t>
-      </w:r>
-      <w:r>
-        <w:t xml:space="preserve"> </w:t>
-      </w:r>
-      <w:r>
-        <w:rPr>
-          <w:rStyle w:val="VerbatimChar"/>
-        </w:rPr>
-        <w:t xml:space="preserve">web-22</w:t>
-      </w:r>
-      <w:r>
-        <w:t xml:space="preserve">,</w:t>
-      </w:r>
-      <w:r>
-        <w:t xml:space="preserve"> </w:t>
-      </w:r>
-      <w:r>
-        <w:rPr>
-          <w:rStyle w:val="VerbatimChar"/>
-        </w:rPr>
-        <w:t xml:space="preserve">web-23</w:t>
-      </w:r>
-      <w:r>
-        <w:t xml:space="preserve">,</w:t>
-      </w:r>
-      <w:r>
-        <w:t xml:space="preserve"> </w:t>
-      </w:r>
-      <w:r>
-        <w:rPr>
-          <w:rStyle w:val="VerbatimChar"/>
-        </w:rPr>
-        <w:t xml:space="preserve">web-24</w:t>
-      </w:r>
-      <w:r>
-        <w:t xml:space="preserve">,</w:t>
-      </w:r>
-      <w:r>
-        <w:t xml:space="preserve"> </w:t>
-      </w:r>
-      <w:r>
-        <w:rPr>
-          <w:rStyle w:val="VerbatimChar"/>
-        </w:rPr>
-        <w:t xml:space="preserve">web-25</w:t>
-      </w:r>
-      <w:r>
-        <w:t xml:space="preserve">,</w:t>
-      </w:r>
-      <w:r>
-        <w:t xml:space="preserve"> </w:t>
-      </w:r>
-      <w:r>
-        <w:rPr>
-          <w:rStyle w:val="VerbatimChar"/>
-        </w:rPr>
-        <w:t xml:space="preserve">web-26</w:t>
-      </w:r>
-      <w:r>
-        <w:t xml:space="preserve">,</w:t>
-      </w:r>
-      <w:r>
-        <w:t xml:space="preserve"> </w:t>
-      </w:r>
-      <w:r>
-        <w:rPr>
-          <w:rStyle w:val="VerbatimChar"/>
-        </w:rPr>
-        <w:t xml:space="preserve">web-27</w:t>
-      </w:r>
-      <w:r>
-        <w:t xml:space="preserve">,</w:t>
-      </w:r>
-      <w:r>
-        <w:t xml:space="preserve"> </w:t>
-      </w:r>
-      <w:r>
-        <w:rPr>
-          <w:rStyle w:val="VerbatimChar"/>
-        </w:rPr>
-        <w:t xml:space="preserve">web-28</w:t>
-      </w:r>
-      <w:r>
-        <w:t xml:space="preserve">,</w:t>
-      </w:r>
-      <w:r>
-        <w:t xml:space="preserve"> </w:t>
-      </w:r>
-      <w:r>
-        <w:rPr>
-          <w:rStyle w:val="VerbatimChar"/>
-        </w:rPr>
-        <w:t xml:space="preserve">web-31</w:t>
-      </w:r>
-      <w:r>
-        <w:t xml:space="preserve"> </w:t>
-      </w:r>
-      <w:r>
-        <w:t xml:space="preserve">and</w:t>
-      </w:r>
-      <w:r>
-        <w:t xml:space="preserve"> </w:t>
-      </w:r>
-      <w:r>
-        <w:rPr>
-          <w:rStyle w:val="VerbatimChar"/>
-        </w:rPr>
-        <w:t xml:space="preserve">web-33</w:t>
-      </w:r>
-      <w:r>
-        <w:t xml:space="preserve"> </w:t>
-      </w:r>
-      <w:r>
-        <w:t xml:space="preserve">carry the same ones (BBMRI-ERIC's apart, in</w:t>
-      </w:r>
-      <w:r>
-        <w:t xml:space="preserve"> </w:t>
-      </w:r>
-      <w:r>
-        <w:rPr>
-          <w:rStyle w:val="VerbatimChar"/>
-        </w:rPr>
-        <w:t xml:space="preserve">web-24</w:t>
-      </w:r>
-      <w:r>
-        <w:t xml:space="preserve">, where its page was not fetched;</w:t>
-      </w:r>
-      <w:r>
-        <w:t xml:space="preserve"> </w:t>
-      </w:r>
-      <w:r>
-        <w:rPr>
-          <w:rStyle w:val="VerbatimChar"/>
-        </w:rPr>
-        <w:t xml:space="preserve">web-25</w:t>
-      </w:r>
-      <w:r>
-        <w:t xml:space="preserve"> </w:t>
-      </w:r>
-      <w:r>
-        <w:t xml:space="preserve">adds fifteen on BBMRI-ERIC's</w:t>
-      </w:r>
-      <w:r>
-        <w:t xml:space="preserve"> </w:t>
-      </w:r>
-      <w:r>
-        <w:rPr>
-          <w:rStyle w:val="VerbatimChar"/>
-        </w:rPr>
-        <w:t xml:space="preserve">dev3.</w:t>
-      </w:r>
-      <w:r>
-        <w:t xml:space="preserve"> </w:t>
-      </w:r>
-      <w:r>
-        <w:t xml:space="preserve">pages: its Director General on the legal notice, the seven members of its scientific and ethical advisory board, the Stakeholder Forum chair and the head of public affairs, and five finance, project and HR staff listed in capitals) (</w:t>
-      </w:r>
-      <w:r>
-        <w:rPr>
-          <w:rStyle w:val="VerbatimChar"/>
-        </w:rPr>
-        <w:t xml:space="preserve">web-21</w:t>
-      </w:r>
-      <w:r>
-        <w:t xml:space="preserve"> </w:t>
-      </w:r>
-      <w:r>
-        <w:t xml:space="preserve">adds one, a photo credit in an image description on Data Terra's new page;</w:t>
-      </w:r>
-      <w:r>
-        <w:t xml:space="preserve"> </w:t>
-      </w:r>
-      <w:r>
-        <w:rPr>
-          <w:rStyle w:val="VerbatimChar"/>
-        </w:rPr>
-        <w:t xml:space="preserve">web-22</w:t>
-      </w:r>
-      <w:r>
-        <w:t xml:space="preserve"> </w:t>
-      </w:r>
-      <w:r>
-        <w:t xml:space="preserve">adds two staff names in a news item on EUDAT's new page and one more GÉANT observer;</w:t>
-      </w:r>
-      <w:r>
-        <w:t xml:space="preserve"> </w:t>
-      </w:r>
-      <w:r>
-        <w:rPr>
-          <w:rStyle w:val="VerbatimChar"/>
-        </w:rPr>
-        <w:t xml:space="preserve">web-27</w:t>
-      </w:r>
-      <w:r>
-        <w:t xml:space="preserve"> </w:t>
-      </w:r>
-      <w:r>
-        <w:t xml:space="preserve">adds the people named in the captions of historical public-domain photos on Poland's page;</w:t>
-      </w:r>
-      <w:r>
-        <w:t xml:space="preserve"> </w:t>
-      </w:r>
-      <w:r>
-        <w:rPr>
-          <w:rStyle w:val="VerbatimChar"/>
-        </w:rPr>
-        <w:t xml:space="preserve">web-28</w:t>
-      </w:r>
-      <w:r>
-        <w:t xml:space="preserve"> </w:t>
-      </w:r>
-      <w:r>
-        <w:t xml:space="preserve">adds, on EBRAINS-RI's pages, its CEO, a section head, its press contact, three testimonial authors and two people named in news items and image captions, also in image file names and link addresses, and the coordinator named in a video title in Life Sciences Connect's screenshot;</w:t>
-      </w:r>
-      <w:r>
-        <w:t xml:space="preserve"> </w:t>
-      </w:r>
-      <w:r>
-        <w:rPr>
-          <w:rStyle w:val="VerbatimChar"/>
-        </w:rPr>
-        <w:t xml:space="preserve">web-31</w:t>
-      </w:r>
-      <w:r>
-        <w:t xml:space="preserve"> </w:t>
-      </w:r>
-      <w:r>
-        <w:t xml:space="preserve">adds the author credited in the document log of BBMRI-ERIC's Acceptable Use Policy and a person interviewed in an EBRAINS-RI news item): about thirty staff, board and news-author names on BBMRI-ERIC's and EGI's pages, and the author lists of publication citations on Czechia's, D4Science's (EOSC DTO, Italy) and PaNOSC's pages. Two of those citation lists were already in the evidence published as</w:t>
-      </w:r>
-      <w:r>
-        <w:t xml:space="preserve"> </w:t>
-      </w:r>
-      <w:r>
-        <w:rPr>
-          <w:rStyle w:val="VerbatimChar"/>
-        </w:rPr>
-        <w:t xml:space="preserve">web-13</w:t>
-      </w:r>
-      <w:r>
-        <w:t xml:space="preserve"> </w:t>
-      </w:r>
-      <w:r>
-        <w:t xml:space="preserve">and were missed then; they remain in the git history.</w:t>
-      </w:r>
-      <w:r>
-        <w:t xml:space="preserve"> </w:t>
-      </w:r>
-      <w:r>
-        <w:rPr>
-          <w:rStyle w:val="VerbatimChar"/>
-        </w:rPr>
-        <w:t xml:space="preserve">web-16</w:t>
-      </w:r>
-      <w:r>
-        <w:t xml:space="preserve">, the first run with GÉANT's page served since 24 September, reached its executive team, governance and membership pages: about 120 names of officers, board members and General Assembly representatives, some cut short at the end of a link label ("Firstname Lastna…"). They were taken from the fixed patterns of those pages ("Representative:", "Substitute:", "… Chief … Officer", "… Member") and masked everywhere, truncated forms included. A deeper run reads more pages, and so needs this check more; look for citations ("Surname, I." lists before a year) as well as for people named in prose. The masking handles addresses and phone numbers only, so a new run needs the same check for names. Before it, commit</w:t>
+        <w:t xml:space="preserve">, the first run with GÉANT's page served since 24 September, reached its executive team, governance and membership pages: about 120 names of officers, board members and General Assembly representatives, some cut short at the end of a link label ("Firstname Lastna…"). They were taken from the fixed patterns of those pages ("Representative:", "Substitute:", "… Chief … Officer", "… Member") and masked everywhere, truncated forms included.</w:t>
+      </w:r>
+      <w:r>
+        <w:t xml:space="preserve"> </w:t>
+      </w:r>
+      <w:r>
+        <w:rPr>
+          <w:rStyle w:val="VerbatimChar"/>
+        </w:rPr>
+        <w:t xml:space="preserve">web-34</w:t>
+      </w:r>
+      <w:r>
+        <w:t xml:space="preserve">, the next run with GÉANT's page served, reached the same pages again; the same patterns gave about 120 names (122 full names and one cut short in a control label), masked the same way. A deeper run reads more pages, and so needs this check more; look for citations ("Surname, I." lists before a year) as well as for people named in prose. The masking handles addresses and phone numbers only, so a new run needs the same check for names. Before it, commit</w:t>
       </w:r>
       <w:r>
         <w:t xml:space="preserve"> </w:t>
@@ -18974,9 +19308,9 @@
         </w:pict>
       </w:r>
     </w:p>
-    <w:bookmarkEnd w:id="67"/>
     <w:bookmarkEnd w:id="68"/>
-    <w:bookmarkStart w:id="71" w:name="X8c4c4ed22fb4dcefc9eca31097b000686e9bb12"/>
+    <w:bookmarkEnd w:id="69"/>
+    <w:bookmarkStart w:id="72" w:name="X8c4c4ed22fb4dcefc9eca31097b000686e9bb12"/>
     <w:p>
       <w:pPr>
         <w:pStyle w:val="Heading2"/>
@@ -19771,7 +20105,7 @@
       <w:r>
         <w:t xml:space="preserve"> </w:t>
       </w:r>
-      <w:hyperlink r:id="rId69">
+      <w:hyperlink r:id="rId70">
         <w:r>
           <w:rPr>
             <w:rStyle w:val="Hyperlink"/>
@@ -19835,7 +20169,7 @@
         <w:t xml:space="preserve">test_a_pipe_in_a_url_cannot_break_the_table</w:t>
       </w:r>
     </w:p>
-    <w:bookmarkStart w:id="70" w:name="a-note-on-what-a-passing-suite-means"/>
+    <w:bookmarkStart w:id="71" w:name="a-note-on-what-a-passing-suite-means"/>
     <w:p>
       <w:pPr>
         <w:pStyle w:val="Heading3"/>
@@ -19912,9 +20246,9 @@
         </w:pict>
       </w:r>
     </w:p>
-    <w:bookmarkEnd w:id="70"/>
     <w:bookmarkEnd w:id="71"/>
-    <w:bookmarkStart w:id="72" w:name="X5b3efa2c0f9c923f21ce32023ca2c65a6e0f0ef"/>
+    <w:bookmarkEnd w:id="72"/>
+    <w:bookmarkStart w:id="73" w:name="X5b3efa2c0f9c923f21ce32023ca2c65a6e0f0ef"/>
     <w:p>
       <w:pPr>
         <w:pStyle w:val="Heading2"/>
@@ -20587,8 +20921,8 @@
         </w:pict>
       </w:r>
     </w:p>
-    <w:bookmarkEnd w:id="72"/>
-    <w:bookmarkStart w:id="73" w:name="X604d32d4245089c058c4a17a722c369f414c972"/>
+    <w:bookmarkEnd w:id="73"/>
+    <w:bookmarkStart w:id="74" w:name="X604d32d4245089c058c4a17a722c369f414c972"/>
     <w:p>
       <w:pPr>
         <w:pStyle w:val="Heading2"/>
@@ -21738,8 +22072,8 @@
         </w:pict>
       </w:r>
     </w:p>
-    <w:bookmarkEnd w:id="73"/>
-    <w:bookmarkStart w:id="74" w:name="X06fd69237b69b86c25fbae3186e71511448d9d7"/>
+    <w:bookmarkEnd w:id="74"/>
+    <w:bookmarkStart w:id="75" w:name="X06fd69237b69b86c25fbae3186e71511448d9d7"/>
     <w:p>
       <w:pPr>
         <w:pStyle w:val="Heading2"/>
@@ -22366,8 +22700,8 @@
         <w:t xml:space="preserve">checklist transcription, so none of it is under this module's control.</w:t>
       </w:r>
     </w:p>
-    <w:bookmarkEnd w:id="74"/>
-    <w:bookmarkStart w:id="78" w:name="Xda1205f52db61b26639938baa97f3777a4c7991"/>
+    <w:bookmarkEnd w:id="75"/>
+    <w:bookmarkStart w:id="79" w:name="Xda1205f52db61b26639938baa97f3777a4c7991"/>
     <w:p>
       <w:pPr>
         <w:pStyle w:val="Heading2"/>
@@ -22664,7 +22998,7 @@
         <w:t xml:space="preserve">own run.</w:t>
       </w:r>
     </w:p>
-    <w:bookmarkStart w:id="75" w:name="X073cb44b8dc5d29e47f376bc008b8613dd82a6a"/>
+    <w:bookmarkStart w:id="76" w:name="X073cb44b8dc5d29e47f376bc008b8613dd82a6a"/>
     <w:p>
       <w:pPr>
         <w:pStyle w:val="Heading3"/>
@@ -22787,7 +23121,7 @@
       <w:r>
         <w:t xml:space="preserve"> </w:t>
       </w:r>
-      <w:hyperlink r:id="rId40">
+      <w:hyperlink r:id="rId41">
         <w:r>
           <w:rPr>
             <w:rStyle w:val="Hyperlink"/>
@@ -24456,8 +24790,8 @@
         <w:t xml:space="preserve"> push</w:t>
       </w:r>
     </w:p>
-    <w:bookmarkEnd w:id="75"/>
-    <w:bookmarkStart w:id="76" w:name="Xe23e918a40335caa5ab24e15a733d1ac9e4c070"/>
+    <w:bookmarkEnd w:id="76"/>
+    <w:bookmarkStart w:id="77" w:name="Xe23e918a40335caa5ab24e15a733d1ac9e4c070"/>
     <w:p>
       <w:pPr>
         <w:pStyle w:val="Heading3"/>
@@ -25714,8 +26048,8 @@
         <w:t xml:space="preserve">the documents together.</w:t>
       </w:r>
     </w:p>
-    <w:bookmarkEnd w:id="76"/>
-    <w:bookmarkStart w:id="77" w:name="Xa570dceeae7de3d84789b8e054a5bbb043a3946"/>
+    <w:bookmarkEnd w:id="77"/>
+    <w:bookmarkStart w:id="78" w:name="Xa570dceeae7de3d84789b8e054a5bbb043a3946"/>
     <w:p>
       <w:pPr>
         <w:pStyle w:val="Heading3"/>
@@ -27846,9 +28180,9 @@
         </w:pict>
       </w:r>
     </w:p>
-    <w:bookmarkEnd w:id="77"/>
     <w:bookmarkEnd w:id="78"/>
-    <w:bookmarkStart w:id="81" w:name="sources"/>
+    <w:bookmarkEnd w:id="79"/>
+    <w:bookmarkStart w:id="82" w:name="sources"/>
     <w:p>
       <w:pPr>
         <w:pStyle w:val="Heading2"/>
@@ -27937,7 +28271,7 @@
       <w:r>
         <w:t xml:space="preserve"> </w:t>
       </w:r>
-      <w:hyperlink r:id="rId40">
+      <w:hyperlink r:id="rId41">
         <w:r>
           <w:rPr>
             <w:rStyle w:val="Hyperlink"/>
@@ -27960,7 +28294,7 @@
       <w:r>
         <w:t xml:space="preserve"> </w:t>
       </w:r>
-      <w:hyperlink r:id="rId79">
+      <w:hyperlink r:id="rId80">
         <w:r>
           <w:rPr>
             <w:rStyle w:val="Hyperlink"/>
@@ -27992,7 +28326,7 @@
       <w:r>
         <w:t xml:space="preserve"> </w:t>
       </w:r>
-      <w:hyperlink r:id="rId35">
+      <w:hyperlink r:id="rId36">
         <w:r>
           <w:rPr>
             <w:rStyle w:val="Hyperlink"/>
@@ -28015,7 +28349,7 @@
       <w:r>
         <w:t xml:space="preserve"> </w:t>
       </w:r>
-      <w:hyperlink r:id="rId80">
+      <w:hyperlink r:id="rId81">
         <w:r>
           <w:rPr>
             <w:rStyle w:val="Hyperlink"/>
@@ -28024,7 +28358,7 @@
         </w:r>
       </w:hyperlink>
     </w:p>
-    <w:bookmarkEnd w:id="81"/>
+    <w:bookmarkEnd w:id="82"/>
     <w:sectPr>
       <w:footerReference r:id="rId16" w:type="default"/>
       <w:footnotePr>

</xml_diff>